<commit_message>
add survey QR codes, links, and embeds
</commit_message>
<xml_diff>
--- a/docassemble/MLHDivorceAndCustody/data/templates/instructions.docx
+++ b/docassemble/MLHDivorceAndCustody/data/templates/instructions.docx
@@ -7,23 +7,63 @@
         <w:pStyle w:val="Normalforinsertedinstructions"/>
       </w:pPr>
       <w:r>
-        <w:t>{{p include_docx_template('docassemble.mlhframework:data/templates/cover_sheet_2.0.docx') }}</w:t>
+        <w:t>{{p include_docx_template('</w:t>
+      </w:r>
+      <w:proofErr w:type="gramStart"/>
+      <w:r>
+        <w:t>docassemble.mlhframework</w:t>
+      </w:r>
+      <w:proofErr w:type="gramEnd"/>
+      <w:r>
+        <w:t>:data/templates/cover_sheet_2.0.docx'</w:t>
+      </w:r>
+      <w:proofErr w:type="gramStart"/>
+      <w:r>
+        <w:t>) }</w:t>
+      </w:r>
+      <w:proofErr w:type="gramEnd"/>
+      <w:r>
+        <w:t>}</w:t>
       </w:r>
     </w:p>
     <w:p/>
     <w:p>
+      <w:r>
+        <w:t xml:space="preserve">{%p if </w:t>
+      </w:r>
+      <w:proofErr w:type="spellStart"/>
+      <w:r>
+        <w:t>tool_ID</w:t>
+      </w:r>
+      <w:proofErr w:type="spellEnd"/>
+      <w:r>
+        <w:t xml:space="preserve"> == “</w:t>
+      </w:r>
+      <w:proofErr w:type="spellStart"/>
+      <w:r>
+        <w:t>divorce_complaint</w:t>
+      </w:r>
+      <w:proofErr w:type="spellEnd"/>
+      <w:r>
+        <w:t>” %}</w:t>
+      </w:r>
+    </w:p>
+    <w:p>
       <w:pPr>
         <w:jc w:val="center"/>
-      </w:pPr>
-      <w:r>
         <w:rPr>
           <w:noProof/>
         </w:rPr>
+      </w:pPr>
+      <w:r>
+        <w:rPr>
+          <w:noProof/>
+        </w:rPr>
         <w:drawing>
-          <wp:inline distT="0" distB="0" distL="0" distR="0" wp14:anchorId="0EF15B15" wp14:editId="74BF2F87">
-            <wp:extent cx="1188720" cy="1188720"/>
-            <wp:effectExtent l="0" t="0" r="0" b="0"/>
-            <wp:docPr id="347106249" name="Picture 6" descr="Survey QR Code"/>
+          <wp:inline distT="0" distB="0" distL="0" distR="0" wp14:anchorId="3AE09D96" wp14:editId="26F97A02">
+            <wp:extent cx="1238250" cy="1247775"/>
+            <wp:effectExtent l="0" t="0" r="0" b="9525"/>
+            <wp:docPr id="2096664221" name="Picture 2" descr="Survey QR Code"/>
             <wp:cNvGraphicFramePr>
               <a:graphicFrameLocks xmlns:a="http://schemas.openxmlformats.org/drawingml/2006/main" noChangeAspect="1"/>
             </wp:cNvGraphicFramePr>
@@ -31,12 +71,12 @@
               <a:graphicData uri="http://schemas.openxmlformats.org/drawingml/2006/picture">
                 <pic:pic xmlns:pic="http://schemas.openxmlformats.org/drawingml/2006/picture">
                   <pic:nvPicPr>
-                    <pic:cNvPr id="347106249" name="Picture 6" descr="Survey QR Code"/>
+                    <pic:cNvPr id="2096664221" name="Picture 2" descr="Survey QR Code"/>
                     <pic:cNvPicPr>
                       <a:picLocks noChangeAspect="1" noChangeArrowheads="1"/>
                     </pic:cNvPicPr>
                   </pic:nvPicPr>
-                  <pic:blipFill>
+                  <pic:blipFill rotWithShape="1">
                     <a:blip r:embed="rId7">
                       <a:extLst>
                         <a:ext uri="{28A0092B-C50C-407E-A947-70E740481C1C}">
@@ -44,7 +84,7 @@
                         </a:ext>
                       </a:extLst>
                     </a:blip>
-                    <a:srcRect/>
+                    <a:srcRect l="9375" t="9375" r="9375" b="8751"/>
                     <a:stretch>
                       <a:fillRect/>
                     </a:stretch>
@@ -52,7 +92,7 @@
                   <pic:spPr bwMode="auto">
                     <a:xfrm>
                       <a:off x="0" y="0"/>
-                      <a:ext cx="1188720" cy="1188720"/>
+                      <a:ext cx="1238250" cy="1247775"/>
                     </a:xfrm>
                     <a:prstGeom prst="rect">
                       <a:avLst/>
@@ -61,6 +101,11 @@
                     <a:ln>
                       <a:noFill/>
                     </a:ln>
+                    <a:extLst>
+                      <a:ext uri="{53640926-AAD7-44D8-BBD7-CCE9431645EC}">
+                        <a14:shadowObscured xmlns:a14="http://schemas.microsoft.com/office/drawing/2010/main"/>
+                      </a:ext>
+                    </a:extLst>
                   </pic:spPr>
                 </pic:pic>
               </a:graphicData>
@@ -70,27 +115,122 @@
       </w:r>
     </w:p>
     <w:p>
-      <w:pPr>
-        <w:jc w:val="center"/>
-      </w:pPr>
+      <w:r>
+        <w:t xml:space="preserve">{%p </w:t>
+      </w:r>
+      <w:proofErr w:type="spellStart"/>
+      <w:r>
+        <w:t>elif</w:t>
+      </w:r>
+      <w:proofErr w:type="spellEnd"/>
+      <w:r>
+        <w:t xml:space="preserve"> </w:t>
+      </w:r>
+      <w:proofErr w:type="spellStart"/>
+      <w:r>
+        <w:t>tool_ID</w:t>
+      </w:r>
+      <w:proofErr w:type="spellEnd"/>
+      <w:r>
+        <w:t xml:space="preserve"> == “</w:t>
+      </w:r>
+      <w:proofErr w:type="spellStart"/>
+      <w:r>
+        <w:t>JOD_only</w:t>
+      </w:r>
+      <w:proofErr w:type="spellEnd"/>
+      <w:r>
+        <w:t>” %}</w:t>
+      </w:r>
     </w:p>
     <w:p>
       <w:pPr>
         <w:jc w:val="center"/>
       </w:pPr>
+      <w:r>
+        <w:drawing>
+          <wp:inline distT="0" distB="0" distL="0" distR="0" wp14:anchorId="287F5EC1" wp14:editId="26014193">
+            <wp:extent cx="1200150" cy="1200150"/>
+            <wp:effectExtent l="0" t="0" r="0" b="0"/>
+            <wp:docPr id="1585607885" name="Picture 4" descr="Survey QR Code"/>
+            <wp:cNvGraphicFramePr>
+              <a:graphicFrameLocks xmlns:a="http://schemas.openxmlformats.org/drawingml/2006/main" noChangeAspect="1"/>
+            </wp:cNvGraphicFramePr>
+            <a:graphic xmlns:a="http://schemas.openxmlformats.org/drawingml/2006/main">
+              <a:graphicData uri="http://schemas.openxmlformats.org/drawingml/2006/picture">
+                <pic:pic xmlns:pic="http://schemas.openxmlformats.org/drawingml/2006/picture">
+                  <pic:nvPicPr>
+                    <pic:cNvPr id="1585607885" name="Picture 4" descr="Survey QR Code"/>
+                    <pic:cNvPicPr>
+                      <a:picLocks noChangeAspect="1" noChangeArrowheads="1"/>
+                    </pic:cNvPicPr>
+                  </pic:nvPicPr>
+                  <pic:blipFill rotWithShape="1">
+                    <a:blip r:embed="rId8">
+                      <a:extLst>
+                        <a:ext uri="{28A0092B-C50C-407E-A947-70E740481C1C}">
+                          <a14:useLocalDpi xmlns:a14="http://schemas.microsoft.com/office/drawing/2010/main" val="0"/>
+                        </a:ext>
+                      </a:extLst>
+                    </a:blip>
+                    <a:srcRect l="9460" t="9460" r="9460" b="9460"/>
+                    <a:stretch>
+                      <a:fillRect/>
+                    </a:stretch>
+                  </pic:blipFill>
+                  <pic:spPr bwMode="auto">
+                    <a:xfrm>
+                      <a:off x="0" y="0"/>
+                      <a:ext cx="1200150" cy="1200150"/>
+                    </a:xfrm>
+                    <a:prstGeom prst="rect">
+                      <a:avLst/>
+                    </a:prstGeom>
+                    <a:noFill/>
+                    <a:ln>
+                      <a:noFill/>
+                    </a:ln>
+                    <a:extLst>
+                      <a:ext uri="{53640926-AAD7-44D8-BBD7-CCE9431645EC}">
+                        <a14:shadowObscured xmlns:a14="http://schemas.microsoft.com/office/drawing/2010/main"/>
+                      </a:ext>
+                    </a:extLst>
+                  </pic:spPr>
+                </pic:pic>
+              </a:graphicData>
+            </a:graphic>
+          </wp:inline>
+        </w:drawing>
+      </w:r>
     </w:p>
     <w:p>
-      <w:pPr>
-        <w:jc w:val="center"/>
-      </w:pPr>
+      <w:r>
+        <w:t>{%p endif %}</w:t>
+      </w:r>
     </w:p>
     <w:p>
       <w:pPr>
+        <w:jc w:val="center"/>
+      </w:pPr>
+    </w:p>
+    <w:p>
+      <w:pPr>
+        <w:jc w:val="center"/>
+      </w:pPr>
+    </w:p>
+    <w:p>
+      <w:pPr>
+        <w:jc w:val="center"/>
+      </w:pPr>
+    </w:p>
+    <w:p>
+      <w:pPr>
         <w:rPr>
           <w:rFonts w:asciiTheme="minorHAnsi" w:hAnsiTheme="minorHAnsi" w:cstheme="minorHAnsi"/>
           <w:szCs w:val="28"/>
         </w:rPr>
       </w:pPr>
+      <w:proofErr w:type="gramStart"/>
       <w:r>
         <w:rPr>
           <w:rFonts w:cs="Times New Roman"/>
@@ -112,14 +252,40 @@
           <w:noProof/>
           <w:szCs w:val="28"/>
         </w:rPr>
-        <w:t xml:space="preserve">cover_sheet_thanks </w:t>
-      </w:r>
-      <w:r>
-        <w:rPr>
-          <w:rFonts w:asciiTheme="minorHAnsi" w:hAnsiTheme="minorHAnsi" w:cstheme="minorHAnsi"/>
+        <w:t>cover</w:t>
+      </w:r>
+      <w:proofErr w:type="gramEnd"/>
+      <w:r>
+        <w:rPr>
+          <w:rFonts w:asciiTheme="minorHAnsi" w:hAnsiTheme="minorHAnsi" w:cstheme="minorHAnsi"/>
+          <w:noProof/>
           <w:szCs w:val="28"/>
         </w:rPr>
-        <w:t>}}</w:t>
+        <w:t>_sheet_</w:t>
+      </w:r>
+      <w:proofErr w:type="gramStart"/>
+      <w:r>
+        <w:rPr>
+          <w:rFonts w:asciiTheme="minorHAnsi" w:hAnsiTheme="minorHAnsi" w:cstheme="minorHAnsi"/>
+          <w:noProof/>
+          <w:szCs w:val="28"/>
+        </w:rPr>
+        <w:t xml:space="preserve">thanks </w:t>
+      </w:r>
+      <w:r>
+        <w:rPr>
+          <w:rFonts w:asciiTheme="minorHAnsi" w:hAnsiTheme="minorHAnsi" w:cstheme="minorHAnsi"/>
+          <w:szCs w:val="28"/>
+        </w:rPr>
+        <w:t>}</w:t>
+      </w:r>
+      <w:proofErr w:type="gramEnd"/>
+      <w:r>
+        <w:rPr>
+          <w:rFonts w:asciiTheme="minorHAnsi" w:hAnsiTheme="minorHAnsi" w:cstheme="minorHAnsi"/>
+          <w:szCs w:val="28"/>
+        </w:rPr>
+        <w:t>}</w:t>
       </w:r>
     </w:p>
     <w:p>
@@ -134,20 +300,84 @@
           <w:rFonts w:asciiTheme="minorHAnsi" w:hAnsiTheme="minorHAnsi" w:cstheme="minorHAnsi"/>
           <w:szCs w:val="28"/>
         </w:rPr>
-        <w:t xml:space="preserve">{%p if tool_ID == “divorce_complaint” </w:t>
-      </w:r>
+        <w:t xml:space="preserve">{%p if </w:t>
+      </w:r>
+      <w:proofErr w:type="spellStart"/>
       <w:r>
         <w:rPr>
           <w:rFonts w:asciiTheme="minorHAnsi" w:hAnsiTheme="minorHAnsi" w:cstheme="minorHAnsi"/>
           <w:szCs w:val="28"/>
         </w:rPr>
-        <w:t xml:space="preserve">or (tool_ID == “JOD_only” and </w:t>
-      </w:r>
+        <w:t>tool_ID</w:t>
+      </w:r>
+      <w:proofErr w:type="spellEnd"/>
       <w:r>
         <w:rPr>
           <w:rFonts w:asciiTheme="minorHAnsi" w:hAnsiTheme="minorHAnsi" w:cstheme="minorHAnsi"/>
           <w:szCs w:val="28"/>
         </w:rPr>
+        <w:t xml:space="preserve"> == “</w:t>
+      </w:r>
+      <w:proofErr w:type="spellStart"/>
+      <w:r>
+        <w:rPr>
+          <w:rFonts w:asciiTheme="minorHAnsi" w:hAnsiTheme="minorHAnsi" w:cstheme="minorHAnsi"/>
+          <w:szCs w:val="28"/>
+        </w:rPr>
+        <w:t>divorce_complaint</w:t>
+      </w:r>
+      <w:proofErr w:type="spellEnd"/>
+      <w:r>
+        <w:rPr>
+          <w:rFonts w:asciiTheme="minorHAnsi" w:hAnsiTheme="minorHAnsi" w:cstheme="minorHAnsi"/>
+          <w:szCs w:val="28"/>
+        </w:rPr>
+        <w:t xml:space="preserve">” </w:t>
+      </w:r>
+      <w:r>
+        <w:rPr>
+          <w:rFonts w:asciiTheme="minorHAnsi" w:hAnsiTheme="minorHAnsi" w:cstheme="minorHAnsi"/>
+          <w:szCs w:val="28"/>
+        </w:rPr>
+        <w:t>or (</w:t>
+      </w:r>
+      <w:proofErr w:type="spellStart"/>
+      <w:r>
+        <w:rPr>
+          <w:rFonts w:asciiTheme="minorHAnsi" w:hAnsiTheme="minorHAnsi" w:cstheme="minorHAnsi"/>
+          <w:szCs w:val="28"/>
+        </w:rPr>
+        <w:t>tool_ID</w:t>
+      </w:r>
+      <w:proofErr w:type="spellEnd"/>
+      <w:r>
+        <w:rPr>
+          <w:rFonts w:asciiTheme="minorHAnsi" w:hAnsiTheme="minorHAnsi" w:cstheme="minorHAnsi"/>
+          <w:szCs w:val="28"/>
+        </w:rPr>
+        <w:t xml:space="preserve"> == “</w:t>
+      </w:r>
+      <w:proofErr w:type="spellStart"/>
+      <w:r>
+        <w:rPr>
+          <w:rFonts w:asciiTheme="minorHAnsi" w:hAnsiTheme="minorHAnsi" w:cstheme="minorHAnsi"/>
+          <w:szCs w:val="28"/>
+        </w:rPr>
+        <w:t>JOD_only</w:t>
+      </w:r>
+      <w:proofErr w:type="spellEnd"/>
+      <w:r>
+        <w:rPr>
+          <w:rFonts w:asciiTheme="minorHAnsi" w:hAnsiTheme="minorHAnsi" w:cstheme="minorHAnsi"/>
+          <w:szCs w:val="28"/>
+        </w:rPr>
+        <w:t xml:space="preserve">” and </w:t>
+      </w:r>
+      <w:r>
+        <w:rPr>
+          <w:rFonts w:asciiTheme="minorHAnsi" w:hAnsiTheme="minorHAnsi" w:cstheme="minorHAnsi"/>
+          <w:szCs w:val="28"/>
+        </w:rPr>
         <w:t>(</w:t>
       </w:r>
       <w:r>
@@ -155,26 +385,81 @@
           <w:rFonts w:asciiTheme="minorHAnsi" w:hAnsiTheme="minorHAnsi" w:cstheme="minorHAnsi"/>
           <w:szCs w:val="28"/>
         </w:rPr>
-        <w:t>(marriage.have_pension_retirement and not marriage.pension_retirement_accounts_keep_own) or (</w:t>
-      </w:r>
-      <w:r>
-        <w:rPr>
-          <w:rFonts w:asciiTheme="minorHAnsi" w:hAnsiTheme="minorHAnsi" w:cstheme="minorHAnsi"/>
-        </w:rPr>
-        <w:t>marriage.personal_property_need_items and marriage.accounts.filter(trigger_investment_reminder=True) | length &gt; 0</w:t>
-      </w:r>
+        <w:t>(</w:t>
+      </w:r>
+      <w:proofErr w:type="spellStart"/>
       <w:r>
         <w:rPr>
           <w:rFonts w:asciiTheme="minorHAnsi" w:hAnsiTheme="minorHAnsi" w:cstheme="minorHAnsi"/>
           <w:szCs w:val="28"/>
         </w:rPr>
+        <w:t>marriage.have_pension_retirement</w:t>
+      </w:r>
+      <w:proofErr w:type="spellEnd"/>
+      <w:r>
+        <w:rPr>
+          <w:rFonts w:asciiTheme="minorHAnsi" w:hAnsiTheme="minorHAnsi" w:cstheme="minorHAnsi"/>
+          <w:szCs w:val="28"/>
+        </w:rPr>
+        <w:t xml:space="preserve"> and not </w:t>
+      </w:r>
+      <w:proofErr w:type="spellStart"/>
+      <w:r>
+        <w:rPr>
+          <w:rFonts w:asciiTheme="minorHAnsi" w:hAnsiTheme="minorHAnsi" w:cstheme="minorHAnsi"/>
+          <w:szCs w:val="28"/>
+        </w:rPr>
+        <w:t>marriage.pension_retirement_accounts_keep_own</w:t>
+      </w:r>
+      <w:proofErr w:type="spellEnd"/>
+      <w:r>
+        <w:rPr>
+          <w:rFonts w:asciiTheme="minorHAnsi" w:hAnsiTheme="minorHAnsi" w:cstheme="minorHAnsi"/>
+          <w:szCs w:val="28"/>
+        </w:rPr>
         <w:t>) or (</w:t>
       </w:r>
-      <w:r>
-        <w:rPr>
-          <w:rFonts w:asciiTheme="minorHAnsi" w:hAnsiTheme="minorHAnsi" w:cstheme="minorHAnsi"/>
-        </w:rPr>
-        <w:t>there_are_marital_children and children.filter(legal_parent="both").filter(revoke_paternity_reminder=True) | length &gt; 0</w:t>
+      <w:proofErr w:type="spellStart"/>
+      <w:r>
+        <w:rPr>
+          <w:rFonts w:asciiTheme="minorHAnsi" w:hAnsiTheme="minorHAnsi" w:cstheme="minorHAnsi"/>
+        </w:rPr>
+        <w:t>marriage.personal_property_need_items</w:t>
+      </w:r>
+      <w:proofErr w:type="spellEnd"/>
+      <w:r>
+        <w:rPr>
+          <w:rFonts w:asciiTheme="minorHAnsi" w:hAnsiTheme="minorHAnsi" w:cstheme="minorHAnsi"/>
+        </w:rPr>
+        <w:t xml:space="preserve"> and </w:t>
+      </w:r>
+      <w:proofErr w:type="spellStart"/>
+      <w:r>
+        <w:rPr>
+          <w:rFonts w:asciiTheme="minorHAnsi" w:hAnsiTheme="minorHAnsi" w:cstheme="minorHAnsi"/>
+        </w:rPr>
+        <w:t>marriage.accounts.filter</w:t>
+      </w:r>
+      <w:proofErr w:type="spellEnd"/>
+      <w:r>
+        <w:rPr>
+          <w:rFonts w:asciiTheme="minorHAnsi" w:hAnsiTheme="minorHAnsi" w:cstheme="minorHAnsi"/>
+        </w:rPr>
+        <w:t>(</w:t>
+      </w:r>
+      <w:proofErr w:type="spellStart"/>
+      <w:r>
+        <w:rPr>
+          <w:rFonts w:asciiTheme="minorHAnsi" w:hAnsiTheme="minorHAnsi" w:cstheme="minorHAnsi"/>
+        </w:rPr>
+        <w:t>trigger_investment_reminder</w:t>
+      </w:r>
+      <w:proofErr w:type="spellEnd"/>
+      <w:r>
+        <w:rPr>
+          <w:rFonts w:asciiTheme="minorHAnsi" w:hAnsiTheme="minorHAnsi" w:cstheme="minorHAnsi"/>
+        </w:rPr>
+        <w:t>=True) | length &gt; 0</w:t>
       </w:r>
       <w:r>
         <w:rPr>
@@ -183,12 +468,49 @@
         </w:rPr>
         <w:t>) or (</w:t>
       </w:r>
-      <w:r>
-        <w:rPr>
-          <w:rFonts w:asciiTheme="minorHAnsi" w:hAnsiTheme="minorHAnsi" w:cstheme="minorHAnsi"/>
-        </w:rPr>
-        <w:t>there_are_marital_children and not MI_has_jurisdiction_all_kids</w:t>
-      </w:r>
+      <w:proofErr w:type="spellStart"/>
+      <w:r>
+        <w:rPr>
+          <w:rFonts w:asciiTheme="minorHAnsi" w:hAnsiTheme="minorHAnsi" w:cstheme="minorHAnsi"/>
+        </w:rPr>
+        <w:t>there_are_marital_children</w:t>
+      </w:r>
+      <w:proofErr w:type="spellEnd"/>
+      <w:r>
+        <w:rPr>
+          <w:rFonts w:asciiTheme="minorHAnsi" w:hAnsiTheme="minorHAnsi" w:cstheme="minorHAnsi"/>
+        </w:rPr>
+        <w:t xml:space="preserve"> and children.filter(legal_parent="both").filter(revoke_paternity_reminder=True) | length &gt; 0</w:t>
+      </w:r>
+      <w:r>
+        <w:rPr>
+          <w:rFonts w:asciiTheme="minorHAnsi" w:hAnsiTheme="minorHAnsi" w:cstheme="minorHAnsi"/>
+          <w:szCs w:val="28"/>
+        </w:rPr>
+        <w:t>) or (</w:t>
+      </w:r>
+      <w:proofErr w:type="spellStart"/>
+      <w:r>
+        <w:rPr>
+          <w:rFonts w:asciiTheme="minorHAnsi" w:hAnsiTheme="minorHAnsi" w:cstheme="minorHAnsi"/>
+        </w:rPr>
+        <w:t>there_are_marital_children</w:t>
+      </w:r>
+      <w:proofErr w:type="spellEnd"/>
+      <w:r>
+        <w:rPr>
+          <w:rFonts w:asciiTheme="minorHAnsi" w:hAnsiTheme="minorHAnsi" w:cstheme="minorHAnsi"/>
+        </w:rPr>
+        <w:t xml:space="preserve"> and not </w:t>
+      </w:r>
+      <w:proofErr w:type="spellStart"/>
+      <w:r>
+        <w:rPr>
+          <w:rFonts w:asciiTheme="minorHAnsi" w:hAnsiTheme="minorHAnsi" w:cstheme="minorHAnsi"/>
+        </w:rPr>
+        <w:t>MI_has_jurisdiction_all_kids</w:t>
+      </w:r>
+      <w:proofErr w:type="spellEnd"/>
       <w:r>
         <w:rPr>
           <w:rFonts w:asciiTheme="minorHAnsi" w:hAnsiTheme="minorHAnsi" w:cstheme="minorHAnsi"/>
@@ -245,7 +567,49 @@
           <w:rFonts w:asciiTheme="minorHAnsi" w:hAnsiTheme="minorHAnsi" w:cstheme="minorHAnsi"/>
         </w:rPr>
         <w:lastRenderedPageBreak/>
-        <w:t>{{p include_docx_template(‘reminders_template.docx’) }}</w:t>
+        <w:t xml:space="preserve">{{p </w:t>
+      </w:r>
+      <w:proofErr w:type="spellStart"/>
+      <w:r>
+        <w:rPr>
+          <w:rFonts w:asciiTheme="minorHAnsi" w:hAnsiTheme="minorHAnsi" w:cstheme="minorHAnsi"/>
+        </w:rPr>
+        <w:t>include_docx_</w:t>
+      </w:r>
+      <w:proofErr w:type="gramStart"/>
+      <w:r>
+        <w:rPr>
+          <w:rFonts w:asciiTheme="minorHAnsi" w:hAnsiTheme="minorHAnsi" w:cstheme="minorHAnsi"/>
+        </w:rPr>
+        <w:t>template</w:t>
+      </w:r>
+      <w:proofErr w:type="spellEnd"/>
+      <w:r>
+        <w:rPr>
+          <w:rFonts w:asciiTheme="minorHAnsi" w:hAnsiTheme="minorHAnsi" w:cstheme="minorHAnsi"/>
+        </w:rPr>
+        <w:t>(‘</w:t>
+      </w:r>
+      <w:proofErr w:type="gramEnd"/>
+      <w:r>
+        <w:rPr>
+          <w:rFonts w:asciiTheme="minorHAnsi" w:hAnsiTheme="minorHAnsi" w:cstheme="minorHAnsi"/>
+        </w:rPr>
+        <w:t>reminders_template.docx’</w:t>
+      </w:r>
+      <w:proofErr w:type="gramStart"/>
+      <w:r>
+        <w:rPr>
+          <w:rFonts w:asciiTheme="minorHAnsi" w:hAnsiTheme="minorHAnsi" w:cstheme="minorHAnsi"/>
+        </w:rPr>
+        <w:t>) }</w:t>
+      </w:r>
+      <w:proofErr w:type="gramEnd"/>
+      <w:r>
+        <w:rPr>
+          <w:rFonts w:asciiTheme="minorHAnsi" w:hAnsiTheme="minorHAnsi" w:cstheme="minorHAnsi"/>
+        </w:rPr>
+        <w:t>}</w:t>
       </w:r>
     </w:p>
     <w:p>
@@ -259,8 +623,16 @@
         <w:rPr>
           <w:rFonts w:asciiTheme="minorHAnsi" w:hAnsiTheme="minorHAnsi" w:cstheme="minorHAnsi"/>
         </w:rPr>
-        <w:t>{%p endif %}</w:t>
-      </w:r>
+        <w:t xml:space="preserve">{%p </w:t>
+      </w:r>
+      <w:proofErr w:type="gramStart"/>
+      <w:r>
+        <w:rPr>
+          <w:rFonts w:asciiTheme="minorHAnsi" w:hAnsiTheme="minorHAnsi" w:cstheme="minorHAnsi"/>
+        </w:rPr>
+        <w:t>endif %}</w:t>
+      </w:r>
+      <w:proofErr w:type="gramEnd"/>
     </w:p>
     <w:p>
       <w:pPr>
@@ -273,8 +645,38 @@
         <w:rPr>
           <w:rFonts w:asciiTheme="minorHAnsi" w:hAnsiTheme="minorHAnsi" w:cstheme="minorHAnsi"/>
         </w:rPr>
-        <w:t>{%p if tool_ID == "divorce_complaint" %}</w:t>
-      </w:r>
+        <w:t xml:space="preserve">{%p if </w:t>
+      </w:r>
+      <w:proofErr w:type="spellStart"/>
+      <w:r>
+        <w:rPr>
+          <w:rFonts w:asciiTheme="minorHAnsi" w:hAnsiTheme="minorHAnsi" w:cstheme="minorHAnsi"/>
+        </w:rPr>
+        <w:t>tool_ID</w:t>
+      </w:r>
+      <w:proofErr w:type="spellEnd"/>
+      <w:r>
+        <w:rPr>
+          <w:rFonts w:asciiTheme="minorHAnsi" w:hAnsiTheme="minorHAnsi" w:cstheme="minorHAnsi"/>
+        </w:rPr>
+        <w:t xml:space="preserve"> == "</w:t>
+      </w:r>
+      <w:proofErr w:type="spellStart"/>
+      <w:r>
+        <w:rPr>
+          <w:rFonts w:asciiTheme="minorHAnsi" w:hAnsiTheme="minorHAnsi" w:cstheme="minorHAnsi"/>
+        </w:rPr>
+        <w:t>divorce_complaint</w:t>
+      </w:r>
+      <w:proofErr w:type="spellEnd"/>
+      <w:proofErr w:type="gramStart"/>
+      <w:r>
+        <w:rPr>
+          <w:rFonts w:asciiTheme="minorHAnsi" w:hAnsiTheme="minorHAnsi" w:cstheme="minorHAnsi"/>
+        </w:rPr>
+        <w:t>" %}</w:t>
+      </w:r>
+      <w:proofErr w:type="gramEnd"/>
     </w:p>
     <w:p>
       <w:r>
@@ -289,32 +691,65 @@
         <w:lastRenderedPageBreak/>
         <w:t xml:space="preserve">{% if </w:t>
       </w:r>
-      <w:r>
-        <w:t>tool_ID == "divorce_complaint</w:t>
-      </w:r>
+      <w:proofErr w:type="spellStart"/>
+      <w:r>
+        <w:t>tool_ID</w:t>
+      </w:r>
+      <w:proofErr w:type="spellEnd"/>
+      <w:r>
+        <w:t xml:space="preserve"> == "</w:t>
+      </w:r>
+      <w:proofErr w:type="spellStart"/>
+      <w:r>
+        <w:t>divorce_complaint</w:t>
+      </w:r>
+      <w:proofErr w:type="spellEnd"/>
       <w:r>
         <w:t xml:space="preserve">" </w:t>
       </w:r>
       <w:r>
         <w:t xml:space="preserve">and </w:t>
       </w:r>
-      <w:r>
-        <w:t xml:space="preserve">there_are_marital_children </w:t>
+      <w:proofErr w:type="spellStart"/>
+      <w:r>
+        <w:t>there_are_marital_</w:t>
+      </w:r>
+      <w:proofErr w:type="gramStart"/>
+      <w:r>
+        <w:t>children</w:t>
+      </w:r>
+      <w:proofErr w:type="spellEnd"/>
+      <w:r>
+        <w:t xml:space="preserve"> </w:t>
       </w:r>
       <w:r>
         <w:t>%}</w:t>
       </w:r>
+      <w:proofErr w:type="gramEnd"/>
     </w:p>
     <w:p>
       <w:pPr>
         <w:pStyle w:val="Normalforinsertedinstructions"/>
       </w:pPr>
       <w:r>
-        <w:t>{{p include_docx_template(</w:t>
+        <w:t xml:space="preserve">{{p </w:t>
+      </w:r>
+      <w:proofErr w:type="spellStart"/>
+      <w:r>
+        <w:t>include_docx_</w:t>
+      </w:r>
+      <w:proofErr w:type="gramStart"/>
+      <w:r>
+        <w:t>template</w:t>
+      </w:r>
+      <w:proofErr w:type="spellEnd"/>
+      <w:r>
+        <w:t>(</w:t>
       </w:r>
       <w:r>
         <w:t>‘</w:t>
       </w:r>
+      <w:proofErr w:type="gramEnd"/>
       <w:r>
         <w:t>instructions_divorce_with_children</w:t>
       </w:r>
@@ -324,8 +759,13 @@
       <w:r>
         <w:t>’</w:t>
       </w:r>
-      <w:r>
-        <w:t>) }}</w:t>
+      <w:proofErr w:type="gramStart"/>
+      <w:r>
+        <w:t>) }</w:t>
+      </w:r>
+      <w:proofErr w:type="gramEnd"/>
+      <w:r>
+        <w:t>}</w:t>
       </w:r>
     </w:p>
     <w:p>
@@ -333,37 +773,70 @@
         <w:pStyle w:val="Normalforinsertedinstructions"/>
       </w:pPr>
       <w:r>
-        <w:t>{% elif tool_ID == "</w:t>
-      </w:r>
+        <w:t xml:space="preserve">{% </w:t>
+      </w:r>
+      <w:proofErr w:type="spellStart"/>
+      <w:r>
+        <w:t>elif</w:t>
+      </w:r>
+      <w:proofErr w:type="spellEnd"/>
+      <w:r>
+        <w:t xml:space="preserve"> </w:t>
+      </w:r>
+      <w:proofErr w:type="spellStart"/>
+      <w:r>
+        <w:t>tool_ID</w:t>
+      </w:r>
+      <w:proofErr w:type="spellEnd"/>
+      <w:r>
+        <w:t xml:space="preserve"> == "</w:t>
+      </w:r>
+      <w:proofErr w:type="spellStart"/>
       <w:r>
         <w:t>divorce_</w:t>
       </w:r>
       <w:r>
         <w:t>complaint</w:t>
       </w:r>
+      <w:proofErr w:type="spellEnd"/>
       <w:r>
         <w:t xml:space="preserve">" </w:t>
       </w:r>
       <w:r>
         <w:t xml:space="preserve">and not </w:t>
       </w:r>
-      <w:r>
-        <w:t xml:space="preserve">there_are_marital_children </w:t>
+      <w:proofErr w:type="spellStart"/>
+      <w:r>
+        <w:t>there_are_marital_</w:t>
+      </w:r>
+      <w:proofErr w:type="gramStart"/>
+      <w:r>
+        <w:t>children</w:t>
+      </w:r>
+      <w:proofErr w:type="spellEnd"/>
+      <w:r>
+        <w:t xml:space="preserve"> </w:t>
       </w:r>
       <w:r>
         <w:t>%}</w:t>
       </w:r>
+      <w:proofErr w:type="gramEnd"/>
     </w:p>
     <w:p>
       <w:pPr>
         <w:pStyle w:val="Normalforinsertedinstructions"/>
       </w:pPr>
       <w:r>
-        <w:t>{{p include_docx_template(</w:t>
+        <w:t>{{p include_docx_</w:t>
+      </w:r>
+      <w:proofErr w:type="gramStart"/>
+      <w:r>
+        <w:t>template(</w:t>
       </w:r>
       <w:r>
         <w:t>‘</w:t>
       </w:r>
+      <w:proofErr w:type="gramEnd"/>
       <w:r>
         <w:t>instructions_divorce_with</w:t>
       </w:r>
@@ -379,8 +852,13 @@
       <w:r>
         <w:t>’</w:t>
       </w:r>
-      <w:r>
-        <w:t>) }}</w:t>
+      <w:proofErr w:type="gramStart"/>
+      <w:r>
+        <w:t>) }</w:t>
+      </w:r>
+      <w:proofErr w:type="gramEnd"/>
+      <w:r>
+        <w:t>}</w:t>
       </w:r>
     </w:p>
     <w:p>
@@ -396,15 +874,28 @@
         <w:pStyle w:val="Normalforinsertedinstructions"/>
       </w:pPr>
       <w:r>
-        <w:t>{%p endif %}</w:t>
-      </w:r>
+        <w:t xml:space="preserve">{%p </w:t>
+      </w:r>
+      <w:proofErr w:type="gramStart"/>
+      <w:r>
+        <w:t>endif %}</w:t>
+      </w:r>
+      <w:proofErr w:type="gramEnd"/>
     </w:p>
     <w:p>
       <w:pPr>
         <w:pStyle w:val="Normalforinsertedinstructions"/>
       </w:pPr>
       <w:r>
-        <w:t>{%p if user_ask_role == “plaintiff” %}</w:t>
+        <w:t xml:space="preserve">{%p if </w:t>
+      </w:r>
+      <w:proofErr w:type="spellStart"/>
+      <w:r>
+        <w:t>user_ask_role</w:t>
+      </w:r>
+      <w:proofErr w:type="spellEnd"/>
+      <w:r>
+        <w:t xml:space="preserve"> == “plaintiff” %}</w:t>
       </w:r>
     </w:p>
     <w:p>
@@ -418,19 +909,37 @@
       </w:pPr>
       <w:r>
         <w:lastRenderedPageBreak/>
-        <w:t>{{p include_docx_template(</w:t>
+        <w:t xml:space="preserve">{{p </w:t>
+      </w:r>
+      <w:proofErr w:type="spellStart"/>
+      <w:r>
+        <w:t>include_docx_</w:t>
+      </w:r>
+      <w:proofErr w:type="gramStart"/>
+      <w:r>
+        <w:t>template</w:t>
+      </w:r>
+      <w:proofErr w:type="spellEnd"/>
+      <w:r>
+        <w:t>(</w:t>
       </w:r>
       <w:r>
         <w:t>‘</w:t>
       </w:r>
+      <w:proofErr w:type="gramEnd"/>
       <w:r>
         <w:t>testimony_script.docx</w:t>
       </w:r>
       <w:r>
         <w:t>’</w:t>
       </w:r>
-      <w:r>
-        <w:t>) }}</w:t>
+      <w:proofErr w:type="gramStart"/>
+      <w:r>
+        <w:t>) }</w:t>
+      </w:r>
+      <w:proofErr w:type="gramEnd"/>
+      <w:r>
+        <w:t>}</w:t>
       </w:r>
     </w:p>
     <w:p>
@@ -438,8 +947,13 @@
         <w:pStyle w:val="Normalforinsertedinstructions"/>
       </w:pPr>
       <w:r>
-        <w:t>{%p endif %}</w:t>
-      </w:r>
+        <w:t xml:space="preserve">{%p </w:t>
+      </w:r>
+      <w:proofErr w:type="gramStart"/>
+      <w:r>
+        <w:t>endif %}</w:t>
+      </w:r>
+      <w:proofErr w:type="gramEnd"/>
     </w:p>
     <w:sectPr>
       <w:type w:val="continuous"/>
@@ -2637,7 +3151,6 @@
   <w:style w:type="character" w:default="1" w:styleId="DefaultParagraphFont">
     <w:name w:val="Default Paragraph Font"/>
     <w:uiPriority w:val="1"/>
-    <w:semiHidden/>
     <w:unhideWhenUsed/>
   </w:style>
   <w:style w:type="table" w:default="1" w:styleId="TableNormal">
@@ -3169,28 +3682,28 @@
 </file>
 
 <file path=customXml/item1.xml><?xml version="1.0" encoding="utf-8"?>
+<b:Sources xmlns:b="http://schemas.openxmlformats.org/officeDocument/2006/bibliography" xmlns="http://schemas.openxmlformats.org/officeDocument/2006/bibliography" SelectedStyle="\APASixthEditionOfficeOnline.xsl" StyleName="APA" Version="6"/>
+</file>
+
+<file path=customXml/item2.xml><?xml version="1.0" encoding="utf-8"?>
 <go:gDocsCustomXmlDataStorage xmlns:go="http://customooxmlschemas.google.com/" xmlns:r="http://schemas.openxmlformats.org/officeDocument/2006/relationships" uri="GoogleDocsCustomDataVersion2">
   <go:docsCustomData xmlns:go="http://customooxmlschemas.google.com/" roundtripDataSignature="AMtx7mjac1FaFv6WV3g0GhcUIQ9kG0o+yg==">CgMxLjAyDmgubjh0aHd2ZHFzMTk0MghoLmdqZGd4czIOaC56N2hubnB1aWk1NDkyDWguc3hkdG9pMzhvYmkyDmguNWY0ZXAwcWVlOXRlMg5oLmVqdDhyOXF0bXp6djIOaC4yOWpnN3o3Y2I3bGIyDmguanM4cTNwM3I0eDZjMg5oLnYzbTFuaXhkbzBwejIOaC5wZzd4dGp6Y2t3dWkyDmgueTE0MHhvdmdnYml0Mg5oLjRocjAxMWhrOXVyNjIOaC5xMTI4N2VvNmMyd24yDmguODY5YjBrbWEwNmtsMg5oLm1hczdybXljNW82ejgAciExV3BDbUx3RGV0a2poVzFWLUZiZXdyanhaTmV2Wm8tWm0=</go:docsCustomData>
 </go:gDocsCustomXmlDataStorage>
 </file>
 
-<file path=customXml/item2.xml><?xml version="1.0" encoding="utf-8"?>
-<b:Sources xmlns:b="http://schemas.openxmlformats.org/officeDocument/2006/bibliography" xmlns="http://schemas.openxmlformats.org/officeDocument/2006/bibliography" SelectedStyle="\APASixthEditionOfficeOnline.xsl" StyleName="APA" Version="6"/>
+<file path=customXml/itemProps1.xml><?xml version="1.0" encoding="utf-8"?>
+<ds:datastoreItem xmlns:ds="http://schemas.openxmlformats.org/officeDocument/2006/customXml" ds:itemID="{8F2F8F94-3641-4302-9FBE-E8DCF2DF547A}">
+  <ds:schemaRefs>
+    <ds:schemaRef ds:uri="http://schemas.openxmlformats.org/officeDocument/2006/bibliography"/>
+  </ds:schemaRefs>
+</ds:datastoreItem>
 </file>
 
-<file path=customXml/itemProps1.xml><?xml version="1.0" encoding="utf-8"?>
+<file path=customXml/itemProps2.xml><?xml version="1.0" encoding="utf-8"?>
 <ds:datastoreItem xmlns:ds="http://schemas.openxmlformats.org/officeDocument/2006/customXml" ds:itemID="{11111111-1234-1234-1234-123412341234}">
   <ds:schemaRefs>
     <ds:schemaRef ds:uri="http://customooxmlschemas.google.com/"/>
     <ds:schemaRef ds:uri="http://schemas.openxmlformats.org/officeDocument/2006/relationships"/>
   </ds:schemaRefs>
 </ds:datastoreItem>
-</file>
-
-<file path=customXml/itemProps2.xml><?xml version="1.0" encoding="utf-8"?>
-<ds:datastoreItem xmlns:ds="http://schemas.openxmlformats.org/officeDocument/2006/customXml" ds:itemID="{8F2F8F94-3641-4302-9FBE-E8DCF2DF547A}">
-  <ds:schemaRefs>
-    <ds:schemaRef ds:uri="http://schemas.openxmlformats.org/officeDocument/2006/bibliography"/>
-  </ds:schemaRefs>
-</ds:datastoreItem>
 </file>
</xml_diff>

<commit_message>
fix bugs, adjust output
</commit_message>
<xml_diff>
--- a/docassemble/MLHDivorceAndCustody/data/templates/instructions.docx
+++ b/docassemble/MLHDivorceAndCustody/data/templates/instructions.docx
@@ -148,6 +148,9 @@
         <w:jc w:val="center"/>
       </w:pPr>
       <w:r>
+        <w:rPr>
+          <w:noProof/>
+        </w:rPr>
         <w:drawing>
           <wp:inline distT="0" distB="0" distL="0" distR="0" wp14:anchorId="287F5EC1" wp14:editId="26014193">
             <wp:extent cx="1200150" cy="1200150"/>
@@ -480,7 +483,49 @@
         <w:rPr>
           <w:rFonts w:asciiTheme="minorHAnsi" w:hAnsiTheme="minorHAnsi" w:cstheme="minorHAnsi"/>
         </w:rPr>
-        <w:t xml:space="preserve"> and children.filter(legal_parent="both").filter(revoke_paternity_reminder=True) | length &gt; 0</w:t>
+        <w:t xml:space="preserve"> and (</w:t>
+      </w:r>
+      <w:proofErr w:type="spellStart"/>
+      <w:r>
+        <w:rPr>
+          <w:rFonts w:asciiTheme="minorHAnsi" w:hAnsiTheme="minorHAnsi" w:cstheme="minorHAnsi"/>
+        </w:rPr>
+        <w:t>parentage_affidavit_revoke</w:t>
+      </w:r>
+      <w:proofErr w:type="spellEnd"/>
+      <w:r>
+        <w:rPr>
+          <w:rFonts w:asciiTheme="minorHAnsi" w:hAnsiTheme="minorHAnsi" w:cstheme="minorHAnsi"/>
+        </w:rPr>
+        <w:t xml:space="preserve"> or </w:t>
+      </w:r>
+      <w:proofErr w:type="spellStart"/>
+      <w:r>
+        <w:rPr>
+          <w:rFonts w:asciiTheme="minorHAnsi" w:hAnsiTheme="minorHAnsi" w:cstheme="minorHAnsi"/>
+        </w:rPr>
+        <w:t>parentage_order_revoke</w:t>
+      </w:r>
+      <w:proofErr w:type="spellEnd"/>
+      <w:r>
+        <w:rPr>
+          <w:rFonts w:asciiTheme="minorHAnsi" w:hAnsiTheme="minorHAnsi" w:cstheme="minorHAnsi"/>
+        </w:rPr>
+        <w:t xml:space="preserve"> or </w:t>
+      </w:r>
+      <w:proofErr w:type="spellStart"/>
+      <w:r>
+        <w:rPr>
+          <w:rFonts w:asciiTheme="minorHAnsi" w:hAnsiTheme="minorHAnsi" w:cstheme="minorHAnsi"/>
+        </w:rPr>
+        <w:t>parentage_marital_revoke</w:t>
+      </w:r>
+      <w:proofErr w:type="spellEnd"/>
+      <w:r>
+        <w:rPr>
+          <w:rFonts w:asciiTheme="minorHAnsi" w:hAnsiTheme="minorHAnsi" w:cstheme="minorHAnsi"/>
+        </w:rPr>
+        <w:t>)</w:t>
       </w:r>
       <w:r>
         <w:rPr>
@@ -3151,6 +3196,7 @@
   <w:style w:type="character" w:default="1" w:styleId="DefaultParagraphFont">
     <w:name w:val="Default Paragraph Font"/>
     <w:uiPriority w:val="1"/>
+    <w:semiHidden/>
     <w:unhideWhenUsed/>
   </w:style>
   <w:style w:type="table" w:default="1" w:styleId="TableNormal">
@@ -3682,28 +3728,28 @@
 </file>
 
 <file path=customXml/item1.xml><?xml version="1.0" encoding="utf-8"?>
-<b:Sources xmlns:b="http://schemas.openxmlformats.org/officeDocument/2006/bibliography" xmlns="http://schemas.openxmlformats.org/officeDocument/2006/bibliography" SelectedStyle="\APASixthEditionOfficeOnline.xsl" StyleName="APA" Version="6"/>
-</file>
-
-<file path=customXml/item2.xml><?xml version="1.0" encoding="utf-8"?>
 <go:gDocsCustomXmlDataStorage xmlns:go="http://customooxmlschemas.google.com/" xmlns:r="http://schemas.openxmlformats.org/officeDocument/2006/relationships" uri="GoogleDocsCustomDataVersion2">
   <go:docsCustomData xmlns:go="http://customooxmlschemas.google.com/" roundtripDataSignature="AMtx7mjac1FaFv6WV3g0GhcUIQ9kG0o+yg==">CgMxLjAyDmgubjh0aHd2ZHFzMTk0MghoLmdqZGd4czIOaC56N2hubnB1aWk1NDkyDWguc3hkdG9pMzhvYmkyDmguNWY0ZXAwcWVlOXRlMg5oLmVqdDhyOXF0bXp6djIOaC4yOWpnN3o3Y2I3bGIyDmguanM4cTNwM3I0eDZjMg5oLnYzbTFuaXhkbzBwejIOaC5wZzd4dGp6Y2t3dWkyDmgueTE0MHhvdmdnYml0Mg5oLjRocjAxMWhrOXVyNjIOaC5xMTI4N2VvNmMyd24yDmguODY5YjBrbWEwNmtsMg5oLm1hczdybXljNW82ejgAciExV3BDbUx3RGV0a2poVzFWLUZiZXdyanhaTmV2Wm8tWm0=</go:docsCustomData>
 </go:gDocsCustomXmlDataStorage>
 </file>
 
-<file path=customXml/itemProps1.xml><?xml version="1.0" encoding="utf-8"?>
-<ds:datastoreItem xmlns:ds="http://schemas.openxmlformats.org/officeDocument/2006/customXml" ds:itemID="{8F2F8F94-3641-4302-9FBE-E8DCF2DF547A}">
-  <ds:schemaRefs>
-    <ds:schemaRef ds:uri="http://schemas.openxmlformats.org/officeDocument/2006/bibliography"/>
-  </ds:schemaRefs>
-</ds:datastoreItem>
+<file path=customXml/item2.xml><?xml version="1.0" encoding="utf-8"?>
+<b:Sources xmlns:b="http://schemas.openxmlformats.org/officeDocument/2006/bibliography" xmlns="http://schemas.openxmlformats.org/officeDocument/2006/bibliography" SelectedStyle="\APASixthEditionOfficeOnline.xsl" StyleName="APA" Version="6"/>
 </file>
 
-<file path=customXml/itemProps2.xml><?xml version="1.0" encoding="utf-8"?>
+<file path=customXml/itemProps1.xml><?xml version="1.0" encoding="utf-8"?>
 <ds:datastoreItem xmlns:ds="http://schemas.openxmlformats.org/officeDocument/2006/customXml" ds:itemID="{11111111-1234-1234-1234-123412341234}">
   <ds:schemaRefs>
     <ds:schemaRef ds:uri="http://customooxmlschemas.google.com/"/>
     <ds:schemaRef ds:uri="http://schemas.openxmlformats.org/officeDocument/2006/relationships"/>
   </ds:schemaRefs>
 </ds:datastoreItem>
+</file>
+
+<file path=customXml/itemProps2.xml><?xml version="1.0" encoding="utf-8"?>
+<ds:datastoreItem xmlns:ds="http://schemas.openxmlformats.org/officeDocument/2006/customXml" ds:itemID="{8F2F8F94-3641-4302-9FBE-E8DCF2DF547A}">
+  <ds:schemaRefs>
+    <ds:schemaRef ds:uri="http://schemas.openxmlformats.org/officeDocument/2006/bibliography"/>
+  </ds:schemaRefs>
+</ds:datastoreItem>
 </file>
</xml_diff>

<commit_message>
implement divorce answer instructions
</commit_message>
<xml_diff>
--- a/docassemble/MLHDivorceAndCustody/data/templates/instructions.docx
+++ b/docassemble/MLHDivorceAndCustody/data/templates/instructions.docx
@@ -1,6 +1,6 @@
 
 <file path=word/document.xml><?xml version="1.0" encoding="utf-8"?>
-<w:document xmlns:wpc="http://schemas.microsoft.com/office/word/2010/wordprocessingCanvas" xmlns:cx="http://schemas.microsoft.com/office/drawing/2014/chartex" xmlns:cx1="http://schemas.microsoft.com/office/drawing/2015/9/8/chartex" xmlns:cx2="http://schemas.microsoft.com/office/drawing/2015/10/21/chartex" xmlns:cx3="http://schemas.microsoft.com/office/drawing/2016/5/9/chartex" xmlns:cx4="http://schemas.microsoft.com/office/drawing/2016/5/10/chartex" xmlns:cx5="http://schemas.microsoft.com/office/drawing/2016/5/11/chartex" xmlns:cx6="http://schemas.microsoft.com/office/drawing/2016/5/12/chartex" xmlns:cx7="http://schemas.microsoft.com/office/drawing/2016/5/13/chartex" xmlns:cx8="http://schemas.microsoft.com/office/drawing/2016/5/14/chartex" xmlns:mc="http://schemas.openxmlformats.org/markup-compatibility/2006" xmlns:aink="http://schemas.microsoft.com/office/drawing/2016/ink" xmlns:am3d="http://schemas.microsoft.com/office/drawing/2017/model3d" xmlns:o="urn:schemas-microsoft-com:office:office" xmlns:oel="http://schemas.microsoft.com/office/2019/extlst" xmlns:r="http://schemas.openxmlformats.org/officeDocument/2006/relationships" xmlns:m="http://schemas.openxmlformats.org/officeDocument/2006/math" xmlns:v="urn:schemas-microsoft-com:vml" xmlns:wp14="http://schemas.microsoft.com/office/word/2010/wordprocessingDrawing" xmlns:wp="http://schemas.openxmlformats.org/drawingml/2006/wordprocessingDrawing" xmlns:w10="urn:schemas-microsoft-com:office:word" xmlns:w="http://schemas.openxmlformats.org/wordprocessingml/2006/main" xmlns:w14="http://schemas.microsoft.com/office/word/2010/wordml" xmlns:w15="http://schemas.microsoft.com/office/word/2012/wordml" xmlns:w16cex="http://schemas.microsoft.com/office/word/2018/wordml/cex" xmlns:w16cid="http://schemas.microsoft.com/office/word/2016/wordml/cid" xmlns:w16="http://schemas.microsoft.com/office/word/2018/wordml" xmlns:w16du="http://schemas.microsoft.com/office/word/2023/wordml/word16du" xmlns:w16sdtdh="http://schemas.microsoft.com/office/word/2020/wordml/sdtdatahash" xmlns:w16sdtfl="http://schemas.microsoft.com/office/word/2024/wordml/sdtformatlock" xmlns:w16se="http://schemas.microsoft.com/office/word/2015/wordml/symex" xmlns:wpg="http://schemas.microsoft.com/office/word/2010/wordprocessingGroup" xmlns:wpi="http://schemas.microsoft.com/office/word/2010/wordprocessingInk" xmlns:wne="http://schemas.microsoft.com/office/word/2006/wordml" xmlns:wps="http://schemas.microsoft.com/office/word/2010/wordprocessingShape" mc:Ignorable="w14 w15 w16se w16cid w16 w16cex w16sdtdh w16sdtfl w16du wp14">
+<w:document xmlns:wpc="http://schemas.microsoft.com/office/word/2010/wordprocessingCanvas" xmlns:cx="http://schemas.microsoft.com/office/drawing/2014/chartex" xmlns:mc="http://schemas.openxmlformats.org/markup-compatibility/2006" xmlns:o="urn:schemas-microsoft-com:office:office" xmlns:r="http://schemas.openxmlformats.org/officeDocument/2006/relationships" xmlns:m="http://schemas.openxmlformats.org/officeDocument/2006/math" xmlns:v="urn:schemas-microsoft-com:vml" xmlns:wp14="http://schemas.microsoft.com/office/word/2010/wordprocessingDrawing" xmlns:wp="http://schemas.openxmlformats.org/drawingml/2006/wordprocessingDrawing" xmlns:w10="urn:schemas-microsoft-com:office:word" xmlns:w="http://schemas.openxmlformats.org/wordprocessingml/2006/main" xmlns:w14="http://schemas.microsoft.com/office/word/2010/wordml" xmlns:w15="http://schemas.microsoft.com/office/word/2012/wordml" xmlns:w16se="http://schemas.microsoft.com/office/word/2015/wordml/symex" xmlns:wpg="http://schemas.microsoft.com/office/word/2010/wordprocessingGroup" xmlns:wpi="http://schemas.microsoft.com/office/word/2010/wordprocessingInk" xmlns:wne="http://schemas.microsoft.com/office/word/2006/wordml" xmlns:wps="http://schemas.microsoft.com/office/word/2010/wordprocessingShape" mc:Ignorable="w14 w15 w16se wp14">
   <w:body>
     <w:p>
       <w:pPr>
@@ -15,15 +15,7 @@
       </w:r>
       <w:proofErr w:type="gramEnd"/>
       <w:r>
-        <w:t>:data/templates/cover_sheet_2.0.docx'</w:t>
-      </w:r>
-      <w:proofErr w:type="gramStart"/>
-      <w:r>
-        <w:t>) }</w:t>
-      </w:r>
-      <w:proofErr w:type="gramEnd"/>
-      <w:r>
-        <w:t>}</w:t>
+        <w:t>:data/templates/cover_sheet_2.0.docx') }}</w:t>
       </w:r>
     </w:p>
     <w:p/>
@@ -264,31 +256,14 @@
           <w:noProof/>
           <w:szCs w:val="28"/>
         </w:rPr>
-        <w:t>_sheet_</w:t>
-      </w:r>
-      <w:proofErr w:type="gramStart"/>
-      <w:r>
-        <w:rPr>
-          <w:rFonts w:asciiTheme="minorHAnsi" w:hAnsiTheme="minorHAnsi" w:cstheme="minorHAnsi"/>
-          <w:noProof/>
+        <w:t xml:space="preserve">_sheet_thanks </w:t>
+      </w:r>
+      <w:r>
+        <w:rPr>
+          <w:rFonts w:asciiTheme="minorHAnsi" w:hAnsiTheme="minorHAnsi" w:cstheme="minorHAnsi"/>
           <w:szCs w:val="28"/>
         </w:rPr>
-        <w:t xml:space="preserve">thanks </w:t>
-      </w:r>
-      <w:r>
-        <w:rPr>
-          <w:rFonts w:asciiTheme="minorHAnsi" w:hAnsiTheme="minorHAnsi" w:cstheme="minorHAnsi"/>
-          <w:szCs w:val="28"/>
-        </w:rPr>
-        <w:t>}</w:t>
-      </w:r>
-      <w:proofErr w:type="gramEnd"/>
-      <w:r>
-        <w:rPr>
-          <w:rFonts w:asciiTheme="minorHAnsi" w:hAnsiTheme="minorHAnsi" w:cstheme="minorHAnsi"/>
-          <w:szCs w:val="28"/>
-        </w:rPr>
-        <w:t>}</w:t>
+        <w:t>}}</w:t>
       </w:r>
     </w:p>
     <w:p>
@@ -619,28 +594,14 @@
         <w:rPr>
           <w:rFonts w:asciiTheme="minorHAnsi" w:hAnsiTheme="minorHAnsi" w:cstheme="minorHAnsi"/>
         </w:rPr>
-        <w:t>include_docx_</w:t>
-      </w:r>
-      <w:proofErr w:type="gramStart"/>
-      <w:r>
-        <w:rPr>
-          <w:rFonts w:asciiTheme="minorHAnsi" w:hAnsiTheme="minorHAnsi" w:cstheme="minorHAnsi"/>
-        </w:rPr>
-        <w:t>template</w:t>
-      </w:r>
-      <w:proofErr w:type="spellEnd"/>
-      <w:r>
-        <w:rPr>
-          <w:rFonts w:asciiTheme="minorHAnsi" w:hAnsiTheme="minorHAnsi" w:cstheme="minorHAnsi"/>
-        </w:rPr>
-        <w:t>(‘</w:t>
-      </w:r>
-      <w:proofErr w:type="gramEnd"/>
-      <w:r>
-        <w:rPr>
-          <w:rFonts w:asciiTheme="minorHAnsi" w:hAnsiTheme="minorHAnsi" w:cstheme="minorHAnsi"/>
-        </w:rPr>
-        <w:t>reminders_template.docx’</w:t>
+        <w:t>include_docx_template</w:t>
+      </w:r>
+      <w:proofErr w:type="spellEnd"/>
+      <w:r>
+        <w:rPr>
+          <w:rFonts w:asciiTheme="minorHAnsi" w:hAnsiTheme="minorHAnsi" w:cstheme="minorHAnsi"/>
+        </w:rPr>
+        <w:t>(‘reminders_template.docx’</w:t>
       </w:r>
       <w:proofErr w:type="gramStart"/>
       <w:r>
@@ -668,16 +629,8 @@
         <w:rPr>
           <w:rFonts w:asciiTheme="minorHAnsi" w:hAnsiTheme="minorHAnsi" w:cstheme="minorHAnsi"/>
         </w:rPr>
-        <w:t xml:space="preserve">{%p </w:t>
-      </w:r>
-      <w:proofErr w:type="gramStart"/>
-      <w:r>
-        <w:rPr>
-          <w:rFonts w:asciiTheme="minorHAnsi" w:hAnsiTheme="minorHAnsi" w:cstheme="minorHAnsi"/>
-        </w:rPr>
-        <w:t>endif %}</w:t>
-      </w:r>
-      <w:proofErr w:type="gramEnd"/>
+        <w:t>{%p endif %}</w:t>
+      </w:r>
     </w:p>
     <w:p>
       <w:pPr>
@@ -714,14 +667,54 @@
         <w:t>divorce_complaint</w:t>
       </w:r>
       <w:proofErr w:type="spellEnd"/>
-      <w:proofErr w:type="gramStart"/>
-      <w:r>
-        <w:rPr>
-          <w:rFonts w:asciiTheme="minorHAnsi" w:hAnsiTheme="minorHAnsi" w:cstheme="minorHAnsi"/>
-        </w:rPr>
-        <w:t>" %}</w:t>
-      </w:r>
-      <w:proofErr w:type="gramEnd"/>
+      <w:r>
+        <w:rPr>
+          <w:rFonts w:asciiTheme="minorHAnsi" w:hAnsiTheme="minorHAnsi" w:cstheme="minorHAnsi"/>
+        </w:rPr>
+        <w:t>"</w:t>
+      </w:r>
+      <w:r>
+        <w:rPr>
+          <w:rFonts w:asciiTheme="minorHAnsi" w:hAnsiTheme="minorHAnsi" w:cstheme="minorHAnsi"/>
+        </w:rPr>
+        <w:t xml:space="preserve"> or </w:t>
+      </w:r>
+      <w:proofErr w:type="spellStart"/>
+      <w:r>
+        <w:rPr>
+          <w:rFonts w:asciiTheme="minorHAnsi" w:hAnsiTheme="minorHAnsi" w:cstheme="minorHAnsi"/>
+        </w:rPr>
+        <w:t>tool_ID</w:t>
+      </w:r>
+      <w:proofErr w:type="spellEnd"/>
+      <w:r>
+        <w:rPr>
+          <w:rFonts w:asciiTheme="minorHAnsi" w:hAnsiTheme="minorHAnsi" w:cstheme="minorHAnsi"/>
+        </w:rPr>
+        <w:t xml:space="preserve"> == “</w:t>
+      </w:r>
+      <w:proofErr w:type="spellStart"/>
+      <w:r>
+        <w:rPr>
+          <w:rFonts w:asciiTheme="minorHAnsi" w:hAnsiTheme="minorHAnsi" w:cstheme="minorHAnsi"/>
+        </w:rPr>
+        <w:t>divorce_answer</w:t>
+      </w:r>
+      <w:proofErr w:type="spellEnd"/>
+      <w:r>
+        <w:rPr>
+          <w:rFonts w:asciiTheme="minorHAnsi" w:hAnsiTheme="minorHAnsi" w:cstheme="minorHAnsi"/>
+        </w:rPr>
+        <w:t>”</w:t>
+      </w:r>
+      <w:bookmarkStart w:id="0" w:name="_GoBack"/>
+      <w:bookmarkEnd w:id="0"/>
+      <w:r>
+        <w:rPr>
+          <w:rFonts w:asciiTheme="minorHAnsi" w:hAnsiTheme="minorHAnsi" w:cstheme="minorHAnsi"/>
+        </w:rPr>
+        <w:t xml:space="preserve"> %}</w:t>
+      </w:r>
     </w:p>
     <w:p>
       <w:r>
@@ -757,11 +750,7 @@
       </w:r>
       <w:proofErr w:type="spellStart"/>
       <w:r>
-        <w:t>there_are_marital_</w:t>
-      </w:r>
-      <w:proofErr w:type="gramStart"/>
-      <w:r>
-        <w:t>children</w:t>
+        <w:t>there_are_marital_children</w:t>
       </w:r>
       <w:proofErr w:type="spellEnd"/>
       <w:r>
@@ -770,7 +759,6 @@
       <w:r>
         <w:t>%}</w:t>
       </w:r>
-      <w:proofErr w:type="gramEnd"/>
     </w:p>
     <w:p>
       <w:pPr>
@@ -781,11 +769,7 @@
       </w:r>
       <w:proofErr w:type="spellStart"/>
       <w:r>
-        <w:t>include_docx_</w:t>
-      </w:r>
-      <w:proofErr w:type="gramStart"/>
-      <w:r>
-        <w:t>template</w:t>
+        <w:t>include_docx_template</w:t>
       </w:r>
       <w:proofErr w:type="spellEnd"/>
       <w:r>
@@ -794,7 +778,6 @@
       <w:r>
         <w:t>‘</w:t>
       </w:r>
-      <w:proofErr w:type="gramEnd"/>
       <w:r>
         <w:t>instructions_divorce_with_children</w:t>
       </w:r>
@@ -838,10 +821,7 @@
       </w:r>
       <w:proofErr w:type="spellStart"/>
       <w:r>
-        <w:t>divorce_</w:t>
-      </w:r>
-      <w:r>
-        <w:t>complaint</w:t>
+        <w:t>divorce_complaint</w:t>
       </w:r>
       <w:proofErr w:type="spellEnd"/>
       <w:r>
@@ -852,11 +832,7 @@
       </w:r>
       <w:proofErr w:type="spellStart"/>
       <w:r>
-        <w:t>there_are_marital_</w:t>
-      </w:r>
-      <w:proofErr w:type="gramStart"/>
-      <w:r>
-        <w:t>children</w:t>
+        <w:t>there_are_marital_children</w:t>
       </w:r>
       <w:proofErr w:type="spellEnd"/>
       <w:r>
@@ -865,23 +841,17 @@
       <w:r>
         <w:t>%}</w:t>
       </w:r>
-      <w:proofErr w:type="gramEnd"/>
     </w:p>
     <w:p>
       <w:pPr>
         <w:pStyle w:val="Normalforinsertedinstructions"/>
       </w:pPr>
       <w:r>
-        <w:t>{{p include_docx_</w:t>
-      </w:r>
-      <w:proofErr w:type="gramStart"/>
-      <w:r>
-        <w:t>template(</w:t>
+        <w:t>{{p include_docx_template(</w:t>
       </w:r>
       <w:r>
         <w:t>‘</w:t>
       </w:r>
-      <w:proofErr w:type="gramEnd"/>
       <w:r>
         <w:t>instructions_divorce_with</w:t>
       </w:r>
@@ -911,7 +881,34 @@
         <w:pStyle w:val="Normalforinsertedinstructions"/>
       </w:pPr>
       <w:r>
-        <w:t>{% endif %}</w:t>
+        <w:t xml:space="preserve">{% </w:t>
+      </w:r>
+      <w:proofErr w:type="spellStart"/>
+      <w:r>
+        <w:t>elif</w:t>
+      </w:r>
+      <w:proofErr w:type="spellEnd"/>
+      <w:r>
+        <w:t xml:space="preserve"> </w:t>
+      </w:r>
+      <w:proofErr w:type="spellStart"/>
+      <w:r>
+        <w:t>tool_ID</w:t>
+      </w:r>
+      <w:proofErr w:type="spellEnd"/>
+      <w:r>
+        <w:t xml:space="preserve"> == "</w:t>
+      </w:r>
+      <w:proofErr w:type="spellStart"/>
+      <w:r>
+        <w:t>divorce_answer</w:t>
+      </w:r>
+      <w:proofErr w:type="spellEnd"/>
+      <w:r>
+        <w:t xml:space="preserve">" </w:t>
+      </w:r>
+      <w:r>
+        <w:t>%}</w:t>
       </w:r>
     </w:p>
     <w:p>
@@ -919,33 +916,43 @@
         <w:pStyle w:val="Normalforinsertedinstructions"/>
       </w:pPr>
       <w:r>
-        <w:t xml:space="preserve">{%p </w:t>
-      </w:r>
-      <w:proofErr w:type="gramStart"/>
-      <w:r>
-        <w:t>endif %}</w:t>
-      </w:r>
-      <w:proofErr w:type="gramEnd"/>
+        <w:t>{{p include_docx_template(</w:t>
+      </w:r>
+      <w:r>
+        <w:t>‘instructions_divorce_answer</w:t>
+      </w:r>
+      <w:r>
+        <w:t>.docx</w:t>
+      </w:r>
+      <w:r>
+        <w:t>’</w:t>
+      </w:r>
+      <w:r>
+        <w:t>) }}</w:t>
+      </w:r>
     </w:p>
     <w:p>
       <w:pPr>
         <w:pStyle w:val="Normalforinsertedinstructions"/>
       </w:pPr>
       <w:r>
-        <w:t xml:space="preserve">{%p if </w:t>
-      </w:r>
-      <w:proofErr w:type="spellStart"/>
-      <w:r>
-        <w:t>user_ask_role</w:t>
-      </w:r>
-      <w:proofErr w:type="spellEnd"/>
-      <w:r>
-        <w:t xml:space="preserve"> == “plaintiff” %}</w:t>
+        <w:t xml:space="preserve">{% </w:t>
+      </w:r>
+      <w:proofErr w:type="spellStart"/>
+      <w:r>
+        <w:t>endif</w:t>
+      </w:r>
+      <w:proofErr w:type="spellEnd"/>
+      <w:r>
+        <w:t xml:space="preserve"> %}</w:t>
       </w:r>
     </w:p>
     <w:p>
-      <w:r>
-        <w:br w:type="page"/>
+      <w:pPr>
+        <w:pStyle w:val="Normalforinsertedinstructions"/>
+      </w:pPr>
+      <w:r>
+        <w:t>{%p endif %}</w:t>
       </w:r>
     </w:p>
     <w:p>
@@ -953,16 +960,77 @@
         <w:pStyle w:val="Normalforinsertedinstructions"/>
       </w:pPr>
       <w:r>
+        <w:t xml:space="preserve">{%p if </w:t>
+      </w:r>
+      <w:proofErr w:type="spellStart"/>
+      <w:r>
+        <w:t>tool_ID</w:t>
+      </w:r>
+      <w:proofErr w:type="spellEnd"/>
+      <w:r>
+        <w:t xml:space="preserve"> == "</w:t>
+      </w:r>
+      <w:proofErr w:type="spellStart"/>
+      <w:r>
+        <w:t>divorce_complaint</w:t>
+      </w:r>
+      <w:proofErr w:type="spellEnd"/>
+      <w:r>
+        <w:t>"</w:t>
+      </w:r>
+      <w:r>
+        <w:t xml:space="preserve"> or (</w:t>
+      </w:r>
+      <w:proofErr w:type="spellStart"/>
+      <w:r>
+        <w:t>tool_ID</w:t>
+      </w:r>
+      <w:proofErr w:type="spellEnd"/>
+      <w:r>
+        <w:t xml:space="preserve"> == "</w:t>
+      </w:r>
+      <w:proofErr w:type="spellStart"/>
+      <w:r>
+        <w:t>JOD_only</w:t>
+      </w:r>
+      <w:proofErr w:type="spellEnd"/>
+      <w:r>
+        <w:t>"</w:t>
+      </w:r>
+      <w:r>
+        <w:t xml:space="preserve"> and </w:t>
+      </w:r>
+      <w:proofErr w:type="spellStart"/>
+      <w:r>
+        <w:t>user_ask_role</w:t>
+      </w:r>
+      <w:proofErr w:type="spellEnd"/>
+      <w:r>
+        <w:t xml:space="preserve"> == “plaintiff”</w:t>
+      </w:r>
+      <w:r>
+        <w:t>)</w:t>
+      </w:r>
+      <w:r>
+        <w:t xml:space="preserve"> %}</w:t>
+      </w:r>
+    </w:p>
+    <w:p>
+      <w:r>
+        <w:br w:type="page"/>
+      </w:r>
+    </w:p>
+    <w:p>
+      <w:pPr>
+        <w:pStyle w:val="Normalforinsertedinstructions"/>
+      </w:pPr>
+      <w:r>
         <w:lastRenderedPageBreak/>
         <w:t xml:space="preserve">{{p </w:t>
       </w:r>
       <w:proofErr w:type="spellStart"/>
       <w:r>
-        <w:t>include_docx_</w:t>
-      </w:r>
-      <w:proofErr w:type="gramStart"/>
-      <w:r>
-        <w:t>template</w:t>
+        <w:t>include_docx_template</w:t>
       </w:r>
       <w:proofErr w:type="spellEnd"/>
       <w:r>
@@ -971,7 +1039,6 @@
       <w:r>
         <w:t>‘</w:t>
       </w:r>
-      <w:proofErr w:type="gramEnd"/>
       <w:r>
         <w:t>testimony_script.docx</w:t>
       </w:r>
@@ -992,13 +1059,8 @@
         <w:pStyle w:val="Normalforinsertedinstructions"/>
       </w:pPr>
       <w:r>
-        <w:t xml:space="preserve">{%p </w:t>
-      </w:r>
-      <w:proofErr w:type="gramStart"/>
-      <w:r>
-        <w:t>endif %}</w:t>
-      </w:r>
-      <w:proofErr w:type="gramEnd"/>
+        <w:t>{%p endif %}</w:t>
+      </w:r>
     </w:p>
     <w:sectPr>
       <w:type w:val="continuous"/>
@@ -1012,7 +1074,7 @@
 </file>
 
 <file path=word/numbering.xml><?xml version="1.0" encoding="utf-8"?>
-<w:numbering xmlns:wpc="http://schemas.microsoft.com/office/word/2010/wordprocessingCanvas" xmlns:cx="http://schemas.microsoft.com/office/drawing/2014/chartex" xmlns:cx1="http://schemas.microsoft.com/office/drawing/2015/9/8/chartex" xmlns:cx2="http://schemas.microsoft.com/office/drawing/2015/10/21/chartex" xmlns:cx3="http://schemas.microsoft.com/office/drawing/2016/5/9/chartex" xmlns:cx4="http://schemas.microsoft.com/office/drawing/2016/5/10/chartex" xmlns:cx5="http://schemas.microsoft.com/office/drawing/2016/5/11/chartex" xmlns:cx6="http://schemas.microsoft.com/office/drawing/2016/5/12/chartex" xmlns:cx7="http://schemas.microsoft.com/office/drawing/2016/5/13/chartex" xmlns:cx8="http://schemas.microsoft.com/office/drawing/2016/5/14/chartex" xmlns:mc="http://schemas.openxmlformats.org/markup-compatibility/2006" xmlns:aink="http://schemas.microsoft.com/office/drawing/2016/ink" xmlns:am3d="http://schemas.microsoft.com/office/drawing/2017/model3d" xmlns:o="urn:schemas-microsoft-com:office:office" xmlns:oel="http://schemas.microsoft.com/office/2019/extlst" xmlns:r="http://schemas.openxmlformats.org/officeDocument/2006/relationships" xmlns:m="http://schemas.openxmlformats.org/officeDocument/2006/math" xmlns:v="urn:schemas-microsoft-com:vml" xmlns:wp14="http://schemas.microsoft.com/office/word/2010/wordprocessingDrawing" xmlns:wp="http://schemas.openxmlformats.org/drawingml/2006/wordprocessingDrawing" xmlns:w10="urn:schemas-microsoft-com:office:word" xmlns:w="http://schemas.openxmlformats.org/wordprocessingml/2006/main" xmlns:w14="http://schemas.microsoft.com/office/word/2010/wordml" xmlns:w15="http://schemas.microsoft.com/office/word/2012/wordml" xmlns:w16cex="http://schemas.microsoft.com/office/word/2018/wordml/cex" xmlns:w16cid="http://schemas.microsoft.com/office/word/2016/wordml/cid" xmlns:w16="http://schemas.microsoft.com/office/word/2018/wordml" xmlns:w16du="http://schemas.microsoft.com/office/word/2023/wordml/word16du" xmlns:w16sdtdh="http://schemas.microsoft.com/office/word/2020/wordml/sdtdatahash" xmlns:w16sdtfl="http://schemas.microsoft.com/office/word/2024/wordml/sdtformatlock" xmlns:w16se="http://schemas.microsoft.com/office/word/2015/wordml/symex" xmlns:wpg="http://schemas.microsoft.com/office/word/2010/wordprocessingGroup" xmlns:wpi="http://schemas.microsoft.com/office/word/2010/wordprocessingInk" xmlns:wne="http://schemas.microsoft.com/office/word/2006/wordml" xmlns:wps="http://schemas.microsoft.com/office/word/2010/wordprocessingShape" mc:Ignorable="w14 w15 w16se w16cid w16 w16cex w16sdtdh w16sdtfl w16du wp14">
+<w:numbering xmlns:wpc="http://schemas.microsoft.com/office/word/2010/wordprocessingCanvas" xmlns:cx="http://schemas.microsoft.com/office/drawing/2014/chartex" xmlns:mc="http://schemas.openxmlformats.org/markup-compatibility/2006" xmlns:o="urn:schemas-microsoft-com:office:office" xmlns:r="http://schemas.openxmlformats.org/officeDocument/2006/relationships" xmlns:m="http://schemas.openxmlformats.org/officeDocument/2006/math" xmlns:v="urn:schemas-microsoft-com:vml" xmlns:wp14="http://schemas.microsoft.com/office/word/2010/wordprocessingDrawing" xmlns:wp="http://schemas.openxmlformats.org/drawingml/2006/wordprocessingDrawing" xmlns:w10="urn:schemas-microsoft-com:office:word" xmlns:w="http://schemas.openxmlformats.org/wordprocessingml/2006/main" xmlns:w14="http://schemas.microsoft.com/office/word/2010/wordml" xmlns:w15="http://schemas.microsoft.com/office/word/2012/wordml" xmlns:w16se="http://schemas.microsoft.com/office/word/2015/wordml/symex" xmlns:wpg="http://schemas.microsoft.com/office/word/2010/wordprocessingGroup" xmlns:wpi="http://schemas.microsoft.com/office/word/2010/wordprocessingInk" xmlns:wne="http://schemas.microsoft.com/office/word/2006/wordml" xmlns:wps="http://schemas.microsoft.com/office/word/2010/wordprocessingShape" mc:Ignorable="w14 w15 w16se wp14">
   <w:abstractNum w:abstractNumId="0" w15:restartNumberingAfterBreak="0">
     <w:nsid w:val="01A548E7"/>
     <w:multiLevelType w:val="multilevel"/>
@@ -2637,53 +2699,53 @@
       </w:rPr>
     </w:lvl>
   </w:abstractNum>
-  <w:num w:numId="1" w16cid:durableId="2074355153">
+  <w:num w:numId="1">
     <w:abstractNumId w:val="9"/>
   </w:num>
-  <w:num w:numId="2" w16cid:durableId="273949149">
+  <w:num w:numId="2">
     <w:abstractNumId w:val="11"/>
   </w:num>
-  <w:num w:numId="3" w16cid:durableId="108166491">
+  <w:num w:numId="3">
     <w:abstractNumId w:val="4"/>
   </w:num>
-  <w:num w:numId="4" w16cid:durableId="1763380174">
+  <w:num w:numId="4">
     <w:abstractNumId w:val="13"/>
   </w:num>
-  <w:num w:numId="5" w16cid:durableId="1028138958">
+  <w:num w:numId="5">
     <w:abstractNumId w:val="6"/>
   </w:num>
-  <w:num w:numId="6" w16cid:durableId="208222582">
+  <w:num w:numId="6">
     <w:abstractNumId w:val="8"/>
   </w:num>
-  <w:num w:numId="7" w16cid:durableId="418872215">
+  <w:num w:numId="7">
     <w:abstractNumId w:val="10"/>
   </w:num>
-  <w:num w:numId="8" w16cid:durableId="1765760915">
+  <w:num w:numId="8">
     <w:abstractNumId w:val="12"/>
   </w:num>
-  <w:num w:numId="9" w16cid:durableId="2053577505">
+  <w:num w:numId="9">
     <w:abstractNumId w:val="0"/>
   </w:num>
-  <w:num w:numId="10" w16cid:durableId="968973115">
+  <w:num w:numId="10">
     <w:abstractNumId w:val="2"/>
   </w:num>
-  <w:num w:numId="11" w16cid:durableId="2125031694">
+  <w:num w:numId="11">
     <w:abstractNumId w:val="1"/>
   </w:num>
-  <w:num w:numId="12" w16cid:durableId="360014964">
+  <w:num w:numId="12">
     <w:abstractNumId w:val="7"/>
   </w:num>
-  <w:num w:numId="13" w16cid:durableId="584461100">
+  <w:num w:numId="13">
     <w:abstractNumId w:val="5"/>
   </w:num>
-  <w:num w:numId="14" w16cid:durableId="2145346124">
+  <w:num w:numId="14">
     <w:abstractNumId w:val="3"/>
   </w:num>
 </w:numbering>
 </file>
 
 <file path=word/styles.xml><?xml version="1.0" encoding="utf-8"?>
-<w:styles xmlns:mc="http://schemas.openxmlformats.org/markup-compatibility/2006" xmlns:r="http://schemas.openxmlformats.org/officeDocument/2006/relationships" xmlns:w="http://schemas.openxmlformats.org/wordprocessingml/2006/main" xmlns:w14="http://schemas.microsoft.com/office/word/2010/wordml" xmlns:w15="http://schemas.microsoft.com/office/word/2012/wordml" xmlns:w16cex="http://schemas.microsoft.com/office/word/2018/wordml/cex" xmlns:w16cid="http://schemas.microsoft.com/office/word/2016/wordml/cid" xmlns:w16="http://schemas.microsoft.com/office/word/2018/wordml" xmlns:w16du="http://schemas.microsoft.com/office/word/2023/wordml/word16du" xmlns:w16sdtdh="http://schemas.microsoft.com/office/word/2020/wordml/sdtdatahash" xmlns:w16sdtfl="http://schemas.microsoft.com/office/word/2024/wordml/sdtformatlock" xmlns:w16se="http://schemas.microsoft.com/office/word/2015/wordml/symex" mc:Ignorable="w14 w15 w16se w16cid w16 w16cex w16sdtdh w16sdtfl w16du">
+<w:styles xmlns:mc="http://schemas.openxmlformats.org/markup-compatibility/2006" xmlns:r="http://schemas.openxmlformats.org/officeDocument/2006/relationships" xmlns:w="http://schemas.openxmlformats.org/wordprocessingml/2006/main" xmlns:w14="http://schemas.microsoft.com/office/word/2010/wordml" xmlns:w15="http://schemas.microsoft.com/office/word/2012/wordml" xmlns:w16se="http://schemas.microsoft.com/office/word/2015/wordml/symex" mc:Ignorable="w14 w15 w16se">
   <w:docDefaults>
     <w:rPrDefault>
       <w:rPr>
@@ -2695,7 +2757,7 @@
     </w:rPrDefault>
     <w:pPrDefault/>
   </w:docDefaults>
-  <w:latentStyles w:defLockedState="0" w:defUIPriority="99" w:defSemiHidden="0" w:defUnhideWhenUsed="0" w:defQFormat="0" w:count="376">
+  <w:latentStyles w:defLockedState="0" w:defUIPriority="99" w:defSemiHidden="0" w:defUnhideWhenUsed="0" w:defQFormat="0" w:count="371">
     <w:lsdException w:name="Normal" w:uiPriority="0" w:qFormat="1"/>
     <w:lsdException w:name="heading 1" w:uiPriority="9" w:qFormat="1"/>
     <w:lsdException w:name="heading 2" w:semiHidden="1" w:uiPriority="9" w:unhideWhenUsed="1" w:qFormat="1"/>
@@ -3067,11 +3129,6 @@
     <w:lsdException w:name="List Table 5 Dark Accent 6" w:uiPriority="50"/>
     <w:lsdException w:name="List Table 6 Colorful Accent 6" w:uiPriority="51"/>
     <w:lsdException w:name="List Table 7 Colorful Accent 6" w:uiPriority="52"/>
-    <w:lsdException w:name="Mention" w:semiHidden="1" w:unhideWhenUsed="1"/>
-    <w:lsdException w:name="Smart Hyperlink" w:semiHidden="1" w:unhideWhenUsed="1"/>
-    <w:lsdException w:name="Hashtag" w:semiHidden="1" w:unhideWhenUsed="1"/>
-    <w:lsdException w:name="Unresolved Mention" w:semiHidden="1" w:unhideWhenUsed="1"/>
-    <w:lsdException w:name="Smart Link" w:semiHidden="1" w:unhideWhenUsed="1"/>
   </w:latentStyles>
   <w:style w:type="paragraph" w:default="1" w:styleId="Normal">
     <w:name w:val="Normal"/>
@@ -3747,7 +3804,7 @@
 </file>
 
 <file path=customXml/itemProps2.xml><?xml version="1.0" encoding="utf-8"?>
-<ds:datastoreItem xmlns:ds="http://schemas.openxmlformats.org/officeDocument/2006/customXml" ds:itemID="{8F2F8F94-3641-4302-9FBE-E8DCF2DF547A}">
+<ds:datastoreItem xmlns:ds="http://schemas.openxmlformats.org/officeDocument/2006/customXml" ds:itemID="{D17ADB1C-BB67-458D-A072-D9E3A76A5AA9}">
   <ds:schemaRefs>
     <ds:schemaRef ds:uri="http://schemas.openxmlformats.org/officeDocument/2006/bibliography"/>
   </ds:schemaRefs>

</xml_diff>

<commit_message>
set up reminders template for Answer
</commit_message>
<xml_diff>
--- a/docassemble/MLHDivorceAndCustody/data/templates/instructions.docx
+++ b/docassemble/MLHDivorceAndCustody/data/templates/instructions.docx
@@ -1,6 +1,6 @@
 
 <file path=word/document.xml><?xml version="1.0" encoding="utf-8"?>
-<w:document xmlns:wpc="http://schemas.microsoft.com/office/word/2010/wordprocessingCanvas" xmlns:cx="http://schemas.microsoft.com/office/drawing/2014/chartex" xmlns:mc="http://schemas.openxmlformats.org/markup-compatibility/2006" xmlns:o="urn:schemas-microsoft-com:office:office" xmlns:r="http://schemas.openxmlformats.org/officeDocument/2006/relationships" xmlns:m="http://schemas.openxmlformats.org/officeDocument/2006/math" xmlns:v="urn:schemas-microsoft-com:vml" xmlns:wp14="http://schemas.microsoft.com/office/word/2010/wordprocessingDrawing" xmlns:wp="http://schemas.openxmlformats.org/drawingml/2006/wordprocessingDrawing" xmlns:w10="urn:schemas-microsoft-com:office:word" xmlns:w="http://schemas.openxmlformats.org/wordprocessingml/2006/main" xmlns:w14="http://schemas.microsoft.com/office/word/2010/wordml" xmlns:w15="http://schemas.microsoft.com/office/word/2012/wordml" xmlns:w16se="http://schemas.microsoft.com/office/word/2015/wordml/symex" xmlns:wpg="http://schemas.microsoft.com/office/word/2010/wordprocessingGroup" xmlns:wpi="http://schemas.microsoft.com/office/word/2010/wordprocessingInk" xmlns:wne="http://schemas.microsoft.com/office/word/2006/wordml" xmlns:wps="http://schemas.microsoft.com/office/word/2010/wordprocessingShape" mc:Ignorable="w14 w15 w16se wp14">
+<w:document xmlns:wpc="http://schemas.microsoft.com/office/word/2010/wordprocessingCanvas" xmlns:cx="http://schemas.microsoft.com/office/drawing/2014/chartex" xmlns:cx1="http://schemas.microsoft.com/office/drawing/2015/9/8/chartex" xmlns:cx2="http://schemas.microsoft.com/office/drawing/2015/10/21/chartex" xmlns:cx3="http://schemas.microsoft.com/office/drawing/2016/5/9/chartex" xmlns:cx4="http://schemas.microsoft.com/office/drawing/2016/5/10/chartex" xmlns:cx5="http://schemas.microsoft.com/office/drawing/2016/5/11/chartex" xmlns:cx6="http://schemas.microsoft.com/office/drawing/2016/5/12/chartex" xmlns:cx7="http://schemas.microsoft.com/office/drawing/2016/5/13/chartex" xmlns:cx8="http://schemas.microsoft.com/office/drawing/2016/5/14/chartex" xmlns:mc="http://schemas.openxmlformats.org/markup-compatibility/2006" xmlns:aink="http://schemas.microsoft.com/office/drawing/2016/ink" xmlns:am3d="http://schemas.microsoft.com/office/drawing/2017/model3d" xmlns:o="urn:schemas-microsoft-com:office:office" xmlns:oel="http://schemas.microsoft.com/office/2019/extlst" xmlns:r="http://schemas.openxmlformats.org/officeDocument/2006/relationships" xmlns:m="http://schemas.openxmlformats.org/officeDocument/2006/math" xmlns:v="urn:schemas-microsoft-com:vml" xmlns:wp14="http://schemas.microsoft.com/office/word/2010/wordprocessingDrawing" xmlns:wp="http://schemas.openxmlformats.org/drawingml/2006/wordprocessingDrawing" xmlns:w10="urn:schemas-microsoft-com:office:word" xmlns:w="http://schemas.openxmlformats.org/wordprocessingml/2006/main" xmlns:w14="http://schemas.microsoft.com/office/word/2010/wordml" xmlns:w15="http://schemas.microsoft.com/office/word/2012/wordml" xmlns:w16cex="http://schemas.microsoft.com/office/word/2018/wordml/cex" xmlns:w16cid="http://schemas.microsoft.com/office/word/2016/wordml/cid" xmlns:w16="http://schemas.microsoft.com/office/word/2018/wordml" xmlns:w16du="http://schemas.microsoft.com/office/word/2023/wordml/word16du" xmlns:w16sdtdh="http://schemas.microsoft.com/office/word/2020/wordml/sdtdatahash" xmlns:w16sdtfl="http://schemas.microsoft.com/office/word/2024/wordml/sdtformatlock" xmlns:w16se="http://schemas.microsoft.com/office/word/2015/wordml/symex" xmlns:wpg="http://schemas.microsoft.com/office/word/2010/wordprocessingGroup" xmlns:wpi="http://schemas.microsoft.com/office/word/2010/wordprocessingInk" xmlns:wne="http://schemas.microsoft.com/office/word/2006/wordml" xmlns:wps="http://schemas.microsoft.com/office/word/2010/wordprocessingShape" mc:Ignorable="w14 w15 w16se w16cid w16 w16cex w16sdtdh w16sdtfl w16du wp14">
   <w:body>
     <w:p>
       <w:pPr>
@@ -15,7 +15,15 @@
       </w:r>
       <w:proofErr w:type="gramEnd"/>
       <w:r>
-        <w:t>:data/templates/cover_sheet_2.0.docx') }}</w:t>
+        <w:t>:data/templates/cover_sheet_2.0.docx'</w:t>
+      </w:r>
+      <w:proofErr w:type="gramStart"/>
+      <w:r>
+        <w:t>) }</w:t>
+      </w:r>
+      <w:proofErr w:type="gramEnd"/>
+      <w:r>
+        <w:t>}</w:t>
       </w:r>
     </w:p>
     <w:p/>
@@ -256,14 +264,31 @@
           <w:noProof/>
           <w:szCs w:val="28"/>
         </w:rPr>
-        <w:t xml:space="preserve">_sheet_thanks </w:t>
-      </w:r>
-      <w:r>
-        <w:rPr>
-          <w:rFonts w:asciiTheme="minorHAnsi" w:hAnsiTheme="minorHAnsi" w:cstheme="minorHAnsi"/>
+        <w:t>_sheet_</w:t>
+      </w:r>
+      <w:proofErr w:type="gramStart"/>
+      <w:r>
+        <w:rPr>
+          <w:rFonts w:asciiTheme="minorHAnsi" w:hAnsiTheme="minorHAnsi" w:cstheme="minorHAnsi"/>
+          <w:noProof/>
           <w:szCs w:val="28"/>
         </w:rPr>
-        <w:t>}}</w:t>
+        <w:t xml:space="preserve">thanks </w:t>
+      </w:r>
+      <w:r>
+        <w:rPr>
+          <w:rFonts w:asciiTheme="minorHAnsi" w:hAnsiTheme="minorHAnsi" w:cstheme="minorHAnsi"/>
+          <w:szCs w:val="28"/>
+        </w:rPr>
+        <w:t>}</w:t>
+      </w:r>
+      <w:proofErr w:type="gramEnd"/>
+      <w:r>
+        <w:rPr>
+          <w:rFonts w:asciiTheme="minorHAnsi" w:hAnsiTheme="minorHAnsi" w:cstheme="minorHAnsi"/>
+          <w:szCs w:val="28"/>
+        </w:rPr>
+        <w:t>}</w:t>
       </w:r>
     </w:p>
     <w:p>
@@ -294,6 +319,89 @@
           <w:rFonts w:asciiTheme="minorHAnsi" w:hAnsiTheme="minorHAnsi" w:cstheme="minorHAnsi"/>
           <w:szCs w:val="28"/>
         </w:rPr>
+        <w:t xml:space="preserve"> </w:t>
+      </w:r>
+      <w:r>
+        <w:rPr>
+          <w:rFonts w:asciiTheme="minorHAnsi" w:hAnsiTheme="minorHAnsi" w:cstheme="minorHAnsi"/>
+          <w:szCs w:val="28"/>
+        </w:rPr>
+        <w:t>in [</w:t>
+      </w:r>
+      <w:r>
+        <w:rPr>
+          <w:rFonts w:asciiTheme="minorHAnsi" w:hAnsiTheme="minorHAnsi" w:cstheme="minorHAnsi"/>
+          <w:szCs w:val="28"/>
+        </w:rPr>
+        <w:t>“</w:t>
+      </w:r>
+      <w:proofErr w:type="spellStart"/>
+      <w:r>
+        <w:rPr>
+          <w:rFonts w:asciiTheme="minorHAnsi" w:hAnsiTheme="minorHAnsi" w:cstheme="minorHAnsi"/>
+          <w:szCs w:val="28"/>
+        </w:rPr>
+        <w:t>divorce_complaint</w:t>
+      </w:r>
+      <w:proofErr w:type="spellEnd"/>
+      <w:r>
+        <w:rPr>
+          <w:rFonts w:asciiTheme="minorHAnsi" w:hAnsiTheme="minorHAnsi" w:cstheme="minorHAnsi"/>
+          <w:szCs w:val="28"/>
+        </w:rPr>
+        <w:t>”</w:t>
+      </w:r>
+      <w:r>
+        <w:rPr>
+          <w:rFonts w:asciiTheme="minorHAnsi" w:hAnsiTheme="minorHAnsi" w:cstheme="minorHAnsi"/>
+          <w:szCs w:val="28"/>
+        </w:rPr>
+        <w:t>, “</w:t>
+      </w:r>
+      <w:proofErr w:type="spellStart"/>
+      <w:r>
+        <w:rPr>
+          <w:rFonts w:asciiTheme="minorHAnsi" w:hAnsiTheme="minorHAnsi" w:cstheme="minorHAnsi"/>
+          <w:szCs w:val="28"/>
+        </w:rPr>
+        <w:t>divorce_answer</w:t>
+      </w:r>
+      <w:proofErr w:type="spellEnd"/>
+      <w:r>
+        <w:rPr>
+          <w:rFonts w:asciiTheme="minorHAnsi" w:hAnsiTheme="minorHAnsi" w:cstheme="minorHAnsi"/>
+          <w:szCs w:val="28"/>
+        </w:rPr>
+        <w:t>”]</w:t>
+      </w:r>
+      <w:r>
+        <w:rPr>
+          <w:rFonts w:asciiTheme="minorHAnsi" w:hAnsiTheme="minorHAnsi" w:cstheme="minorHAnsi"/>
+          <w:szCs w:val="28"/>
+        </w:rPr>
+        <w:t xml:space="preserve"> </w:t>
+      </w:r>
+      <w:r>
+        <w:rPr>
+          <w:rFonts w:asciiTheme="minorHAnsi" w:hAnsiTheme="minorHAnsi" w:cstheme="minorHAnsi"/>
+          <w:szCs w:val="28"/>
+        </w:rPr>
+        <w:t>or (</w:t>
+      </w:r>
+      <w:proofErr w:type="spellStart"/>
+      <w:r>
+        <w:rPr>
+          <w:rFonts w:asciiTheme="minorHAnsi" w:hAnsiTheme="minorHAnsi" w:cstheme="minorHAnsi"/>
+          <w:szCs w:val="28"/>
+        </w:rPr>
+        <w:t>tool_ID</w:t>
+      </w:r>
+      <w:proofErr w:type="spellEnd"/>
+      <w:r>
+        <w:rPr>
+          <w:rFonts w:asciiTheme="minorHAnsi" w:hAnsiTheme="minorHAnsi" w:cstheme="minorHAnsi"/>
+          <w:szCs w:val="28"/>
+        </w:rPr>
         <w:t xml:space="preserve"> == “</w:t>
       </w:r>
       <w:proofErr w:type="spellStart"/>
@@ -302,7 +410,7 @@
           <w:rFonts w:asciiTheme="minorHAnsi" w:hAnsiTheme="minorHAnsi" w:cstheme="minorHAnsi"/>
           <w:szCs w:val="28"/>
         </w:rPr>
-        <w:t>divorce_complaint</w:t>
+        <w:t>JOD_only</w:t>
       </w:r>
       <w:proofErr w:type="spellEnd"/>
       <w:r>
@@ -310,68 +418,186 @@
           <w:rFonts w:asciiTheme="minorHAnsi" w:hAnsiTheme="minorHAnsi" w:cstheme="minorHAnsi"/>
           <w:szCs w:val="28"/>
         </w:rPr>
-        <w:t xml:space="preserve">” </w:t>
+        <w:t xml:space="preserve">” and </w:t>
       </w:r>
       <w:r>
         <w:rPr>
           <w:rFonts w:asciiTheme="minorHAnsi" w:hAnsiTheme="minorHAnsi" w:cstheme="minorHAnsi"/>
           <w:szCs w:val="28"/>
         </w:rPr>
-        <w:t>or (</w:t>
-      </w:r>
-      <w:proofErr w:type="spellStart"/>
+        <w:t>(</w:t>
+      </w:r>
       <w:r>
         <w:rPr>
           <w:rFonts w:asciiTheme="minorHAnsi" w:hAnsiTheme="minorHAnsi" w:cstheme="minorHAnsi"/>
           <w:szCs w:val="28"/>
         </w:rPr>
-        <w:t>tool_ID</w:t>
-      </w:r>
-      <w:proofErr w:type="spellEnd"/>
+        <w:t>(</w:t>
+      </w:r>
+      <w:proofErr w:type="spellStart"/>
       <w:r>
         <w:rPr>
           <w:rFonts w:asciiTheme="minorHAnsi" w:hAnsiTheme="minorHAnsi" w:cstheme="minorHAnsi"/>
           <w:szCs w:val="28"/>
         </w:rPr>
-        <w:t xml:space="preserve"> == “</w:t>
-      </w:r>
-      <w:proofErr w:type="spellStart"/>
+        <w:t>marriage.have_pension_retirement</w:t>
+      </w:r>
+      <w:proofErr w:type="spellEnd"/>
       <w:r>
         <w:rPr>
           <w:rFonts w:asciiTheme="minorHAnsi" w:hAnsiTheme="minorHAnsi" w:cstheme="minorHAnsi"/>
           <w:szCs w:val="28"/>
         </w:rPr>
-        <w:t>JOD_only</w:t>
-      </w:r>
-      <w:proofErr w:type="spellEnd"/>
+        <w:t xml:space="preserve"> and not </w:t>
+      </w:r>
+      <w:proofErr w:type="spellStart"/>
       <w:r>
         <w:rPr>
           <w:rFonts w:asciiTheme="minorHAnsi" w:hAnsiTheme="minorHAnsi" w:cstheme="minorHAnsi"/>
           <w:szCs w:val="28"/>
         </w:rPr>
-        <w:t xml:space="preserve">” and </w:t>
-      </w:r>
+        <w:t>marriage.pension_retirement_accounts_keep_own</w:t>
+      </w:r>
+      <w:proofErr w:type="spellEnd"/>
       <w:r>
         <w:rPr>
           <w:rFonts w:asciiTheme="minorHAnsi" w:hAnsiTheme="minorHAnsi" w:cstheme="minorHAnsi"/>
           <w:szCs w:val="28"/>
         </w:rPr>
+        <w:t>) or (</w:t>
+      </w:r>
+      <w:proofErr w:type="spellStart"/>
+      <w:r>
+        <w:rPr>
+          <w:rFonts w:asciiTheme="minorHAnsi" w:hAnsiTheme="minorHAnsi" w:cstheme="minorHAnsi"/>
+        </w:rPr>
+        <w:t>marriage.personal_property_need_items</w:t>
+      </w:r>
+      <w:proofErr w:type="spellEnd"/>
+      <w:r>
+        <w:rPr>
+          <w:rFonts w:asciiTheme="minorHAnsi" w:hAnsiTheme="minorHAnsi" w:cstheme="minorHAnsi"/>
+        </w:rPr>
+        <w:t xml:space="preserve"> and </w:t>
+      </w:r>
+      <w:proofErr w:type="spellStart"/>
+      <w:r>
+        <w:rPr>
+          <w:rFonts w:asciiTheme="minorHAnsi" w:hAnsiTheme="minorHAnsi" w:cstheme="minorHAnsi"/>
+        </w:rPr>
+        <w:t>marriage.accounts.filter</w:t>
+      </w:r>
+      <w:proofErr w:type="spellEnd"/>
+      <w:r>
+        <w:rPr>
+          <w:rFonts w:asciiTheme="minorHAnsi" w:hAnsiTheme="minorHAnsi" w:cstheme="minorHAnsi"/>
+        </w:rPr>
         <w:t>(</w:t>
       </w:r>
+      <w:proofErr w:type="spellStart"/>
+      <w:r>
+        <w:rPr>
+          <w:rFonts w:asciiTheme="minorHAnsi" w:hAnsiTheme="minorHAnsi" w:cstheme="minorHAnsi"/>
+        </w:rPr>
+        <w:t>trigger_investment_reminder</w:t>
+      </w:r>
+      <w:proofErr w:type="spellEnd"/>
+      <w:r>
+        <w:rPr>
+          <w:rFonts w:asciiTheme="minorHAnsi" w:hAnsiTheme="minorHAnsi" w:cstheme="minorHAnsi"/>
+        </w:rPr>
+        <w:t>=True) | length &gt; 0</w:t>
+      </w:r>
       <w:r>
         <w:rPr>
           <w:rFonts w:asciiTheme="minorHAnsi" w:hAnsiTheme="minorHAnsi" w:cstheme="minorHAnsi"/>
           <w:szCs w:val="28"/>
         </w:rPr>
-        <w:t>(</w:t>
-      </w:r>
-      <w:proofErr w:type="spellStart"/>
+        <w:t>) or (</w:t>
+      </w:r>
+      <w:proofErr w:type="spellStart"/>
+      <w:r>
+        <w:rPr>
+          <w:rFonts w:asciiTheme="minorHAnsi" w:hAnsiTheme="minorHAnsi" w:cstheme="minorHAnsi"/>
+        </w:rPr>
+        <w:t>there_are_marital_children</w:t>
+      </w:r>
+      <w:proofErr w:type="spellEnd"/>
+      <w:r>
+        <w:rPr>
+          <w:rFonts w:asciiTheme="minorHAnsi" w:hAnsiTheme="minorHAnsi" w:cstheme="minorHAnsi"/>
+        </w:rPr>
+        <w:t xml:space="preserve"> and (</w:t>
+      </w:r>
+      <w:proofErr w:type="spellStart"/>
+      <w:r>
+        <w:rPr>
+          <w:rFonts w:asciiTheme="minorHAnsi" w:hAnsiTheme="minorHAnsi" w:cstheme="minorHAnsi"/>
+        </w:rPr>
+        <w:t>parentage_affidavit_revoke</w:t>
+      </w:r>
+      <w:proofErr w:type="spellEnd"/>
+      <w:r>
+        <w:rPr>
+          <w:rFonts w:asciiTheme="minorHAnsi" w:hAnsiTheme="minorHAnsi" w:cstheme="minorHAnsi"/>
+        </w:rPr>
+        <w:t xml:space="preserve"> or </w:t>
+      </w:r>
+      <w:proofErr w:type="spellStart"/>
+      <w:r>
+        <w:rPr>
+          <w:rFonts w:asciiTheme="minorHAnsi" w:hAnsiTheme="minorHAnsi" w:cstheme="minorHAnsi"/>
+        </w:rPr>
+        <w:t>parentage_order_revoke</w:t>
+      </w:r>
+      <w:proofErr w:type="spellEnd"/>
+      <w:r>
+        <w:rPr>
+          <w:rFonts w:asciiTheme="minorHAnsi" w:hAnsiTheme="minorHAnsi" w:cstheme="minorHAnsi"/>
+        </w:rPr>
+        <w:t xml:space="preserve"> or </w:t>
+      </w:r>
+      <w:proofErr w:type="spellStart"/>
+      <w:r>
+        <w:rPr>
+          <w:rFonts w:asciiTheme="minorHAnsi" w:hAnsiTheme="minorHAnsi" w:cstheme="minorHAnsi"/>
+        </w:rPr>
+        <w:t>parentage_marital_revoke</w:t>
+      </w:r>
+      <w:proofErr w:type="spellEnd"/>
+      <w:r>
+        <w:rPr>
+          <w:rFonts w:asciiTheme="minorHAnsi" w:hAnsiTheme="minorHAnsi" w:cstheme="minorHAnsi"/>
+        </w:rPr>
+        <w:t>)</w:t>
+      </w:r>
       <w:r>
         <w:rPr>
           <w:rFonts w:asciiTheme="minorHAnsi" w:hAnsiTheme="minorHAnsi" w:cstheme="minorHAnsi"/>
           <w:szCs w:val="28"/>
         </w:rPr>
-        <w:t>marriage.have_pension_retirement</w:t>
+        <w:t>) or (</w:t>
+      </w:r>
+      <w:proofErr w:type="spellStart"/>
+      <w:r>
+        <w:rPr>
+          <w:rFonts w:asciiTheme="minorHAnsi" w:hAnsiTheme="minorHAnsi" w:cstheme="minorHAnsi"/>
+        </w:rPr>
+        <w:t>there_are_marital_children</w:t>
+      </w:r>
+      <w:proofErr w:type="spellEnd"/>
+      <w:r>
+        <w:rPr>
+          <w:rFonts w:asciiTheme="minorHAnsi" w:hAnsiTheme="minorHAnsi" w:cstheme="minorHAnsi"/>
+        </w:rPr>
+        <w:t xml:space="preserve"> and not </w:t>
+      </w:r>
+      <w:proofErr w:type="spellStart"/>
+      <w:r>
+        <w:rPr>
+          <w:rFonts w:asciiTheme="minorHAnsi" w:hAnsiTheme="minorHAnsi" w:cstheme="minorHAnsi"/>
+        </w:rPr>
+        <w:t>MI_has_jurisdiction_all_kids</w:t>
       </w:r>
       <w:proofErr w:type="spellEnd"/>
       <w:r>
@@ -379,178 +605,28 @@
           <w:rFonts w:asciiTheme="minorHAnsi" w:hAnsiTheme="minorHAnsi" w:cstheme="minorHAnsi"/>
           <w:szCs w:val="28"/>
         </w:rPr>
-        <w:t xml:space="preserve"> and not </w:t>
-      </w:r>
-      <w:proofErr w:type="spellStart"/>
+        <w:t>)</w:t>
+      </w:r>
       <w:r>
         <w:rPr>
           <w:rFonts w:asciiTheme="minorHAnsi" w:hAnsiTheme="minorHAnsi" w:cstheme="minorHAnsi"/>
           <w:szCs w:val="28"/>
         </w:rPr>
-        <w:t>marriage.pension_retirement_accounts_keep_own</w:t>
-      </w:r>
-      <w:proofErr w:type="spellEnd"/>
+        <w:t>)</w:t>
+      </w:r>
       <w:r>
         <w:rPr>
           <w:rFonts w:asciiTheme="minorHAnsi" w:hAnsiTheme="minorHAnsi" w:cstheme="minorHAnsi"/>
           <w:szCs w:val="28"/>
         </w:rPr>
-        <w:t>) or (</w:t>
-      </w:r>
-      <w:proofErr w:type="spellStart"/>
-      <w:r>
-        <w:rPr>
-          <w:rFonts w:asciiTheme="minorHAnsi" w:hAnsiTheme="minorHAnsi" w:cstheme="minorHAnsi"/>
-        </w:rPr>
-        <w:t>marriage.personal_property_need_items</w:t>
-      </w:r>
-      <w:proofErr w:type="spellEnd"/>
-      <w:r>
-        <w:rPr>
-          <w:rFonts w:asciiTheme="minorHAnsi" w:hAnsiTheme="minorHAnsi" w:cstheme="minorHAnsi"/>
-        </w:rPr>
-        <w:t xml:space="preserve"> and </w:t>
-      </w:r>
-      <w:proofErr w:type="spellStart"/>
-      <w:r>
-        <w:rPr>
-          <w:rFonts w:asciiTheme="minorHAnsi" w:hAnsiTheme="minorHAnsi" w:cstheme="minorHAnsi"/>
-        </w:rPr>
-        <w:t>marriage.accounts.filter</w:t>
-      </w:r>
-      <w:proofErr w:type="spellEnd"/>
-      <w:r>
-        <w:rPr>
-          <w:rFonts w:asciiTheme="minorHAnsi" w:hAnsiTheme="minorHAnsi" w:cstheme="minorHAnsi"/>
-        </w:rPr>
-        <w:t>(</w:t>
-      </w:r>
-      <w:proofErr w:type="spellStart"/>
-      <w:r>
-        <w:rPr>
-          <w:rFonts w:asciiTheme="minorHAnsi" w:hAnsiTheme="minorHAnsi" w:cstheme="minorHAnsi"/>
-        </w:rPr>
-        <w:t>trigger_investment_reminder</w:t>
-      </w:r>
-      <w:proofErr w:type="spellEnd"/>
-      <w:r>
-        <w:rPr>
-          <w:rFonts w:asciiTheme="minorHAnsi" w:hAnsiTheme="minorHAnsi" w:cstheme="minorHAnsi"/>
-        </w:rPr>
-        <w:t>=True) | length &gt; 0</w:t>
+        <w:t>)</w:t>
       </w:r>
       <w:r>
         <w:rPr>
           <w:rFonts w:asciiTheme="minorHAnsi" w:hAnsiTheme="minorHAnsi" w:cstheme="minorHAnsi"/>
           <w:szCs w:val="28"/>
         </w:rPr>
-        <w:t>) or (</w:t>
-      </w:r>
-      <w:proofErr w:type="spellStart"/>
-      <w:r>
-        <w:rPr>
-          <w:rFonts w:asciiTheme="minorHAnsi" w:hAnsiTheme="minorHAnsi" w:cstheme="minorHAnsi"/>
-        </w:rPr>
-        <w:t>there_are_marital_children</w:t>
-      </w:r>
-      <w:proofErr w:type="spellEnd"/>
-      <w:r>
-        <w:rPr>
-          <w:rFonts w:asciiTheme="minorHAnsi" w:hAnsiTheme="minorHAnsi" w:cstheme="minorHAnsi"/>
-        </w:rPr>
-        <w:t xml:space="preserve"> and (</w:t>
-      </w:r>
-      <w:proofErr w:type="spellStart"/>
-      <w:r>
-        <w:rPr>
-          <w:rFonts w:asciiTheme="minorHAnsi" w:hAnsiTheme="minorHAnsi" w:cstheme="minorHAnsi"/>
-        </w:rPr>
-        <w:t>parentage_affidavit_revoke</w:t>
-      </w:r>
-      <w:proofErr w:type="spellEnd"/>
-      <w:r>
-        <w:rPr>
-          <w:rFonts w:asciiTheme="minorHAnsi" w:hAnsiTheme="minorHAnsi" w:cstheme="minorHAnsi"/>
-        </w:rPr>
-        <w:t xml:space="preserve"> or </w:t>
-      </w:r>
-      <w:proofErr w:type="spellStart"/>
-      <w:r>
-        <w:rPr>
-          <w:rFonts w:asciiTheme="minorHAnsi" w:hAnsiTheme="minorHAnsi" w:cstheme="minorHAnsi"/>
-        </w:rPr>
-        <w:t>parentage_order_revoke</w:t>
-      </w:r>
-      <w:proofErr w:type="spellEnd"/>
-      <w:r>
-        <w:rPr>
-          <w:rFonts w:asciiTheme="minorHAnsi" w:hAnsiTheme="minorHAnsi" w:cstheme="minorHAnsi"/>
-        </w:rPr>
-        <w:t xml:space="preserve"> or </w:t>
-      </w:r>
-      <w:proofErr w:type="spellStart"/>
-      <w:r>
-        <w:rPr>
-          <w:rFonts w:asciiTheme="minorHAnsi" w:hAnsiTheme="minorHAnsi" w:cstheme="minorHAnsi"/>
-        </w:rPr>
-        <w:t>parentage_marital_revoke</w:t>
-      </w:r>
-      <w:proofErr w:type="spellEnd"/>
-      <w:r>
-        <w:rPr>
-          <w:rFonts w:asciiTheme="minorHAnsi" w:hAnsiTheme="minorHAnsi" w:cstheme="minorHAnsi"/>
-        </w:rPr>
-        <w:t>)</w:t>
-      </w:r>
-      <w:r>
-        <w:rPr>
-          <w:rFonts w:asciiTheme="minorHAnsi" w:hAnsiTheme="minorHAnsi" w:cstheme="minorHAnsi"/>
-          <w:szCs w:val="28"/>
-        </w:rPr>
-        <w:t>) or (</w:t>
-      </w:r>
-      <w:proofErr w:type="spellStart"/>
-      <w:r>
-        <w:rPr>
-          <w:rFonts w:asciiTheme="minorHAnsi" w:hAnsiTheme="minorHAnsi" w:cstheme="minorHAnsi"/>
-        </w:rPr>
-        <w:t>there_are_marital_children</w:t>
-      </w:r>
-      <w:proofErr w:type="spellEnd"/>
-      <w:r>
-        <w:rPr>
-          <w:rFonts w:asciiTheme="minorHAnsi" w:hAnsiTheme="minorHAnsi" w:cstheme="minorHAnsi"/>
-        </w:rPr>
-        <w:t xml:space="preserve"> and not </w:t>
-      </w:r>
-      <w:proofErr w:type="spellStart"/>
-      <w:r>
-        <w:rPr>
-          <w:rFonts w:asciiTheme="minorHAnsi" w:hAnsiTheme="minorHAnsi" w:cstheme="minorHAnsi"/>
-        </w:rPr>
-        <w:t>MI_has_jurisdiction_all_kids</w:t>
-      </w:r>
-      <w:proofErr w:type="spellEnd"/>
-      <w:r>
-        <w:rPr>
-          <w:rFonts w:asciiTheme="minorHAnsi" w:hAnsiTheme="minorHAnsi" w:cstheme="minorHAnsi"/>
-          <w:szCs w:val="28"/>
-        </w:rPr>
-        <w:t>)</w:t>
-      </w:r>
-      <w:r>
-        <w:rPr>
-          <w:rFonts w:asciiTheme="minorHAnsi" w:hAnsiTheme="minorHAnsi" w:cstheme="minorHAnsi"/>
-          <w:szCs w:val="28"/>
-        </w:rPr>
-        <w:t>)</w:t>
-      </w:r>
-      <w:r>
-        <w:rPr>
-          <w:rFonts w:asciiTheme="minorHAnsi" w:hAnsiTheme="minorHAnsi" w:cstheme="minorHAnsi"/>
-          <w:szCs w:val="28"/>
-        </w:rPr>
-        <w:t>)</w:t>
+        <w:t xml:space="preserve"> </w:t>
       </w:r>
       <w:r>
         <w:rPr>
@@ -594,14 +670,28 @@
         <w:rPr>
           <w:rFonts w:asciiTheme="minorHAnsi" w:hAnsiTheme="minorHAnsi" w:cstheme="minorHAnsi"/>
         </w:rPr>
-        <w:t>include_docx_template</w:t>
-      </w:r>
-      <w:proofErr w:type="spellEnd"/>
-      <w:r>
-        <w:rPr>
-          <w:rFonts w:asciiTheme="minorHAnsi" w:hAnsiTheme="minorHAnsi" w:cstheme="minorHAnsi"/>
-        </w:rPr>
-        <w:t>(‘reminders_template.docx’</w:t>
+        <w:t>include_docx_</w:t>
+      </w:r>
+      <w:proofErr w:type="gramStart"/>
+      <w:r>
+        <w:rPr>
+          <w:rFonts w:asciiTheme="minorHAnsi" w:hAnsiTheme="minorHAnsi" w:cstheme="minorHAnsi"/>
+        </w:rPr>
+        <w:t>template</w:t>
+      </w:r>
+      <w:proofErr w:type="spellEnd"/>
+      <w:r>
+        <w:rPr>
+          <w:rFonts w:asciiTheme="minorHAnsi" w:hAnsiTheme="minorHAnsi" w:cstheme="minorHAnsi"/>
+        </w:rPr>
+        <w:t>(‘</w:t>
+      </w:r>
+      <w:proofErr w:type="gramEnd"/>
+      <w:r>
+        <w:rPr>
+          <w:rFonts w:asciiTheme="minorHAnsi" w:hAnsiTheme="minorHAnsi" w:cstheme="minorHAnsi"/>
+        </w:rPr>
+        <w:t>reminders_template.docx’</w:t>
       </w:r>
       <w:proofErr w:type="gramStart"/>
       <w:r>
@@ -707,8 +797,6 @@
         </w:rPr>
         <w:t>”</w:t>
       </w:r>
-      <w:bookmarkStart w:id="0" w:name="_GoBack"/>
-      <w:bookmarkEnd w:id="0"/>
       <w:r>
         <w:rPr>
           <w:rFonts w:asciiTheme="minorHAnsi" w:hAnsiTheme="minorHAnsi" w:cstheme="minorHAnsi"/>
@@ -769,7 +857,11 @@
       </w:r>
       <w:proofErr w:type="spellStart"/>
       <w:r>
-        <w:t>include_docx_template</w:t>
+        <w:t>include_docx_</w:t>
+      </w:r>
+      <w:proofErr w:type="gramStart"/>
+      <w:r>
+        <w:t>template</w:t>
       </w:r>
       <w:proofErr w:type="spellEnd"/>
       <w:r>
@@ -778,6 +870,7 @@
       <w:r>
         <w:t>‘</w:t>
       </w:r>
+      <w:proofErr w:type="gramEnd"/>
       <w:r>
         <w:t>instructions_divorce_with_children</w:t>
       </w:r>
@@ -847,11 +940,16 @@
         <w:pStyle w:val="Normalforinsertedinstructions"/>
       </w:pPr>
       <w:r>
-        <w:t>{{p include_docx_template(</w:t>
+        <w:t>{{p include_docx_</w:t>
+      </w:r>
+      <w:proofErr w:type="gramStart"/>
+      <w:r>
+        <w:t>template(</w:t>
       </w:r>
       <w:r>
         <w:t>‘</w:t>
       </w:r>
+      <w:proofErr w:type="gramEnd"/>
       <w:r>
         <w:t>instructions_divorce_with</w:t>
       </w:r>
@@ -936,15 +1034,7 @@
         <w:pStyle w:val="Normalforinsertedinstructions"/>
       </w:pPr>
       <w:r>
-        <w:t xml:space="preserve">{% </w:t>
-      </w:r>
-      <w:proofErr w:type="spellStart"/>
-      <w:r>
-        <w:t>endif</w:t>
-      </w:r>
-      <w:proofErr w:type="spellEnd"/>
-      <w:r>
-        <w:t xml:space="preserve"> %}</w:t>
+        <w:t>{% endif %}</w:t>
       </w:r>
     </w:p>
     <w:p>
@@ -1030,7 +1120,11 @@
       </w:r>
       <w:proofErr w:type="spellStart"/>
       <w:r>
-        <w:t>include_docx_template</w:t>
+        <w:t>include_docx_</w:t>
+      </w:r>
+      <w:proofErr w:type="gramStart"/>
+      <w:r>
+        <w:t>template</w:t>
       </w:r>
       <w:proofErr w:type="spellEnd"/>
       <w:r>
@@ -1039,6 +1133,7 @@
       <w:r>
         <w:t>‘</w:t>
       </w:r>
+      <w:proofErr w:type="gramEnd"/>
       <w:r>
         <w:t>testimony_script.docx</w:t>
       </w:r>
@@ -1074,7 +1169,7 @@
 </file>
 
 <file path=word/numbering.xml><?xml version="1.0" encoding="utf-8"?>
-<w:numbering xmlns:wpc="http://schemas.microsoft.com/office/word/2010/wordprocessingCanvas" xmlns:cx="http://schemas.microsoft.com/office/drawing/2014/chartex" xmlns:mc="http://schemas.openxmlformats.org/markup-compatibility/2006" xmlns:o="urn:schemas-microsoft-com:office:office" xmlns:r="http://schemas.openxmlformats.org/officeDocument/2006/relationships" xmlns:m="http://schemas.openxmlformats.org/officeDocument/2006/math" xmlns:v="urn:schemas-microsoft-com:vml" xmlns:wp14="http://schemas.microsoft.com/office/word/2010/wordprocessingDrawing" xmlns:wp="http://schemas.openxmlformats.org/drawingml/2006/wordprocessingDrawing" xmlns:w10="urn:schemas-microsoft-com:office:word" xmlns:w="http://schemas.openxmlformats.org/wordprocessingml/2006/main" xmlns:w14="http://schemas.microsoft.com/office/word/2010/wordml" xmlns:w15="http://schemas.microsoft.com/office/word/2012/wordml" xmlns:w16se="http://schemas.microsoft.com/office/word/2015/wordml/symex" xmlns:wpg="http://schemas.microsoft.com/office/word/2010/wordprocessingGroup" xmlns:wpi="http://schemas.microsoft.com/office/word/2010/wordprocessingInk" xmlns:wne="http://schemas.microsoft.com/office/word/2006/wordml" xmlns:wps="http://schemas.microsoft.com/office/word/2010/wordprocessingShape" mc:Ignorable="w14 w15 w16se wp14">
+<w:numbering xmlns:wpc="http://schemas.microsoft.com/office/word/2010/wordprocessingCanvas" xmlns:cx="http://schemas.microsoft.com/office/drawing/2014/chartex" xmlns:cx1="http://schemas.microsoft.com/office/drawing/2015/9/8/chartex" xmlns:cx2="http://schemas.microsoft.com/office/drawing/2015/10/21/chartex" xmlns:cx3="http://schemas.microsoft.com/office/drawing/2016/5/9/chartex" xmlns:cx4="http://schemas.microsoft.com/office/drawing/2016/5/10/chartex" xmlns:cx5="http://schemas.microsoft.com/office/drawing/2016/5/11/chartex" xmlns:cx6="http://schemas.microsoft.com/office/drawing/2016/5/12/chartex" xmlns:cx7="http://schemas.microsoft.com/office/drawing/2016/5/13/chartex" xmlns:cx8="http://schemas.microsoft.com/office/drawing/2016/5/14/chartex" xmlns:mc="http://schemas.openxmlformats.org/markup-compatibility/2006" xmlns:aink="http://schemas.microsoft.com/office/drawing/2016/ink" xmlns:am3d="http://schemas.microsoft.com/office/drawing/2017/model3d" xmlns:o="urn:schemas-microsoft-com:office:office" xmlns:oel="http://schemas.microsoft.com/office/2019/extlst" xmlns:r="http://schemas.openxmlformats.org/officeDocument/2006/relationships" xmlns:m="http://schemas.openxmlformats.org/officeDocument/2006/math" xmlns:v="urn:schemas-microsoft-com:vml" xmlns:wp14="http://schemas.microsoft.com/office/word/2010/wordprocessingDrawing" xmlns:wp="http://schemas.openxmlformats.org/drawingml/2006/wordprocessingDrawing" xmlns:w10="urn:schemas-microsoft-com:office:word" xmlns:w="http://schemas.openxmlformats.org/wordprocessingml/2006/main" xmlns:w14="http://schemas.microsoft.com/office/word/2010/wordml" xmlns:w15="http://schemas.microsoft.com/office/word/2012/wordml" xmlns:w16cex="http://schemas.microsoft.com/office/word/2018/wordml/cex" xmlns:w16cid="http://schemas.microsoft.com/office/word/2016/wordml/cid" xmlns:w16="http://schemas.microsoft.com/office/word/2018/wordml" xmlns:w16du="http://schemas.microsoft.com/office/word/2023/wordml/word16du" xmlns:w16sdtdh="http://schemas.microsoft.com/office/word/2020/wordml/sdtdatahash" xmlns:w16sdtfl="http://schemas.microsoft.com/office/word/2024/wordml/sdtformatlock" xmlns:w16se="http://schemas.microsoft.com/office/word/2015/wordml/symex" xmlns:wpg="http://schemas.microsoft.com/office/word/2010/wordprocessingGroup" xmlns:wpi="http://schemas.microsoft.com/office/word/2010/wordprocessingInk" xmlns:wne="http://schemas.microsoft.com/office/word/2006/wordml" xmlns:wps="http://schemas.microsoft.com/office/word/2010/wordprocessingShape" mc:Ignorable="w14 w15 w16se w16cid w16 w16cex w16sdtdh w16sdtfl w16du wp14">
   <w:abstractNum w:abstractNumId="0" w15:restartNumberingAfterBreak="0">
     <w:nsid w:val="01A548E7"/>
     <w:multiLevelType w:val="multilevel"/>
@@ -2699,53 +2794,53 @@
       </w:rPr>
     </w:lvl>
   </w:abstractNum>
-  <w:num w:numId="1">
+  <w:num w:numId="1" w16cid:durableId="1820996540">
     <w:abstractNumId w:val="9"/>
   </w:num>
-  <w:num w:numId="2">
+  <w:num w:numId="2" w16cid:durableId="648628967">
     <w:abstractNumId w:val="11"/>
   </w:num>
-  <w:num w:numId="3">
+  <w:num w:numId="3" w16cid:durableId="1535770703">
     <w:abstractNumId w:val="4"/>
   </w:num>
-  <w:num w:numId="4">
+  <w:num w:numId="4" w16cid:durableId="565461191">
     <w:abstractNumId w:val="13"/>
   </w:num>
-  <w:num w:numId="5">
+  <w:num w:numId="5" w16cid:durableId="1032417000">
     <w:abstractNumId w:val="6"/>
   </w:num>
-  <w:num w:numId="6">
+  <w:num w:numId="6" w16cid:durableId="1219899649">
     <w:abstractNumId w:val="8"/>
   </w:num>
-  <w:num w:numId="7">
+  <w:num w:numId="7" w16cid:durableId="1415931011">
     <w:abstractNumId w:val="10"/>
   </w:num>
-  <w:num w:numId="8">
+  <w:num w:numId="8" w16cid:durableId="421343425">
     <w:abstractNumId w:val="12"/>
   </w:num>
-  <w:num w:numId="9">
+  <w:num w:numId="9" w16cid:durableId="553738554">
     <w:abstractNumId w:val="0"/>
   </w:num>
-  <w:num w:numId="10">
+  <w:num w:numId="10" w16cid:durableId="1165778778">
     <w:abstractNumId w:val="2"/>
   </w:num>
-  <w:num w:numId="11">
+  <w:num w:numId="11" w16cid:durableId="241841229">
     <w:abstractNumId w:val="1"/>
   </w:num>
-  <w:num w:numId="12">
+  <w:num w:numId="12" w16cid:durableId="982539903">
     <w:abstractNumId w:val="7"/>
   </w:num>
-  <w:num w:numId="13">
+  <w:num w:numId="13" w16cid:durableId="192159581">
     <w:abstractNumId w:val="5"/>
   </w:num>
-  <w:num w:numId="14">
+  <w:num w:numId="14" w16cid:durableId="1698196192">
     <w:abstractNumId w:val="3"/>
   </w:num>
 </w:numbering>
 </file>
 
 <file path=word/styles.xml><?xml version="1.0" encoding="utf-8"?>
-<w:styles xmlns:mc="http://schemas.openxmlformats.org/markup-compatibility/2006" xmlns:r="http://schemas.openxmlformats.org/officeDocument/2006/relationships" xmlns:w="http://schemas.openxmlformats.org/wordprocessingml/2006/main" xmlns:w14="http://schemas.microsoft.com/office/word/2010/wordml" xmlns:w15="http://schemas.microsoft.com/office/word/2012/wordml" xmlns:w16se="http://schemas.microsoft.com/office/word/2015/wordml/symex" mc:Ignorable="w14 w15 w16se">
+<w:styles xmlns:mc="http://schemas.openxmlformats.org/markup-compatibility/2006" xmlns:r="http://schemas.openxmlformats.org/officeDocument/2006/relationships" xmlns:w="http://schemas.openxmlformats.org/wordprocessingml/2006/main" xmlns:w14="http://schemas.microsoft.com/office/word/2010/wordml" xmlns:w15="http://schemas.microsoft.com/office/word/2012/wordml" xmlns:w16cex="http://schemas.microsoft.com/office/word/2018/wordml/cex" xmlns:w16cid="http://schemas.microsoft.com/office/word/2016/wordml/cid" xmlns:w16="http://schemas.microsoft.com/office/word/2018/wordml" xmlns:w16du="http://schemas.microsoft.com/office/word/2023/wordml/word16du" xmlns:w16sdtdh="http://schemas.microsoft.com/office/word/2020/wordml/sdtdatahash" xmlns:w16sdtfl="http://schemas.microsoft.com/office/word/2024/wordml/sdtformatlock" xmlns:w16se="http://schemas.microsoft.com/office/word/2015/wordml/symex" mc:Ignorable="w14 w15 w16se w16cid w16 w16cex w16sdtdh w16sdtfl w16du">
   <w:docDefaults>
     <w:rPrDefault>
       <w:rPr>
@@ -2757,7 +2852,7 @@
     </w:rPrDefault>
     <w:pPrDefault/>
   </w:docDefaults>
-  <w:latentStyles w:defLockedState="0" w:defUIPriority="99" w:defSemiHidden="0" w:defUnhideWhenUsed="0" w:defQFormat="0" w:count="371">
+  <w:latentStyles w:defLockedState="0" w:defUIPriority="99" w:defSemiHidden="0" w:defUnhideWhenUsed="0" w:defQFormat="0" w:count="376">
     <w:lsdException w:name="Normal" w:uiPriority="0" w:qFormat="1"/>
     <w:lsdException w:name="heading 1" w:uiPriority="9" w:qFormat="1"/>
     <w:lsdException w:name="heading 2" w:semiHidden="1" w:uiPriority="9" w:unhideWhenUsed="1" w:qFormat="1"/>
@@ -3129,6 +3224,11 @@
     <w:lsdException w:name="List Table 5 Dark Accent 6" w:uiPriority="50"/>
     <w:lsdException w:name="List Table 6 Colorful Accent 6" w:uiPriority="51"/>
     <w:lsdException w:name="List Table 7 Colorful Accent 6" w:uiPriority="52"/>
+    <w:lsdException w:name="Mention" w:semiHidden="1" w:unhideWhenUsed="1"/>
+    <w:lsdException w:name="Smart Hyperlink" w:semiHidden="1" w:unhideWhenUsed="1"/>
+    <w:lsdException w:name="Hashtag" w:semiHidden="1" w:unhideWhenUsed="1"/>
+    <w:lsdException w:name="Unresolved Mention" w:semiHidden="1" w:unhideWhenUsed="1"/>
+    <w:lsdException w:name="Smart Link" w:semiHidden="1" w:unhideWhenUsed="1"/>
   </w:latentStyles>
   <w:style w:type="paragraph" w:default="1" w:styleId="Normal">
     <w:name w:val="Normal"/>
@@ -3785,28 +3885,28 @@
 </file>
 
 <file path=customXml/item1.xml><?xml version="1.0" encoding="utf-8"?>
+<b:Sources xmlns:b="http://schemas.openxmlformats.org/officeDocument/2006/bibliography" xmlns="http://schemas.openxmlformats.org/officeDocument/2006/bibliography" SelectedStyle="\APASixthEditionOfficeOnline.xsl" StyleName="APA" Version="6"/>
+</file>
+
+<file path=customXml/item2.xml><?xml version="1.0" encoding="utf-8"?>
 <go:gDocsCustomXmlDataStorage xmlns:go="http://customooxmlschemas.google.com/" xmlns:r="http://schemas.openxmlformats.org/officeDocument/2006/relationships" uri="GoogleDocsCustomDataVersion2">
   <go:docsCustomData xmlns:go="http://customooxmlschemas.google.com/" roundtripDataSignature="AMtx7mjac1FaFv6WV3g0GhcUIQ9kG0o+yg==">CgMxLjAyDmgubjh0aHd2ZHFzMTk0MghoLmdqZGd4czIOaC56N2hubnB1aWk1NDkyDWguc3hkdG9pMzhvYmkyDmguNWY0ZXAwcWVlOXRlMg5oLmVqdDhyOXF0bXp6djIOaC4yOWpnN3o3Y2I3bGIyDmguanM4cTNwM3I0eDZjMg5oLnYzbTFuaXhkbzBwejIOaC5wZzd4dGp6Y2t3dWkyDmgueTE0MHhvdmdnYml0Mg5oLjRocjAxMWhrOXVyNjIOaC5xMTI4N2VvNmMyd24yDmguODY5YjBrbWEwNmtsMg5oLm1hczdybXljNW82ejgAciExV3BDbUx3RGV0a2poVzFWLUZiZXdyanhaTmV2Wm8tWm0=</go:docsCustomData>
 </go:gDocsCustomXmlDataStorage>
 </file>
 
-<file path=customXml/item2.xml><?xml version="1.0" encoding="utf-8"?>
-<b:Sources xmlns:b="http://schemas.openxmlformats.org/officeDocument/2006/bibliography" xmlns="http://schemas.openxmlformats.org/officeDocument/2006/bibliography" SelectedStyle="\APASixthEditionOfficeOnline.xsl" StyleName="APA" Version="6"/>
+<file path=customXml/itemProps1.xml><?xml version="1.0" encoding="utf-8"?>
+<ds:datastoreItem xmlns:ds="http://schemas.openxmlformats.org/officeDocument/2006/customXml" ds:itemID="{D17ADB1C-BB67-458D-A072-D9E3A76A5AA9}">
+  <ds:schemaRefs>
+    <ds:schemaRef ds:uri="http://schemas.openxmlformats.org/officeDocument/2006/bibliography"/>
+  </ds:schemaRefs>
+</ds:datastoreItem>
 </file>
 
-<file path=customXml/itemProps1.xml><?xml version="1.0" encoding="utf-8"?>
+<file path=customXml/itemProps2.xml><?xml version="1.0" encoding="utf-8"?>
 <ds:datastoreItem xmlns:ds="http://schemas.openxmlformats.org/officeDocument/2006/customXml" ds:itemID="{11111111-1234-1234-1234-123412341234}">
   <ds:schemaRefs>
     <ds:schemaRef ds:uri="http://customooxmlschemas.google.com/"/>
     <ds:schemaRef ds:uri="http://schemas.openxmlformats.org/officeDocument/2006/relationships"/>
   </ds:schemaRefs>
 </ds:datastoreItem>
-</file>
-
-<file path=customXml/itemProps2.xml><?xml version="1.0" encoding="utf-8"?>
-<ds:datastoreItem xmlns:ds="http://schemas.openxmlformats.org/officeDocument/2006/customXml" ds:itemID="{D17ADB1C-BB67-458D-A072-D9E3A76A5AA9}">
-  <ds:schemaRefs>
-    <ds:schemaRef ds:uri="http://schemas.openxmlformats.org/officeDocument/2006/bibliography"/>
-  </ds:schemaRefs>
-</ds:datastoreItem>
 </file>
</xml_diff>

<commit_message>
fix logic; edit complaint-type warnings
</commit_message>
<xml_diff>
--- a/docassemble/MLHDivorceAndCustody/data/templates/instructions.docx
+++ b/docassemble/MLHDivorceAndCustody/data/templates/instructions.docx
@@ -7,45 +7,13 @@
         <w:pStyle w:val="Normalforinsertedinstructions"/>
       </w:pPr>
       <w:r>
-        <w:t>{{p include_docx_template('</w:t>
-      </w:r>
-      <w:proofErr w:type="gramStart"/>
-      <w:r>
-        <w:t>docassemble.mlhframework</w:t>
-      </w:r>
-      <w:proofErr w:type="gramEnd"/>
-      <w:r>
-        <w:t>:data/templates/cover_sheet_2.0.docx'</w:t>
-      </w:r>
-      <w:proofErr w:type="gramStart"/>
-      <w:r>
-        <w:t>) }</w:t>
-      </w:r>
-      <w:proofErr w:type="gramEnd"/>
-      <w:r>
-        <w:t>}</w:t>
+        <w:t>{{p include_docx_template('docassemble.mlhframework:data/templates/cover_sheet_2.0.docx') }}</w:t>
       </w:r>
     </w:p>
     <w:p/>
     <w:p>
       <w:r>
-        <w:t xml:space="preserve">{%p if </w:t>
-      </w:r>
-      <w:proofErr w:type="spellStart"/>
-      <w:r>
-        <w:t>tool_ID</w:t>
-      </w:r>
-      <w:proofErr w:type="spellEnd"/>
-      <w:r>
-        <w:t xml:space="preserve"> == “</w:t>
-      </w:r>
-      <w:proofErr w:type="spellStart"/>
-      <w:r>
-        <w:t>divorce_complaint</w:t>
-      </w:r>
-      <w:proofErr w:type="spellEnd"/>
-      <w:r>
-        <w:t>” %}</w:t>
+        <w:t>{%p if tool_ID == “divorce_complaint” %}</w:t>
       </w:r>
     </w:p>
     <w:p>
@@ -116,31 +84,7 @@
     </w:p>
     <w:p>
       <w:r>
-        <w:t xml:space="preserve">{%p </w:t>
-      </w:r>
-      <w:proofErr w:type="spellStart"/>
-      <w:r>
-        <w:t>elif</w:t>
-      </w:r>
-      <w:proofErr w:type="spellEnd"/>
-      <w:r>
-        <w:t xml:space="preserve"> </w:t>
-      </w:r>
-      <w:proofErr w:type="spellStart"/>
-      <w:r>
-        <w:t>tool_ID</w:t>
-      </w:r>
-      <w:proofErr w:type="spellEnd"/>
-      <w:r>
-        <w:t xml:space="preserve"> == “</w:t>
-      </w:r>
-      <w:proofErr w:type="spellStart"/>
-      <w:r>
-        <w:t>JOD_only</w:t>
-      </w:r>
-      <w:proofErr w:type="spellEnd"/>
-      <w:r>
-        <w:t>” %}</w:t>
+        <w:t>{%p elif tool_ID == “JOD_only” %}</w:t>
       </w:r>
     </w:p>
     <w:p>
@@ -208,7 +152,13 @@
     </w:p>
     <w:p>
       <w:r>
-        <w:t>{%p endif %}</w:t>
+        <w:t>{%p elif tool_ID == “</w:t>
+      </w:r>
+      <w:r>
+        <w:t>divorce_answer</w:t>
+      </w:r>
+      <w:r>
+        <w:t>” %}</w:t>
       </w:r>
     </w:p>
     <w:p>
@@ -220,20 +170,89 @@
       <w:pPr>
         <w:jc w:val="center"/>
       </w:pPr>
+      <w:r>
+        <w:drawing>
+          <wp:inline distT="0" distB="0" distL="0" distR="0" wp14:anchorId="773F6699" wp14:editId="62A8263F">
+            <wp:extent cx="1162050" cy="1162050"/>
+            <wp:effectExtent l="0" t="0" r="0" b="0"/>
+            <wp:docPr id="398336805" name="Picture 2" descr="Survey QR Code"/>
+            <wp:cNvGraphicFramePr>
+              <a:graphicFrameLocks xmlns:a="http://schemas.openxmlformats.org/drawingml/2006/main" noChangeAspect="1"/>
+            </wp:cNvGraphicFramePr>
+            <a:graphic xmlns:a="http://schemas.openxmlformats.org/drawingml/2006/main">
+              <a:graphicData uri="http://schemas.openxmlformats.org/drawingml/2006/picture">
+                <pic:pic xmlns:pic="http://schemas.openxmlformats.org/drawingml/2006/picture">
+                  <pic:nvPicPr>
+                    <pic:cNvPr id="398336805" name="Picture 2" descr="Survey QR Code"/>
+                    <pic:cNvPicPr>
+                      <a:picLocks noChangeAspect="1" noChangeArrowheads="1"/>
+                    </pic:cNvPicPr>
+                  </pic:nvPicPr>
+                  <pic:blipFill rotWithShape="1">
+                    <a:blip r:embed="rId9">
+                      <a:extLst>
+                        <a:ext uri="{28A0092B-C50C-407E-A947-70E740481C1C}">
+                          <a14:useLocalDpi xmlns:a14="http://schemas.microsoft.com/office/drawing/2010/main" val="0"/>
+                        </a:ext>
+                      </a:extLst>
+                    </a:blip>
+                    <a:srcRect l="9933" t="9934" r="9271" b="9273"/>
+                    <a:stretch>
+                      <a:fillRect/>
+                    </a:stretch>
+                  </pic:blipFill>
+                  <pic:spPr bwMode="auto">
+                    <a:xfrm>
+                      <a:off x="0" y="0"/>
+                      <a:ext cx="1162050" cy="1162050"/>
+                    </a:xfrm>
+                    <a:prstGeom prst="rect">
+                      <a:avLst/>
+                    </a:prstGeom>
+                    <a:noFill/>
+                    <a:ln>
+                      <a:noFill/>
+                    </a:ln>
+                    <a:extLst>
+                      <a:ext uri="{53640926-AAD7-44D8-BBD7-CCE9431645EC}">
+                        <a14:shadowObscured xmlns:a14="http://schemas.microsoft.com/office/drawing/2010/main"/>
+                      </a:ext>
+                    </a:extLst>
+                  </pic:spPr>
+                </pic:pic>
+              </a:graphicData>
+            </a:graphic>
+          </wp:inline>
+        </w:drawing>
+      </w:r>
     </w:p>
     <w:p>
-      <w:pPr>
-        <w:jc w:val="center"/>
-      </w:pPr>
+      <w:r>
+        <w:t>{%p endif %}</w:t>
+      </w:r>
     </w:p>
     <w:p>
       <w:pPr>
+        <w:jc w:val="center"/>
+      </w:pPr>
+    </w:p>
+    <w:p>
+      <w:pPr>
+        <w:jc w:val="center"/>
+      </w:pPr>
+    </w:p>
+    <w:p>
+      <w:pPr>
+        <w:jc w:val="center"/>
+      </w:pPr>
+    </w:p>
+    <w:p>
+      <w:pPr>
         <w:rPr>
           <w:rFonts w:asciiTheme="minorHAnsi" w:hAnsiTheme="minorHAnsi" w:cstheme="minorHAnsi"/>
           <w:szCs w:val="28"/>
         </w:rPr>
       </w:pPr>
-      <w:proofErr w:type="gramStart"/>
       <w:r>
         <w:rPr>
           <w:rFonts w:cs="Times New Roman"/>
@@ -255,40 +274,145 @@
           <w:noProof/>
           <w:szCs w:val="28"/>
         </w:rPr>
-        <w:t>cover</w:t>
-      </w:r>
-      <w:proofErr w:type="gramEnd"/>
-      <w:r>
-        <w:rPr>
-          <w:rFonts w:asciiTheme="minorHAnsi" w:hAnsiTheme="minorHAnsi" w:cstheme="minorHAnsi"/>
-          <w:noProof/>
-          <w:szCs w:val="28"/>
-        </w:rPr>
-        <w:t>_sheet_</w:t>
-      </w:r>
-      <w:proofErr w:type="gramStart"/>
-      <w:r>
-        <w:rPr>
-          <w:rFonts w:asciiTheme="minorHAnsi" w:hAnsiTheme="minorHAnsi" w:cstheme="minorHAnsi"/>
-          <w:noProof/>
-          <w:szCs w:val="28"/>
-        </w:rPr>
-        <w:t xml:space="preserve">thanks </w:t>
+        <w:t xml:space="preserve">cover_sheet_thanks </w:t>
       </w:r>
       <w:r>
         <w:rPr>
           <w:rFonts w:asciiTheme="minorHAnsi" w:hAnsiTheme="minorHAnsi" w:cstheme="minorHAnsi"/>
           <w:szCs w:val="28"/>
         </w:rPr>
-        <w:t>}</w:t>
-      </w:r>
-      <w:proofErr w:type="gramEnd"/>
-      <w:r>
+        <w:t>}}</w:t>
+      </w:r>
+    </w:p>
+    <w:p>
+      <w:pPr>
         <w:rPr>
           <w:rFonts w:asciiTheme="minorHAnsi" w:hAnsiTheme="minorHAnsi" w:cstheme="minorHAnsi"/>
           <w:szCs w:val="28"/>
         </w:rPr>
-        <w:t>}</w:t>
+      </w:pPr>
+      <w:r>
+        <w:rPr>
+          <w:rFonts w:asciiTheme="minorHAnsi" w:hAnsiTheme="minorHAnsi" w:cstheme="minorHAnsi"/>
+          <w:szCs w:val="28"/>
+        </w:rPr>
+        <w:t xml:space="preserve">{%p if tool_ID </w:t>
+      </w:r>
+      <w:r>
+        <w:rPr>
+          <w:rFonts w:asciiTheme="minorHAnsi" w:hAnsiTheme="minorHAnsi" w:cstheme="minorHAnsi"/>
+          <w:szCs w:val="28"/>
+        </w:rPr>
+        <w:t>in [</w:t>
+      </w:r>
+      <w:r>
+        <w:rPr>
+          <w:rFonts w:asciiTheme="minorHAnsi" w:hAnsiTheme="minorHAnsi" w:cstheme="minorHAnsi"/>
+          <w:szCs w:val="28"/>
+        </w:rPr>
+        <w:t>“divorce_complaint”</w:t>
+      </w:r>
+      <w:r>
+        <w:rPr>
+          <w:rFonts w:asciiTheme="minorHAnsi" w:hAnsiTheme="minorHAnsi" w:cstheme="minorHAnsi"/>
+          <w:szCs w:val="28"/>
+        </w:rPr>
+        <w:t>, “divorce_answer”]</w:t>
+      </w:r>
+      <w:r>
+        <w:rPr>
+          <w:rFonts w:asciiTheme="minorHAnsi" w:hAnsiTheme="minorHAnsi" w:cstheme="minorHAnsi"/>
+          <w:szCs w:val="28"/>
+        </w:rPr>
+        <w:t xml:space="preserve"> </w:t>
+      </w:r>
+      <w:r>
+        <w:rPr>
+          <w:rFonts w:asciiTheme="minorHAnsi" w:hAnsiTheme="minorHAnsi" w:cstheme="minorHAnsi"/>
+          <w:szCs w:val="28"/>
+        </w:rPr>
+        <w:t xml:space="preserve">or (tool_ID == “JOD_only” and </w:t>
+      </w:r>
+      <w:r>
+        <w:rPr>
+          <w:rFonts w:asciiTheme="minorHAnsi" w:hAnsiTheme="minorHAnsi" w:cstheme="minorHAnsi"/>
+          <w:szCs w:val="28"/>
+        </w:rPr>
+        <w:t>(</w:t>
+      </w:r>
+      <w:r>
+        <w:rPr>
+          <w:rFonts w:asciiTheme="minorHAnsi" w:hAnsiTheme="minorHAnsi" w:cstheme="minorHAnsi"/>
+          <w:szCs w:val="28"/>
+        </w:rPr>
+        <w:t>(marriage.have_pension_retirement and not marriage.pension_retirement_accounts_keep_own) or (</w:t>
+      </w:r>
+      <w:r>
+        <w:rPr>
+          <w:rFonts w:asciiTheme="minorHAnsi" w:hAnsiTheme="minorHAnsi" w:cstheme="minorHAnsi"/>
+        </w:rPr>
+        <w:t>marriage.personal_property_need_items and marriage.accounts.filter(trigger_investment_reminder=True) | length &gt; 0</w:t>
+      </w:r>
+      <w:r>
+        <w:rPr>
+          <w:rFonts w:asciiTheme="minorHAnsi" w:hAnsiTheme="minorHAnsi" w:cstheme="minorHAnsi"/>
+          <w:szCs w:val="28"/>
+        </w:rPr>
+        <w:t>) or (</w:t>
+      </w:r>
+      <w:r>
+        <w:rPr>
+          <w:rFonts w:asciiTheme="minorHAnsi" w:hAnsiTheme="minorHAnsi" w:cstheme="minorHAnsi"/>
+        </w:rPr>
+        <w:t>there_are_marital_children and (parentage_affidavit_revoke or parentage_order_revoke or parentage_marital_revoke)</w:t>
+      </w:r>
+      <w:r>
+        <w:rPr>
+          <w:rFonts w:asciiTheme="minorHAnsi" w:hAnsiTheme="minorHAnsi" w:cstheme="minorHAnsi"/>
+          <w:szCs w:val="28"/>
+        </w:rPr>
+        <w:t>) or (</w:t>
+      </w:r>
+      <w:r>
+        <w:rPr>
+          <w:rFonts w:asciiTheme="minorHAnsi" w:hAnsiTheme="minorHAnsi" w:cstheme="minorHAnsi"/>
+        </w:rPr>
+        <w:t>there_are_marital_children and not MI_has_jurisdiction_all_kids</w:t>
+      </w:r>
+      <w:r>
+        <w:rPr>
+          <w:rFonts w:asciiTheme="minorHAnsi" w:hAnsiTheme="minorHAnsi" w:cstheme="minorHAnsi"/>
+          <w:szCs w:val="28"/>
+        </w:rPr>
+        <w:t>)</w:t>
+      </w:r>
+      <w:r>
+        <w:rPr>
+          <w:rFonts w:asciiTheme="minorHAnsi" w:hAnsiTheme="minorHAnsi" w:cstheme="minorHAnsi"/>
+          <w:szCs w:val="28"/>
+        </w:rPr>
+        <w:t>)</w:t>
+      </w:r>
+      <w:r>
+        <w:rPr>
+          <w:rFonts w:asciiTheme="minorHAnsi" w:hAnsiTheme="minorHAnsi" w:cstheme="minorHAnsi"/>
+          <w:szCs w:val="28"/>
+        </w:rPr>
+        <w:t>)</w:t>
+      </w:r>
+      <w:r>
+        <w:rPr>
+          <w:rFonts w:asciiTheme="minorHAnsi" w:hAnsiTheme="minorHAnsi" w:cstheme="minorHAnsi"/>
+          <w:szCs w:val="28"/>
+        </w:rPr>
+        <w:t xml:space="preserve"> </w:t>
+      </w:r>
+      <w:r>
+        <w:rPr>
+          <w:rFonts w:asciiTheme="minorHAnsi" w:hAnsiTheme="minorHAnsi" w:cstheme="minorHAnsi"/>
+          <w:szCs w:val="28"/>
+        </w:rPr>
+        <w:t>%}</w:t>
       </w:r>
     </w:p>
     <w:p>
@@ -303,352 +427,22 @@
           <w:rFonts w:asciiTheme="minorHAnsi" w:hAnsiTheme="minorHAnsi" w:cstheme="minorHAnsi"/>
           <w:szCs w:val="28"/>
         </w:rPr>
-        <w:t xml:space="preserve">{%p if </w:t>
-      </w:r>
-      <w:proofErr w:type="spellStart"/>
-      <w:r>
-        <w:rPr>
-          <w:rFonts w:asciiTheme="minorHAnsi" w:hAnsiTheme="minorHAnsi" w:cstheme="minorHAnsi"/>
-          <w:szCs w:val="28"/>
-        </w:rPr>
-        <w:t>tool_ID</w:t>
-      </w:r>
-      <w:proofErr w:type="spellEnd"/>
-      <w:r>
-        <w:rPr>
-          <w:rFonts w:asciiTheme="minorHAnsi" w:hAnsiTheme="minorHAnsi" w:cstheme="minorHAnsi"/>
-          <w:szCs w:val="28"/>
-        </w:rPr>
-        <w:t xml:space="preserve"> </w:t>
-      </w:r>
-      <w:r>
-        <w:rPr>
-          <w:rFonts w:asciiTheme="minorHAnsi" w:hAnsiTheme="minorHAnsi" w:cstheme="minorHAnsi"/>
-          <w:szCs w:val="28"/>
-        </w:rPr>
-        <w:t>in [</w:t>
-      </w:r>
-      <w:r>
-        <w:rPr>
-          <w:rFonts w:asciiTheme="minorHAnsi" w:hAnsiTheme="minorHAnsi" w:cstheme="minorHAnsi"/>
-          <w:szCs w:val="28"/>
-        </w:rPr>
-        <w:t>“</w:t>
-      </w:r>
-      <w:proofErr w:type="spellStart"/>
-      <w:r>
-        <w:rPr>
-          <w:rFonts w:asciiTheme="minorHAnsi" w:hAnsiTheme="minorHAnsi" w:cstheme="minorHAnsi"/>
-          <w:szCs w:val="28"/>
-        </w:rPr>
-        <w:t>divorce_complaint</w:t>
-      </w:r>
-      <w:proofErr w:type="spellEnd"/>
-      <w:r>
-        <w:rPr>
-          <w:rFonts w:asciiTheme="minorHAnsi" w:hAnsiTheme="minorHAnsi" w:cstheme="minorHAnsi"/>
-          <w:szCs w:val="28"/>
-        </w:rPr>
-        <w:t>”</w:t>
-      </w:r>
-      <w:r>
-        <w:rPr>
-          <w:rFonts w:asciiTheme="minorHAnsi" w:hAnsiTheme="minorHAnsi" w:cstheme="minorHAnsi"/>
-          <w:szCs w:val="28"/>
-        </w:rPr>
-        <w:t>, “</w:t>
-      </w:r>
-      <w:proofErr w:type="spellStart"/>
-      <w:r>
-        <w:rPr>
-          <w:rFonts w:asciiTheme="minorHAnsi" w:hAnsiTheme="minorHAnsi" w:cstheme="minorHAnsi"/>
-          <w:szCs w:val="28"/>
-        </w:rPr>
-        <w:t>divorce_answer</w:t>
-      </w:r>
-      <w:proofErr w:type="spellEnd"/>
-      <w:r>
-        <w:rPr>
-          <w:rFonts w:asciiTheme="minorHAnsi" w:hAnsiTheme="minorHAnsi" w:cstheme="minorHAnsi"/>
-          <w:szCs w:val="28"/>
-        </w:rPr>
-        <w:t>”]</w:t>
-      </w:r>
-      <w:r>
-        <w:rPr>
-          <w:rFonts w:asciiTheme="minorHAnsi" w:hAnsiTheme="minorHAnsi" w:cstheme="minorHAnsi"/>
-          <w:szCs w:val="28"/>
-        </w:rPr>
-        <w:t xml:space="preserve"> </w:t>
-      </w:r>
-      <w:r>
-        <w:rPr>
-          <w:rFonts w:asciiTheme="minorHAnsi" w:hAnsiTheme="minorHAnsi" w:cstheme="minorHAnsi"/>
-          <w:szCs w:val="28"/>
-        </w:rPr>
-        <w:t>or (</w:t>
-      </w:r>
-      <w:proofErr w:type="spellStart"/>
-      <w:r>
-        <w:rPr>
-          <w:rFonts w:asciiTheme="minorHAnsi" w:hAnsiTheme="minorHAnsi" w:cstheme="minorHAnsi"/>
-          <w:szCs w:val="28"/>
-        </w:rPr>
-        <w:t>tool_ID</w:t>
-      </w:r>
-      <w:proofErr w:type="spellEnd"/>
-      <w:r>
-        <w:rPr>
-          <w:rFonts w:asciiTheme="minorHAnsi" w:hAnsiTheme="minorHAnsi" w:cstheme="minorHAnsi"/>
-          <w:szCs w:val="28"/>
-        </w:rPr>
-        <w:t xml:space="preserve"> == “</w:t>
-      </w:r>
-      <w:proofErr w:type="spellStart"/>
-      <w:r>
-        <w:rPr>
-          <w:rFonts w:asciiTheme="minorHAnsi" w:hAnsiTheme="minorHAnsi" w:cstheme="minorHAnsi"/>
-          <w:szCs w:val="28"/>
-        </w:rPr>
-        <w:t>JOD_only</w:t>
-      </w:r>
-      <w:proofErr w:type="spellEnd"/>
-      <w:r>
-        <w:rPr>
-          <w:rFonts w:asciiTheme="minorHAnsi" w:hAnsiTheme="minorHAnsi" w:cstheme="minorHAnsi"/>
-          <w:szCs w:val="28"/>
-        </w:rPr>
-        <w:t xml:space="preserve">” and </w:t>
-      </w:r>
-      <w:r>
-        <w:rPr>
-          <w:rFonts w:asciiTheme="minorHAnsi" w:hAnsiTheme="minorHAnsi" w:cstheme="minorHAnsi"/>
-          <w:szCs w:val="28"/>
-        </w:rPr>
-        <w:t>(</w:t>
-      </w:r>
-      <w:r>
-        <w:rPr>
-          <w:rFonts w:asciiTheme="minorHAnsi" w:hAnsiTheme="minorHAnsi" w:cstheme="minorHAnsi"/>
-          <w:szCs w:val="28"/>
-        </w:rPr>
-        <w:t>(</w:t>
-      </w:r>
-      <w:proofErr w:type="spellStart"/>
-      <w:r>
-        <w:rPr>
-          <w:rFonts w:asciiTheme="minorHAnsi" w:hAnsiTheme="minorHAnsi" w:cstheme="minorHAnsi"/>
-          <w:szCs w:val="28"/>
-        </w:rPr>
-        <w:t>marriage.have_pension_retirement</w:t>
-      </w:r>
-      <w:proofErr w:type="spellEnd"/>
-      <w:r>
-        <w:rPr>
-          <w:rFonts w:asciiTheme="minorHAnsi" w:hAnsiTheme="minorHAnsi" w:cstheme="minorHAnsi"/>
-          <w:szCs w:val="28"/>
-        </w:rPr>
-        <w:t xml:space="preserve"> and not </w:t>
-      </w:r>
-      <w:proofErr w:type="spellStart"/>
-      <w:r>
-        <w:rPr>
-          <w:rFonts w:asciiTheme="minorHAnsi" w:hAnsiTheme="minorHAnsi" w:cstheme="minorHAnsi"/>
-          <w:szCs w:val="28"/>
-        </w:rPr>
-        <w:t>marriage.pension_retirement_accounts_keep_own</w:t>
-      </w:r>
-      <w:proofErr w:type="spellEnd"/>
-      <w:r>
-        <w:rPr>
-          <w:rFonts w:asciiTheme="minorHAnsi" w:hAnsiTheme="minorHAnsi" w:cstheme="minorHAnsi"/>
-          <w:szCs w:val="28"/>
-        </w:rPr>
-        <w:t>) or (</w:t>
-      </w:r>
-      <w:proofErr w:type="spellStart"/>
-      <w:r>
-        <w:rPr>
-          <w:rFonts w:asciiTheme="minorHAnsi" w:hAnsiTheme="minorHAnsi" w:cstheme="minorHAnsi"/>
-        </w:rPr>
-        <w:t>marriage.personal_property_need_items</w:t>
-      </w:r>
-      <w:proofErr w:type="spellEnd"/>
-      <w:r>
-        <w:rPr>
-          <w:rFonts w:asciiTheme="minorHAnsi" w:hAnsiTheme="minorHAnsi" w:cstheme="minorHAnsi"/>
-        </w:rPr>
-        <w:t xml:space="preserve"> and </w:t>
-      </w:r>
-      <w:proofErr w:type="spellStart"/>
-      <w:r>
-        <w:rPr>
-          <w:rFonts w:asciiTheme="minorHAnsi" w:hAnsiTheme="minorHAnsi" w:cstheme="minorHAnsi"/>
-        </w:rPr>
-        <w:t>marriage.accounts.filter</w:t>
-      </w:r>
-      <w:proofErr w:type="spellEnd"/>
-      <w:r>
-        <w:rPr>
-          <w:rFonts w:asciiTheme="minorHAnsi" w:hAnsiTheme="minorHAnsi" w:cstheme="minorHAnsi"/>
-        </w:rPr>
-        <w:t>(</w:t>
-      </w:r>
-      <w:proofErr w:type="spellStart"/>
-      <w:r>
-        <w:rPr>
-          <w:rFonts w:asciiTheme="minorHAnsi" w:hAnsiTheme="minorHAnsi" w:cstheme="minorHAnsi"/>
-        </w:rPr>
-        <w:t>trigger_investment_reminder</w:t>
-      </w:r>
-      <w:proofErr w:type="spellEnd"/>
-      <w:r>
-        <w:rPr>
-          <w:rFonts w:asciiTheme="minorHAnsi" w:hAnsiTheme="minorHAnsi" w:cstheme="minorHAnsi"/>
-        </w:rPr>
-        <w:t>=True) | length &gt; 0</w:t>
-      </w:r>
-      <w:r>
-        <w:rPr>
-          <w:rFonts w:asciiTheme="minorHAnsi" w:hAnsiTheme="minorHAnsi" w:cstheme="minorHAnsi"/>
-          <w:szCs w:val="28"/>
-        </w:rPr>
-        <w:t>) or (</w:t>
-      </w:r>
-      <w:proofErr w:type="spellStart"/>
-      <w:r>
-        <w:rPr>
-          <w:rFonts w:asciiTheme="minorHAnsi" w:hAnsiTheme="minorHAnsi" w:cstheme="minorHAnsi"/>
-        </w:rPr>
-        <w:t>there_are_marital_children</w:t>
-      </w:r>
-      <w:proofErr w:type="spellEnd"/>
-      <w:r>
-        <w:rPr>
-          <w:rFonts w:asciiTheme="minorHAnsi" w:hAnsiTheme="minorHAnsi" w:cstheme="minorHAnsi"/>
-        </w:rPr>
-        <w:t xml:space="preserve"> and (</w:t>
-      </w:r>
-      <w:proofErr w:type="spellStart"/>
-      <w:r>
-        <w:rPr>
-          <w:rFonts w:asciiTheme="minorHAnsi" w:hAnsiTheme="minorHAnsi" w:cstheme="minorHAnsi"/>
-        </w:rPr>
-        <w:t>parentage_affidavit_revoke</w:t>
-      </w:r>
-      <w:proofErr w:type="spellEnd"/>
-      <w:r>
-        <w:rPr>
-          <w:rFonts w:asciiTheme="minorHAnsi" w:hAnsiTheme="minorHAnsi" w:cstheme="minorHAnsi"/>
-        </w:rPr>
-        <w:t xml:space="preserve"> or </w:t>
-      </w:r>
-      <w:proofErr w:type="spellStart"/>
-      <w:r>
-        <w:rPr>
-          <w:rFonts w:asciiTheme="minorHAnsi" w:hAnsiTheme="minorHAnsi" w:cstheme="minorHAnsi"/>
-        </w:rPr>
-        <w:t>parentage_order_revoke</w:t>
-      </w:r>
-      <w:proofErr w:type="spellEnd"/>
-      <w:r>
-        <w:rPr>
-          <w:rFonts w:asciiTheme="minorHAnsi" w:hAnsiTheme="minorHAnsi" w:cstheme="minorHAnsi"/>
-        </w:rPr>
-        <w:t xml:space="preserve"> or </w:t>
-      </w:r>
-      <w:proofErr w:type="spellStart"/>
-      <w:r>
-        <w:rPr>
-          <w:rFonts w:asciiTheme="minorHAnsi" w:hAnsiTheme="minorHAnsi" w:cstheme="minorHAnsi"/>
-        </w:rPr>
-        <w:t>parentage_marital_revoke</w:t>
-      </w:r>
-      <w:proofErr w:type="spellEnd"/>
-      <w:r>
-        <w:rPr>
-          <w:rFonts w:asciiTheme="minorHAnsi" w:hAnsiTheme="minorHAnsi" w:cstheme="minorHAnsi"/>
-        </w:rPr>
-        <w:t>)</w:t>
-      </w:r>
-      <w:r>
-        <w:rPr>
-          <w:rFonts w:asciiTheme="minorHAnsi" w:hAnsiTheme="minorHAnsi" w:cstheme="minorHAnsi"/>
-          <w:szCs w:val="28"/>
-        </w:rPr>
-        <w:t>) or (</w:t>
-      </w:r>
-      <w:proofErr w:type="spellStart"/>
-      <w:r>
-        <w:rPr>
-          <w:rFonts w:asciiTheme="minorHAnsi" w:hAnsiTheme="minorHAnsi" w:cstheme="minorHAnsi"/>
-        </w:rPr>
-        <w:t>there_are_marital_children</w:t>
-      </w:r>
-      <w:proofErr w:type="spellEnd"/>
-      <w:r>
-        <w:rPr>
-          <w:rFonts w:asciiTheme="minorHAnsi" w:hAnsiTheme="minorHAnsi" w:cstheme="minorHAnsi"/>
-        </w:rPr>
-        <w:t xml:space="preserve"> and not </w:t>
-      </w:r>
-      <w:proofErr w:type="spellStart"/>
-      <w:r>
-        <w:rPr>
-          <w:rFonts w:asciiTheme="minorHAnsi" w:hAnsiTheme="minorHAnsi" w:cstheme="minorHAnsi"/>
-        </w:rPr>
-        <w:t>MI_has_jurisdiction_all_kids</w:t>
-      </w:r>
-      <w:proofErr w:type="spellEnd"/>
-      <w:r>
-        <w:rPr>
-          <w:rFonts w:asciiTheme="minorHAnsi" w:hAnsiTheme="minorHAnsi" w:cstheme="minorHAnsi"/>
-          <w:szCs w:val="28"/>
-        </w:rPr>
-        <w:t>)</w:t>
-      </w:r>
-      <w:r>
-        <w:rPr>
-          <w:rFonts w:asciiTheme="minorHAnsi" w:hAnsiTheme="minorHAnsi" w:cstheme="minorHAnsi"/>
-          <w:szCs w:val="28"/>
-        </w:rPr>
-        <w:t>)</w:t>
-      </w:r>
-      <w:r>
-        <w:rPr>
-          <w:rFonts w:asciiTheme="minorHAnsi" w:hAnsiTheme="minorHAnsi" w:cstheme="minorHAnsi"/>
-          <w:szCs w:val="28"/>
-        </w:rPr>
-        <w:t>)</w:t>
-      </w:r>
-      <w:r>
-        <w:rPr>
-          <w:rFonts w:asciiTheme="minorHAnsi" w:hAnsiTheme="minorHAnsi" w:cstheme="minorHAnsi"/>
-          <w:szCs w:val="28"/>
-        </w:rPr>
-        <w:t xml:space="preserve"> </w:t>
-      </w:r>
-      <w:r>
-        <w:rPr>
-          <w:rFonts w:asciiTheme="minorHAnsi" w:hAnsiTheme="minorHAnsi" w:cstheme="minorHAnsi"/>
-          <w:szCs w:val="28"/>
-        </w:rPr>
-        <w:t>%}</w:t>
+        <w:br w:type="page"/>
       </w:r>
     </w:p>
     <w:p>
       <w:pPr>
+        <w:pStyle w:val="Normalforinsertedinstructions"/>
         <w:rPr>
           <w:rFonts w:asciiTheme="minorHAnsi" w:hAnsiTheme="minorHAnsi" w:cstheme="minorHAnsi"/>
-          <w:szCs w:val="28"/>
         </w:rPr>
       </w:pPr>
       <w:r>
         <w:rPr>
           <w:rFonts w:asciiTheme="minorHAnsi" w:hAnsiTheme="minorHAnsi" w:cstheme="minorHAnsi"/>
-          <w:szCs w:val="28"/>
-        </w:rPr>
-        <w:br w:type="page"/>
+        </w:rPr>
+        <w:lastRenderedPageBreak/>
+        <w:t>{{p include_docx_template(‘reminders_template.docx’) }}</w:t>
       </w:r>
     </w:p>
     <w:p>
@@ -662,50 +456,7 @@
         <w:rPr>
           <w:rFonts w:asciiTheme="minorHAnsi" w:hAnsiTheme="minorHAnsi" w:cstheme="minorHAnsi"/>
         </w:rPr>
-        <w:lastRenderedPageBreak/>
-        <w:t xml:space="preserve">{{p </w:t>
-      </w:r>
-      <w:proofErr w:type="spellStart"/>
-      <w:r>
-        <w:rPr>
-          <w:rFonts w:asciiTheme="minorHAnsi" w:hAnsiTheme="minorHAnsi" w:cstheme="minorHAnsi"/>
-        </w:rPr>
-        <w:t>include_docx_</w:t>
-      </w:r>
-      <w:proofErr w:type="gramStart"/>
-      <w:r>
-        <w:rPr>
-          <w:rFonts w:asciiTheme="minorHAnsi" w:hAnsiTheme="minorHAnsi" w:cstheme="minorHAnsi"/>
-        </w:rPr>
-        <w:t>template</w:t>
-      </w:r>
-      <w:proofErr w:type="spellEnd"/>
-      <w:r>
-        <w:rPr>
-          <w:rFonts w:asciiTheme="minorHAnsi" w:hAnsiTheme="minorHAnsi" w:cstheme="minorHAnsi"/>
-        </w:rPr>
-        <w:t>(‘</w:t>
-      </w:r>
-      <w:proofErr w:type="gramEnd"/>
-      <w:r>
-        <w:rPr>
-          <w:rFonts w:asciiTheme="minorHAnsi" w:hAnsiTheme="minorHAnsi" w:cstheme="minorHAnsi"/>
-        </w:rPr>
-        <w:t>reminders_template.docx’</w:t>
-      </w:r>
-      <w:proofErr w:type="gramStart"/>
-      <w:r>
-        <w:rPr>
-          <w:rFonts w:asciiTheme="minorHAnsi" w:hAnsiTheme="minorHAnsi" w:cstheme="minorHAnsi"/>
-        </w:rPr>
-        <w:t>) }</w:t>
-      </w:r>
-      <w:proofErr w:type="gramEnd"/>
-      <w:r>
-        <w:rPr>
-          <w:rFonts w:asciiTheme="minorHAnsi" w:hAnsiTheme="minorHAnsi" w:cstheme="minorHAnsi"/>
-        </w:rPr>
-        <w:t>}</w:t>
+        <w:t>{%p endif %}</w:t>
       </w:r>
     </w:p>
     <w:p>
@@ -719,94 +470,48 @@
         <w:rPr>
           <w:rFonts w:asciiTheme="minorHAnsi" w:hAnsiTheme="minorHAnsi" w:cstheme="minorHAnsi"/>
         </w:rPr>
-        <w:t>{%p endif %}</w:t>
+        <w:t>{%p if tool_ID == "divorce_complaint"</w:t>
+      </w:r>
+      <w:r>
+        <w:rPr>
+          <w:rFonts w:asciiTheme="minorHAnsi" w:hAnsiTheme="minorHAnsi" w:cstheme="minorHAnsi"/>
+        </w:rPr>
+        <w:t xml:space="preserve"> or tool_ID == “divorce_answer”</w:t>
+      </w:r>
+      <w:r>
+        <w:rPr>
+          <w:rFonts w:asciiTheme="minorHAnsi" w:hAnsiTheme="minorHAnsi" w:cstheme="minorHAnsi"/>
+        </w:rPr>
+        <w:t xml:space="preserve"> %}</w:t>
       </w:r>
     </w:p>
     <w:p>
-      <w:pPr>
-        <w:pStyle w:val="Normalforinsertedinstructions"/>
-        <w:rPr>
-          <w:rFonts w:asciiTheme="minorHAnsi" w:hAnsiTheme="minorHAnsi" w:cstheme="minorHAnsi"/>
-        </w:rPr>
-      </w:pPr>
-      <w:r>
-        <w:rPr>
-          <w:rFonts w:asciiTheme="minorHAnsi" w:hAnsiTheme="minorHAnsi" w:cstheme="minorHAnsi"/>
-        </w:rPr>
-        <w:t xml:space="preserve">{%p if </w:t>
-      </w:r>
-      <w:proofErr w:type="spellStart"/>
-      <w:r>
-        <w:rPr>
-          <w:rFonts w:asciiTheme="minorHAnsi" w:hAnsiTheme="minorHAnsi" w:cstheme="minorHAnsi"/>
-        </w:rPr>
-        <w:t>tool_ID</w:t>
-      </w:r>
-      <w:proofErr w:type="spellEnd"/>
-      <w:r>
-        <w:rPr>
-          <w:rFonts w:asciiTheme="minorHAnsi" w:hAnsiTheme="minorHAnsi" w:cstheme="minorHAnsi"/>
-        </w:rPr>
-        <w:t xml:space="preserve"> == "</w:t>
-      </w:r>
-      <w:proofErr w:type="spellStart"/>
-      <w:r>
-        <w:rPr>
-          <w:rFonts w:asciiTheme="minorHAnsi" w:hAnsiTheme="minorHAnsi" w:cstheme="minorHAnsi"/>
-        </w:rPr>
-        <w:t>divorce_complaint</w:t>
-      </w:r>
-      <w:proofErr w:type="spellEnd"/>
-      <w:r>
-        <w:rPr>
-          <w:rFonts w:asciiTheme="minorHAnsi" w:hAnsiTheme="minorHAnsi" w:cstheme="minorHAnsi"/>
-        </w:rPr>
-        <w:t>"</w:t>
-      </w:r>
-      <w:r>
-        <w:rPr>
-          <w:rFonts w:asciiTheme="minorHAnsi" w:hAnsiTheme="minorHAnsi" w:cstheme="minorHAnsi"/>
-        </w:rPr>
-        <w:t xml:space="preserve"> or </w:t>
-      </w:r>
-      <w:proofErr w:type="spellStart"/>
-      <w:r>
-        <w:rPr>
-          <w:rFonts w:asciiTheme="minorHAnsi" w:hAnsiTheme="minorHAnsi" w:cstheme="minorHAnsi"/>
-        </w:rPr>
-        <w:t>tool_ID</w:t>
-      </w:r>
-      <w:proofErr w:type="spellEnd"/>
-      <w:r>
-        <w:rPr>
-          <w:rFonts w:asciiTheme="minorHAnsi" w:hAnsiTheme="minorHAnsi" w:cstheme="minorHAnsi"/>
-        </w:rPr>
-        <w:t xml:space="preserve"> == “</w:t>
-      </w:r>
-      <w:proofErr w:type="spellStart"/>
-      <w:r>
-        <w:rPr>
-          <w:rFonts w:asciiTheme="minorHAnsi" w:hAnsiTheme="minorHAnsi" w:cstheme="minorHAnsi"/>
-        </w:rPr>
-        <w:t>divorce_answer</w:t>
-      </w:r>
-      <w:proofErr w:type="spellEnd"/>
-      <w:r>
-        <w:rPr>
-          <w:rFonts w:asciiTheme="minorHAnsi" w:hAnsiTheme="minorHAnsi" w:cstheme="minorHAnsi"/>
-        </w:rPr>
-        <w:t>”</w:t>
-      </w:r>
-      <w:r>
-        <w:rPr>
-          <w:rFonts w:asciiTheme="minorHAnsi" w:hAnsiTheme="minorHAnsi" w:cstheme="minorHAnsi"/>
-        </w:rPr>
-        <w:t xml:space="preserve"> %}</w:t>
+      <w:r>
+        <w:br w:type="page"/>
       </w:r>
     </w:p>
     <w:p>
-      <w:r>
-        <w:br w:type="page"/>
+      <w:pPr>
+        <w:pStyle w:val="Normalforinsertedinstructions"/>
+      </w:pPr>
+      <w:r>
+        <w:lastRenderedPageBreak/>
+        <w:t xml:space="preserve">{% if </w:t>
+      </w:r>
+      <w:r>
+        <w:t>tool_ID == "divorce_complaint</w:t>
+      </w:r>
+      <w:r>
+        <w:t xml:space="preserve">" </w:t>
+      </w:r>
+      <w:r>
+        <w:t xml:space="preserve">and </w:t>
+      </w:r>
+      <w:r>
+        <w:t xml:space="preserve">there_are_marital_children </w:t>
+      </w:r>
+      <w:r>
+        <w:t>%}</w:t>
       </w:r>
     </w:p>
     <w:p>
@@ -814,38 +519,22 @@
         <w:pStyle w:val="Normalforinsertedinstructions"/>
       </w:pPr>
       <w:r>
-        <w:lastRenderedPageBreak/>
-        <w:t xml:space="preserve">{% if </w:t>
-      </w:r>
-      <w:proofErr w:type="spellStart"/>
-      <w:r>
-        <w:t>tool_ID</w:t>
-      </w:r>
-      <w:proofErr w:type="spellEnd"/>
-      <w:r>
-        <w:t xml:space="preserve"> == "</w:t>
-      </w:r>
-      <w:proofErr w:type="spellStart"/>
-      <w:r>
-        <w:t>divorce_complaint</w:t>
-      </w:r>
-      <w:proofErr w:type="spellEnd"/>
-      <w:r>
-        <w:t xml:space="preserve">" </w:t>
-      </w:r>
-      <w:r>
-        <w:t xml:space="preserve">and </w:t>
-      </w:r>
-      <w:proofErr w:type="spellStart"/>
-      <w:r>
-        <w:t>there_are_marital_children</w:t>
-      </w:r>
-      <w:proofErr w:type="spellEnd"/>
-      <w:r>
-        <w:t xml:space="preserve"> </w:t>
-      </w:r>
-      <w:r>
-        <w:t>%}</w:t>
+        <w:t>{{p include_docx_template(</w:t>
+      </w:r>
+      <w:r>
+        <w:t>‘</w:t>
+      </w:r>
+      <w:r>
+        <w:t>instructions_divorce_with_children</w:t>
+      </w:r>
+      <w:r>
+        <w:t>.docx</w:t>
+      </w:r>
+      <w:r>
+        <w:t>’</w:t>
+      </w:r>
+      <w:r>
+        <w:t>) }}</w:t>
       </w:r>
     </w:p>
     <w:p>
@@ -853,40 +542,19 @@
         <w:pStyle w:val="Normalforinsertedinstructions"/>
       </w:pPr>
       <w:r>
-        <w:t xml:space="preserve">{{p </w:t>
-      </w:r>
-      <w:proofErr w:type="spellStart"/>
-      <w:r>
-        <w:t>include_docx_</w:t>
-      </w:r>
-      <w:proofErr w:type="gramStart"/>
-      <w:r>
-        <w:t>template</w:t>
-      </w:r>
-      <w:proofErr w:type="spellEnd"/>
-      <w:r>
-        <w:t>(</w:t>
-      </w:r>
-      <w:r>
-        <w:t>‘</w:t>
-      </w:r>
-      <w:proofErr w:type="gramEnd"/>
-      <w:r>
-        <w:t>instructions_divorce_with_children</w:t>
-      </w:r>
-      <w:r>
-        <w:t>.docx</w:t>
-      </w:r>
-      <w:r>
-        <w:t>’</w:t>
-      </w:r>
-      <w:proofErr w:type="gramStart"/>
-      <w:r>
-        <w:t>) }</w:t>
-      </w:r>
-      <w:proofErr w:type="gramEnd"/>
-      <w:r>
-        <w:t>}</w:t>
+        <w:t>{% elif tool_ID == "divorce_complaint</w:t>
+      </w:r>
+      <w:r>
+        <w:t xml:space="preserve">" </w:t>
+      </w:r>
+      <w:r>
+        <w:t xml:space="preserve">and not </w:t>
+      </w:r>
+      <w:r>
+        <w:t xml:space="preserve">there_are_marital_children </w:t>
+      </w:r>
+      <w:r>
+        <w:t>%}</w:t>
       </w:r>
     </w:p>
     <w:p>
@@ -894,45 +562,28 @@
         <w:pStyle w:val="Normalforinsertedinstructions"/>
       </w:pPr>
       <w:r>
-        <w:t xml:space="preserve">{% </w:t>
-      </w:r>
-      <w:proofErr w:type="spellStart"/>
-      <w:r>
-        <w:t>elif</w:t>
-      </w:r>
-      <w:proofErr w:type="spellEnd"/>
-      <w:r>
-        <w:t xml:space="preserve"> </w:t>
-      </w:r>
-      <w:proofErr w:type="spellStart"/>
-      <w:r>
-        <w:t>tool_ID</w:t>
-      </w:r>
-      <w:proofErr w:type="spellEnd"/>
-      <w:r>
-        <w:t xml:space="preserve"> == "</w:t>
-      </w:r>
-      <w:proofErr w:type="spellStart"/>
-      <w:r>
-        <w:t>divorce_complaint</w:t>
-      </w:r>
-      <w:proofErr w:type="spellEnd"/>
-      <w:r>
-        <w:t xml:space="preserve">" </w:t>
-      </w:r>
-      <w:r>
-        <w:t xml:space="preserve">and not </w:t>
-      </w:r>
-      <w:proofErr w:type="spellStart"/>
-      <w:r>
-        <w:t>there_are_marital_children</w:t>
-      </w:r>
-      <w:proofErr w:type="spellEnd"/>
-      <w:r>
-        <w:t xml:space="preserve"> </w:t>
-      </w:r>
-      <w:r>
-        <w:t>%}</w:t>
+        <w:t>{{p include_docx_template(</w:t>
+      </w:r>
+      <w:r>
+        <w:t>‘</w:t>
+      </w:r>
+      <w:r>
+        <w:t>instructions_divorce_with</w:t>
+      </w:r>
+      <w:r>
+        <w:t>out</w:t>
+      </w:r>
+      <w:r>
+        <w:t>_children</w:t>
+      </w:r>
+      <w:r>
+        <w:t>.docx</w:t>
+      </w:r>
+      <w:r>
+        <w:t>’</w:t>
+      </w:r>
+      <w:r>
+        <w:t>) }}</w:t>
       </w:r>
     </w:p>
     <w:p>
@@ -940,38 +591,13 @@
         <w:pStyle w:val="Normalforinsertedinstructions"/>
       </w:pPr>
       <w:r>
-        <w:t>{{p include_docx_</w:t>
-      </w:r>
-      <w:proofErr w:type="gramStart"/>
-      <w:r>
-        <w:t>template(</w:t>
-      </w:r>
-      <w:r>
-        <w:t>‘</w:t>
-      </w:r>
-      <w:proofErr w:type="gramEnd"/>
-      <w:r>
-        <w:t>instructions_divorce_with</w:t>
-      </w:r>
-      <w:r>
-        <w:t>out</w:t>
-      </w:r>
-      <w:r>
-        <w:t>_children</w:t>
-      </w:r>
-      <w:r>
-        <w:t>.docx</w:t>
-      </w:r>
-      <w:r>
-        <w:t>’</w:t>
-      </w:r>
-      <w:proofErr w:type="gramStart"/>
-      <w:r>
-        <w:t>) }</w:t>
-      </w:r>
-      <w:proofErr w:type="gramEnd"/>
-      <w:r>
-        <w:t>}</w:t>
+        <w:t>{% elif tool_ID == "divorce_answer</w:t>
+      </w:r>
+      <w:r>
+        <w:t xml:space="preserve">" </w:t>
+      </w:r>
+      <w:r>
+        <w:t>%}</w:t>
       </w:r>
     </w:p>
     <w:p>
@@ -979,34 +605,19 @@
         <w:pStyle w:val="Normalforinsertedinstructions"/>
       </w:pPr>
       <w:r>
-        <w:t xml:space="preserve">{% </w:t>
-      </w:r>
-      <w:proofErr w:type="spellStart"/>
-      <w:r>
-        <w:t>elif</w:t>
-      </w:r>
-      <w:proofErr w:type="spellEnd"/>
-      <w:r>
-        <w:t xml:space="preserve"> </w:t>
-      </w:r>
-      <w:proofErr w:type="spellStart"/>
-      <w:r>
-        <w:t>tool_ID</w:t>
-      </w:r>
-      <w:proofErr w:type="spellEnd"/>
-      <w:r>
-        <w:t xml:space="preserve"> == "</w:t>
-      </w:r>
-      <w:proofErr w:type="spellStart"/>
-      <w:r>
-        <w:t>divorce_answer</w:t>
-      </w:r>
-      <w:proofErr w:type="spellEnd"/>
-      <w:r>
-        <w:t xml:space="preserve">" </w:t>
-      </w:r>
-      <w:r>
-        <w:t>%}</w:t>
+        <w:t>{{p include_docx_template(</w:t>
+      </w:r>
+      <w:r>
+        <w:t>‘instructions_divorce_answer</w:t>
+      </w:r>
+      <w:r>
+        <w:t>.docx</w:t>
+      </w:r>
+      <w:r>
+        <w:t>’</w:t>
+      </w:r>
+      <w:r>
+        <w:t>) }}</w:t>
       </w:r>
     </w:p>
     <w:p>
@@ -1014,19 +625,7 @@
         <w:pStyle w:val="Normalforinsertedinstructions"/>
       </w:pPr>
       <w:r>
-        <w:t>{{p include_docx_template(</w:t>
-      </w:r>
-      <w:r>
-        <w:t>‘instructions_divorce_answer</w:t>
-      </w:r>
-      <w:r>
-        <w:t>.docx</w:t>
-      </w:r>
-      <w:r>
-        <w:t>’</w:t>
-      </w:r>
-      <w:r>
-        <w:t>) }}</w:t>
+        <w:t>{% endif %}</w:t>
       </w:r>
     </w:p>
     <w:p>
@@ -1034,7 +633,7 @@
         <w:pStyle w:val="Normalforinsertedinstructions"/>
       </w:pPr>
       <w:r>
-        <w:t>{% endif %}</w:t>
+        <w:t>{%p endif %}</w:t>
       </w:r>
     </w:p>
     <w:p>
@@ -1042,111 +641,57 @@
         <w:pStyle w:val="Normalforinsertedinstructions"/>
       </w:pPr>
       <w:r>
-        <w:t>{%p endif %}</w:t>
+        <w:t xml:space="preserve">{%p if </w:t>
+      </w:r>
+      <w:r>
+        <w:t>tool_ID == "divorce_complaint</w:t>
+      </w:r>
+      <w:r>
+        <w:t>"</w:t>
+      </w:r>
+      <w:r>
+        <w:t xml:space="preserve"> or (tool_ID == "JOD_only</w:t>
+      </w:r>
+      <w:r>
+        <w:t>"</w:t>
+      </w:r>
+      <w:r>
+        <w:t xml:space="preserve"> and </w:t>
+      </w:r>
+      <w:r>
+        <w:t>user_ask_role == “plaintiff”</w:t>
+      </w:r>
+      <w:r>
+        <w:t>)</w:t>
+      </w:r>
+      <w:r>
+        <w:t xml:space="preserve"> %}</w:t>
       </w:r>
     </w:p>
     <w:p>
-      <w:pPr>
-        <w:pStyle w:val="Normalforinsertedinstructions"/>
-      </w:pPr>
-      <w:r>
-        <w:t xml:space="preserve">{%p if </w:t>
-      </w:r>
-      <w:proofErr w:type="spellStart"/>
-      <w:r>
-        <w:t>tool_ID</w:t>
-      </w:r>
-      <w:proofErr w:type="spellEnd"/>
-      <w:r>
-        <w:t xml:space="preserve"> == "</w:t>
-      </w:r>
-      <w:proofErr w:type="spellStart"/>
-      <w:r>
-        <w:t>divorce_complaint</w:t>
-      </w:r>
-      <w:proofErr w:type="spellEnd"/>
-      <w:r>
-        <w:t>"</w:t>
-      </w:r>
-      <w:r>
-        <w:t xml:space="preserve"> or (</w:t>
-      </w:r>
-      <w:proofErr w:type="spellStart"/>
-      <w:r>
-        <w:t>tool_ID</w:t>
-      </w:r>
-      <w:proofErr w:type="spellEnd"/>
-      <w:r>
-        <w:t xml:space="preserve"> == "</w:t>
-      </w:r>
-      <w:proofErr w:type="spellStart"/>
-      <w:r>
-        <w:t>JOD_only</w:t>
-      </w:r>
-      <w:proofErr w:type="spellEnd"/>
-      <w:r>
-        <w:t>"</w:t>
-      </w:r>
-      <w:r>
-        <w:t xml:space="preserve"> and </w:t>
-      </w:r>
-      <w:proofErr w:type="spellStart"/>
-      <w:r>
-        <w:t>user_ask_role</w:t>
-      </w:r>
-      <w:proofErr w:type="spellEnd"/>
-      <w:r>
-        <w:t xml:space="preserve"> == “plaintiff”</w:t>
-      </w:r>
-      <w:r>
-        <w:t>)</w:t>
-      </w:r>
-      <w:r>
-        <w:t xml:space="preserve"> %}</w:t>
+      <w:r>
+        <w:br w:type="page"/>
       </w:r>
     </w:p>
     <w:p>
-      <w:r>
-        <w:br w:type="page"/>
-      </w:r>
-    </w:p>
-    <w:p>
       <w:pPr>
         <w:pStyle w:val="Normalforinsertedinstructions"/>
       </w:pPr>
       <w:r>
         <w:lastRenderedPageBreak/>
-        <w:t xml:space="preserve">{{p </w:t>
-      </w:r>
-      <w:proofErr w:type="spellStart"/>
-      <w:r>
-        <w:t>include_docx_</w:t>
-      </w:r>
-      <w:proofErr w:type="gramStart"/>
-      <w:r>
-        <w:t>template</w:t>
-      </w:r>
-      <w:proofErr w:type="spellEnd"/>
-      <w:r>
-        <w:t>(</w:t>
+        <w:t>{{p include_docx_template(</w:t>
       </w:r>
       <w:r>
         <w:t>‘</w:t>
       </w:r>
-      <w:proofErr w:type="gramEnd"/>
       <w:r>
         <w:t>testimony_script.docx</w:t>
       </w:r>
       <w:r>
         <w:t>’</w:t>
       </w:r>
-      <w:proofErr w:type="gramStart"/>
-      <w:r>
-        <w:t>) }</w:t>
-      </w:r>
-      <w:proofErr w:type="gramEnd"/>
-      <w:r>
-        <w:t>}</w:t>
+      <w:r>
+        <w:t>) }}</w:t>
       </w:r>
     </w:p>
     <w:p>
@@ -3353,7 +2898,6 @@
   <w:style w:type="character" w:default="1" w:styleId="DefaultParagraphFont">
     <w:name w:val="Default Paragraph Font"/>
     <w:uiPriority w:val="1"/>
-    <w:semiHidden/>
     <w:unhideWhenUsed/>
   </w:style>
   <w:style w:type="table" w:default="1" w:styleId="TableNormal">
@@ -3885,28 +3429,28 @@
 </file>
 
 <file path=customXml/item1.xml><?xml version="1.0" encoding="utf-8"?>
-<b:Sources xmlns:b="http://schemas.openxmlformats.org/officeDocument/2006/bibliography" xmlns="http://schemas.openxmlformats.org/officeDocument/2006/bibliography" SelectedStyle="\APASixthEditionOfficeOnline.xsl" StyleName="APA" Version="6"/>
-</file>
-
-<file path=customXml/item2.xml><?xml version="1.0" encoding="utf-8"?>
 <go:gDocsCustomXmlDataStorage xmlns:go="http://customooxmlschemas.google.com/" xmlns:r="http://schemas.openxmlformats.org/officeDocument/2006/relationships" uri="GoogleDocsCustomDataVersion2">
   <go:docsCustomData xmlns:go="http://customooxmlschemas.google.com/" roundtripDataSignature="AMtx7mjac1FaFv6WV3g0GhcUIQ9kG0o+yg==">CgMxLjAyDmgubjh0aHd2ZHFzMTk0MghoLmdqZGd4czIOaC56N2hubnB1aWk1NDkyDWguc3hkdG9pMzhvYmkyDmguNWY0ZXAwcWVlOXRlMg5oLmVqdDhyOXF0bXp6djIOaC4yOWpnN3o3Y2I3bGIyDmguanM4cTNwM3I0eDZjMg5oLnYzbTFuaXhkbzBwejIOaC5wZzd4dGp6Y2t3dWkyDmgueTE0MHhvdmdnYml0Mg5oLjRocjAxMWhrOXVyNjIOaC5xMTI4N2VvNmMyd24yDmguODY5YjBrbWEwNmtsMg5oLm1hczdybXljNW82ejgAciExV3BDbUx3RGV0a2poVzFWLUZiZXdyanhaTmV2Wm8tWm0=</go:docsCustomData>
 </go:gDocsCustomXmlDataStorage>
 </file>
 
-<file path=customXml/itemProps1.xml><?xml version="1.0" encoding="utf-8"?>
-<ds:datastoreItem xmlns:ds="http://schemas.openxmlformats.org/officeDocument/2006/customXml" ds:itemID="{D17ADB1C-BB67-458D-A072-D9E3A76A5AA9}">
-  <ds:schemaRefs>
-    <ds:schemaRef ds:uri="http://schemas.openxmlformats.org/officeDocument/2006/bibliography"/>
-  </ds:schemaRefs>
-</ds:datastoreItem>
+<file path=customXml/item2.xml><?xml version="1.0" encoding="utf-8"?>
+<b:Sources xmlns:b="http://schemas.openxmlformats.org/officeDocument/2006/bibliography" xmlns="http://schemas.openxmlformats.org/officeDocument/2006/bibliography" SelectedStyle="\APASixthEditionOfficeOnline.xsl" StyleName="APA" Version="6"/>
 </file>
 
-<file path=customXml/itemProps2.xml><?xml version="1.0" encoding="utf-8"?>
+<file path=customXml/itemProps1.xml><?xml version="1.0" encoding="utf-8"?>
 <ds:datastoreItem xmlns:ds="http://schemas.openxmlformats.org/officeDocument/2006/customXml" ds:itemID="{11111111-1234-1234-1234-123412341234}">
   <ds:schemaRefs>
     <ds:schemaRef ds:uri="http://customooxmlschemas.google.com/"/>
     <ds:schemaRef ds:uri="http://schemas.openxmlformats.org/officeDocument/2006/relationships"/>
   </ds:schemaRefs>
 </ds:datastoreItem>
+</file>
+
+<file path=customXml/itemProps2.xml><?xml version="1.0" encoding="utf-8"?>
+<ds:datastoreItem xmlns:ds="http://schemas.openxmlformats.org/officeDocument/2006/customXml" ds:itemID="{D17ADB1C-BB67-458D-A072-D9E3A76A5AA9}">
+  <ds:schemaRefs>
+    <ds:schemaRef ds:uri="http://schemas.openxmlformats.org/officeDocument/2006/bibliography"/>
+  </ds:schemaRefs>
+</ds:datastoreItem>
 </file>
</xml_diff>

<commit_message>
update testimony script and inclusion logic; update WNT logic; advance to 1.1.1.2
</commit_message>
<xml_diff>
--- a/docassemble/MLHDivorceAndCustody/data/templates/instructions.docx
+++ b/docassemble/MLHDivorceAndCustody/data/templates/instructions.docx
@@ -13,7 +13,23 @@
     <w:p/>
     <w:p>
       <w:r>
-        <w:t>{%p if tool_ID == “divorce_complaint” %}</w:t>
+        <w:t xml:space="preserve">{%p if </w:t>
+      </w:r>
+      <w:proofErr w:type="spellStart"/>
+      <w:r>
+        <w:t>tool_ID</w:t>
+      </w:r>
+      <w:proofErr w:type="spellEnd"/>
+      <w:r>
+        <w:t xml:space="preserve"> == “</w:t>
+      </w:r>
+      <w:proofErr w:type="spellStart"/>
+      <w:r>
+        <w:t>divorce_complaint</w:t>
+      </w:r>
+      <w:proofErr w:type="spellEnd"/>
+      <w:r>
+        <w:t>” %}</w:t>
       </w:r>
     </w:p>
     <w:p>
@@ -84,7 +100,31 @@
     </w:p>
     <w:p>
       <w:r>
-        <w:t>{%p elif tool_ID == “JOD_only” %}</w:t>
+        <w:t xml:space="preserve">{%p </w:t>
+      </w:r>
+      <w:proofErr w:type="spellStart"/>
+      <w:r>
+        <w:t>elif</w:t>
+      </w:r>
+      <w:proofErr w:type="spellEnd"/>
+      <w:r>
+        <w:t xml:space="preserve"> </w:t>
+      </w:r>
+      <w:proofErr w:type="spellStart"/>
+      <w:r>
+        <w:t>tool_ID</w:t>
+      </w:r>
+      <w:proofErr w:type="spellEnd"/>
+      <w:r>
+        <w:t xml:space="preserve"> == “</w:t>
+      </w:r>
+      <w:proofErr w:type="spellStart"/>
+      <w:r>
+        <w:t>JOD_only</w:t>
+      </w:r>
+      <w:proofErr w:type="spellEnd"/>
+      <w:r>
+        <w:t>” %}</w:t>
       </w:r>
     </w:p>
     <w:p>
@@ -152,11 +192,29 @@
     </w:p>
     <w:p>
       <w:r>
-        <w:t>{%p elif tool_ID == “</w:t>
-      </w:r>
+        <w:t xml:space="preserve">{%p </w:t>
+      </w:r>
+      <w:proofErr w:type="spellStart"/>
+      <w:r>
+        <w:t>elif</w:t>
+      </w:r>
+      <w:proofErr w:type="spellEnd"/>
+      <w:r>
+        <w:t xml:space="preserve"> </w:t>
+      </w:r>
+      <w:proofErr w:type="spellStart"/>
+      <w:r>
+        <w:t>tool_ID</w:t>
+      </w:r>
+      <w:proofErr w:type="spellEnd"/>
+      <w:r>
+        <w:t xml:space="preserve"> == “</w:t>
+      </w:r>
+      <w:proofErr w:type="spellStart"/>
       <w:r>
         <w:t>divorce_answer</w:t>
       </w:r>
+      <w:proofErr w:type="spellEnd"/>
       <w:r>
         <w:t>” %}</w:t>
       </w:r>
@@ -171,6 +229,9 @@
         <w:jc w:val="center"/>
       </w:pPr>
       <w:r>
+        <w:rPr>
+          <w:noProof/>
+        </w:rPr>
         <w:drawing>
           <wp:inline distT="0" distB="0" distL="0" distR="0" wp14:anchorId="773F6699" wp14:editId="62A8263F">
             <wp:extent cx="1162050" cy="1162050"/>
@@ -296,13 +357,29 @@
           <w:rFonts w:asciiTheme="minorHAnsi" w:hAnsiTheme="minorHAnsi" w:cstheme="minorHAnsi"/>
           <w:szCs w:val="28"/>
         </w:rPr>
-        <w:t xml:space="preserve">{%p if tool_ID </w:t>
-      </w:r>
+        <w:t xml:space="preserve">{%p if </w:t>
+      </w:r>
+      <w:proofErr w:type="spellStart"/>
       <w:r>
         <w:rPr>
           <w:rFonts w:asciiTheme="minorHAnsi" w:hAnsiTheme="minorHAnsi" w:cstheme="minorHAnsi"/>
           <w:szCs w:val="28"/>
         </w:rPr>
+        <w:t>tool_ID</w:t>
+      </w:r>
+      <w:proofErr w:type="spellEnd"/>
+      <w:r>
+        <w:rPr>
+          <w:rFonts w:asciiTheme="minorHAnsi" w:hAnsiTheme="minorHAnsi" w:cstheme="minorHAnsi"/>
+          <w:szCs w:val="28"/>
+        </w:rPr>
+        <w:t xml:space="preserve"> </w:t>
+      </w:r>
+      <w:r>
+        <w:rPr>
+          <w:rFonts w:asciiTheme="minorHAnsi" w:hAnsiTheme="minorHAnsi" w:cstheme="minorHAnsi"/>
+          <w:szCs w:val="28"/>
+        </w:rPr>
         <w:t>in [</w:t>
       </w:r>
       <w:r>
@@ -310,20 +387,52 @@
           <w:rFonts w:asciiTheme="minorHAnsi" w:hAnsiTheme="minorHAnsi" w:cstheme="minorHAnsi"/>
           <w:szCs w:val="28"/>
         </w:rPr>
-        <w:t>“divorce_complaint”</w:t>
-      </w:r>
+        <w:t>“</w:t>
+      </w:r>
+      <w:proofErr w:type="spellStart"/>
       <w:r>
         <w:rPr>
           <w:rFonts w:asciiTheme="minorHAnsi" w:hAnsiTheme="minorHAnsi" w:cstheme="minorHAnsi"/>
           <w:szCs w:val="28"/>
         </w:rPr>
-        <w:t>, “divorce_answer”]</w:t>
-      </w:r>
+        <w:t>divorce_complaint</w:t>
+      </w:r>
+      <w:proofErr w:type="spellEnd"/>
       <w:r>
         <w:rPr>
           <w:rFonts w:asciiTheme="minorHAnsi" w:hAnsiTheme="minorHAnsi" w:cstheme="minorHAnsi"/>
           <w:szCs w:val="28"/>
         </w:rPr>
+        <w:t>”</w:t>
+      </w:r>
+      <w:r>
+        <w:rPr>
+          <w:rFonts w:asciiTheme="minorHAnsi" w:hAnsiTheme="minorHAnsi" w:cstheme="minorHAnsi"/>
+          <w:szCs w:val="28"/>
+        </w:rPr>
+        <w:t>, “</w:t>
+      </w:r>
+      <w:proofErr w:type="spellStart"/>
+      <w:r>
+        <w:rPr>
+          <w:rFonts w:asciiTheme="minorHAnsi" w:hAnsiTheme="minorHAnsi" w:cstheme="minorHAnsi"/>
+          <w:szCs w:val="28"/>
+        </w:rPr>
+        <w:t>divorce_answer</w:t>
+      </w:r>
+      <w:proofErr w:type="spellEnd"/>
+      <w:r>
+        <w:rPr>
+          <w:rFonts w:asciiTheme="minorHAnsi" w:hAnsiTheme="minorHAnsi" w:cstheme="minorHAnsi"/>
+          <w:szCs w:val="28"/>
+        </w:rPr>
+        <w:t>”]</w:t>
+      </w:r>
+      <w:r>
+        <w:rPr>
+          <w:rFonts w:asciiTheme="minorHAnsi" w:hAnsiTheme="minorHAnsi" w:cstheme="minorHAnsi"/>
+          <w:szCs w:val="28"/>
+        </w:rPr>
         <w:t xml:space="preserve"> </w:t>
       </w:r>
       <w:r>
@@ -331,13 +440,45 @@
           <w:rFonts w:asciiTheme="minorHAnsi" w:hAnsiTheme="minorHAnsi" w:cstheme="minorHAnsi"/>
           <w:szCs w:val="28"/>
         </w:rPr>
-        <w:t xml:space="preserve">or (tool_ID == “JOD_only” and </w:t>
-      </w:r>
+        <w:t>or (</w:t>
+      </w:r>
+      <w:proofErr w:type="spellStart"/>
       <w:r>
         <w:rPr>
           <w:rFonts w:asciiTheme="minorHAnsi" w:hAnsiTheme="minorHAnsi" w:cstheme="minorHAnsi"/>
           <w:szCs w:val="28"/>
         </w:rPr>
+        <w:t>tool_ID</w:t>
+      </w:r>
+      <w:proofErr w:type="spellEnd"/>
+      <w:r>
+        <w:rPr>
+          <w:rFonts w:asciiTheme="minorHAnsi" w:hAnsiTheme="minorHAnsi" w:cstheme="minorHAnsi"/>
+          <w:szCs w:val="28"/>
+        </w:rPr>
+        <w:t xml:space="preserve"> == “</w:t>
+      </w:r>
+      <w:proofErr w:type="spellStart"/>
+      <w:r>
+        <w:rPr>
+          <w:rFonts w:asciiTheme="minorHAnsi" w:hAnsiTheme="minorHAnsi" w:cstheme="minorHAnsi"/>
+          <w:szCs w:val="28"/>
+        </w:rPr>
+        <w:t>JOD_only</w:t>
+      </w:r>
+      <w:proofErr w:type="spellEnd"/>
+      <w:r>
+        <w:rPr>
+          <w:rFonts w:asciiTheme="minorHAnsi" w:hAnsiTheme="minorHAnsi" w:cstheme="minorHAnsi"/>
+          <w:szCs w:val="28"/>
+        </w:rPr>
+        <w:t xml:space="preserve">” and </w:t>
+      </w:r>
+      <w:r>
+        <w:rPr>
+          <w:rFonts w:asciiTheme="minorHAnsi" w:hAnsiTheme="minorHAnsi" w:cstheme="minorHAnsi"/>
+          <w:szCs w:val="28"/>
+        </w:rPr>
         <w:t>(</w:t>
       </w:r>
       <w:r>
@@ -345,26 +486,81 @@
           <w:rFonts w:asciiTheme="minorHAnsi" w:hAnsiTheme="minorHAnsi" w:cstheme="minorHAnsi"/>
           <w:szCs w:val="28"/>
         </w:rPr>
-        <w:t>(marriage.have_pension_retirement and not marriage.pension_retirement_accounts_keep_own) or (</w:t>
-      </w:r>
-      <w:r>
-        <w:rPr>
-          <w:rFonts w:asciiTheme="minorHAnsi" w:hAnsiTheme="minorHAnsi" w:cstheme="minorHAnsi"/>
-        </w:rPr>
-        <w:t>marriage.personal_property_need_items and marriage.accounts.filter(trigger_investment_reminder=True) | length &gt; 0</w:t>
-      </w:r>
+        <w:t>(</w:t>
+      </w:r>
+      <w:proofErr w:type="spellStart"/>
       <w:r>
         <w:rPr>
           <w:rFonts w:asciiTheme="minorHAnsi" w:hAnsiTheme="minorHAnsi" w:cstheme="minorHAnsi"/>
           <w:szCs w:val="28"/>
         </w:rPr>
+        <w:t>marriage.have_pension_retirement</w:t>
+      </w:r>
+      <w:proofErr w:type="spellEnd"/>
+      <w:r>
+        <w:rPr>
+          <w:rFonts w:asciiTheme="minorHAnsi" w:hAnsiTheme="minorHAnsi" w:cstheme="minorHAnsi"/>
+          <w:szCs w:val="28"/>
+        </w:rPr>
+        <w:t xml:space="preserve"> and not </w:t>
+      </w:r>
+      <w:proofErr w:type="spellStart"/>
+      <w:r>
+        <w:rPr>
+          <w:rFonts w:asciiTheme="minorHAnsi" w:hAnsiTheme="minorHAnsi" w:cstheme="minorHAnsi"/>
+          <w:szCs w:val="28"/>
+        </w:rPr>
+        <w:t>marriage.pension_retirement_accounts_keep_own</w:t>
+      </w:r>
+      <w:proofErr w:type="spellEnd"/>
+      <w:r>
+        <w:rPr>
+          <w:rFonts w:asciiTheme="minorHAnsi" w:hAnsiTheme="minorHAnsi" w:cstheme="minorHAnsi"/>
+          <w:szCs w:val="28"/>
+        </w:rPr>
         <w:t>) or (</w:t>
       </w:r>
-      <w:r>
-        <w:rPr>
-          <w:rFonts w:asciiTheme="minorHAnsi" w:hAnsiTheme="minorHAnsi" w:cstheme="minorHAnsi"/>
-        </w:rPr>
-        <w:t>there_are_marital_children and (parentage_affidavit_revoke or parentage_order_revoke or parentage_marital_revoke)</w:t>
+      <w:proofErr w:type="spellStart"/>
+      <w:r>
+        <w:rPr>
+          <w:rFonts w:asciiTheme="minorHAnsi" w:hAnsiTheme="minorHAnsi" w:cstheme="minorHAnsi"/>
+        </w:rPr>
+        <w:t>marriage.personal_property_need_items</w:t>
+      </w:r>
+      <w:proofErr w:type="spellEnd"/>
+      <w:r>
+        <w:rPr>
+          <w:rFonts w:asciiTheme="minorHAnsi" w:hAnsiTheme="minorHAnsi" w:cstheme="minorHAnsi"/>
+        </w:rPr>
+        <w:t xml:space="preserve"> and </w:t>
+      </w:r>
+      <w:proofErr w:type="spellStart"/>
+      <w:r>
+        <w:rPr>
+          <w:rFonts w:asciiTheme="minorHAnsi" w:hAnsiTheme="minorHAnsi" w:cstheme="minorHAnsi"/>
+        </w:rPr>
+        <w:t>marriage.accounts.filter</w:t>
+      </w:r>
+      <w:proofErr w:type="spellEnd"/>
+      <w:r>
+        <w:rPr>
+          <w:rFonts w:asciiTheme="minorHAnsi" w:hAnsiTheme="minorHAnsi" w:cstheme="minorHAnsi"/>
+        </w:rPr>
+        <w:t>(</w:t>
+      </w:r>
+      <w:proofErr w:type="spellStart"/>
+      <w:r>
+        <w:rPr>
+          <w:rFonts w:asciiTheme="minorHAnsi" w:hAnsiTheme="minorHAnsi" w:cstheme="minorHAnsi"/>
+        </w:rPr>
+        <w:t>trigger_investment_reminder</w:t>
+      </w:r>
+      <w:proofErr w:type="spellEnd"/>
+      <w:r>
+        <w:rPr>
+          <w:rFonts w:asciiTheme="minorHAnsi" w:hAnsiTheme="minorHAnsi" w:cstheme="minorHAnsi"/>
+        </w:rPr>
+        <w:t>=True) | length &gt; 0</w:t>
       </w:r>
       <w:r>
         <w:rPr>
@@ -373,12 +569,91 @@
         </w:rPr>
         <w:t>) or (</w:t>
       </w:r>
-      <w:r>
-        <w:rPr>
-          <w:rFonts w:asciiTheme="minorHAnsi" w:hAnsiTheme="minorHAnsi" w:cstheme="minorHAnsi"/>
-        </w:rPr>
-        <w:t>there_are_marital_children and not MI_has_jurisdiction_all_kids</w:t>
-      </w:r>
+      <w:proofErr w:type="spellStart"/>
+      <w:r>
+        <w:rPr>
+          <w:rFonts w:asciiTheme="minorHAnsi" w:hAnsiTheme="minorHAnsi" w:cstheme="minorHAnsi"/>
+        </w:rPr>
+        <w:t>there_are_marital_children</w:t>
+      </w:r>
+      <w:proofErr w:type="spellEnd"/>
+      <w:r>
+        <w:rPr>
+          <w:rFonts w:asciiTheme="minorHAnsi" w:hAnsiTheme="minorHAnsi" w:cstheme="minorHAnsi"/>
+        </w:rPr>
+        <w:t xml:space="preserve"> and (</w:t>
+      </w:r>
+      <w:proofErr w:type="spellStart"/>
+      <w:r>
+        <w:rPr>
+          <w:rFonts w:asciiTheme="minorHAnsi" w:hAnsiTheme="minorHAnsi" w:cstheme="minorHAnsi"/>
+        </w:rPr>
+        <w:t>parentage_affidavit_revoke</w:t>
+      </w:r>
+      <w:proofErr w:type="spellEnd"/>
+      <w:r>
+        <w:rPr>
+          <w:rFonts w:asciiTheme="minorHAnsi" w:hAnsiTheme="minorHAnsi" w:cstheme="minorHAnsi"/>
+        </w:rPr>
+        <w:t xml:space="preserve"> or </w:t>
+      </w:r>
+      <w:proofErr w:type="spellStart"/>
+      <w:r>
+        <w:rPr>
+          <w:rFonts w:asciiTheme="minorHAnsi" w:hAnsiTheme="minorHAnsi" w:cstheme="minorHAnsi"/>
+        </w:rPr>
+        <w:t>parentage_order_revoke</w:t>
+      </w:r>
+      <w:proofErr w:type="spellEnd"/>
+      <w:r>
+        <w:rPr>
+          <w:rFonts w:asciiTheme="minorHAnsi" w:hAnsiTheme="minorHAnsi" w:cstheme="minorHAnsi"/>
+        </w:rPr>
+        <w:t xml:space="preserve"> or </w:t>
+      </w:r>
+      <w:proofErr w:type="spellStart"/>
+      <w:r>
+        <w:rPr>
+          <w:rFonts w:asciiTheme="minorHAnsi" w:hAnsiTheme="minorHAnsi" w:cstheme="minorHAnsi"/>
+        </w:rPr>
+        <w:t>parentage_marital_revoke</w:t>
+      </w:r>
+      <w:proofErr w:type="spellEnd"/>
+      <w:r>
+        <w:rPr>
+          <w:rFonts w:asciiTheme="minorHAnsi" w:hAnsiTheme="minorHAnsi" w:cstheme="minorHAnsi"/>
+        </w:rPr>
+        <w:t>)</w:t>
+      </w:r>
+      <w:r>
+        <w:rPr>
+          <w:rFonts w:asciiTheme="minorHAnsi" w:hAnsiTheme="minorHAnsi" w:cstheme="minorHAnsi"/>
+          <w:szCs w:val="28"/>
+        </w:rPr>
+        <w:t>) or (</w:t>
+      </w:r>
+      <w:proofErr w:type="spellStart"/>
+      <w:r>
+        <w:rPr>
+          <w:rFonts w:asciiTheme="minorHAnsi" w:hAnsiTheme="minorHAnsi" w:cstheme="minorHAnsi"/>
+        </w:rPr>
+        <w:t>there_are_marital_children</w:t>
+      </w:r>
+      <w:proofErr w:type="spellEnd"/>
+      <w:r>
+        <w:rPr>
+          <w:rFonts w:asciiTheme="minorHAnsi" w:hAnsiTheme="minorHAnsi" w:cstheme="minorHAnsi"/>
+        </w:rPr>
+        <w:t xml:space="preserve"> and not </w:t>
+      </w:r>
+      <w:proofErr w:type="spellStart"/>
+      <w:r>
+        <w:rPr>
+          <w:rFonts w:asciiTheme="minorHAnsi" w:hAnsiTheme="minorHAnsi" w:cstheme="minorHAnsi"/>
+        </w:rPr>
+        <w:t>MI_has_jurisdiction_all_kids</w:t>
+      </w:r>
+      <w:proofErr w:type="spellEnd"/>
       <w:r>
         <w:rPr>
           <w:rFonts w:asciiTheme="minorHAnsi" w:hAnsiTheme="minorHAnsi" w:cstheme="minorHAnsi"/>
@@ -442,7 +717,21 @@
           <w:rFonts w:asciiTheme="minorHAnsi" w:hAnsiTheme="minorHAnsi" w:cstheme="minorHAnsi"/>
         </w:rPr>
         <w:lastRenderedPageBreak/>
-        <w:t>{{p include_docx_template(‘reminders_template.docx’) }}</w:t>
+        <w:t xml:space="preserve">{{p </w:t>
+      </w:r>
+      <w:proofErr w:type="spellStart"/>
+      <w:r>
+        <w:rPr>
+          <w:rFonts w:asciiTheme="minorHAnsi" w:hAnsiTheme="minorHAnsi" w:cstheme="minorHAnsi"/>
+        </w:rPr>
+        <w:t>include_docx_template</w:t>
+      </w:r>
+      <w:proofErr w:type="spellEnd"/>
+      <w:r>
+        <w:rPr>
+          <w:rFonts w:asciiTheme="minorHAnsi" w:hAnsiTheme="minorHAnsi" w:cstheme="minorHAnsi"/>
+        </w:rPr>
+        <w:t>(‘reminders_template.docx’) }}</w:t>
       </w:r>
     </w:p>
     <w:p>
@@ -470,13 +759,69 @@
         <w:rPr>
           <w:rFonts w:asciiTheme="minorHAnsi" w:hAnsiTheme="minorHAnsi" w:cstheme="minorHAnsi"/>
         </w:rPr>
-        <w:t>{%p if tool_ID == "divorce_complaint"</w:t>
-      </w:r>
-      <w:r>
-        <w:rPr>
-          <w:rFonts w:asciiTheme="minorHAnsi" w:hAnsiTheme="minorHAnsi" w:cstheme="minorHAnsi"/>
-        </w:rPr>
-        <w:t xml:space="preserve"> or tool_ID == “divorce_answer”</w:t>
+        <w:t xml:space="preserve">{%p if </w:t>
+      </w:r>
+      <w:proofErr w:type="spellStart"/>
+      <w:r>
+        <w:rPr>
+          <w:rFonts w:asciiTheme="minorHAnsi" w:hAnsiTheme="minorHAnsi" w:cstheme="minorHAnsi"/>
+        </w:rPr>
+        <w:t>tool_ID</w:t>
+      </w:r>
+      <w:proofErr w:type="spellEnd"/>
+      <w:r>
+        <w:rPr>
+          <w:rFonts w:asciiTheme="minorHAnsi" w:hAnsiTheme="minorHAnsi" w:cstheme="minorHAnsi"/>
+        </w:rPr>
+        <w:t xml:space="preserve"> == "</w:t>
+      </w:r>
+      <w:proofErr w:type="spellStart"/>
+      <w:r>
+        <w:rPr>
+          <w:rFonts w:asciiTheme="minorHAnsi" w:hAnsiTheme="minorHAnsi" w:cstheme="minorHAnsi"/>
+        </w:rPr>
+        <w:t>divorce_complaint</w:t>
+      </w:r>
+      <w:proofErr w:type="spellEnd"/>
+      <w:r>
+        <w:rPr>
+          <w:rFonts w:asciiTheme="minorHAnsi" w:hAnsiTheme="minorHAnsi" w:cstheme="minorHAnsi"/>
+        </w:rPr>
+        <w:t>"</w:t>
+      </w:r>
+      <w:r>
+        <w:rPr>
+          <w:rFonts w:asciiTheme="minorHAnsi" w:hAnsiTheme="minorHAnsi" w:cstheme="minorHAnsi"/>
+        </w:rPr>
+        <w:t xml:space="preserve"> or </w:t>
+      </w:r>
+      <w:proofErr w:type="spellStart"/>
+      <w:r>
+        <w:rPr>
+          <w:rFonts w:asciiTheme="minorHAnsi" w:hAnsiTheme="minorHAnsi" w:cstheme="minorHAnsi"/>
+        </w:rPr>
+        <w:t>tool_ID</w:t>
+      </w:r>
+      <w:proofErr w:type="spellEnd"/>
+      <w:r>
+        <w:rPr>
+          <w:rFonts w:asciiTheme="minorHAnsi" w:hAnsiTheme="minorHAnsi" w:cstheme="minorHAnsi"/>
+        </w:rPr>
+        <w:t xml:space="preserve"> == “</w:t>
+      </w:r>
+      <w:proofErr w:type="spellStart"/>
+      <w:r>
+        <w:rPr>
+          <w:rFonts w:asciiTheme="minorHAnsi" w:hAnsiTheme="minorHAnsi" w:cstheme="minorHAnsi"/>
+        </w:rPr>
+        <w:t>divorce_answer</w:t>
+      </w:r>
+      <w:proofErr w:type="spellEnd"/>
+      <w:r>
+        <w:rPr>
+          <w:rFonts w:asciiTheme="minorHAnsi" w:hAnsiTheme="minorHAnsi" w:cstheme="minorHAnsi"/>
+        </w:rPr>
+        <w:t>”</w:t>
       </w:r>
       <w:r>
         <w:rPr>
@@ -498,17 +843,32 @@
         <w:lastRenderedPageBreak/>
         <w:t xml:space="preserve">{% if </w:t>
       </w:r>
-      <w:r>
-        <w:t>tool_ID == "divorce_complaint</w:t>
-      </w:r>
+      <w:proofErr w:type="spellStart"/>
+      <w:r>
+        <w:t>tool_ID</w:t>
+      </w:r>
+      <w:proofErr w:type="spellEnd"/>
+      <w:r>
+        <w:t xml:space="preserve"> == "</w:t>
+      </w:r>
+      <w:proofErr w:type="spellStart"/>
+      <w:r>
+        <w:t>divorce_complaint</w:t>
+      </w:r>
+      <w:proofErr w:type="spellEnd"/>
       <w:r>
         <w:t xml:space="preserve">" </w:t>
       </w:r>
       <w:r>
         <w:t xml:space="preserve">and </w:t>
       </w:r>
-      <w:r>
-        <w:t xml:space="preserve">there_are_marital_children </w:t>
+      <w:proofErr w:type="spellStart"/>
+      <w:r>
+        <w:t>there_are_marital_children</w:t>
+      </w:r>
+      <w:proofErr w:type="spellEnd"/>
+      <w:r>
+        <w:t xml:space="preserve"> </w:t>
       </w:r>
       <w:r>
         <w:t>%}</w:t>
@@ -519,7 +879,15 @@
         <w:pStyle w:val="Normalforinsertedinstructions"/>
       </w:pPr>
       <w:r>
-        <w:t>{{p include_docx_template(</w:t>
+        <w:t xml:space="preserve">{{p </w:t>
+      </w:r>
+      <w:proofErr w:type="spellStart"/>
+      <w:r>
+        <w:t>include_docx_template</w:t>
+      </w:r>
+      <w:proofErr w:type="spellEnd"/>
+      <w:r>
+        <w:t>(</w:t>
       </w:r>
       <w:r>
         <w:t>‘</w:t>
@@ -542,16 +910,42 @@
         <w:pStyle w:val="Normalforinsertedinstructions"/>
       </w:pPr>
       <w:r>
-        <w:t>{% elif tool_ID == "divorce_complaint</w:t>
-      </w:r>
+        <w:t xml:space="preserve">{% </w:t>
+      </w:r>
+      <w:proofErr w:type="spellStart"/>
+      <w:r>
+        <w:t>elif</w:t>
+      </w:r>
+      <w:proofErr w:type="spellEnd"/>
+      <w:r>
+        <w:t xml:space="preserve"> </w:t>
+      </w:r>
+      <w:proofErr w:type="spellStart"/>
+      <w:r>
+        <w:t>tool_ID</w:t>
+      </w:r>
+      <w:proofErr w:type="spellEnd"/>
+      <w:r>
+        <w:t xml:space="preserve"> == "</w:t>
+      </w:r>
+      <w:proofErr w:type="spellStart"/>
+      <w:r>
+        <w:t>divorce_complaint</w:t>
+      </w:r>
+      <w:proofErr w:type="spellEnd"/>
       <w:r>
         <w:t xml:space="preserve">" </w:t>
       </w:r>
       <w:r>
         <w:t xml:space="preserve">and not </w:t>
       </w:r>
-      <w:r>
-        <w:t xml:space="preserve">there_are_marital_children </w:t>
+      <w:proofErr w:type="spellStart"/>
+      <w:r>
+        <w:t>there_are_marital_children</w:t>
+      </w:r>
+      <w:proofErr w:type="spellEnd"/>
+      <w:r>
+        <w:t xml:space="preserve"> </w:t>
       </w:r>
       <w:r>
         <w:t>%}</w:t>
@@ -591,8 +985,29 @@
         <w:pStyle w:val="Normalforinsertedinstructions"/>
       </w:pPr>
       <w:r>
-        <w:t>{% elif tool_ID == "divorce_answer</w:t>
-      </w:r>
+        <w:t xml:space="preserve">{% </w:t>
+      </w:r>
+      <w:proofErr w:type="spellStart"/>
+      <w:r>
+        <w:t>elif</w:t>
+      </w:r>
+      <w:proofErr w:type="spellEnd"/>
+      <w:r>
+        <w:t xml:space="preserve"> </w:t>
+      </w:r>
+      <w:proofErr w:type="spellStart"/>
+      <w:r>
+        <w:t>tool_ID</w:t>
+      </w:r>
+      <w:proofErr w:type="spellEnd"/>
+      <w:r>
+        <w:t xml:space="preserve"> == "</w:t>
+      </w:r>
+      <w:proofErr w:type="spellStart"/>
+      <w:r>
+        <w:t>divorce_answer</w:t>
+      </w:r>
+      <w:proofErr w:type="spellEnd"/>
       <w:r>
         <w:t xml:space="preserve">" </w:t>
       </w:r>
@@ -605,7 +1020,15 @@
         <w:pStyle w:val="Normalforinsertedinstructions"/>
       </w:pPr>
       <w:r>
-        <w:t>{{p include_docx_template(</w:t>
+        <w:t xml:space="preserve">{{p </w:t>
+      </w:r>
+      <w:proofErr w:type="spellStart"/>
+      <w:r>
+        <w:t>include_docx_template</w:t>
+      </w:r>
+      <w:proofErr w:type="spellEnd"/>
+      <w:r>
+        <w:t>(</w:t>
       </w:r>
       <w:r>
         <w:t>‘instructions_divorce_answer</w:t>
@@ -643,29 +1066,53 @@
       <w:r>
         <w:t xml:space="preserve">{%p if </w:t>
       </w:r>
-      <w:r>
-        <w:t>tool_ID == "divorce_complaint</w:t>
+      <w:proofErr w:type="spellStart"/>
+      <w:r>
+        <w:t>tool_ID</w:t>
+      </w:r>
+      <w:proofErr w:type="spellEnd"/>
+      <w:r>
+        <w:t xml:space="preserve"> </w:t>
+      </w:r>
+      <w:r>
+        <w:t>in</w:t>
+      </w:r>
+      <w:r>
+        <w:t xml:space="preserve"> </w:t>
+      </w:r>
+      <w:r>
+        <w:t>[</w:t>
       </w:r>
       <w:r>
         <w:t>"</w:t>
       </w:r>
-      <w:r>
-        <w:t xml:space="preserve"> or (tool_ID == "JOD_only</w:t>
-      </w:r>
+      <w:proofErr w:type="spellStart"/>
+      <w:r>
+        <w:t>divorce_complaint</w:t>
+      </w:r>
+      <w:proofErr w:type="spellEnd"/>
       <w:r>
         <w:t>"</w:t>
       </w:r>
       <w:r>
-        <w:t xml:space="preserve"> and </w:t>
-      </w:r>
-      <w:r>
-        <w:t>user_ask_role == “plaintiff”</w:t>
-      </w:r>
-      <w:r>
-        <w:t>)</w:t>
-      </w:r>
-      <w:r>
-        <w:t xml:space="preserve"> %}</w:t>
+        <w:t xml:space="preserve">, </w:t>
+      </w:r>
+      <w:r>
+        <w:t>"</w:t>
+      </w:r>
+      <w:proofErr w:type="spellStart"/>
+      <w:r>
+        <w:t>JOD_only</w:t>
+      </w:r>
+      <w:proofErr w:type="spellEnd"/>
+      <w:r>
+        <w:t>"</w:t>
+      </w:r>
+      <w:r>
+        <w:t xml:space="preserve">] </w:t>
+      </w:r>
+      <w:r>
+        <w:t>%}</w:t>
       </w:r>
     </w:p>
     <w:p>
@@ -679,7 +1126,15 @@
       </w:pPr>
       <w:r>
         <w:lastRenderedPageBreak/>
-        <w:t>{{p include_docx_template(</w:t>
+        <w:t xml:space="preserve">{{p </w:t>
+      </w:r>
+      <w:proofErr w:type="spellStart"/>
+      <w:r>
+        <w:t>include_docx_template</w:t>
+      </w:r>
+      <w:proofErr w:type="spellEnd"/>
+      <w:r>
+        <w:t>(</w:t>
       </w:r>
       <w:r>
         <w:t>‘</w:t>
@@ -2898,6 +3353,7 @@
   <w:style w:type="character" w:default="1" w:styleId="DefaultParagraphFont">
     <w:name w:val="Default Paragraph Font"/>
     <w:uiPriority w:val="1"/>
+    <w:semiHidden/>
     <w:unhideWhenUsed/>
   </w:style>
   <w:style w:type="table" w:default="1" w:styleId="TableNormal">
@@ -3429,28 +3885,28 @@
 </file>
 
 <file path=customXml/item1.xml><?xml version="1.0" encoding="utf-8"?>
+<b:Sources xmlns:b="http://schemas.openxmlformats.org/officeDocument/2006/bibliography" xmlns="http://schemas.openxmlformats.org/officeDocument/2006/bibliography" SelectedStyle="\APASixthEditionOfficeOnline.xsl" StyleName="APA" Version="6"/>
+</file>
+
+<file path=customXml/item2.xml><?xml version="1.0" encoding="utf-8"?>
 <go:gDocsCustomXmlDataStorage xmlns:go="http://customooxmlschemas.google.com/" xmlns:r="http://schemas.openxmlformats.org/officeDocument/2006/relationships" uri="GoogleDocsCustomDataVersion2">
   <go:docsCustomData xmlns:go="http://customooxmlschemas.google.com/" roundtripDataSignature="AMtx7mjac1FaFv6WV3g0GhcUIQ9kG0o+yg==">CgMxLjAyDmgubjh0aHd2ZHFzMTk0MghoLmdqZGd4czIOaC56N2hubnB1aWk1NDkyDWguc3hkdG9pMzhvYmkyDmguNWY0ZXAwcWVlOXRlMg5oLmVqdDhyOXF0bXp6djIOaC4yOWpnN3o3Y2I3bGIyDmguanM4cTNwM3I0eDZjMg5oLnYzbTFuaXhkbzBwejIOaC5wZzd4dGp6Y2t3dWkyDmgueTE0MHhvdmdnYml0Mg5oLjRocjAxMWhrOXVyNjIOaC5xMTI4N2VvNmMyd24yDmguODY5YjBrbWEwNmtsMg5oLm1hczdybXljNW82ejgAciExV3BDbUx3RGV0a2poVzFWLUZiZXdyanhaTmV2Wm8tWm0=</go:docsCustomData>
 </go:gDocsCustomXmlDataStorage>
 </file>
 
-<file path=customXml/item2.xml><?xml version="1.0" encoding="utf-8"?>
-<b:Sources xmlns:b="http://schemas.openxmlformats.org/officeDocument/2006/bibliography" xmlns="http://schemas.openxmlformats.org/officeDocument/2006/bibliography" SelectedStyle="\APASixthEditionOfficeOnline.xsl" StyleName="APA" Version="6"/>
+<file path=customXml/itemProps1.xml><?xml version="1.0" encoding="utf-8"?>
+<ds:datastoreItem xmlns:ds="http://schemas.openxmlformats.org/officeDocument/2006/customXml" ds:itemID="{D17ADB1C-BB67-458D-A072-D9E3A76A5AA9}">
+  <ds:schemaRefs>
+    <ds:schemaRef ds:uri="http://schemas.openxmlformats.org/officeDocument/2006/bibliography"/>
+  </ds:schemaRefs>
+</ds:datastoreItem>
 </file>
 
-<file path=customXml/itemProps1.xml><?xml version="1.0" encoding="utf-8"?>
+<file path=customXml/itemProps2.xml><?xml version="1.0" encoding="utf-8"?>
 <ds:datastoreItem xmlns:ds="http://schemas.openxmlformats.org/officeDocument/2006/customXml" ds:itemID="{11111111-1234-1234-1234-123412341234}">
   <ds:schemaRefs>
     <ds:schemaRef ds:uri="http://customooxmlschemas.google.com/"/>
     <ds:schemaRef ds:uri="http://schemas.openxmlformats.org/officeDocument/2006/relationships"/>
   </ds:schemaRefs>
 </ds:datastoreItem>
-</file>
-
-<file path=customXml/itemProps2.xml><?xml version="1.0" encoding="utf-8"?>
-<ds:datastoreItem xmlns:ds="http://schemas.openxmlformats.org/officeDocument/2006/customXml" ds:itemID="{D17ADB1C-BB67-458D-A072-D9E3A76A5AA9}">
-  <ds:schemaRefs>
-    <ds:schemaRef ds:uri="http://schemas.openxmlformats.org/officeDocument/2006/bibliography"/>
-  </ds:schemaRefs>
-</ds:datastoreItem>
 </file>
</xml_diff>

<commit_message>
stop call marriage.pension_retirement_accounts_keep_own when undefined
</commit_message>
<xml_diff>
--- a/docassemble/MLHDivorceAndCustody/data/templates/instructions.docx
+++ b/docassemble/MLHDivorceAndCustody/data/templates/instructions.docx
@@ -1,6 +1,6 @@
 
 <file path=word/document.xml><?xml version="1.0" encoding="utf-8"?>
-<w:document xmlns:wpc="http://schemas.microsoft.com/office/word/2010/wordprocessingCanvas" xmlns:cx="http://schemas.microsoft.com/office/drawing/2014/chartex" xmlns:cx1="http://schemas.microsoft.com/office/drawing/2015/9/8/chartex" xmlns:cx2="http://schemas.microsoft.com/office/drawing/2015/10/21/chartex" xmlns:cx3="http://schemas.microsoft.com/office/drawing/2016/5/9/chartex" xmlns:cx4="http://schemas.microsoft.com/office/drawing/2016/5/10/chartex" xmlns:cx5="http://schemas.microsoft.com/office/drawing/2016/5/11/chartex" xmlns:cx6="http://schemas.microsoft.com/office/drawing/2016/5/12/chartex" xmlns:cx7="http://schemas.microsoft.com/office/drawing/2016/5/13/chartex" xmlns:cx8="http://schemas.microsoft.com/office/drawing/2016/5/14/chartex" xmlns:mc="http://schemas.openxmlformats.org/markup-compatibility/2006" xmlns:aink="http://schemas.microsoft.com/office/drawing/2016/ink" xmlns:am3d="http://schemas.microsoft.com/office/drawing/2017/model3d" xmlns:o="urn:schemas-microsoft-com:office:office" xmlns:oel="http://schemas.microsoft.com/office/2019/extlst" xmlns:r="http://schemas.openxmlformats.org/officeDocument/2006/relationships" xmlns:m="http://schemas.openxmlformats.org/officeDocument/2006/math" xmlns:v="urn:schemas-microsoft-com:vml" xmlns:wp14="http://schemas.microsoft.com/office/word/2010/wordprocessingDrawing" xmlns:wp="http://schemas.openxmlformats.org/drawingml/2006/wordprocessingDrawing" xmlns:w10="urn:schemas-microsoft-com:office:word" xmlns:w="http://schemas.openxmlformats.org/wordprocessingml/2006/main" xmlns:w14="http://schemas.microsoft.com/office/word/2010/wordml" xmlns:w15="http://schemas.microsoft.com/office/word/2012/wordml" xmlns:w16cex="http://schemas.microsoft.com/office/word/2018/wordml/cex" xmlns:w16cid="http://schemas.microsoft.com/office/word/2016/wordml/cid" xmlns:w16="http://schemas.microsoft.com/office/word/2018/wordml" xmlns:w16du="http://schemas.microsoft.com/office/word/2023/wordml/word16du" xmlns:w16sdtdh="http://schemas.microsoft.com/office/word/2020/wordml/sdtdatahash" xmlns:w16sdtfl="http://schemas.microsoft.com/office/word/2024/wordml/sdtformatlock" xmlns:w16se="http://schemas.microsoft.com/office/word/2015/wordml/symex" xmlns:wpg="http://schemas.microsoft.com/office/word/2010/wordprocessingGroup" xmlns:wpi="http://schemas.microsoft.com/office/word/2010/wordprocessingInk" xmlns:wne="http://schemas.microsoft.com/office/word/2006/wordml" xmlns:wps="http://schemas.microsoft.com/office/word/2010/wordprocessingShape" mc:Ignorable="w14 w15 w16se w16cid w16 w16cex w16sdtdh w16sdtfl w16du wp14">
+<w:document xmlns:wpc="http://schemas.microsoft.com/office/word/2010/wordprocessingCanvas" xmlns:cx="http://schemas.microsoft.com/office/drawing/2014/chartex" xmlns:cx1="http://schemas.microsoft.com/office/drawing/2015/9/8/chartex" xmlns:cx2="http://schemas.microsoft.com/office/drawing/2015/10/21/chartex" xmlns:cx3="http://schemas.microsoft.com/office/drawing/2016/5/9/chartex" xmlns:cx4="http://schemas.microsoft.com/office/drawing/2016/5/10/chartex" xmlns:cx5="http://schemas.microsoft.com/office/drawing/2016/5/11/chartex" xmlns:cx6="http://schemas.microsoft.com/office/drawing/2016/5/12/chartex" xmlns:cx7="http://schemas.microsoft.com/office/drawing/2016/5/13/chartex" xmlns:cx8="http://schemas.microsoft.com/office/drawing/2016/5/14/chartex" xmlns:mc="http://schemas.openxmlformats.org/markup-compatibility/2006" xmlns:aink="http://schemas.microsoft.com/office/drawing/2016/ink" xmlns:am3d="http://schemas.microsoft.com/office/drawing/2017/model3d" xmlns:o="urn:schemas-microsoft-com:office:office" xmlns:oel="http://schemas.microsoft.com/office/2019/extlst" xmlns:r="http://schemas.openxmlformats.org/officeDocument/2006/relationships" xmlns:m="http://schemas.openxmlformats.org/officeDocument/2006/math" xmlns:v="urn:schemas-microsoft-com:vml" xmlns:wp14="http://schemas.microsoft.com/office/word/2010/wordprocessingDrawing" xmlns:wp="http://schemas.openxmlformats.org/drawingml/2006/wordprocessingDrawing" xmlns:w10="urn:schemas-microsoft-com:office:word" xmlns:w="http://schemas.openxmlformats.org/wordprocessingml/2006/main" xmlns:w14="http://schemas.microsoft.com/office/word/2010/wordml" xmlns:w15="http://schemas.microsoft.com/office/word/2012/wordml" xmlns:w16cei="http://schemas.microsoft.com/office/word/2026/wordml/cei" xmlns:w16cex="http://schemas.microsoft.com/office/word/2018/wordml/cex" xmlns:w16cid="http://schemas.microsoft.com/office/word/2016/wordml/cid" xmlns:w16="http://schemas.microsoft.com/office/word/2018/wordml" xmlns:w16du="http://schemas.microsoft.com/office/word/2023/wordml/word16du" xmlns:w16sdtdh="http://schemas.microsoft.com/office/word/2020/wordml/sdtdatahash" xmlns:w16sdtfl="http://schemas.microsoft.com/office/word/2024/wordml/sdtformatlock" xmlns:w16se="http://schemas.microsoft.com/office/word/2015/wordml/symex" xmlns:wpg="http://schemas.microsoft.com/office/word/2010/wordprocessingGroup" xmlns:wpi="http://schemas.microsoft.com/office/word/2010/wordprocessingInk" xmlns:wne="http://schemas.microsoft.com/office/word/2006/wordml" xmlns:wps="http://schemas.microsoft.com/office/word/2010/wordprocessingShape" mc:Ignorable="w14 w15 w16se w16cid w16 w16cex w16sdtdh w16sdtfl w16du wp14">
   <w:body>
     <w:p>
       <w:pPr>
@@ -13,23 +13,7 @@
     <w:p/>
     <w:p>
       <w:r>
-        <w:t xml:space="preserve">{%p if </w:t>
-      </w:r>
-      <w:proofErr w:type="spellStart"/>
-      <w:r>
-        <w:t>tool_ID</w:t>
-      </w:r>
-      <w:proofErr w:type="spellEnd"/>
-      <w:r>
-        <w:t xml:space="preserve"> == “</w:t>
-      </w:r>
-      <w:proofErr w:type="spellStart"/>
-      <w:r>
-        <w:t>divorce_complaint</w:t>
-      </w:r>
-      <w:proofErr w:type="spellEnd"/>
-      <w:r>
-        <w:t>” %}</w:t>
+        <w:t>{%p if tool_ID == “divorce_complaint” %}</w:t>
       </w:r>
     </w:p>
     <w:p>
@@ -100,31 +84,7 @@
     </w:p>
     <w:p>
       <w:r>
-        <w:t xml:space="preserve">{%p </w:t>
-      </w:r>
-      <w:proofErr w:type="spellStart"/>
-      <w:r>
-        <w:t>elif</w:t>
-      </w:r>
-      <w:proofErr w:type="spellEnd"/>
-      <w:r>
-        <w:t xml:space="preserve"> </w:t>
-      </w:r>
-      <w:proofErr w:type="spellStart"/>
-      <w:r>
-        <w:t>tool_ID</w:t>
-      </w:r>
-      <w:proofErr w:type="spellEnd"/>
-      <w:r>
-        <w:t xml:space="preserve"> == “</w:t>
-      </w:r>
-      <w:proofErr w:type="spellStart"/>
-      <w:r>
-        <w:t>JOD_only</w:t>
-      </w:r>
-      <w:proofErr w:type="spellEnd"/>
-      <w:r>
-        <w:t>” %}</w:t>
+        <w:t>{%p elif tool_ID == “JOD_only” %}</w:t>
       </w:r>
     </w:p>
     <w:p>
@@ -192,31 +152,7 @@
     </w:p>
     <w:p>
       <w:r>
-        <w:t xml:space="preserve">{%p </w:t>
-      </w:r>
-      <w:proofErr w:type="spellStart"/>
-      <w:r>
-        <w:t>elif</w:t>
-      </w:r>
-      <w:proofErr w:type="spellEnd"/>
-      <w:r>
-        <w:t xml:space="preserve"> </w:t>
-      </w:r>
-      <w:proofErr w:type="spellStart"/>
-      <w:r>
-        <w:t>tool_ID</w:t>
-      </w:r>
-      <w:proofErr w:type="spellEnd"/>
-      <w:r>
-        <w:t xml:space="preserve"> == “</w:t>
-      </w:r>
-      <w:proofErr w:type="spellStart"/>
-      <w:r>
-        <w:t>divorce_answer</w:t>
-      </w:r>
-      <w:proofErr w:type="spellEnd"/>
-      <w:r>
-        <w:t>” %}</w:t>
+        <w:t>{%p elif tool_ID == “divorce_answer” %}</w:t>
       </w:r>
     </w:p>
     <w:p>
@@ -357,352 +293,174 @@
           <w:rFonts w:asciiTheme="minorHAnsi" w:hAnsiTheme="minorHAnsi" w:cstheme="minorHAnsi"/>
           <w:szCs w:val="28"/>
         </w:rPr>
-        <w:t xml:space="preserve">{%p if </w:t>
-      </w:r>
-      <w:proofErr w:type="spellStart"/>
+        <w:t xml:space="preserve">{%p if tool_ID </w:t>
+      </w:r>
       <w:r>
         <w:rPr>
           <w:rFonts w:asciiTheme="minorHAnsi" w:hAnsiTheme="minorHAnsi" w:cstheme="minorHAnsi"/>
           <w:szCs w:val="28"/>
         </w:rPr>
-        <w:t>tool_ID</w:t>
-      </w:r>
-      <w:proofErr w:type="spellEnd"/>
+        <w:t>in [</w:t>
+      </w:r>
       <w:r>
         <w:rPr>
           <w:rFonts w:asciiTheme="minorHAnsi" w:hAnsiTheme="minorHAnsi" w:cstheme="minorHAnsi"/>
           <w:szCs w:val="28"/>
         </w:rPr>
-        <w:t xml:space="preserve"> </w:t>
+        <w:t>“divorce_complaint”</w:t>
       </w:r>
       <w:r>
         <w:rPr>
           <w:rFonts w:asciiTheme="minorHAnsi" w:hAnsiTheme="minorHAnsi" w:cstheme="minorHAnsi"/>
           <w:szCs w:val="28"/>
         </w:rPr>
-        <w:t>in [</w:t>
+        <w:t>, “divorce_answer”]</w:t>
       </w:r>
       <w:r>
         <w:rPr>
           <w:rFonts w:asciiTheme="minorHAnsi" w:hAnsiTheme="minorHAnsi" w:cstheme="minorHAnsi"/>
           <w:szCs w:val="28"/>
         </w:rPr>
-        <w:t>“</w:t>
-      </w:r>
-      <w:proofErr w:type="spellStart"/>
+        <w:t xml:space="preserve"> </w:t>
+      </w:r>
       <w:r>
         <w:rPr>
           <w:rFonts w:asciiTheme="minorHAnsi" w:hAnsiTheme="minorHAnsi" w:cstheme="minorHAnsi"/>
           <w:szCs w:val="28"/>
         </w:rPr>
-        <w:t>divorce_complaint</w:t>
-      </w:r>
-      <w:proofErr w:type="spellEnd"/>
+        <w:t xml:space="preserve">or (tool_ID == “JOD_only” and </w:t>
+      </w:r>
       <w:r>
         <w:rPr>
           <w:rFonts w:asciiTheme="minorHAnsi" w:hAnsiTheme="minorHAnsi" w:cstheme="minorHAnsi"/>
           <w:szCs w:val="28"/>
         </w:rPr>
-        <w:t>”</w:t>
+        <w:t>(</w:t>
       </w:r>
       <w:r>
         <w:rPr>
           <w:rFonts w:asciiTheme="minorHAnsi" w:hAnsiTheme="minorHAnsi" w:cstheme="minorHAnsi"/>
           <w:szCs w:val="28"/>
         </w:rPr>
-        <w:t>, “</w:t>
-      </w:r>
-      <w:proofErr w:type="spellStart"/>
+        <w:t xml:space="preserve">(marriage.have_pension_retirement </w:t>
+      </w:r>
       <w:r>
         <w:rPr>
           <w:rFonts w:asciiTheme="minorHAnsi" w:hAnsiTheme="minorHAnsi" w:cstheme="minorHAnsi"/>
           <w:szCs w:val="28"/>
         </w:rPr>
-        <w:t>divorce_answer</w:t>
-      </w:r>
-      <w:proofErr w:type="spellEnd"/>
+        <w:t>and marriage.pension_contributions_made</w:t>
+      </w:r>
       <w:r>
         <w:rPr>
           <w:rFonts w:asciiTheme="minorHAnsi" w:hAnsiTheme="minorHAnsi" w:cstheme="minorHAnsi"/>
           <w:szCs w:val="28"/>
         </w:rPr>
-        <w:t>”]</w:t>
+        <w:t xml:space="preserve"> </w:t>
       </w:r>
       <w:r>
         <w:rPr>
           <w:rFonts w:asciiTheme="minorHAnsi" w:hAnsiTheme="minorHAnsi" w:cstheme="minorHAnsi"/>
           <w:szCs w:val="28"/>
         </w:rPr>
-        <w:t xml:space="preserve"> </w:t>
+        <w:t>and not marriage.pension_retirement_accounts_keep_own) or (</w:t>
+      </w:r>
+      <w:r>
+        <w:rPr>
+          <w:rFonts w:asciiTheme="minorHAnsi" w:hAnsiTheme="minorHAnsi" w:cstheme="minorHAnsi"/>
+        </w:rPr>
+        <w:t>marriage.personal_property_need_items and marriage.accounts.filter(trigger_investment_reminder=True) | length &gt; 0</w:t>
       </w:r>
       <w:r>
         <w:rPr>
           <w:rFonts w:asciiTheme="minorHAnsi" w:hAnsiTheme="minorHAnsi" w:cstheme="minorHAnsi"/>
           <w:szCs w:val="28"/>
         </w:rPr>
-        <w:t>or (</w:t>
-      </w:r>
-      <w:proofErr w:type="spellStart"/>
+        <w:t>) or (</w:t>
+      </w:r>
+      <w:r>
+        <w:rPr>
+          <w:rFonts w:asciiTheme="minorHAnsi" w:hAnsiTheme="minorHAnsi" w:cstheme="minorHAnsi"/>
+        </w:rPr>
+        <w:t>there_are_marital_children and (parentage_affidavit_revoke or parentage_order_revoke or parentage_marital_revoke)</w:t>
+      </w:r>
       <w:r>
         <w:rPr>
           <w:rFonts w:asciiTheme="minorHAnsi" w:hAnsiTheme="minorHAnsi" w:cstheme="minorHAnsi"/>
           <w:szCs w:val="28"/>
         </w:rPr>
-        <w:t>tool_ID</w:t>
-      </w:r>
-      <w:proofErr w:type="spellEnd"/>
+        <w:t>) or (</w:t>
+      </w:r>
+      <w:r>
+        <w:rPr>
+          <w:rFonts w:asciiTheme="minorHAnsi" w:hAnsiTheme="minorHAnsi" w:cstheme="minorHAnsi"/>
+        </w:rPr>
+        <w:t>there_are_marital_children and not MI_has_jurisdiction_all_kids</w:t>
+      </w:r>
       <w:r>
         <w:rPr>
           <w:rFonts w:asciiTheme="minorHAnsi" w:hAnsiTheme="minorHAnsi" w:cstheme="minorHAnsi"/>
           <w:szCs w:val="28"/>
         </w:rPr>
-        <w:t xml:space="preserve"> == “</w:t>
-      </w:r>
-      <w:proofErr w:type="spellStart"/>
+        <w:t>)</w:t>
+      </w:r>
       <w:r>
         <w:rPr>
           <w:rFonts w:asciiTheme="minorHAnsi" w:hAnsiTheme="minorHAnsi" w:cstheme="minorHAnsi"/>
           <w:szCs w:val="28"/>
         </w:rPr>
-        <w:t>JOD_only</w:t>
-      </w:r>
-      <w:proofErr w:type="spellEnd"/>
+        <w:t>)</w:t>
+      </w:r>
       <w:r>
         <w:rPr>
           <w:rFonts w:asciiTheme="minorHAnsi" w:hAnsiTheme="minorHAnsi" w:cstheme="minorHAnsi"/>
           <w:szCs w:val="28"/>
         </w:rPr>
-        <w:t xml:space="preserve">” and </w:t>
+        <w:t>)</w:t>
       </w:r>
       <w:r>
         <w:rPr>
           <w:rFonts w:asciiTheme="minorHAnsi" w:hAnsiTheme="minorHAnsi" w:cstheme="minorHAnsi"/>
           <w:szCs w:val="28"/>
         </w:rPr>
-        <w:t>(</w:t>
+        <w:t xml:space="preserve"> </w:t>
       </w:r>
       <w:r>
         <w:rPr>
           <w:rFonts w:asciiTheme="minorHAnsi" w:hAnsiTheme="minorHAnsi" w:cstheme="minorHAnsi"/>
           <w:szCs w:val="28"/>
         </w:rPr>
-        <w:t>(</w:t>
-      </w:r>
-      <w:proofErr w:type="spellStart"/>
-      <w:r>
+        <w:t>%}</w:t>
+      </w:r>
+    </w:p>
+    <w:p>
+      <w:pPr>
         <w:rPr>
           <w:rFonts w:asciiTheme="minorHAnsi" w:hAnsiTheme="minorHAnsi" w:cstheme="minorHAnsi"/>
           <w:szCs w:val="28"/>
         </w:rPr>
-        <w:t>marriage.have_pension_retirement</w:t>
-      </w:r>
-      <w:proofErr w:type="spellEnd"/>
+      </w:pPr>
       <w:r>
         <w:rPr>
           <w:rFonts w:asciiTheme="minorHAnsi" w:hAnsiTheme="minorHAnsi" w:cstheme="minorHAnsi"/>
           <w:szCs w:val="28"/>
         </w:rPr>
-        <w:t xml:space="preserve"> and not </w:t>
-      </w:r>
-      <w:proofErr w:type="spellStart"/>
-      <w:r>
-        <w:rPr>
-          <w:rFonts w:asciiTheme="minorHAnsi" w:hAnsiTheme="minorHAnsi" w:cstheme="minorHAnsi"/>
-          <w:szCs w:val="28"/>
-        </w:rPr>
-        <w:t>marriage.pension_retirement_accounts_keep_own</w:t>
-      </w:r>
-      <w:proofErr w:type="spellEnd"/>
-      <w:r>
-        <w:rPr>
-          <w:rFonts w:asciiTheme="minorHAnsi" w:hAnsiTheme="minorHAnsi" w:cstheme="minorHAnsi"/>
-          <w:szCs w:val="28"/>
-        </w:rPr>
-        <w:t>) or (</w:t>
-      </w:r>
-      <w:proofErr w:type="spellStart"/>
-      <w:r>
-        <w:rPr>
-          <w:rFonts w:asciiTheme="minorHAnsi" w:hAnsiTheme="minorHAnsi" w:cstheme="minorHAnsi"/>
-        </w:rPr>
-        <w:t>marriage.personal_property_need_items</w:t>
-      </w:r>
-      <w:proofErr w:type="spellEnd"/>
-      <w:r>
-        <w:rPr>
-          <w:rFonts w:asciiTheme="minorHAnsi" w:hAnsiTheme="minorHAnsi" w:cstheme="minorHAnsi"/>
-        </w:rPr>
-        <w:t xml:space="preserve"> and </w:t>
-      </w:r>
-      <w:proofErr w:type="spellStart"/>
-      <w:r>
-        <w:rPr>
-          <w:rFonts w:asciiTheme="minorHAnsi" w:hAnsiTheme="minorHAnsi" w:cstheme="minorHAnsi"/>
-        </w:rPr>
-        <w:t>marriage.accounts.filter</w:t>
-      </w:r>
-      <w:proofErr w:type="spellEnd"/>
-      <w:r>
-        <w:rPr>
-          <w:rFonts w:asciiTheme="minorHAnsi" w:hAnsiTheme="minorHAnsi" w:cstheme="minorHAnsi"/>
-        </w:rPr>
-        <w:t>(</w:t>
-      </w:r>
-      <w:proofErr w:type="spellStart"/>
-      <w:r>
-        <w:rPr>
-          <w:rFonts w:asciiTheme="minorHAnsi" w:hAnsiTheme="minorHAnsi" w:cstheme="minorHAnsi"/>
-        </w:rPr>
-        <w:t>trigger_investment_reminder</w:t>
-      </w:r>
-      <w:proofErr w:type="spellEnd"/>
-      <w:r>
-        <w:rPr>
-          <w:rFonts w:asciiTheme="minorHAnsi" w:hAnsiTheme="minorHAnsi" w:cstheme="minorHAnsi"/>
-        </w:rPr>
-        <w:t>=True) | length &gt; 0</w:t>
-      </w:r>
-      <w:r>
-        <w:rPr>
-          <w:rFonts w:asciiTheme="minorHAnsi" w:hAnsiTheme="minorHAnsi" w:cstheme="minorHAnsi"/>
-          <w:szCs w:val="28"/>
-        </w:rPr>
-        <w:t>) or (</w:t>
-      </w:r>
-      <w:proofErr w:type="spellStart"/>
-      <w:r>
-        <w:rPr>
-          <w:rFonts w:asciiTheme="minorHAnsi" w:hAnsiTheme="minorHAnsi" w:cstheme="minorHAnsi"/>
-        </w:rPr>
-        <w:t>there_are_marital_children</w:t>
-      </w:r>
-      <w:proofErr w:type="spellEnd"/>
-      <w:r>
-        <w:rPr>
-          <w:rFonts w:asciiTheme="minorHAnsi" w:hAnsiTheme="minorHAnsi" w:cstheme="minorHAnsi"/>
-        </w:rPr>
-        <w:t xml:space="preserve"> and (</w:t>
-      </w:r>
-      <w:proofErr w:type="spellStart"/>
-      <w:r>
-        <w:rPr>
-          <w:rFonts w:asciiTheme="minorHAnsi" w:hAnsiTheme="minorHAnsi" w:cstheme="minorHAnsi"/>
-        </w:rPr>
-        <w:t>parentage_affidavit_revoke</w:t>
-      </w:r>
-      <w:proofErr w:type="spellEnd"/>
-      <w:r>
-        <w:rPr>
-          <w:rFonts w:asciiTheme="minorHAnsi" w:hAnsiTheme="minorHAnsi" w:cstheme="minorHAnsi"/>
-        </w:rPr>
-        <w:t xml:space="preserve"> or </w:t>
-      </w:r>
-      <w:proofErr w:type="spellStart"/>
-      <w:r>
-        <w:rPr>
-          <w:rFonts w:asciiTheme="minorHAnsi" w:hAnsiTheme="minorHAnsi" w:cstheme="minorHAnsi"/>
-        </w:rPr>
-        <w:t>parentage_order_revoke</w:t>
-      </w:r>
-      <w:proofErr w:type="spellEnd"/>
-      <w:r>
-        <w:rPr>
-          <w:rFonts w:asciiTheme="minorHAnsi" w:hAnsiTheme="minorHAnsi" w:cstheme="minorHAnsi"/>
-        </w:rPr>
-        <w:t xml:space="preserve"> or </w:t>
-      </w:r>
-      <w:proofErr w:type="spellStart"/>
-      <w:r>
-        <w:rPr>
-          <w:rFonts w:asciiTheme="minorHAnsi" w:hAnsiTheme="minorHAnsi" w:cstheme="minorHAnsi"/>
-        </w:rPr>
-        <w:t>parentage_marital_revoke</w:t>
-      </w:r>
-      <w:proofErr w:type="spellEnd"/>
-      <w:r>
-        <w:rPr>
-          <w:rFonts w:asciiTheme="minorHAnsi" w:hAnsiTheme="minorHAnsi" w:cstheme="minorHAnsi"/>
-        </w:rPr>
-        <w:t>)</w:t>
-      </w:r>
-      <w:r>
-        <w:rPr>
-          <w:rFonts w:asciiTheme="minorHAnsi" w:hAnsiTheme="minorHAnsi" w:cstheme="minorHAnsi"/>
-          <w:szCs w:val="28"/>
-        </w:rPr>
-        <w:t>) or (</w:t>
-      </w:r>
-      <w:proofErr w:type="spellStart"/>
-      <w:r>
-        <w:rPr>
-          <w:rFonts w:asciiTheme="minorHAnsi" w:hAnsiTheme="minorHAnsi" w:cstheme="minorHAnsi"/>
-        </w:rPr>
-        <w:t>there_are_marital_children</w:t>
-      </w:r>
-      <w:proofErr w:type="spellEnd"/>
-      <w:r>
-        <w:rPr>
-          <w:rFonts w:asciiTheme="minorHAnsi" w:hAnsiTheme="minorHAnsi" w:cstheme="minorHAnsi"/>
-        </w:rPr>
-        <w:t xml:space="preserve"> and not </w:t>
-      </w:r>
-      <w:proofErr w:type="spellStart"/>
-      <w:r>
-        <w:rPr>
-          <w:rFonts w:asciiTheme="minorHAnsi" w:hAnsiTheme="minorHAnsi" w:cstheme="minorHAnsi"/>
-        </w:rPr>
-        <w:t>MI_has_jurisdiction_all_kids</w:t>
-      </w:r>
-      <w:proofErr w:type="spellEnd"/>
-      <w:r>
-        <w:rPr>
-          <w:rFonts w:asciiTheme="minorHAnsi" w:hAnsiTheme="minorHAnsi" w:cstheme="minorHAnsi"/>
-          <w:szCs w:val="28"/>
-        </w:rPr>
-        <w:t>)</w:t>
-      </w:r>
-      <w:r>
-        <w:rPr>
-          <w:rFonts w:asciiTheme="minorHAnsi" w:hAnsiTheme="minorHAnsi" w:cstheme="minorHAnsi"/>
-          <w:szCs w:val="28"/>
-        </w:rPr>
-        <w:t>)</w:t>
-      </w:r>
-      <w:r>
-        <w:rPr>
-          <w:rFonts w:asciiTheme="minorHAnsi" w:hAnsiTheme="minorHAnsi" w:cstheme="minorHAnsi"/>
-          <w:szCs w:val="28"/>
-        </w:rPr>
-        <w:t>)</w:t>
-      </w:r>
-      <w:r>
-        <w:rPr>
-          <w:rFonts w:asciiTheme="minorHAnsi" w:hAnsiTheme="minorHAnsi" w:cstheme="minorHAnsi"/>
-          <w:szCs w:val="28"/>
-        </w:rPr>
-        <w:t xml:space="preserve"> </w:t>
-      </w:r>
-      <w:r>
-        <w:rPr>
-          <w:rFonts w:asciiTheme="minorHAnsi" w:hAnsiTheme="minorHAnsi" w:cstheme="minorHAnsi"/>
-          <w:szCs w:val="28"/>
-        </w:rPr>
-        <w:t>%}</w:t>
+        <w:br w:type="page"/>
       </w:r>
     </w:p>
     <w:p>
       <w:pPr>
+        <w:pStyle w:val="Normalforinsertedinstructions"/>
         <w:rPr>
           <w:rFonts w:asciiTheme="minorHAnsi" w:hAnsiTheme="minorHAnsi" w:cstheme="minorHAnsi"/>
-          <w:szCs w:val="28"/>
         </w:rPr>
       </w:pPr>
       <w:r>
         <w:rPr>
           <w:rFonts w:asciiTheme="minorHAnsi" w:hAnsiTheme="minorHAnsi" w:cstheme="minorHAnsi"/>
-          <w:szCs w:val="28"/>
-        </w:rPr>
-        <w:br w:type="page"/>
+        </w:rPr>
+        <w:lastRenderedPageBreak/>
+        <w:t>{{p include_docx_template(‘reminders_template.docx’) }}</w:t>
       </w:r>
     </w:p>
     <w:p>
@@ -716,22 +474,7 @@
         <w:rPr>
           <w:rFonts w:asciiTheme="minorHAnsi" w:hAnsiTheme="minorHAnsi" w:cstheme="minorHAnsi"/>
         </w:rPr>
-        <w:lastRenderedPageBreak/>
-        <w:t xml:space="preserve">{{p </w:t>
-      </w:r>
-      <w:proofErr w:type="spellStart"/>
-      <w:r>
-        <w:rPr>
-          <w:rFonts w:asciiTheme="minorHAnsi" w:hAnsiTheme="minorHAnsi" w:cstheme="minorHAnsi"/>
-        </w:rPr>
-        <w:t>include_docx_template</w:t>
-      </w:r>
-      <w:proofErr w:type="spellEnd"/>
-      <w:r>
-        <w:rPr>
-          <w:rFonts w:asciiTheme="minorHAnsi" w:hAnsiTheme="minorHAnsi" w:cstheme="minorHAnsi"/>
-        </w:rPr>
-        <w:t>(‘reminders_template.docx’) }}</w:t>
+        <w:t>{%p endif %}</w:t>
       </w:r>
     </w:p>
     <w:p>
@@ -745,94 +488,48 @@
         <w:rPr>
           <w:rFonts w:asciiTheme="minorHAnsi" w:hAnsiTheme="minorHAnsi" w:cstheme="minorHAnsi"/>
         </w:rPr>
-        <w:t>{%p endif %}</w:t>
+        <w:t>{%p if tool_ID == "divorce_complaint"</w:t>
+      </w:r>
+      <w:r>
+        <w:rPr>
+          <w:rFonts w:asciiTheme="minorHAnsi" w:hAnsiTheme="minorHAnsi" w:cstheme="minorHAnsi"/>
+        </w:rPr>
+        <w:t xml:space="preserve"> or tool_ID == “divorce_answer”</w:t>
+      </w:r>
+      <w:r>
+        <w:rPr>
+          <w:rFonts w:asciiTheme="minorHAnsi" w:hAnsiTheme="minorHAnsi" w:cstheme="minorHAnsi"/>
+        </w:rPr>
+        <w:t xml:space="preserve"> %}</w:t>
       </w:r>
     </w:p>
     <w:p>
-      <w:pPr>
-        <w:pStyle w:val="Normalforinsertedinstructions"/>
-        <w:rPr>
-          <w:rFonts w:asciiTheme="minorHAnsi" w:hAnsiTheme="minorHAnsi" w:cstheme="minorHAnsi"/>
-        </w:rPr>
-      </w:pPr>
-      <w:r>
-        <w:rPr>
-          <w:rFonts w:asciiTheme="minorHAnsi" w:hAnsiTheme="minorHAnsi" w:cstheme="minorHAnsi"/>
-        </w:rPr>
-        <w:t xml:space="preserve">{%p if </w:t>
-      </w:r>
-      <w:proofErr w:type="spellStart"/>
-      <w:r>
-        <w:rPr>
-          <w:rFonts w:asciiTheme="minorHAnsi" w:hAnsiTheme="minorHAnsi" w:cstheme="minorHAnsi"/>
-        </w:rPr>
-        <w:t>tool_ID</w:t>
-      </w:r>
-      <w:proofErr w:type="spellEnd"/>
-      <w:r>
-        <w:rPr>
-          <w:rFonts w:asciiTheme="minorHAnsi" w:hAnsiTheme="minorHAnsi" w:cstheme="minorHAnsi"/>
-        </w:rPr>
-        <w:t xml:space="preserve"> == "</w:t>
-      </w:r>
-      <w:proofErr w:type="spellStart"/>
-      <w:r>
-        <w:rPr>
-          <w:rFonts w:asciiTheme="minorHAnsi" w:hAnsiTheme="minorHAnsi" w:cstheme="minorHAnsi"/>
-        </w:rPr>
-        <w:t>divorce_complaint</w:t>
-      </w:r>
-      <w:proofErr w:type="spellEnd"/>
-      <w:r>
-        <w:rPr>
-          <w:rFonts w:asciiTheme="minorHAnsi" w:hAnsiTheme="minorHAnsi" w:cstheme="minorHAnsi"/>
-        </w:rPr>
-        <w:t>"</w:t>
-      </w:r>
-      <w:r>
-        <w:rPr>
-          <w:rFonts w:asciiTheme="minorHAnsi" w:hAnsiTheme="minorHAnsi" w:cstheme="minorHAnsi"/>
-        </w:rPr>
-        <w:t xml:space="preserve"> or </w:t>
-      </w:r>
-      <w:proofErr w:type="spellStart"/>
-      <w:r>
-        <w:rPr>
-          <w:rFonts w:asciiTheme="minorHAnsi" w:hAnsiTheme="minorHAnsi" w:cstheme="minorHAnsi"/>
-        </w:rPr>
-        <w:t>tool_ID</w:t>
-      </w:r>
-      <w:proofErr w:type="spellEnd"/>
-      <w:r>
-        <w:rPr>
-          <w:rFonts w:asciiTheme="minorHAnsi" w:hAnsiTheme="minorHAnsi" w:cstheme="minorHAnsi"/>
-        </w:rPr>
-        <w:t xml:space="preserve"> == “</w:t>
-      </w:r>
-      <w:proofErr w:type="spellStart"/>
-      <w:r>
-        <w:rPr>
-          <w:rFonts w:asciiTheme="minorHAnsi" w:hAnsiTheme="minorHAnsi" w:cstheme="minorHAnsi"/>
-        </w:rPr>
-        <w:t>divorce_answer</w:t>
-      </w:r>
-      <w:proofErr w:type="spellEnd"/>
-      <w:r>
-        <w:rPr>
-          <w:rFonts w:asciiTheme="minorHAnsi" w:hAnsiTheme="minorHAnsi" w:cstheme="minorHAnsi"/>
-        </w:rPr>
-        <w:t>”</w:t>
-      </w:r>
-      <w:r>
-        <w:rPr>
-          <w:rFonts w:asciiTheme="minorHAnsi" w:hAnsiTheme="minorHAnsi" w:cstheme="minorHAnsi"/>
-        </w:rPr>
-        <w:t xml:space="preserve"> %}</w:t>
+      <w:r>
+        <w:br w:type="page"/>
       </w:r>
     </w:p>
     <w:p>
-      <w:r>
-        <w:br w:type="page"/>
+      <w:pPr>
+        <w:pStyle w:val="Normalforinsertedinstructions"/>
+      </w:pPr>
+      <w:r>
+        <w:lastRenderedPageBreak/>
+        <w:t xml:space="preserve">{% if </w:t>
+      </w:r>
+      <w:r>
+        <w:t>tool_ID == "divorce_complaint</w:t>
+      </w:r>
+      <w:r>
+        <w:t xml:space="preserve">" </w:t>
+      </w:r>
+      <w:r>
+        <w:t xml:space="preserve">and </w:t>
+      </w:r>
+      <w:r>
+        <w:t xml:space="preserve">there_are_marital_children </w:t>
+      </w:r>
+      <w:r>
+        <w:t>%}</w:t>
       </w:r>
     </w:p>
     <w:p>
@@ -840,38 +537,22 @@
         <w:pStyle w:val="Normalforinsertedinstructions"/>
       </w:pPr>
       <w:r>
-        <w:lastRenderedPageBreak/>
-        <w:t xml:space="preserve">{% if </w:t>
-      </w:r>
-      <w:proofErr w:type="spellStart"/>
-      <w:r>
-        <w:t>tool_ID</w:t>
-      </w:r>
-      <w:proofErr w:type="spellEnd"/>
-      <w:r>
-        <w:t xml:space="preserve"> == "</w:t>
-      </w:r>
-      <w:proofErr w:type="spellStart"/>
-      <w:r>
-        <w:t>divorce_complaint</w:t>
-      </w:r>
-      <w:proofErr w:type="spellEnd"/>
-      <w:r>
-        <w:t xml:space="preserve">" </w:t>
-      </w:r>
-      <w:r>
-        <w:t xml:space="preserve">and </w:t>
-      </w:r>
-      <w:proofErr w:type="spellStart"/>
-      <w:r>
-        <w:t>there_are_marital_children</w:t>
-      </w:r>
-      <w:proofErr w:type="spellEnd"/>
-      <w:r>
-        <w:t xml:space="preserve"> </w:t>
-      </w:r>
-      <w:r>
-        <w:t>%}</w:t>
+        <w:t>{{p include_docx_template(</w:t>
+      </w:r>
+      <w:r>
+        <w:t>‘</w:t>
+      </w:r>
+      <w:r>
+        <w:t>instructions_divorce_with_children</w:t>
+      </w:r>
+      <w:r>
+        <w:t>.docx</w:t>
+      </w:r>
+      <w:r>
+        <w:t>’</w:t>
+      </w:r>
+      <w:r>
+        <w:t>) }}</w:t>
       </w:r>
     </w:p>
     <w:p>
@@ -879,30 +560,19 @@
         <w:pStyle w:val="Normalforinsertedinstructions"/>
       </w:pPr>
       <w:r>
-        <w:t xml:space="preserve">{{p </w:t>
-      </w:r>
-      <w:proofErr w:type="spellStart"/>
-      <w:r>
-        <w:t>include_docx_template</w:t>
-      </w:r>
-      <w:proofErr w:type="spellEnd"/>
-      <w:r>
-        <w:t>(</w:t>
-      </w:r>
-      <w:r>
-        <w:t>‘</w:t>
-      </w:r>
-      <w:r>
-        <w:t>instructions_divorce_with_children</w:t>
-      </w:r>
-      <w:r>
-        <w:t>.docx</w:t>
-      </w:r>
-      <w:r>
-        <w:t>’</w:t>
-      </w:r>
-      <w:r>
-        <w:t>) }}</w:t>
+        <w:t>{% elif tool_ID == "divorce_complaint</w:t>
+      </w:r>
+      <w:r>
+        <w:t xml:space="preserve">" </w:t>
+      </w:r>
+      <w:r>
+        <w:t xml:space="preserve">and not </w:t>
+      </w:r>
+      <w:r>
+        <w:t xml:space="preserve">there_are_marital_children </w:t>
+      </w:r>
+      <w:r>
+        <w:t>%}</w:t>
       </w:r>
     </w:p>
     <w:p>
@@ -910,45 +580,28 @@
         <w:pStyle w:val="Normalforinsertedinstructions"/>
       </w:pPr>
       <w:r>
-        <w:t xml:space="preserve">{% </w:t>
-      </w:r>
-      <w:proofErr w:type="spellStart"/>
-      <w:r>
-        <w:t>elif</w:t>
-      </w:r>
-      <w:proofErr w:type="spellEnd"/>
-      <w:r>
-        <w:t xml:space="preserve"> </w:t>
-      </w:r>
-      <w:proofErr w:type="spellStart"/>
-      <w:r>
-        <w:t>tool_ID</w:t>
-      </w:r>
-      <w:proofErr w:type="spellEnd"/>
-      <w:r>
-        <w:t xml:space="preserve"> == "</w:t>
-      </w:r>
-      <w:proofErr w:type="spellStart"/>
-      <w:r>
-        <w:t>divorce_complaint</w:t>
-      </w:r>
-      <w:proofErr w:type="spellEnd"/>
-      <w:r>
-        <w:t xml:space="preserve">" </w:t>
-      </w:r>
-      <w:r>
-        <w:t xml:space="preserve">and not </w:t>
-      </w:r>
-      <w:proofErr w:type="spellStart"/>
-      <w:r>
-        <w:t>there_are_marital_children</w:t>
-      </w:r>
-      <w:proofErr w:type="spellEnd"/>
-      <w:r>
-        <w:t xml:space="preserve"> </w:t>
-      </w:r>
-      <w:r>
-        <w:t>%}</w:t>
+        <w:t>{{p include_docx_template(</w:t>
+      </w:r>
+      <w:r>
+        <w:t>‘</w:t>
+      </w:r>
+      <w:r>
+        <w:t>instructions_divorce_with</w:t>
+      </w:r>
+      <w:r>
+        <w:t>out</w:t>
+      </w:r>
+      <w:r>
+        <w:t>_children</w:t>
+      </w:r>
+      <w:r>
+        <w:t>.docx</w:t>
+      </w:r>
+      <w:r>
+        <w:t>’</w:t>
+      </w:r>
+      <w:r>
+        <w:t>) }}</w:t>
       </w:r>
     </w:p>
     <w:p>
@@ -956,28 +609,13 @@
         <w:pStyle w:val="Normalforinsertedinstructions"/>
       </w:pPr>
       <w:r>
-        <w:t>{{p include_docx_template(</w:t>
-      </w:r>
-      <w:r>
-        <w:t>‘</w:t>
-      </w:r>
-      <w:r>
-        <w:t>instructions_divorce_with</w:t>
-      </w:r>
-      <w:r>
-        <w:t>out</w:t>
-      </w:r>
-      <w:r>
-        <w:t>_children</w:t>
-      </w:r>
-      <w:r>
-        <w:t>.docx</w:t>
-      </w:r>
-      <w:r>
-        <w:t>’</w:t>
-      </w:r>
-      <w:r>
-        <w:t>) }}</w:t>
+        <w:t>{% elif tool_ID == "divorce_answer</w:t>
+      </w:r>
+      <w:r>
+        <w:t xml:space="preserve">" </w:t>
+      </w:r>
+      <w:r>
+        <w:t>%}</w:t>
       </w:r>
     </w:p>
     <w:p>
@@ -985,34 +623,19 @@
         <w:pStyle w:val="Normalforinsertedinstructions"/>
       </w:pPr>
       <w:r>
-        <w:t xml:space="preserve">{% </w:t>
-      </w:r>
-      <w:proofErr w:type="spellStart"/>
-      <w:r>
-        <w:t>elif</w:t>
-      </w:r>
-      <w:proofErr w:type="spellEnd"/>
-      <w:r>
-        <w:t xml:space="preserve"> </w:t>
-      </w:r>
-      <w:proofErr w:type="spellStart"/>
-      <w:r>
-        <w:t>tool_ID</w:t>
-      </w:r>
-      <w:proofErr w:type="spellEnd"/>
-      <w:r>
-        <w:t xml:space="preserve"> == "</w:t>
-      </w:r>
-      <w:proofErr w:type="spellStart"/>
-      <w:r>
-        <w:t>divorce_answer</w:t>
-      </w:r>
-      <w:proofErr w:type="spellEnd"/>
-      <w:r>
-        <w:t xml:space="preserve">" </w:t>
-      </w:r>
-      <w:r>
-        <w:t>%}</w:t>
+        <w:t>{{p include_docx_template(</w:t>
+      </w:r>
+      <w:r>
+        <w:t>‘instructions_divorce_answer</w:t>
+      </w:r>
+      <w:r>
+        <w:t>.docx</w:t>
+      </w:r>
+      <w:r>
+        <w:t>’</w:t>
+      </w:r>
+      <w:r>
+        <w:t>) }}</w:t>
       </w:r>
     </w:p>
     <w:p>
@@ -1020,27 +643,7 @@
         <w:pStyle w:val="Normalforinsertedinstructions"/>
       </w:pPr>
       <w:r>
-        <w:t xml:space="preserve">{{p </w:t>
-      </w:r>
-      <w:proofErr w:type="spellStart"/>
-      <w:r>
-        <w:t>include_docx_template</w:t>
-      </w:r>
-      <w:proofErr w:type="spellEnd"/>
-      <w:r>
-        <w:t>(</w:t>
-      </w:r>
-      <w:r>
-        <w:t>‘instructions_divorce_answer</w:t>
-      </w:r>
-      <w:r>
-        <w:t>.docx</w:t>
-      </w:r>
-      <w:r>
-        <w:t>’</w:t>
-      </w:r>
-      <w:r>
-        <w:t>) }}</w:t>
+        <w:t>{% endif %}</w:t>
       </w:r>
     </w:p>
     <w:p>
@@ -1048,7 +651,7 @@
         <w:pStyle w:val="Normalforinsertedinstructions"/>
       </w:pPr>
       <w:r>
-        <w:t>{% endif %}</w:t>
+        <w:t>{%p endif %}</w:t>
       </w:r>
     </w:p>
     <w:p>
@@ -1056,85 +659,54 @@
         <w:pStyle w:val="Normalforinsertedinstructions"/>
       </w:pPr>
       <w:r>
-        <w:t>{%p endif %}</w:t>
+        <w:t xml:space="preserve">{%p if </w:t>
+      </w:r>
+      <w:r>
+        <w:t xml:space="preserve">tool_ID </w:t>
+      </w:r>
+      <w:r>
+        <w:t>in</w:t>
+      </w:r>
+      <w:r>
+        <w:t xml:space="preserve"> </w:t>
+      </w:r>
+      <w:r>
+        <w:t>[</w:t>
+      </w:r>
+      <w:r>
+        <w:t>"divorce_complaint</w:t>
+      </w:r>
+      <w:r>
+        <w:t>"</w:t>
+      </w:r>
+      <w:r>
+        <w:t xml:space="preserve">, </w:t>
+      </w:r>
+      <w:r>
+        <w:t>"JOD_only</w:t>
+      </w:r>
+      <w:r>
+        <w:t>"</w:t>
+      </w:r>
+      <w:r>
+        <w:t xml:space="preserve">] </w:t>
+      </w:r>
+      <w:r>
+        <w:t>%}</w:t>
       </w:r>
     </w:p>
     <w:p>
-      <w:pPr>
-        <w:pStyle w:val="Normalforinsertedinstructions"/>
-      </w:pPr>
-      <w:r>
-        <w:t xml:space="preserve">{%p if </w:t>
-      </w:r>
-      <w:proofErr w:type="spellStart"/>
-      <w:r>
-        <w:t>tool_ID</w:t>
-      </w:r>
-      <w:proofErr w:type="spellEnd"/>
-      <w:r>
-        <w:t xml:space="preserve"> </w:t>
-      </w:r>
-      <w:r>
-        <w:t>in</w:t>
-      </w:r>
-      <w:r>
-        <w:t xml:space="preserve"> </w:t>
-      </w:r>
-      <w:r>
-        <w:t>[</w:t>
-      </w:r>
-      <w:r>
-        <w:t>"</w:t>
-      </w:r>
-      <w:proofErr w:type="spellStart"/>
-      <w:r>
-        <w:t>divorce_complaint</w:t>
-      </w:r>
-      <w:proofErr w:type="spellEnd"/>
-      <w:r>
-        <w:t>"</w:t>
-      </w:r>
-      <w:r>
-        <w:t xml:space="preserve">, </w:t>
-      </w:r>
-      <w:r>
-        <w:t>"</w:t>
-      </w:r>
-      <w:proofErr w:type="spellStart"/>
-      <w:r>
-        <w:t>JOD_only</w:t>
-      </w:r>
-      <w:proofErr w:type="spellEnd"/>
-      <w:r>
-        <w:t>"</w:t>
-      </w:r>
-      <w:r>
-        <w:t xml:space="preserve">] </w:t>
-      </w:r>
-      <w:r>
-        <w:t>%}</w:t>
+      <w:r>
+        <w:br w:type="page"/>
       </w:r>
     </w:p>
     <w:p>
-      <w:r>
-        <w:br w:type="page"/>
-      </w:r>
-    </w:p>
-    <w:p>
       <w:pPr>
         <w:pStyle w:val="Normalforinsertedinstructions"/>
       </w:pPr>
       <w:r>
         <w:lastRenderedPageBreak/>
-        <w:t xml:space="preserve">{{p </w:t>
-      </w:r>
-      <w:proofErr w:type="spellStart"/>
-      <w:r>
-        <w:t>include_docx_template</w:t>
-      </w:r>
-      <w:proofErr w:type="spellEnd"/>
-      <w:r>
-        <w:t>(</w:t>
+        <w:t>{{p include_docx_template(</w:t>
       </w:r>
       <w:r>
         <w:t>‘</w:t>
@@ -1169,7 +741,7 @@
 </file>
 
 <file path=word/numbering.xml><?xml version="1.0" encoding="utf-8"?>
-<w:numbering xmlns:wpc="http://schemas.microsoft.com/office/word/2010/wordprocessingCanvas" xmlns:cx="http://schemas.microsoft.com/office/drawing/2014/chartex" xmlns:cx1="http://schemas.microsoft.com/office/drawing/2015/9/8/chartex" xmlns:cx2="http://schemas.microsoft.com/office/drawing/2015/10/21/chartex" xmlns:cx3="http://schemas.microsoft.com/office/drawing/2016/5/9/chartex" xmlns:cx4="http://schemas.microsoft.com/office/drawing/2016/5/10/chartex" xmlns:cx5="http://schemas.microsoft.com/office/drawing/2016/5/11/chartex" xmlns:cx6="http://schemas.microsoft.com/office/drawing/2016/5/12/chartex" xmlns:cx7="http://schemas.microsoft.com/office/drawing/2016/5/13/chartex" xmlns:cx8="http://schemas.microsoft.com/office/drawing/2016/5/14/chartex" xmlns:mc="http://schemas.openxmlformats.org/markup-compatibility/2006" xmlns:aink="http://schemas.microsoft.com/office/drawing/2016/ink" xmlns:am3d="http://schemas.microsoft.com/office/drawing/2017/model3d" xmlns:o="urn:schemas-microsoft-com:office:office" xmlns:oel="http://schemas.microsoft.com/office/2019/extlst" xmlns:r="http://schemas.openxmlformats.org/officeDocument/2006/relationships" xmlns:m="http://schemas.openxmlformats.org/officeDocument/2006/math" xmlns:v="urn:schemas-microsoft-com:vml" xmlns:wp14="http://schemas.microsoft.com/office/word/2010/wordprocessingDrawing" xmlns:wp="http://schemas.openxmlformats.org/drawingml/2006/wordprocessingDrawing" xmlns:w10="urn:schemas-microsoft-com:office:word" xmlns:w="http://schemas.openxmlformats.org/wordprocessingml/2006/main" xmlns:w14="http://schemas.microsoft.com/office/word/2010/wordml" xmlns:w15="http://schemas.microsoft.com/office/word/2012/wordml" xmlns:w16cex="http://schemas.microsoft.com/office/word/2018/wordml/cex" xmlns:w16cid="http://schemas.microsoft.com/office/word/2016/wordml/cid" xmlns:w16="http://schemas.microsoft.com/office/word/2018/wordml" xmlns:w16du="http://schemas.microsoft.com/office/word/2023/wordml/word16du" xmlns:w16sdtdh="http://schemas.microsoft.com/office/word/2020/wordml/sdtdatahash" xmlns:w16sdtfl="http://schemas.microsoft.com/office/word/2024/wordml/sdtformatlock" xmlns:w16se="http://schemas.microsoft.com/office/word/2015/wordml/symex" xmlns:wpg="http://schemas.microsoft.com/office/word/2010/wordprocessingGroup" xmlns:wpi="http://schemas.microsoft.com/office/word/2010/wordprocessingInk" xmlns:wne="http://schemas.microsoft.com/office/word/2006/wordml" xmlns:wps="http://schemas.microsoft.com/office/word/2010/wordprocessingShape" mc:Ignorable="w14 w15 w16se w16cid w16 w16cex w16sdtdh w16sdtfl w16du wp14">
+<w:numbering xmlns:wpc="http://schemas.microsoft.com/office/word/2010/wordprocessingCanvas" xmlns:cx="http://schemas.microsoft.com/office/drawing/2014/chartex" xmlns:cx1="http://schemas.microsoft.com/office/drawing/2015/9/8/chartex" xmlns:cx2="http://schemas.microsoft.com/office/drawing/2015/10/21/chartex" xmlns:cx3="http://schemas.microsoft.com/office/drawing/2016/5/9/chartex" xmlns:cx4="http://schemas.microsoft.com/office/drawing/2016/5/10/chartex" xmlns:cx5="http://schemas.microsoft.com/office/drawing/2016/5/11/chartex" xmlns:cx6="http://schemas.microsoft.com/office/drawing/2016/5/12/chartex" xmlns:cx7="http://schemas.microsoft.com/office/drawing/2016/5/13/chartex" xmlns:cx8="http://schemas.microsoft.com/office/drawing/2016/5/14/chartex" xmlns:mc="http://schemas.openxmlformats.org/markup-compatibility/2006" xmlns:aink="http://schemas.microsoft.com/office/drawing/2016/ink" xmlns:am3d="http://schemas.microsoft.com/office/drawing/2017/model3d" xmlns:o="urn:schemas-microsoft-com:office:office" xmlns:oel="http://schemas.microsoft.com/office/2019/extlst" xmlns:r="http://schemas.openxmlformats.org/officeDocument/2006/relationships" xmlns:m="http://schemas.openxmlformats.org/officeDocument/2006/math" xmlns:v="urn:schemas-microsoft-com:vml" xmlns:wp14="http://schemas.microsoft.com/office/word/2010/wordprocessingDrawing" xmlns:wp="http://schemas.openxmlformats.org/drawingml/2006/wordprocessingDrawing" xmlns:w10="urn:schemas-microsoft-com:office:word" xmlns:w="http://schemas.openxmlformats.org/wordprocessingml/2006/main" xmlns:w14="http://schemas.microsoft.com/office/word/2010/wordml" xmlns:w15="http://schemas.microsoft.com/office/word/2012/wordml" xmlns:w16cei="http://schemas.microsoft.com/office/word/2026/wordml/cei" xmlns:w16cex="http://schemas.microsoft.com/office/word/2018/wordml/cex" xmlns:w16cid="http://schemas.microsoft.com/office/word/2016/wordml/cid" xmlns:w16="http://schemas.microsoft.com/office/word/2018/wordml" xmlns:w16du="http://schemas.microsoft.com/office/word/2023/wordml/word16du" xmlns:w16sdtdh="http://schemas.microsoft.com/office/word/2020/wordml/sdtdatahash" xmlns:w16sdtfl="http://schemas.microsoft.com/office/word/2024/wordml/sdtformatlock" xmlns:w16se="http://schemas.microsoft.com/office/word/2015/wordml/symex" xmlns:wpg="http://schemas.microsoft.com/office/word/2010/wordprocessingGroup" xmlns:wpi="http://schemas.microsoft.com/office/word/2010/wordprocessingInk" xmlns:wne="http://schemas.microsoft.com/office/word/2006/wordml" xmlns:wps="http://schemas.microsoft.com/office/word/2010/wordprocessingShape" mc:Ignorable="w14 w15 w16se w16cid w16 w16cex w16sdtdh w16sdtfl w16du wp14">
   <w:abstractNum w:abstractNumId="0" w15:restartNumberingAfterBreak="0">
     <w:nsid w:val="01A548E7"/>
     <w:multiLevelType w:val="multilevel"/>
@@ -3885,28 +3457,28 @@
 </file>
 
 <file path=customXml/item1.xml><?xml version="1.0" encoding="utf-8"?>
-<b:Sources xmlns:b="http://schemas.openxmlformats.org/officeDocument/2006/bibliography" xmlns="http://schemas.openxmlformats.org/officeDocument/2006/bibliography" SelectedStyle="\APASixthEditionOfficeOnline.xsl" StyleName="APA" Version="6"/>
-</file>
-
-<file path=customXml/item2.xml><?xml version="1.0" encoding="utf-8"?>
 <go:gDocsCustomXmlDataStorage xmlns:go="http://customooxmlschemas.google.com/" xmlns:r="http://schemas.openxmlformats.org/officeDocument/2006/relationships" uri="GoogleDocsCustomDataVersion2">
   <go:docsCustomData xmlns:go="http://customooxmlschemas.google.com/" roundtripDataSignature="AMtx7mjac1FaFv6WV3g0GhcUIQ9kG0o+yg==">CgMxLjAyDmgubjh0aHd2ZHFzMTk0MghoLmdqZGd4czIOaC56N2hubnB1aWk1NDkyDWguc3hkdG9pMzhvYmkyDmguNWY0ZXAwcWVlOXRlMg5oLmVqdDhyOXF0bXp6djIOaC4yOWpnN3o3Y2I3bGIyDmguanM4cTNwM3I0eDZjMg5oLnYzbTFuaXhkbzBwejIOaC5wZzd4dGp6Y2t3dWkyDmgueTE0MHhvdmdnYml0Mg5oLjRocjAxMWhrOXVyNjIOaC5xMTI4N2VvNmMyd24yDmguODY5YjBrbWEwNmtsMg5oLm1hczdybXljNW82ejgAciExV3BDbUx3RGV0a2poVzFWLUZiZXdyanhaTmV2Wm8tWm0=</go:docsCustomData>
 </go:gDocsCustomXmlDataStorage>
 </file>
 
-<file path=customXml/itemProps1.xml><?xml version="1.0" encoding="utf-8"?>
-<ds:datastoreItem xmlns:ds="http://schemas.openxmlformats.org/officeDocument/2006/customXml" ds:itemID="{D17ADB1C-BB67-458D-A072-D9E3A76A5AA9}">
-  <ds:schemaRefs>
-    <ds:schemaRef ds:uri="http://schemas.openxmlformats.org/officeDocument/2006/bibliography"/>
-  </ds:schemaRefs>
-</ds:datastoreItem>
+<file path=customXml/item2.xml><?xml version="1.0" encoding="utf-8"?>
+<b:Sources xmlns:b="http://schemas.openxmlformats.org/officeDocument/2006/bibliography" xmlns="http://schemas.openxmlformats.org/officeDocument/2006/bibliography" SelectedStyle="\APASixthEditionOfficeOnline.xsl" StyleName="APA" Version="6"/>
 </file>
 
-<file path=customXml/itemProps2.xml><?xml version="1.0" encoding="utf-8"?>
+<file path=customXml/itemProps1.xml><?xml version="1.0" encoding="utf-8"?>
 <ds:datastoreItem xmlns:ds="http://schemas.openxmlformats.org/officeDocument/2006/customXml" ds:itemID="{11111111-1234-1234-1234-123412341234}">
   <ds:schemaRefs>
     <ds:schemaRef ds:uri="http://customooxmlschemas.google.com/"/>
     <ds:schemaRef ds:uri="http://schemas.openxmlformats.org/officeDocument/2006/relationships"/>
   </ds:schemaRefs>
 </ds:datastoreItem>
+</file>
+
+<file path=customXml/itemProps2.xml><?xml version="1.0" encoding="utf-8"?>
+<ds:datastoreItem xmlns:ds="http://schemas.openxmlformats.org/officeDocument/2006/customXml" ds:itemID="{D17ADB1C-BB67-458D-A072-D9E3A76A5AA9}">
+  <ds:schemaRefs>
+    <ds:schemaRef ds:uri="http://schemas.openxmlformats.org/officeDocument/2006/bibliography"/>
+  </ds:schemaRefs>
+</ds:datastoreItem>
 </file>
</xml_diff>

<commit_message>
fixes #338; adds insertion logic for quitclaim reminder for JOD-only; formatting tweaks to reminders doc
</commit_message>
<xml_diff>
--- a/docassemble/MLHDivorceAndCustody/data/templates/instructions.docx
+++ b/docassemble/MLHDivorceAndCustody/data/templates/instructions.docx
@@ -1,6 +1,6 @@
 
 <file path=word/document.xml><?xml version="1.0" encoding="utf-8"?>
-<w:document xmlns:wpc="http://schemas.microsoft.com/office/word/2010/wordprocessingCanvas" xmlns:cx="http://schemas.microsoft.com/office/drawing/2014/chartex" xmlns:cx1="http://schemas.microsoft.com/office/drawing/2015/9/8/chartex" xmlns:cx2="http://schemas.microsoft.com/office/drawing/2015/10/21/chartex" xmlns:cx3="http://schemas.microsoft.com/office/drawing/2016/5/9/chartex" xmlns:cx4="http://schemas.microsoft.com/office/drawing/2016/5/10/chartex" xmlns:cx5="http://schemas.microsoft.com/office/drawing/2016/5/11/chartex" xmlns:cx6="http://schemas.microsoft.com/office/drawing/2016/5/12/chartex" xmlns:cx7="http://schemas.microsoft.com/office/drawing/2016/5/13/chartex" xmlns:cx8="http://schemas.microsoft.com/office/drawing/2016/5/14/chartex" xmlns:mc="http://schemas.openxmlformats.org/markup-compatibility/2006" xmlns:aink="http://schemas.microsoft.com/office/drawing/2016/ink" xmlns:am3d="http://schemas.microsoft.com/office/drawing/2017/model3d" xmlns:o="urn:schemas-microsoft-com:office:office" xmlns:oel="http://schemas.microsoft.com/office/2019/extlst" xmlns:r="http://schemas.openxmlformats.org/officeDocument/2006/relationships" xmlns:m="http://schemas.openxmlformats.org/officeDocument/2006/math" xmlns:v="urn:schemas-microsoft-com:vml" xmlns:wp14="http://schemas.microsoft.com/office/word/2010/wordprocessingDrawing" xmlns:wp="http://schemas.openxmlformats.org/drawingml/2006/wordprocessingDrawing" xmlns:w10="urn:schemas-microsoft-com:office:word" xmlns:w="http://schemas.openxmlformats.org/wordprocessingml/2006/main" xmlns:w14="http://schemas.microsoft.com/office/word/2010/wordml" xmlns:w15="http://schemas.microsoft.com/office/word/2012/wordml" xmlns:w16cei="http://schemas.microsoft.com/office/word/2026/wordml/cei" xmlns:w16cex="http://schemas.microsoft.com/office/word/2018/wordml/cex" xmlns:w16cid="http://schemas.microsoft.com/office/word/2016/wordml/cid" xmlns:w16="http://schemas.microsoft.com/office/word/2018/wordml" xmlns:w16du="http://schemas.microsoft.com/office/word/2023/wordml/word16du" xmlns:w16sdtdh="http://schemas.microsoft.com/office/word/2020/wordml/sdtdatahash" xmlns:w16sdtfl="http://schemas.microsoft.com/office/word/2024/wordml/sdtformatlock" xmlns:w16se="http://schemas.microsoft.com/office/word/2015/wordml/symex" xmlns:wpg="http://schemas.microsoft.com/office/word/2010/wordprocessingGroup" xmlns:wpi="http://schemas.microsoft.com/office/word/2010/wordprocessingInk" xmlns:wne="http://schemas.microsoft.com/office/word/2006/wordml" xmlns:wps="http://schemas.microsoft.com/office/word/2010/wordprocessingShape" mc:Ignorable="w14 w15 w16se w16cid w16 w16cex w16sdtdh w16sdtfl w16du wp14">
+<w:document xmlns:wpc="http://schemas.microsoft.com/office/word/2010/wordprocessingCanvas" xmlns:cx="http://schemas.microsoft.com/office/drawing/2014/chartex" xmlns:cx1="http://schemas.microsoft.com/office/drawing/2015/9/8/chartex" xmlns:cx2="http://schemas.microsoft.com/office/drawing/2015/10/21/chartex" xmlns:cx3="http://schemas.microsoft.com/office/drawing/2016/5/9/chartex" xmlns:cx4="http://schemas.microsoft.com/office/drawing/2016/5/10/chartex" xmlns:cx5="http://schemas.microsoft.com/office/drawing/2016/5/11/chartex" xmlns:cx6="http://schemas.microsoft.com/office/drawing/2016/5/12/chartex" xmlns:cx7="http://schemas.microsoft.com/office/drawing/2016/5/13/chartex" xmlns:cx8="http://schemas.microsoft.com/office/drawing/2016/5/14/chartex" xmlns:mc="http://schemas.openxmlformats.org/markup-compatibility/2006" xmlns:aink="http://schemas.microsoft.com/office/drawing/2016/ink" xmlns:am3d="http://schemas.microsoft.com/office/drawing/2017/model3d" xmlns:o="urn:schemas-microsoft-com:office:office" xmlns:oel="http://schemas.microsoft.com/office/2019/extlst" xmlns:r="http://schemas.openxmlformats.org/officeDocument/2006/relationships" xmlns:m="http://schemas.openxmlformats.org/officeDocument/2006/math" xmlns:v="urn:schemas-microsoft-com:vml" xmlns:wp14="http://schemas.microsoft.com/office/word/2010/wordprocessingDrawing" xmlns:wp="http://schemas.openxmlformats.org/drawingml/2006/wordprocessingDrawing" xmlns:w10="urn:schemas-microsoft-com:office:word" xmlns:w="http://schemas.openxmlformats.org/wordprocessingml/2006/main" xmlns:w14="http://schemas.microsoft.com/office/word/2010/wordml" xmlns:w15="http://schemas.microsoft.com/office/word/2012/wordml" xmlns:w16cex="http://schemas.microsoft.com/office/word/2018/wordml/cex" xmlns:w16cid="http://schemas.microsoft.com/office/word/2016/wordml/cid" xmlns:w16="http://schemas.microsoft.com/office/word/2018/wordml" xmlns:w16du="http://schemas.microsoft.com/office/word/2023/wordml/word16du" xmlns:w16sdtdh="http://schemas.microsoft.com/office/word/2020/wordml/sdtdatahash" xmlns:w16sdtfl="http://schemas.microsoft.com/office/word/2024/wordml/sdtformatlock" xmlns:w16se="http://schemas.microsoft.com/office/word/2015/wordml/symex" xmlns:wpg="http://schemas.microsoft.com/office/word/2010/wordprocessingGroup" xmlns:wpi="http://schemas.microsoft.com/office/word/2010/wordprocessingInk" xmlns:wne="http://schemas.microsoft.com/office/word/2006/wordml" xmlns:wps="http://schemas.microsoft.com/office/word/2010/wordprocessingShape" mc:Ignorable="w14 w15 w16se w16cid w16 w16cex w16sdtdh w16sdtfl w16du wp14">
   <w:body>
     <w:p>
       <w:pPr>
@@ -13,7 +13,23 @@
     <w:p/>
     <w:p>
       <w:r>
-        <w:t>{%p if tool_ID == “divorce_complaint” %}</w:t>
+        <w:t xml:space="preserve">{%p if </w:t>
+      </w:r>
+      <w:proofErr w:type="spellStart"/>
+      <w:r>
+        <w:t>tool_ID</w:t>
+      </w:r>
+      <w:proofErr w:type="spellEnd"/>
+      <w:r>
+        <w:t xml:space="preserve"> == “</w:t>
+      </w:r>
+      <w:proofErr w:type="spellStart"/>
+      <w:r>
+        <w:t>divorce_complaint</w:t>
+      </w:r>
+      <w:proofErr w:type="spellEnd"/>
+      <w:r>
+        <w:t>” %}</w:t>
       </w:r>
     </w:p>
     <w:p>
@@ -84,7 +100,31 @@
     </w:p>
     <w:p>
       <w:r>
-        <w:t>{%p elif tool_ID == “JOD_only” %}</w:t>
+        <w:t xml:space="preserve">{%p </w:t>
+      </w:r>
+      <w:proofErr w:type="spellStart"/>
+      <w:r>
+        <w:t>elif</w:t>
+      </w:r>
+      <w:proofErr w:type="spellEnd"/>
+      <w:r>
+        <w:t xml:space="preserve"> </w:t>
+      </w:r>
+      <w:proofErr w:type="spellStart"/>
+      <w:r>
+        <w:t>tool_ID</w:t>
+      </w:r>
+      <w:proofErr w:type="spellEnd"/>
+      <w:r>
+        <w:t xml:space="preserve"> == “</w:t>
+      </w:r>
+      <w:proofErr w:type="spellStart"/>
+      <w:r>
+        <w:t>JOD_only</w:t>
+      </w:r>
+      <w:proofErr w:type="spellEnd"/>
+      <w:r>
+        <w:t>” %}</w:t>
       </w:r>
     </w:p>
     <w:p>
@@ -152,7 +192,31 @@
     </w:p>
     <w:p>
       <w:r>
-        <w:t>{%p elif tool_ID == “divorce_answer” %}</w:t>
+        <w:t xml:space="preserve">{%p </w:t>
+      </w:r>
+      <w:proofErr w:type="spellStart"/>
+      <w:r>
+        <w:t>elif</w:t>
+      </w:r>
+      <w:proofErr w:type="spellEnd"/>
+      <w:r>
+        <w:t xml:space="preserve"> </w:t>
+      </w:r>
+      <w:proofErr w:type="spellStart"/>
+      <w:r>
+        <w:t>tool_ID</w:t>
+      </w:r>
+      <w:proofErr w:type="spellEnd"/>
+      <w:r>
+        <w:t xml:space="preserve"> == “</w:t>
+      </w:r>
+      <w:proofErr w:type="spellStart"/>
+      <w:r>
+        <w:t>divorce_answer</w:t>
+      </w:r>
+      <w:proofErr w:type="spellEnd"/>
+      <w:r>
+        <w:t>” %}</w:t>
       </w:r>
     </w:p>
     <w:p>
@@ -293,7 +357,23 @@
           <w:rFonts w:asciiTheme="minorHAnsi" w:hAnsiTheme="minorHAnsi" w:cstheme="minorHAnsi"/>
           <w:szCs w:val="28"/>
         </w:rPr>
-        <w:t xml:space="preserve">{%p if tool_ID </w:t>
+        <w:t xml:space="preserve">{%p if </w:t>
+      </w:r>
+      <w:proofErr w:type="spellStart"/>
+      <w:r>
+        <w:rPr>
+          <w:rFonts w:asciiTheme="minorHAnsi" w:hAnsiTheme="minorHAnsi" w:cstheme="minorHAnsi"/>
+          <w:szCs w:val="28"/>
+        </w:rPr>
+        <w:t>tool_ID</w:t>
+      </w:r>
+      <w:proofErr w:type="spellEnd"/>
+      <w:r>
+        <w:rPr>
+          <w:rFonts w:asciiTheme="minorHAnsi" w:hAnsiTheme="minorHAnsi" w:cstheme="minorHAnsi"/>
+          <w:szCs w:val="28"/>
+        </w:rPr>
+        <w:t xml:space="preserve"> </w:t>
       </w:r>
       <w:r>
         <w:rPr>
@@ -307,14 +387,46 @@
           <w:rFonts w:asciiTheme="minorHAnsi" w:hAnsiTheme="minorHAnsi" w:cstheme="minorHAnsi"/>
           <w:szCs w:val="28"/>
         </w:rPr>
-        <w:t>“divorce_complaint”</w:t>
-      </w:r>
-      <w:r>
-        <w:rPr>
-          <w:rFonts w:asciiTheme="minorHAnsi" w:hAnsiTheme="minorHAnsi" w:cstheme="minorHAnsi"/>
-          <w:szCs w:val="28"/>
-        </w:rPr>
-        <w:t>, “divorce_answer”]</w:t>
+        <w:t>“</w:t>
+      </w:r>
+      <w:proofErr w:type="spellStart"/>
+      <w:r>
+        <w:rPr>
+          <w:rFonts w:asciiTheme="minorHAnsi" w:hAnsiTheme="minorHAnsi" w:cstheme="minorHAnsi"/>
+          <w:szCs w:val="28"/>
+        </w:rPr>
+        <w:t>divorce_complaint</w:t>
+      </w:r>
+      <w:proofErr w:type="spellEnd"/>
+      <w:r>
+        <w:rPr>
+          <w:rFonts w:asciiTheme="minorHAnsi" w:hAnsiTheme="minorHAnsi" w:cstheme="minorHAnsi"/>
+          <w:szCs w:val="28"/>
+        </w:rPr>
+        <w:t>”</w:t>
+      </w:r>
+      <w:r>
+        <w:rPr>
+          <w:rFonts w:asciiTheme="minorHAnsi" w:hAnsiTheme="minorHAnsi" w:cstheme="minorHAnsi"/>
+          <w:szCs w:val="28"/>
+        </w:rPr>
+        <w:t>, “</w:t>
+      </w:r>
+      <w:proofErr w:type="spellStart"/>
+      <w:r>
+        <w:rPr>
+          <w:rFonts w:asciiTheme="minorHAnsi" w:hAnsiTheme="minorHAnsi" w:cstheme="minorHAnsi"/>
+          <w:szCs w:val="28"/>
+        </w:rPr>
+        <w:t>divorce_answer</w:t>
+      </w:r>
+      <w:proofErr w:type="spellEnd"/>
+      <w:r>
+        <w:rPr>
+          <w:rFonts w:asciiTheme="minorHAnsi" w:hAnsiTheme="minorHAnsi" w:cstheme="minorHAnsi"/>
+          <w:szCs w:val="28"/>
+        </w:rPr>
+        <w:t>”]</w:t>
       </w:r>
       <w:r>
         <w:rPr>
@@ -328,7 +440,39 @@
           <w:rFonts w:asciiTheme="minorHAnsi" w:hAnsiTheme="minorHAnsi" w:cstheme="minorHAnsi"/>
           <w:szCs w:val="28"/>
         </w:rPr>
-        <w:t xml:space="preserve">or (tool_ID == “JOD_only” and </w:t>
+        <w:t>or (</w:t>
+      </w:r>
+      <w:proofErr w:type="spellStart"/>
+      <w:r>
+        <w:rPr>
+          <w:rFonts w:asciiTheme="minorHAnsi" w:hAnsiTheme="minorHAnsi" w:cstheme="minorHAnsi"/>
+          <w:szCs w:val="28"/>
+        </w:rPr>
+        <w:t>tool_ID</w:t>
+      </w:r>
+      <w:proofErr w:type="spellEnd"/>
+      <w:r>
+        <w:rPr>
+          <w:rFonts w:asciiTheme="minorHAnsi" w:hAnsiTheme="minorHAnsi" w:cstheme="minorHAnsi"/>
+          <w:szCs w:val="28"/>
+        </w:rPr>
+        <w:t xml:space="preserve"> == “</w:t>
+      </w:r>
+      <w:proofErr w:type="spellStart"/>
+      <w:r>
+        <w:rPr>
+          <w:rFonts w:asciiTheme="minorHAnsi" w:hAnsiTheme="minorHAnsi" w:cstheme="minorHAnsi"/>
+          <w:szCs w:val="28"/>
+        </w:rPr>
+        <w:t>JOD_only</w:t>
+      </w:r>
+      <w:proofErr w:type="spellEnd"/>
+      <w:r>
+        <w:rPr>
+          <w:rFonts w:asciiTheme="minorHAnsi" w:hAnsiTheme="minorHAnsi" w:cstheme="minorHAnsi"/>
+          <w:szCs w:val="28"/>
+        </w:rPr>
+        <w:t xml:space="preserve">” and </w:t>
       </w:r>
       <w:r>
         <w:rPr>
@@ -342,15 +486,17 @@
           <w:rFonts w:asciiTheme="minorHAnsi" w:hAnsiTheme="minorHAnsi" w:cstheme="minorHAnsi"/>
           <w:szCs w:val="28"/>
         </w:rPr>
-        <w:t xml:space="preserve">(marriage.have_pension_retirement </w:t>
-      </w:r>
-      <w:r>
-        <w:rPr>
-          <w:rFonts w:asciiTheme="minorHAnsi" w:hAnsiTheme="minorHAnsi" w:cstheme="minorHAnsi"/>
-          <w:szCs w:val="28"/>
-        </w:rPr>
-        <w:t>and marriage.pension_contributions_made</w:t>
-      </w:r>
+        <w:t>(</w:t>
+      </w:r>
+      <w:proofErr w:type="spellStart"/>
+      <w:r>
+        <w:rPr>
+          <w:rFonts w:asciiTheme="minorHAnsi" w:hAnsiTheme="minorHAnsi" w:cstheme="minorHAnsi"/>
+          <w:szCs w:val="28"/>
+        </w:rPr>
+        <w:t>marriage.have_pension_retirement</w:t>
+      </w:r>
+      <w:proofErr w:type="spellEnd"/>
       <w:r>
         <w:rPr>
           <w:rFonts w:asciiTheme="minorHAnsi" w:hAnsiTheme="minorHAnsi" w:cstheme="minorHAnsi"/>
@@ -363,14 +509,40 @@
           <w:rFonts w:asciiTheme="minorHAnsi" w:hAnsiTheme="minorHAnsi" w:cstheme="minorHAnsi"/>
           <w:szCs w:val="28"/>
         </w:rPr>
-        <w:t>and not marriage.pension_retirement_accounts_keep_own) or (</w:t>
-      </w:r>
-      <w:r>
-        <w:rPr>
-          <w:rFonts w:asciiTheme="minorHAnsi" w:hAnsiTheme="minorHAnsi" w:cstheme="minorHAnsi"/>
-        </w:rPr>
-        <w:t>marriage.personal_property_need_items and marriage.accounts.filter(trigger_investment_reminder=True) | length &gt; 0</w:t>
-      </w:r>
+        <w:t xml:space="preserve">and </w:t>
+      </w:r>
+      <w:proofErr w:type="spellStart"/>
+      <w:r>
+        <w:rPr>
+          <w:rFonts w:asciiTheme="minorHAnsi" w:hAnsiTheme="minorHAnsi" w:cstheme="minorHAnsi"/>
+          <w:szCs w:val="28"/>
+        </w:rPr>
+        <w:t>marriage.pension_contributions_made</w:t>
+      </w:r>
+      <w:proofErr w:type="spellEnd"/>
+      <w:r>
+        <w:rPr>
+          <w:rFonts w:asciiTheme="minorHAnsi" w:hAnsiTheme="minorHAnsi" w:cstheme="minorHAnsi"/>
+          <w:szCs w:val="28"/>
+        </w:rPr>
+        <w:t xml:space="preserve"> </w:t>
+      </w:r>
+      <w:r>
+        <w:rPr>
+          <w:rFonts w:asciiTheme="minorHAnsi" w:hAnsiTheme="minorHAnsi" w:cstheme="minorHAnsi"/>
+          <w:szCs w:val="28"/>
+        </w:rPr>
+        <w:t xml:space="preserve">and not </w:t>
+      </w:r>
+      <w:proofErr w:type="spellStart"/>
+      <w:r>
+        <w:rPr>
+          <w:rFonts w:asciiTheme="minorHAnsi" w:hAnsiTheme="minorHAnsi" w:cstheme="minorHAnsi"/>
+          <w:szCs w:val="28"/>
+        </w:rPr>
+        <w:t>marriage.pension_retirement_accounts_keep_own</w:t>
+      </w:r>
+      <w:proofErr w:type="spellEnd"/>
       <w:r>
         <w:rPr>
           <w:rFonts w:asciiTheme="minorHAnsi" w:hAnsiTheme="minorHAnsi" w:cstheme="minorHAnsi"/>
@@ -378,11 +550,47 @@
         </w:rPr>
         <w:t>) or (</w:t>
       </w:r>
-      <w:r>
-        <w:rPr>
-          <w:rFonts w:asciiTheme="minorHAnsi" w:hAnsiTheme="minorHAnsi" w:cstheme="minorHAnsi"/>
-        </w:rPr>
-        <w:t>there_are_marital_children and (parentage_affidavit_revoke or parentage_order_revoke or parentage_marital_revoke)</w:t>
+      <w:proofErr w:type="spellStart"/>
+      <w:r>
+        <w:rPr>
+          <w:rFonts w:asciiTheme="minorHAnsi" w:hAnsiTheme="minorHAnsi" w:cstheme="minorHAnsi"/>
+        </w:rPr>
+        <w:t>marriage.personal_property_need_items</w:t>
+      </w:r>
+      <w:proofErr w:type="spellEnd"/>
+      <w:r>
+        <w:rPr>
+          <w:rFonts w:asciiTheme="minorHAnsi" w:hAnsiTheme="minorHAnsi" w:cstheme="minorHAnsi"/>
+        </w:rPr>
+        <w:t xml:space="preserve"> and </w:t>
+      </w:r>
+      <w:proofErr w:type="spellStart"/>
+      <w:r>
+        <w:rPr>
+          <w:rFonts w:asciiTheme="minorHAnsi" w:hAnsiTheme="minorHAnsi" w:cstheme="minorHAnsi"/>
+        </w:rPr>
+        <w:t>marriage.accounts.filter</w:t>
+      </w:r>
+      <w:proofErr w:type="spellEnd"/>
+      <w:r>
+        <w:rPr>
+          <w:rFonts w:asciiTheme="minorHAnsi" w:hAnsiTheme="minorHAnsi" w:cstheme="minorHAnsi"/>
+        </w:rPr>
+        <w:t>(</w:t>
+      </w:r>
+      <w:proofErr w:type="spellStart"/>
+      <w:r>
+        <w:rPr>
+          <w:rFonts w:asciiTheme="minorHAnsi" w:hAnsiTheme="minorHAnsi" w:cstheme="minorHAnsi"/>
+        </w:rPr>
+        <w:t>trigger_investment_reminder</w:t>
+      </w:r>
+      <w:proofErr w:type="spellEnd"/>
+      <w:r>
+        <w:rPr>
+          <w:rFonts w:asciiTheme="minorHAnsi" w:hAnsiTheme="minorHAnsi" w:cstheme="minorHAnsi"/>
+        </w:rPr>
+        <w:t>=True) | length &gt; 0</w:t>
       </w:r>
       <w:r>
         <w:rPr>
@@ -391,11 +599,143 @@
         </w:rPr>
         <w:t>) or (</w:t>
       </w:r>
-      <w:r>
-        <w:rPr>
-          <w:rFonts w:asciiTheme="minorHAnsi" w:hAnsiTheme="minorHAnsi" w:cstheme="minorHAnsi"/>
-        </w:rPr>
-        <w:t>there_are_marital_children and not MI_has_jurisdiction_all_kids</w:t>
+      <w:proofErr w:type="spellStart"/>
+      <w:r>
+        <w:rPr>
+          <w:rFonts w:asciiTheme="minorHAnsi" w:hAnsiTheme="minorHAnsi" w:cstheme="minorHAnsi"/>
+        </w:rPr>
+        <w:t>there_are_marital_children</w:t>
+      </w:r>
+      <w:proofErr w:type="spellEnd"/>
+      <w:r>
+        <w:rPr>
+          <w:rFonts w:asciiTheme="minorHAnsi" w:hAnsiTheme="minorHAnsi" w:cstheme="minorHAnsi"/>
+        </w:rPr>
+        <w:t xml:space="preserve"> and (</w:t>
+      </w:r>
+      <w:proofErr w:type="spellStart"/>
+      <w:r>
+        <w:rPr>
+          <w:rFonts w:asciiTheme="minorHAnsi" w:hAnsiTheme="minorHAnsi" w:cstheme="minorHAnsi"/>
+        </w:rPr>
+        <w:t>parentage_affidavit_revoke</w:t>
+      </w:r>
+      <w:proofErr w:type="spellEnd"/>
+      <w:r>
+        <w:rPr>
+          <w:rFonts w:asciiTheme="minorHAnsi" w:hAnsiTheme="minorHAnsi" w:cstheme="minorHAnsi"/>
+        </w:rPr>
+        <w:t xml:space="preserve"> or </w:t>
+      </w:r>
+      <w:proofErr w:type="spellStart"/>
+      <w:r>
+        <w:rPr>
+          <w:rFonts w:asciiTheme="minorHAnsi" w:hAnsiTheme="minorHAnsi" w:cstheme="minorHAnsi"/>
+        </w:rPr>
+        <w:t>parentage_order_revoke</w:t>
+      </w:r>
+      <w:proofErr w:type="spellEnd"/>
+      <w:r>
+        <w:rPr>
+          <w:rFonts w:asciiTheme="minorHAnsi" w:hAnsiTheme="minorHAnsi" w:cstheme="minorHAnsi"/>
+        </w:rPr>
+        <w:t xml:space="preserve"> or </w:t>
+      </w:r>
+      <w:proofErr w:type="spellStart"/>
+      <w:r>
+        <w:rPr>
+          <w:rFonts w:asciiTheme="minorHAnsi" w:hAnsiTheme="minorHAnsi" w:cstheme="minorHAnsi"/>
+        </w:rPr>
+        <w:t>parentage_marital_revoke</w:t>
+      </w:r>
+      <w:proofErr w:type="spellEnd"/>
+      <w:r>
+        <w:rPr>
+          <w:rFonts w:asciiTheme="minorHAnsi" w:hAnsiTheme="minorHAnsi" w:cstheme="minorHAnsi"/>
+        </w:rPr>
+        <w:t>)</w:t>
+      </w:r>
+      <w:r>
+        <w:rPr>
+          <w:rFonts w:asciiTheme="minorHAnsi" w:hAnsiTheme="minorHAnsi" w:cstheme="minorHAnsi"/>
+          <w:szCs w:val="28"/>
+        </w:rPr>
+        <w:t>) or (</w:t>
+      </w:r>
+      <w:proofErr w:type="spellStart"/>
+      <w:r>
+        <w:rPr>
+          <w:rFonts w:asciiTheme="minorHAnsi" w:hAnsiTheme="minorHAnsi" w:cstheme="minorHAnsi"/>
+        </w:rPr>
+        <w:t>there_are_marital_children</w:t>
+      </w:r>
+      <w:proofErr w:type="spellEnd"/>
+      <w:r>
+        <w:rPr>
+          <w:rFonts w:asciiTheme="minorHAnsi" w:hAnsiTheme="minorHAnsi" w:cstheme="minorHAnsi"/>
+        </w:rPr>
+        <w:t xml:space="preserve"> and not </w:t>
+      </w:r>
+      <w:proofErr w:type="spellStart"/>
+      <w:r>
+        <w:rPr>
+          <w:rFonts w:asciiTheme="minorHAnsi" w:hAnsiTheme="minorHAnsi" w:cstheme="minorHAnsi"/>
+        </w:rPr>
+        <w:t>MI_has_jurisdiction_all_kids</w:t>
+      </w:r>
+      <w:proofErr w:type="spellEnd"/>
+      <w:r>
+        <w:rPr>
+          <w:rFonts w:asciiTheme="minorHAnsi" w:hAnsiTheme="minorHAnsi" w:cstheme="minorHAnsi"/>
+          <w:szCs w:val="28"/>
+        </w:rPr>
+        <w:t>)</w:t>
+      </w:r>
+      <w:r>
+        <w:rPr>
+          <w:rFonts w:asciiTheme="minorHAnsi" w:hAnsiTheme="minorHAnsi" w:cstheme="minorHAnsi"/>
+          <w:szCs w:val="28"/>
+        </w:rPr>
+        <w:t xml:space="preserve"> or </w:t>
+      </w:r>
+      <w:r>
+        <w:rPr>
+          <w:rFonts w:asciiTheme="minorHAnsi" w:hAnsiTheme="minorHAnsi" w:cstheme="minorHAnsi"/>
+          <w:szCs w:val="28"/>
+        </w:rPr>
+        <w:t>(</w:t>
+      </w:r>
+      <w:proofErr w:type="spellStart"/>
+      <w:r>
+        <w:rPr>
+          <w:rFonts w:asciiTheme="minorHAnsi" w:hAnsiTheme="minorHAnsi" w:cstheme="minorHAnsi"/>
+          <w:szCs w:val="28"/>
+        </w:rPr>
+        <w:t>marriage.real_property.filter</w:t>
+      </w:r>
+      <w:proofErr w:type="spellEnd"/>
+      <w:r>
+        <w:rPr>
+          <w:rFonts w:asciiTheme="minorHAnsi" w:hAnsiTheme="minorHAnsi" w:cstheme="minorHAnsi"/>
+          <w:szCs w:val="28"/>
+        </w:rPr>
+        <w:t>(</w:t>
+      </w:r>
+      <w:proofErr w:type="spellStart"/>
+      <w:r>
+        <w:rPr>
+          <w:rFonts w:asciiTheme="minorHAnsi" w:hAnsiTheme="minorHAnsi" w:cstheme="minorHAnsi"/>
+          <w:szCs w:val="28"/>
+        </w:rPr>
+        <w:t>titled_together</w:t>
+      </w:r>
+      <w:proofErr w:type="spellEnd"/>
+      <w:r>
+        <w:rPr>
+          <w:rFonts w:asciiTheme="minorHAnsi" w:hAnsiTheme="minorHAnsi" w:cstheme="minorHAnsi"/>
+          <w:szCs w:val="28"/>
+        </w:rPr>
+        <w:t>=True) | length &gt; 0 or marriage.real_property.filter(titled_together=False).filter(title_award_to_named=False) | length &gt; 0</w:t>
       </w:r>
       <w:r>
         <w:rPr>
@@ -460,7 +800,21 @@
           <w:rFonts w:asciiTheme="minorHAnsi" w:hAnsiTheme="minorHAnsi" w:cstheme="minorHAnsi"/>
         </w:rPr>
         <w:lastRenderedPageBreak/>
-        <w:t>{{p include_docx_template(‘reminders_template.docx’) }}</w:t>
+        <w:t xml:space="preserve">{{p </w:t>
+      </w:r>
+      <w:proofErr w:type="spellStart"/>
+      <w:r>
+        <w:rPr>
+          <w:rFonts w:asciiTheme="minorHAnsi" w:hAnsiTheme="minorHAnsi" w:cstheme="minorHAnsi"/>
+        </w:rPr>
+        <w:t>include_docx_template</w:t>
+      </w:r>
+      <w:proofErr w:type="spellEnd"/>
+      <w:r>
+        <w:rPr>
+          <w:rFonts w:asciiTheme="minorHAnsi" w:hAnsiTheme="minorHAnsi" w:cstheme="minorHAnsi"/>
+        </w:rPr>
+        <w:t>(‘reminders_template.docx’) }}</w:t>
       </w:r>
     </w:p>
     <w:p>
@@ -488,13 +842,69 @@
         <w:rPr>
           <w:rFonts w:asciiTheme="minorHAnsi" w:hAnsiTheme="minorHAnsi" w:cstheme="minorHAnsi"/>
         </w:rPr>
-        <w:t>{%p if tool_ID == "divorce_complaint"</w:t>
-      </w:r>
-      <w:r>
-        <w:rPr>
-          <w:rFonts w:asciiTheme="minorHAnsi" w:hAnsiTheme="minorHAnsi" w:cstheme="minorHAnsi"/>
-        </w:rPr>
-        <w:t xml:space="preserve"> or tool_ID == “divorce_answer”</w:t>
+        <w:t xml:space="preserve">{%p if </w:t>
+      </w:r>
+      <w:proofErr w:type="spellStart"/>
+      <w:r>
+        <w:rPr>
+          <w:rFonts w:asciiTheme="minorHAnsi" w:hAnsiTheme="minorHAnsi" w:cstheme="minorHAnsi"/>
+        </w:rPr>
+        <w:t>tool_ID</w:t>
+      </w:r>
+      <w:proofErr w:type="spellEnd"/>
+      <w:r>
+        <w:rPr>
+          <w:rFonts w:asciiTheme="minorHAnsi" w:hAnsiTheme="minorHAnsi" w:cstheme="minorHAnsi"/>
+        </w:rPr>
+        <w:t xml:space="preserve"> == "</w:t>
+      </w:r>
+      <w:proofErr w:type="spellStart"/>
+      <w:r>
+        <w:rPr>
+          <w:rFonts w:asciiTheme="minorHAnsi" w:hAnsiTheme="minorHAnsi" w:cstheme="minorHAnsi"/>
+        </w:rPr>
+        <w:t>divorce_complaint</w:t>
+      </w:r>
+      <w:proofErr w:type="spellEnd"/>
+      <w:r>
+        <w:rPr>
+          <w:rFonts w:asciiTheme="minorHAnsi" w:hAnsiTheme="minorHAnsi" w:cstheme="minorHAnsi"/>
+        </w:rPr>
+        <w:t>"</w:t>
+      </w:r>
+      <w:r>
+        <w:rPr>
+          <w:rFonts w:asciiTheme="minorHAnsi" w:hAnsiTheme="minorHAnsi" w:cstheme="minorHAnsi"/>
+        </w:rPr>
+        <w:t xml:space="preserve"> or </w:t>
+      </w:r>
+      <w:proofErr w:type="spellStart"/>
+      <w:r>
+        <w:rPr>
+          <w:rFonts w:asciiTheme="minorHAnsi" w:hAnsiTheme="minorHAnsi" w:cstheme="minorHAnsi"/>
+        </w:rPr>
+        <w:t>tool_ID</w:t>
+      </w:r>
+      <w:proofErr w:type="spellEnd"/>
+      <w:r>
+        <w:rPr>
+          <w:rFonts w:asciiTheme="minorHAnsi" w:hAnsiTheme="minorHAnsi" w:cstheme="minorHAnsi"/>
+        </w:rPr>
+        <w:t xml:space="preserve"> == “</w:t>
+      </w:r>
+      <w:proofErr w:type="spellStart"/>
+      <w:r>
+        <w:rPr>
+          <w:rFonts w:asciiTheme="minorHAnsi" w:hAnsiTheme="minorHAnsi" w:cstheme="minorHAnsi"/>
+        </w:rPr>
+        <w:t>divorce_answer</w:t>
+      </w:r>
+      <w:proofErr w:type="spellEnd"/>
+      <w:r>
+        <w:rPr>
+          <w:rFonts w:asciiTheme="minorHAnsi" w:hAnsiTheme="minorHAnsi" w:cstheme="minorHAnsi"/>
+        </w:rPr>
+        <w:t>”</w:t>
       </w:r>
       <w:r>
         <w:rPr>
@@ -516,17 +926,32 @@
         <w:lastRenderedPageBreak/>
         <w:t xml:space="preserve">{% if </w:t>
       </w:r>
-      <w:r>
-        <w:t>tool_ID == "divorce_complaint</w:t>
-      </w:r>
+      <w:proofErr w:type="spellStart"/>
+      <w:r>
+        <w:t>tool_ID</w:t>
+      </w:r>
+      <w:proofErr w:type="spellEnd"/>
+      <w:r>
+        <w:t xml:space="preserve"> == "</w:t>
+      </w:r>
+      <w:proofErr w:type="spellStart"/>
+      <w:r>
+        <w:t>divorce_complaint</w:t>
+      </w:r>
+      <w:proofErr w:type="spellEnd"/>
       <w:r>
         <w:t xml:space="preserve">" </w:t>
       </w:r>
       <w:r>
         <w:t xml:space="preserve">and </w:t>
       </w:r>
-      <w:r>
-        <w:t xml:space="preserve">there_are_marital_children </w:t>
+      <w:proofErr w:type="spellStart"/>
+      <w:r>
+        <w:t>there_are_marital_children</w:t>
+      </w:r>
+      <w:proofErr w:type="spellEnd"/>
+      <w:r>
+        <w:t xml:space="preserve"> </w:t>
       </w:r>
       <w:r>
         <w:t>%}</w:t>
@@ -537,7 +962,15 @@
         <w:pStyle w:val="Normalforinsertedinstructions"/>
       </w:pPr>
       <w:r>
-        <w:t>{{p include_docx_template(</w:t>
+        <w:t xml:space="preserve">{{p </w:t>
+      </w:r>
+      <w:proofErr w:type="spellStart"/>
+      <w:r>
+        <w:t>include_docx_template</w:t>
+      </w:r>
+      <w:proofErr w:type="spellEnd"/>
+      <w:r>
+        <w:t>(</w:t>
       </w:r>
       <w:r>
         <w:t>‘</w:t>
@@ -560,16 +993,42 @@
         <w:pStyle w:val="Normalforinsertedinstructions"/>
       </w:pPr>
       <w:r>
-        <w:t>{% elif tool_ID == "divorce_complaint</w:t>
-      </w:r>
+        <w:t xml:space="preserve">{% </w:t>
+      </w:r>
+      <w:proofErr w:type="spellStart"/>
+      <w:r>
+        <w:t>elif</w:t>
+      </w:r>
+      <w:proofErr w:type="spellEnd"/>
+      <w:r>
+        <w:t xml:space="preserve"> </w:t>
+      </w:r>
+      <w:proofErr w:type="spellStart"/>
+      <w:r>
+        <w:t>tool_ID</w:t>
+      </w:r>
+      <w:proofErr w:type="spellEnd"/>
+      <w:r>
+        <w:t xml:space="preserve"> == "</w:t>
+      </w:r>
+      <w:proofErr w:type="spellStart"/>
+      <w:r>
+        <w:t>divorce_complaint</w:t>
+      </w:r>
+      <w:proofErr w:type="spellEnd"/>
       <w:r>
         <w:t xml:space="preserve">" </w:t>
       </w:r>
       <w:r>
         <w:t xml:space="preserve">and not </w:t>
       </w:r>
-      <w:r>
-        <w:t xml:space="preserve">there_are_marital_children </w:t>
+      <w:proofErr w:type="spellStart"/>
+      <w:r>
+        <w:t>there_are_marital_children</w:t>
+      </w:r>
+      <w:proofErr w:type="spellEnd"/>
+      <w:r>
+        <w:t xml:space="preserve"> </w:t>
       </w:r>
       <w:r>
         <w:t>%}</w:t>
@@ -609,8 +1068,29 @@
         <w:pStyle w:val="Normalforinsertedinstructions"/>
       </w:pPr>
       <w:r>
-        <w:t>{% elif tool_ID == "divorce_answer</w:t>
-      </w:r>
+        <w:t xml:space="preserve">{% </w:t>
+      </w:r>
+      <w:proofErr w:type="spellStart"/>
+      <w:r>
+        <w:t>elif</w:t>
+      </w:r>
+      <w:proofErr w:type="spellEnd"/>
+      <w:r>
+        <w:t xml:space="preserve"> </w:t>
+      </w:r>
+      <w:proofErr w:type="spellStart"/>
+      <w:r>
+        <w:t>tool_ID</w:t>
+      </w:r>
+      <w:proofErr w:type="spellEnd"/>
+      <w:r>
+        <w:t xml:space="preserve"> == "</w:t>
+      </w:r>
+      <w:proofErr w:type="spellStart"/>
+      <w:r>
+        <w:t>divorce_answer</w:t>
+      </w:r>
+      <w:proofErr w:type="spellEnd"/>
       <w:r>
         <w:t xml:space="preserve">" </w:t>
       </w:r>
@@ -623,7 +1103,15 @@
         <w:pStyle w:val="Normalforinsertedinstructions"/>
       </w:pPr>
       <w:r>
-        <w:t>{{p include_docx_template(</w:t>
+        <w:t xml:space="preserve">{{p </w:t>
+      </w:r>
+      <w:proofErr w:type="spellStart"/>
+      <w:r>
+        <w:t>include_docx_template</w:t>
+      </w:r>
+      <w:proofErr w:type="spellEnd"/>
+      <w:r>
+        <w:t>(</w:t>
       </w:r>
       <w:r>
         <w:t>‘instructions_divorce_answer</w:t>
@@ -661,8 +1149,13 @@
       <w:r>
         <w:t xml:space="preserve">{%p if </w:t>
       </w:r>
-      <w:r>
-        <w:t xml:space="preserve">tool_ID </w:t>
+      <w:proofErr w:type="spellStart"/>
+      <w:r>
+        <w:t>tool_ID</w:t>
+      </w:r>
+      <w:proofErr w:type="spellEnd"/>
+      <w:r>
+        <w:t xml:space="preserve"> </w:t>
       </w:r>
       <w:r>
         <w:t>in</w:t>
@@ -674,17 +1167,27 @@
         <w:t>[</w:t>
       </w:r>
       <w:r>
-        <w:t>"divorce_complaint</w:t>
-      </w:r>
-      <w:r>
         <w:t>"</w:t>
       </w:r>
+      <w:proofErr w:type="spellStart"/>
+      <w:r>
+        <w:t>divorce_complaint</w:t>
+      </w:r>
+      <w:proofErr w:type="spellEnd"/>
+      <w:r>
+        <w:t>"</w:t>
+      </w:r>
       <w:r>
         <w:t xml:space="preserve">, </w:t>
       </w:r>
       <w:r>
-        <w:t>"JOD_only</w:t>
-      </w:r>
+        <w:t>"</w:t>
+      </w:r>
+      <w:proofErr w:type="spellStart"/>
+      <w:r>
+        <w:t>JOD_only</w:t>
+      </w:r>
+      <w:proofErr w:type="spellEnd"/>
       <w:r>
         <w:t>"</w:t>
       </w:r>
@@ -706,7 +1209,15 @@
       </w:pPr>
       <w:r>
         <w:lastRenderedPageBreak/>
-        <w:t>{{p include_docx_template(</w:t>
+        <w:t xml:space="preserve">{{p </w:t>
+      </w:r>
+      <w:proofErr w:type="spellStart"/>
+      <w:r>
+        <w:t>include_docx_template</w:t>
+      </w:r>
+      <w:proofErr w:type="spellEnd"/>
+      <w:r>
+        <w:t>(</w:t>
       </w:r>
       <w:r>
         <w:t>‘</w:t>
@@ -741,7 +1252,7 @@
 </file>
 
 <file path=word/numbering.xml><?xml version="1.0" encoding="utf-8"?>
-<w:numbering xmlns:wpc="http://schemas.microsoft.com/office/word/2010/wordprocessingCanvas" xmlns:cx="http://schemas.microsoft.com/office/drawing/2014/chartex" xmlns:cx1="http://schemas.microsoft.com/office/drawing/2015/9/8/chartex" xmlns:cx2="http://schemas.microsoft.com/office/drawing/2015/10/21/chartex" xmlns:cx3="http://schemas.microsoft.com/office/drawing/2016/5/9/chartex" xmlns:cx4="http://schemas.microsoft.com/office/drawing/2016/5/10/chartex" xmlns:cx5="http://schemas.microsoft.com/office/drawing/2016/5/11/chartex" xmlns:cx6="http://schemas.microsoft.com/office/drawing/2016/5/12/chartex" xmlns:cx7="http://schemas.microsoft.com/office/drawing/2016/5/13/chartex" xmlns:cx8="http://schemas.microsoft.com/office/drawing/2016/5/14/chartex" xmlns:mc="http://schemas.openxmlformats.org/markup-compatibility/2006" xmlns:aink="http://schemas.microsoft.com/office/drawing/2016/ink" xmlns:am3d="http://schemas.microsoft.com/office/drawing/2017/model3d" xmlns:o="urn:schemas-microsoft-com:office:office" xmlns:oel="http://schemas.microsoft.com/office/2019/extlst" xmlns:r="http://schemas.openxmlformats.org/officeDocument/2006/relationships" xmlns:m="http://schemas.openxmlformats.org/officeDocument/2006/math" xmlns:v="urn:schemas-microsoft-com:vml" xmlns:wp14="http://schemas.microsoft.com/office/word/2010/wordprocessingDrawing" xmlns:wp="http://schemas.openxmlformats.org/drawingml/2006/wordprocessingDrawing" xmlns:w10="urn:schemas-microsoft-com:office:word" xmlns:w="http://schemas.openxmlformats.org/wordprocessingml/2006/main" xmlns:w14="http://schemas.microsoft.com/office/word/2010/wordml" xmlns:w15="http://schemas.microsoft.com/office/word/2012/wordml" xmlns:w16cei="http://schemas.microsoft.com/office/word/2026/wordml/cei" xmlns:w16cex="http://schemas.microsoft.com/office/word/2018/wordml/cex" xmlns:w16cid="http://schemas.microsoft.com/office/word/2016/wordml/cid" xmlns:w16="http://schemas.microsoft.com/office/word/2018/wordml" xmlns:w16du="http://schemas.microsoft.com/office/word/2023/wordml/word16du" xmlns:w16sdtdh="http://schemas.microsoft.com/office/word/2020/wordml/sdtdatahash" xmlns:w16sdtfl="http://schemas.microsoft.com/office/word/2024/wordml/sdtformatlock" xmlns:w16se="http://schemas.microsoft.com/office/word/2015/wordml/symex" xmlns:wpg="http://schemas.microsoft.com/office/word/2010/wordprocessingGroup" xmlns:wpi="http://schemas.microsoft.com/office/word/2010/wordprocessingInk" xmlns:wne="http://schemas.microsoft.com/office/word/2006/wordml" xmlns:wps="http://schemas.microsoft.com/office/word/2010/wordprocessingShape" mc:Ignorable="w14 w15 w16se w16cid w16 w16cex w16sdtdh w16sdtfl w16du wp14">
+<w:numbering xmlns:wpc="http://schemas.microsoft.com/office/word/2010/wordprocessingCanvas" xmlns:cx="http://schemas.microsoft.com/office/drawing/2014/chartex" xmlns:cx1="http://schemas.microsoft.com/office/drawing/2015/9/8/chartex" xmlns:cx2="http://schemas.microsoft.com/office/drawing/2015/10/21/chartex" xmlns:cx3="http://schemas.microsoft.com/office/drawing/2016/5/9/chartex" xmlns:cx4="http://schemas.microsoft.com/office/drawing/2016/5/10/chartex" xmlns:cx5="http://schemas.microsoft.com/office/drawing/2016/5/11/chartex" xmlns:cx6="http://schemas.microsoft.com/office/drawing/2016/5/12/chartex" xmlns:cx7="http://schemas.microsoft.com/office/drawing/2016/5/13/chartex" xmlns:cx8="http://schemas.microsoft.com/office/drawing/2016/5/14/chartex" xmlns:mc="http://schemas.openxmlformats.org/markup-compatibility/2006" xmlns:aink="http://schemas.microsoft.com/office/drawing/2016/ink" xmlns:am3d="http://schemas.microsoft.com/office/drawing/2017/model3d" xmlns:o="urn:schemas-microsoft-com:office:office" xmlns:oel="http://schemas.microsoft.com/office/2019/extlst" xmlns:r="http://schemas.openxmlformats.org/officeDocument/2006/relationships" xmlns:m="http://schemas.openxmlformats.org/officeDocument/2006/math" xmlns:v="urn:schemas-microsoft-com:vml" xmlns:wp14="http://schemas.microsoft.com/office/word/2010/wordprocessingDrawing" xmlns:wp="http://schemas.openxmlformats.org/drawingml/2006/wordprocessingDrawing" xmlns:w10="urn:schemas-microsoft-com:office:word" xmlns:w="http://schemas.openxmlformats.org/wordprocessingml/2006/main" xmlns:w14="http://schemas.microsoft.com/office/word/2010/wordml" xmlns:w15="http://schemas.microsoft.com/office/word/2012/wordml" xmlns:w16cex="http://schemas.microsoft.com/office/word/2018/wordml/cex" xmlns:w16cid="http://schemas.microsoft.com/office/word/2016/wordml/cid" xmlns:w16="http://schemas.microsoft.com/office/word/2018/wordml" xmlns:w16du="http://schemas.microsoft.com/office/word/2023/wordml/word16du" xmlns:w16sdtdh="http://schemas.microsoft.com/office/word/2020/wordml/sdtdatahash" xmlns:w16sdtfl="http://schemas.microsoft.com/office/word/2024/wordml/sdtformatlock" xmlns:w16se="http://schemas.microsoft.com/office/word/2015/wordml/symex" xmlns:wpg="http://schemas.microsoft.com/office/word/2010/wordprocessingGroup" xmlns:wpi="http://schemas.microsoft.com/office/word/2010/wordprocessingInk" xmlns:wne="http://schemas.microsoft.com/office/word/2006/wordml" xmlns:wps="http://schemas.microsoft.com/office/word/2010/wordprocessingShape" mc:Ignorable="w14 w15 w16se w16cid w16 w16cex w16sdtdh w16sdtfl w16du wp14">
   <w:abstractNum w:abstractNumId="0" w15:restartNumberingAfterBreak="0">
     <w:nsid w:val="01A548E7"/>
     <w:multiLevelType w:val="multilevel"/>
@@ -3457,28 +3968,28 @@
 </file>
 
 <file path=customXml/item1.xml><?xml version="1.0" encoding="utf-8"?>
+<b:Sources xmlns:b="http://schemas.openxmlformats.org/officeDocument/2006/bibliography" xmlns="http://schemas.openxmlformats.org/officeDocument/2006/bibliography" SelectedStyle="\APASixthEditionOfficeOnline.xsl" StyleName="APA" Version="6"/>
+</file>
+
+<file path=customXml/item2.xml><?xml version="1.0" encoding="utf-8"?>
 <go:gDocsCustomXmlDataStorage xmlns:go="http://customooxmlschemas.google.com/" xmlns:r="http://schemas.openxmlformats.org/officeDocument/2006/relationships" uri="GoogleDocsCustomDataVersion2">
   <go:docsCustomData xmlns:go="http://customooxmlschemas.google.com/" roundtripDataSignature="AMtx7mjac1FaFv6WV3g0GhcUIQ9kG0o+yg==">CgMxLjAyDmgubjh0aHd2ZHFzMTk0MghoLmdqZGd4czIOaC56N2hubnB1aWk1NDkyDWguc3hkdG9pMzhvYmkyDmguNWY0ZXAwcWVlOXRlMg5oLmVqdDhyOXF0bXp6djIOaC4yOWpnN3o3Y2I3bGIyDmguanM4cTNwM3I0eDZjMg5oLnYzbTFuaXhkbzBwejIOaC5wZzd4dGp6Y2t3dWkyDmgueTE0MHhvdmdnYml0Mg5oLjRocjAxMWhrOXVyNjIOaC5xMTI4N2VvNmMyd24yDmguODY5YjBrbWEwNmtsMg5oLm1hczdybXljNW82ejgAciExV3BDbUx3RGV0a2poVzFWLUZiZXdyanhaTmV2Wm8tWm0=</go:docsCustomData>
 </go:gDocsCustomXmlDataStorage>
 </file>
 
-<file path=customXml/item2.xml><?xml version="1.0" encoding="utf-8"?>
-<b:Sources xmlns:b="http://schemas.openxmlformats.org/officeDocument/2006/bibliography" xmlns="http://schemas.openxmlformats.org/officeDocument/2006/bibliography" SelectedStyle="\APASixthEditionOfficeOnline.xsl" StyleName="APA" Version="6"/>
+<file path=customXml/itemProps1.xml><?xml version="1.0" encoding="utf-8"?>
+<ds:datastoreItem xmlns:ds="http://schemas.openxmlformats.org/officeDocument/2006/customXml" ds:itemID="{D17ADB1C-BB67-458D-A072-D9E3A76A5AA9}">
+  <ds:schemaRefs>
+    <ds:schemaRef ds:uri="http://schemas.openxmlformats.org/officeDocument/2006/bibliography"/>
+  </ds:schemaRefs>
+</ds:datastoreItem>
 </file>
 
-<file path=customXml/itemProps1.xml><?xml version="1.0" encoding="utf-8"?>
+<file path=customXml/itemProps2.xml><?xml version="1.0" encoding="utf-8"?>
 <ds:datastoreItem xmlns:ds="http://schemas.openxmlformats.org/officeDocument/2006/customXml" ds:itemID="{11111111-1234-1234-1234-123412341234}">
   <ds:schemaRefs>
     <ds:schemaRef ds:uri="http://customooxmlschemas.google.com/"/>
     <ds:schemaRef ds:uri="http://schemas.openxmlformats.org/officeDocument/2006/relationships"/>
   </ds:schemaRefs>
 </ds:datastoreItem>
-</file>
-
-<file path=customXml/itemProps2.xml><?xml version="1.0" encoding="utf-8"?>
-<ds:datastoreItem xmlns:ds="http://schemas.openxmlformats.org/officeDocument/2006/customXml" ds:itemID="{D17ADB1C-BB67-458D-A072-D9E3A76A5AA9}">
-  <ds:schemaRefs>
-    <ds:schemaRef ds:uri="http://schemas.openxmlformats.org/officeDocument/2006/bibliography"/>
-  </ds:schemaRefs>
-</ds:datastoreItem>
 </file>
</xml_diff>

<commit_message>
fix bug in new quitclaim reminder code
</commit_message>
<xml_diff>
--- a/docassemble/MLHDivorceAndCustody/data/templates/instructions.docx
+++ b/docassemble/MLHDivorceAndCustody/data/templates/instructions.docx
@@ -7,7 +7,23 @@
         <w:pStyle w:val="Normalforinsertedinstructions"/>
       </w:pPr>
       <w:r>
-        <w:t>{{p include_docx_template('docassemble.mlhframework:data/templates/cover_sheet_2.0.docx') }}</w:t>
+        <w:t>{{p include_docx_template('</w:t>
+      </w:r>
+      <w:proofErr w:type="gramStart"/>
+      <w:r>
+        <w:t>docassemble.mlhframework</w:t>
+      </w:r>
+      <w:proofErr w:type="gramEnd"/>
+      <w:r>
+        <w:t>:data/templates/cover_sheet_2.0.docx'</w:t>
+      </w:r>
+      <w:proofErr w:type="gramStart"/>
+      <w:r>
+        <w:t>) }</w:t>
+      </w:r>
+      <w:proofErr w:type="gramEnd"/>
+      <w:r>
+        <w:t>}</w:t>
       </w:r>
     </w:p>
     <w:p/>
@@ -289,8 +305,13 @@
     </w:p>
     <w:p>
       <w:r>
-        <w:t>{%p endif %}</w:t>
-      </w:r>
+        <w:t xml:space="preserve">{%p </w:t>
+      </w:r>
+      <w:proofErr w:type="gramStart"/>
+      <w:r>
+        <w:t>endif %}</w:t>
+      </w:r>
+      <w:proofErr w:type="gramEnd"/>
     </w:p>
     <w:p>
       <w:pPr>
@@ -314,6 +335,7 @@
           <w:szCs w:val="28"/>
         </w:rPr>
       </w:pPr>
+      <w:proofErr w:type="gramStart"/>
       <w:r>
         <w:rPr>
           <w:rFonts w:cs="Times New Roman"/>
@@ -335,14 +357,40 @@
           <w:noProof/>
           <w:szCs w:val="28"/>
         </w:rPr>
-        <w:t xml:space="preserve">cover_sheet_thanks </w:t>
-      </w:r>
-      <w:r>
-        <w:rPr>
-          <w:rFonts w:asciiTheme="minorHAnsi" w:hAnsiTheme="minorHAnsi" w:cstheme="minorHAnsi"/>
-          <w:szCs w:val="28"/>
-        </w:rPr>
-        <w:t>}}</w:t>
+        <w:t>cover</w:t>
+      </w:r>
+      <w:proofErr w:type="gramEnd"/>
+      <w:r>
+        <w:rPr>
+          <w:rFonts w:asciiTheme="minorHAnsi" w:hAnsiTheme="minorHAnsi" w:cstheme="minorHAnsi"/>
+          <w:noProof/>
+          <w:szCs w:val="28"/>
+        </w:rPr>
+        <w:t>_sheet_</w:t>
+      </w:r>
+      <w:proofErr w:type="gramStart"/>
+      <w:r>
+        <w:rPr>
+          <w:rFonts w:asciiTheme="minorHAnsi" w:hAnsiTheme="minorHAnsi" w:cstheme="minorHAnsi"/>
+          <w:noProof/>
+          <w:szCs w:val="28"/>
+        </w:rPr>
+        <w:t xml:space="preserve">thanks </w:t>
+      </w:r>
+      <w:r>
+        <w:rPr>
+          <w:rFonts w:asciiTheme="minorHAnsi" w:hAnsiTheme="minorHAnsi" w:cstheme="minorHAnsi"/>
+          <w:szCs w:val="28"/>
+        </w:rPr>
+        <w:t>}</w:t>
+      </w:r>
+      <w:proofErr w:type="gramEnd"/>
+      <w:r>
+        <w:rPr>
+          <w:rFonts w:asciiTheme="minorHAnsi" w:hAnsiTheme="minorHAnsi" w:cstheme="minorHAnsi"/>
+          <w:szCs w:val="28"/>
+        </w:rPr>
+        <w:t>}</w:t>
       </w:r>
     </w:p>
     <w:p>
@@ -705,37 +753,20 @@
         </w:rPr>
         <w:t>(</w:t>
       </w:r>
-      <w:proofErr w:type="spellStart"/>
-      <w:r>
-        <w:rPr>
-          <w:rFonts w:asciiTheme="minorHAnsi" w:hAnsiTheme="minorHAnsi" w:cstheme="minorHAnsi"/>
-          <w:szCs w:val="28"/>
-        </w:rPr>
-        <w:t>marriage.real_property.filter</w:t>
-      </w:r>
-      <w:proofErr w:type="spellEnd"/>
-      <w:r>
-        <w:rPr>
-          <w:rFonts w:asciiTheme="minorHAnsi" w:hAnsiTheme="minorHAnsi" w:cstheme="minorHAnsi"/>
-          <w:szCs w:val="28"/>
-        </w:rPr>
-        <w:t>(</w:t>
-      </w:r>
-      <w:proofErr w:type="spellStart"/>
-      <w:r>
-        <w:rPr>
-          <w:rFonts w:asciiTheme="minorHAnsi" w:hAnsiTheme="minorHAnsi" w:cstheme="minorHAnsi"/>
-          <w:szCs w:val="28"/>
-        </w:rPr>
-        <w:t>titled_together</w:t>
-      </w:r>
-      <w:proofErr w:type="spellEnd"/>
-      <w:r>
-        <w:rPr>
-          <w:rFonts w:asciiTheme="minorHAnsi" w:hAnsiTheme="minorHAnsi" w:cstheme="minorHAnsi"/>
-          <w:szCs w:val="28"/>
-        </w:rPr>
-        <w:t>=True) | length &gt; 0 or marriage.real_property.filter(titled_together=False).filter(title_award_to_named=False) | length &gt; 0</w:t>
+      <w:r>
+        <w:rPr>
+          <w:rFonts w:asciiTheme="minorHAnsi" w:hAnsiTheme="minorHAnsi" w:cstheme="minorHAnsi"/>
+          <w:szCs w:val="28"/>
+        </w:rPr>
+        <w:t xml:space="preserve">marriage.real_property.filter(owner=users[0]).filter(titled_together=True) | length + marriage.real_property.filter(owner=other_parties[0]).filter(titled_together=True) | length &gt; 0 or </w:t>
+      </w:r>
+      <w:r>
+        <w:rPr>
+          <w:rFonts w:asciiTheme="minorHAnsi" w:hAnsiTheme="minorHAnsi" w:cstheme="minorHAnsi"/>
+          <w:szCs w:val="28"/>
+        </w:rPr>
+        <w:lastRenderedPageBreak/>
+        <w:t>marriage.real_property.filter(owner=users[0]).filter(titled_together=False).filter(title_award_to_named=False) | length + marriage.real_property.filter(owner=other_parties[0]).filter(titled_together=False).filter(title_award_to_named=False) | length &gt; 0</w:t>
       </w:r>
       <w:r>
         <w:rPr>
@@ -807,14 +838,42 @@
         <w:rPr>
           <w:rFonts w:asciiTheme="minorHAnsi" w:hAnsiTheme="minorHAnsi" w:cstheme="minorHAnsi"/>
         </w:rPr>
-        <w:t>include_docx_template</w:t>
-      </w:r>
-      <w:proofErr w:type="spellEnd"/>
-      <w:r>
-        <w:rPr>
-          <w:rFonts w:asciiTheme="minorHAnsi" w:hAnsiTheme="minorHAnsi" w:cstheme="minorHAnsi"/>
-        </w:rPr>
-        <w:t>(‘reminders_template.docx’) }}</w:t>
+        <w:t>include_docx_</w:t>
+      </w:r>
+      <w:proofErr w:type="gramStart"/>
+      <w:r>
+        <w:rPr>
+          <w:rFonts w:asciiTheme="minorHAnsi" w:hAnsiTheme="minorHAnsi" w:cstheme="minorHAnsi"/>
+        </w:rPr>
+        <w:t>template</w:t>
+      </w:r>
+      <w:proofErr w:type="spellEnd"/>
+      <w:r>
+        <w:rPr>
+          <w:rFonts w:asciiTheme="minorHAnsi" w:hAnsiTheme="minorHAnsi" w:cstheme="minorHAnsi"/>
+        </w:rPr>
+        <w:t>(‘</w:t>
+      </w:r>
+      <w:proofErr w:type="gramEnd"/>
+      <w:r>
+        <w:rPr>
+          <w:rFonts w:asciiTheme="minorHAnsi" w:hAnsiTheme="minorHAnsi" w:cstheme="minorHAnsi"/>
+        </w:rPr>
+        <w:t>reminders_template.docx’</w:t>
+      </w:r>
+      <w:proofErr w:type="gramStart"/>
+      <w:r>
+        <w:rPr>
+          <w:rFonts w:asciiTheme="minorHAnsi" w:hAnsiTheme="minorHAnsi" w:cstheme="minorHAnsi"/>
+        </w:rPr>
+        <w:t>) }</w:t>
+      </w:r>
+      <w:proofErr w:type="gramEnd"/>
+      <w:r>
+        <w:rPr>
+          <w:rFonts w:asciiTheme="minorHAnsi" w:hAnsiTheme="minorHAnsi" w:cstheme="minorHAnsi"/>
+        </w:rPr>
+        <w:t>}</w:t>
       </w:r>
     </w:p>
     <w:p>
@@ -828,8 +887,16 @@
         <w:rPr>
           <w:rFonts w:asciiTheme="minorHAnsi" w:hAnsiTheme="minorHAnsi" w:cstheme="minorHAnsi"/>
         </w:rPr>
-        <w:t>{%p endif %}</w:t>
-      </w:r>
+        <w:t xml:space="preserve">{%p </w:t>
+      </w:r>
+      <w:proofErr w:type="gramStart"/>
+      <w:r>
+        <w:rPr>
+          <w:rFonts w:asciiTheme="minorHAnsi" w:hAnsiTheme="minorHAnsi" w:cstheme="minorHAnsi"/>
+        </w:rPr>
+        <w:t>endif %}</w:t>
+      </w:r>
+      <w:proofErr w:type="gramEnd"/>
     </w:p>
     <w:p>
       <w:pPr>
@@ -947,7 +1014,11 @@
       </w:r>
       <w:proofErr w:type="spellStart"/>
       <w:r>
-        <w:t>there_are_marital_children</w:t>
+        <w:t>there_are_marital_</w:t>
+      </w:r>
+      <w:proofErr w:type="gramStart"/>
+      <w:r>
+        <w:t>children</w:t>
       </w:r>
       <w:proofErr w:type="spellEnd"/>
       <w:r>
@@ -956,6 +1027,7 @@
       <w:r>
         <w:t>%}</w:t>
       </w:r>
+      <w:proofErr w:type="gramEnd"/>
     </w:p>
     <w:p>
       <w:pPr>
@@ -966,7 +1038,11 @@
       </w:r>
       <w:proofErr w:type="spellStart"/>
       <w:r>
-        <w:t>include_docx_template</w:t>
+        <w:t>include_docx_</w:t>
+      </w:r>
+      <w:proofErr w:type="gramStart"/>
+      <w:r>
+        <w:t>template</w:t>
       </w:r>
       <w:proofErr w:type="spellEnd"/>
       <w:r>
@@ -975,6 +1051,7 @@
       <w:r>
         <w:t>‘</w:t>
       </w:r>
+      <w:proofErr w:type="gramEnd"/>
       <w:r>
         <w:t>instructions_divorce_with_children</w:t>
       </w:r>
@@ -984,8 +1061,13 @@
       <w:r>
         <w:t>’</w:t>
       </w:r>
-      <w:r>
-        <w:t>) }}</w:t>
+      <w:proofErr w:type="gramStart"/>
+      <w:r>
+        <w:t>) }</w:t>
+      </w:r>
+      <w:proofErr w:type="gramEnd"/>
+      <w:r>
+        <w:t>}</w:t>
       </w:r>
     </w:p>
     <w:p>
@@ -1024,7 +1106,11 @@
       </w:r>
       <w:proofErr w:type="spellStart"/>
       <w:r>
-        <w:t>there_are_marital_children</w:t>
+        <w:t>there_are_marital_</w:t>
+      </w:r>
+      <w:proofErr w:type="gramStart"/>
+      <w:r>
+        <w:t>children</w:t>
       </w:r>
       <w:proofErr w:type="spellEnd"/>
       <w:r>
@@ -1033,17 +1119,23 @@
       <w:r>
         <w:t>%}</w:t>
       </w:r>
+      <w:proofErr w:type="gramEnd"/>
     </w:p>
     <w:p>
       <w:pPr>
         <w:pStyle w:val="Normalforinsertedinstructions"/>
       </w:pPr>
       <w:r>
-        <w:t>{{p include_docx_template(</w:t>
+        <w:t>{{p include_docx_</w:t>
+      </w:r>
+      <w:proofErr w:type="gramStart"/>
+      <w:r>
+        <w:t>template(</w:t>
       </w:r>
       <w:r>
         <w:t>‘</w:t>
       </w:r>
+      <w:proofErr w:type="gramEnd"/>
       <w:r>
         <w:t>instructions_divorce_with</w:t>
       </w:r>
@@ -1059,8 +1151,13 @@
       <w:r>
         <w:t>’</w:t>
       </w:r>
-      <w:r>
-        <w:t>) }}</w:t>
+      <w:proofErr w:type="gramStart"/>
+      <w:r>
+        <w:t>) }</w:t>
+      </w:r>
+      <w:proofErr w:type="gramEnd"/>
+      <w:r>
+        <w:t>}</w:t>
       </w:r>
     </w:p>
     <w:p>
@@ -1091,12 +1188,14 @@
         <w:t>divorce_answer</w:t>
       </w:r>
       <w:proofErr w:type="spellEnd"/>
+      <w:proofErr w:type="gramStart"/>
       <w:r>
         <w:t xml:space="preserve">" </w:t>
       </w:r>
       <w:r>
         <w:t>%}</w:t>
       </w:r>
+      <w:proofErr w:type="gramEnd"/>
     </w:p>
     <w:p>
       <w:pPr>
@@ -1107,14 +1206,22 @@
       </w:r>
       <w:proofErr w:type="spellStart"/>
       <w:r>
-        <w:t>include_docx_template</w:t>
+        <w:t>include_docx_</w:t>
+      </w:r>
+      <w:proofErr w:type="gramStart"/>
+      <w:r>
+        <w:t>template</w:t>
       </w:r>
       <w:proofErr w:type="spellEnd"/>
       <w:r>
         <w:t>(</w:t>
       </w:r>
       <w:r>
-        <w:t>‘instructions_divorce_answer</w:t>
+        <w:t>‘</w:t>
+      </w:r>
+      <w:proofErr w:type="gramEnd"/>
+      <w:r>
+        <w:t>instructions_divorce_answer</w:t>
       </w:r>
       <w:r>
         <w:t>.docx</w:t>
@@ -1122,8 +1229,13 @@
       <w:r>
         <w:t>’</w:t>
       </w:r>
-      <w:r>
-        <w:t>) }}</w:t>
+      <w:proofErr w:type="gramStart"/>
+      <w:r>
+        <w:t>) }</w:t>
+      </w:r>
+      <w:proofErr w:type="gramEnd"/>
+      <w:r>
+        <w:t>}</w:t>
       </w:r>
     </w:p>
     <w:p>
@@ -1139,8 +1251,13 @@
         <w:pStyle w:val="Normalforinsertedinstructions"/>
       </w:pPr>
       <w:r>
-        <w:t>{%p endif %}</w:t>
-      </w:r>
+        <w:t xml:space="preserve">{%p </w:t>
+      </w:r>
+      <w:proofErr w:type="gramStart"/>
+      <w:r>
+        <w:t>endif %}</w:t>
+      </w:r>
+      <w:proofErr w:type="gramEnd"/>
     </w:p>
     <w:p>
       <w:pPr>
@@ -1191,12 +1308,14 @@
       <w:r>
         <w:t>"</w:t>
       </w:r>
+      <w:proofErr w:type="gramStart"/>
       <w:r>
         <w:t xml:space="preserve">] </w:t>
       </w:r>
       <w:r>
         <w:t>%}</w:t>
       </w:r>
+      <w:proofErr w:type="gramEnd"/>
     </w:p>
     <w:p>
       <w:r>
@@ -1213,7 +1332,11 @@
       </w:r>
       <w:proofErr w:type="spellStart"/>
       <w:r>
-        <w:t>include_docx_template</w:t>
+        <w:t>include_docx_</w:t>
+      </w:r>
+      <w:proofErr w:type="gramStart"/>
+      <w:r>
+        <w:t>template</w:t>
       </w:r>
       <w:proofErr w:type="spellEnd"/>
       <w:r>
@@ -1222,14 +1345,20 @@
       <w:r>
         <w:t>‘</w:t>
       </w:r>
+      <w:proofErr w:type="gramEnd"/>
       <w:r>
         <w:t>testimony_script.docx</w:t>
       </w:r>
       <w:r>
         <w:t>’</w:t>
       </w:r>
-      <w:r>
-        <w:t>) }}</w:t>
+      <w:proofErr w:type="gramStart"/>
+      <w:r>
+        <w:t>) }</w:t>
+      </w:r>
+      <w:proofErr w:type="gramEnd"/>
+      <w:r>
+        <w:t>}</w:t>
       </w:r>
     </w:p>
     <w:p>
@@ -1237,8 +1366,13 @@
         <w:pStyle w:val="Normalforinsertedinstructions"/>
       </w:pPr>
       <w:r>
-        <w:t>{%p endif %}</w:t>
-      </w:r>
+        <w:t xml:space="preserve">{%p </w:t>
+      </w:r>
+      <w:proofErr w:type="gramStart"/>
+      <w:r>
+        <w:t>endif %}</w:t>
+      </w:r>
+      <w:proofErr w:type="gramEnd"/>
     </w:p>
     <w:sectPr>
       <w:type w:val="continuous"/>

</xml_diff>

<commit_message>
update reminders and instructions templates; other edits
</commit_message>
<xml_diff>
--- a/docassemble/MLHDivorceAndCustody/data/templates/instructions.docx
+++ b/docassemble/MLHDivorceAndCustody/data/templates/instructions.docx
@@ -7,45 +7,13 @@
         <w:pStyle w:val="Normalforinsertedinstructions"/>
       </w:pPr>
       <w:r>
-        <w:t>{{p include_docx_template('</w:t>
-      </w:r>
-      <w:proofErr w:type="gramStart"/>
-      <w:r>
-        <w:t>docassemble.mlhframework</w:t>
-      </w:r>
-      <w:proofErr w:type="gramEnd"/>
-      <w:r>
-        <w:t>:data/templates/cover_sheet_2.0.docx'</w:t>
-      </w:r>
-      <w:proofErr w:type="gramStart"/>
-      <w:r>
-        <w:t>) }</w:t>
-      </w:r>
-      <w:proofErr w:type="gramEnd"/>
-      <w:r>
-        <w:t>}</w:t>
+        <w:t>{{p include_docx_template('docassemble.mlhframework:data/templates/cover_sheet_2.0.docx') }}</w:t>
       </w:r>
     </w:p>
     <w:p/>
     <w:p>
       <w:r>
-        <w:t xml:space="preserve">{%p if </w:t>
-      </w:r>
-      <w:proofErr w:type="spellStart"/>
-      <w:r>
-        <w:t>tool_ID</w:t>
-      </w:r>
-      <w:proofErr w:type="spellEnd"/>
-      <w:r>
-        <w:t xml:space="preserve"> == “</w:t>
-      </w:r>
-      <w:proofErr w:type="spellStart"/>
-      <w:r>
-        <w:t>divorce_complaint</w:t>
-      </w:r>
-      <w:proofErr w:type="spellEnd"/>
-      <w:r>
-        <w:t>” %}</w:t>
+        <w:t>{%p if tool_ID == “divorce_complaint” %}</w:t>
       </w:r>
     </w:p>
     <w:p>
@@ -116,31 +84,7 @@
     </w:p>
     <w:p>
       <w:r>
-        <w:t xml:space="preserve">{%p </w:t>
-      </w:r>
-      <w:proofErr w:type="spellStart"/>
-      <w:r>
-        <w:t>elif</w:t>
-      </w:r>
-      <w:proofErr w:type="spellEnd"/>
-      <w:r>
-        <w:t xml:space="preserve"> </w:t>
-      </w:r>
-      <w:proofErr w:type="spellStart"/>
-      <w:r>
-        <w:t>tool_ID</w:t>
-      </w:r>
-      <w:proofErr w:type="spellEnd"/>
-      <w:r>
-        <w:t xml:space="preserve"> == “</w:t>
-      </w:r>
-      <w:proofErr w:type="spellStart"/>
-      <w:r>
-        <w:t>JOD_only</w:t>
-      </w:r>
-      <w:proofErr w:type="spellEnd"/>
-      <w:r>
-        <w:t>” %}</w:t>
+        <w:t>{%p elif tool_ID == “JOD_only” %}</w:t>
       </w:r>
     </w:p>
     <w:p>
@@ -208,31 +152,7 @@
     </w:p>
     <w:p>
       <w:r>
-        <w:t xml:space="preserve">{%p </w:t>
-      </w:r>
-      <w:proofErr w:type="spellStart"/>
-      <w:r>
-        <w:t>elif</w:t>
-      </w:r>
-      <w:proofErr w:type="spellEnd"/>
-      <w:r>
-        <w:t xml:space="preserve"> </w:t>
-      </w:r>
-      <w:proofErr w:type="spellStart"/>
-      <w:r>
-        <w:t>tool_ID</w:t>
-      </w:r>
-      <w:proofErr w:type="spellEnd"/>
-      <w:r>
-        <w:t xml:space="preserve"> == “</w:t>
-      </w:r>
-      <w:proofErr w:type="spellStart"/>
-      <w:r>
-        <w:t>divorce_answer</w:t>
-      </w:r>
-      <w:proofErr w:type="spellEnd"/>
-      <w:r>
-        <w:t>” %}</w:t>
+        <w:t>{%p elif tool_ID == “divorce_answer” %}</w:t>
       </w:r>
     </w:p>
     <w:p>
@@ -305,13 +225,8 @@
     </w:p>
     <w:p>
       <w:r>
-        <w:t xml:space="preserve">{%p </w:t>
-      </w:r>
-      <w:proofErr w:type="gramStart"/>
-      <w:r>
-        <w:t>endif %}</w:t>
-      </w:r>
-      <w:proofErr w:type="gramEnd"/>
+        <w:t>{%p endif %}</w:t>
+      </w:r>
     </w:p>
     <w:p>
       <w:pPr>
@@ -335,7 +250,6 @@
           <w:szCs w:val="28"/>
         </w:rPr>
       </w:pPr>
-      <w:proofErr w:type="gramStart"/>
       <w:r>
         <w:rPr>
           <w:rFonts w:cs="Times New Roman"/>
@@ -357,40 +271,14 @@
           <w:noProof/>
           <w:szCs w:val="28"/>
         </w:rPr>
-        <w:t>cover</w:t>
-      </w:r>
-      <w:proofErr w:type="gramEnd"/>
-      <w:r>
-        <w:rPr>
-          <w:rFonts w:asciiTheme="minorHAnsi" w:hAnsiTheme="minorHAnsi" w:cstheme="minorHAnsi"/>
-          <w:noProof/>
+        <w:t xml:space="preserve">cover_sheet_thanks </w:t>
+      </w:r>
+      <w:r>
+        <w:rPr>
+          <w:rFonts w:asciiTheme="minorHAnsi" w:hAnsiTheme="minorHAnsi" w:cstheme="minorHAnsi"/>
           <w:szCs w:val="28"/>
         </w:rPr>
-        <w:t>_sheet_</w:t>
-      </w:r>
-      <w:proofErr w:type="gramStart"/>
-      <w:r>
-        <w:rPr>
-          <w:rFonts w:asciiTheme="minorHAnsi" w:hAnsiTheme="minorHAnsi" w:cstheme="minorHAnsi"/>
-          <w:noProof/>
-          <w:szCs w:val="28"/>
-        </w:rPr>
-        <w:t xml:space="preserve">thanks </w:t>
-      </w:r>
-      <w:r>
-        <w:rPr>
-          <w:rFonts w:asciiTheme="minorHAnsi" w:hAnsiTheme="minorHAnsi" w:cstheme="minorHAnsi"/>
-          <w:szCs w:val="28"/>
-        </w:rPr>
-        <w:t>}</w:t>
-      </w:r>
-      <w:proofErr w:type="gramEnd"/>
-      <w:r>
-        <w:rPr>
-          <w:rFonts w:asciiTheme="minorHAnsi" w:hAnsiTheme="minorHAnsi" w:cstheme="minorHAnsi"/>
-          <w:szCs w:val="28"/>
-        </w:rPr>
-        <w:t>}</w:t>
+        <w:t>}}</w:t>
       </w:r>
     </w:p>
     <w:p>
@@ -405,22 +293,48 @@
           <w:rFonts w:asciiTheme="minorHAnsi" w:hAnsiTheme="minorHAnsi" w:cstheme="minorHAnsi"/>
           <w:szCs w:val="28"/>
         </w:rPr>
-        <w:t xml:space="preserve">{%p if </w:t>
-      </w:r>
-      <w:proofErr w:type="spellStart"/>
+        <w:t xml:space="preserve">{%p if tool_ID </w:t>
+      </w:r>
       <w:r>
         <w:rPr>
           <w:rFonts w:asciiTheme="minorHAnsi" w:hAnsiTheme="minorHAnsi" w:cstheme="minorHAnsi"/>
           <w:szCs w:val="28"/>
         </w:rPr>
-        <w:t>tool_ID</w:t>
-      </w:r>
-      <w:proofErr w:type="spellEnd"/>
+        <w:t>in [</w:t>
+      </w:r>
       <w:r>
         <w:rPr>
           <w:rFonts w:asciiTheme="minorHAnsi" w:hAnsiTheme="minorHAnsi" w:cstheme="minorHAnsi"/>
           <w:szCs w:val="28"/>
         </w:rPr>
+        <w:t>“divorce_complaint”</w:t>
+      </w:r>
+      <w:r>
+        <w:rPr>
+          <w:rFonts w:asciiTheme="minorHAnsi" w:hAnsiTheme="minorHAnsi" w:cstheme="minorHAnsi"/>
+          <w:szCs w:val="28"/>
+        </w:rPr>
+        <w:t>, “divorce_answer”</w:t>
+      </w:r>
+      <w:r>
+        <w:rPr>
+          <w:rFonts w:asciiTheme="minorHAnsi" w:hAnsiTheme="minorHAnsi" w:cstheme="minorHAnsi"/>
+          <w:szCs w:val="28"/>
+        </w:rPr>
+        <w:t>, “custody_complaint”, “custody_answer”</w:t>
+      </w:r>
+      <w:r>
+        <w:rPr>
+          <w:rFonts w:asciiTheme="minorHAnsi" w:hAnsiTheme="minorHAnsi" w:cstheme="minorHAnsi"/>
+          <w:szCs w:val="28"/>
+        </w:rPr>
+        <w:t>]</w:t>
+      </w:r>
+      <w:r>
+        <w:rPr>
+          <w:rFonts w:asciiTheme="minorHAnsi" w:hAnsiTheme="minorHAnsi" w:cstheme="minorHAnsi"/>
+          <w:szCs w:val="28"/>
+        </w:rPr>
         <w:t xml:space="preserve"> </w:t>
       </w:r>
       <w:r>
@@ -428,345 +342,103 @@
           <w:rFonts w:asciiTheme="minorHAnsi" w:hAnsiTheme="minorHAnsi" w:cstheme="minorHAnsi"/>
           <w:szCs w:val="28"/>
         </w:rPr>
-        <w:t>in [</w:t>
+        <w:t xml:space="preserve">or (tool_ID == “JOD_only” and </w:t>
       </w:r>
       <w:r>
         <w:rPr>
           <w:rFonts w:asciiTheme="minorHAnsi" w:hAnsiTheme="minorHAnsi" w:cstheme="minorHAnsi"/>
           <w:szCs w:val="28"/>
         </w:rPr>
-        <w:t>“</w:t>
-      </w:r>
-      <w:proofErr w:type="spellStart"/>
+        <w:t>(</w:t>
+      </w:r>
       <w:r>
         <w:rPr>
           <w:rFonts w:asciiTheme="minorHAnsi" w:hAnsiTheme="minorHAnsi" w:cstheme="minorHAnsi"/>
           <w:szCs w:val="28"/>
         </w:rPr>
-        <w:t>divorce_complaint</w:t>
-      </w:r>
-      <w:proofErr w:type="spellEnd"/>
+        <w:t xml:space="preserve">(marriage.have_pension_retirement </w:t>
+      </w:r>
       <w:r>
         <w:rPr>
           <w:rFonts w:asciiTheme="minorHAnsi" w:hAnsiTheme="minorHAnsi" w:cstheme="minorHAnsi"/>
           <w:szCs w:val="28"/>
         </w:rPr>
-        <w:t>”</w:t>
+        <w:t xml:space="preserve">and marriage.pension_contributions_made </w:t>
       </w:r>
       <w:r>
         <w:rPr>
           <w:rFonts w:asciiTheme="minorHAnsi" w:hAnsiTheme="minorHAnsi" w:cstheme="minorHAnsi"/>
           <w:szCs w:val="28"/>
         </w:rPr>
-        <w:t>, “</w:t>
-      </w:r>
-      <w:proofErr w:type="spellStart"/>
+        <w:t>and not marriage.pension_retirement_accounts_keep_own) or (</w:t>
+      </w:r>
+      <w:r>
+        <w:rPr>
+          <w:rFonts w:asciiTheme="minorHAnsi" w:hAnsiTheme="minorHAnsi" w:cstheme="minorHAnsi"/>
+        </w:rPr>
+        <w:t>marriage.personal_property_need_items and marriage.accounts.filter(trigger_investment_reminder=True) | length &gt; 0</w:t>
+      </w:r>
       <w:r>
         <w:rPr>
           <w:rFonts w:asciiTheme="minorHAnsi" w:hAnsiTheme="minorHAnsi" w:cstheme="minorHAnsi"/>
           <w:szCs w:val="28"/>
         </w:rPr>
-        <w:t>divorce_answer</w:t>
-      </w:r>
-      <w:proofErr w:type="spellEnd"/>
+        <w:t>) or (</w:t>
+      </w:r>
+      <w:r>
+        <w:rPr>
+          <w:rFonts w:asciiTheme="minorHAnsi" w:hAnsiTheme="minorHAnsi" w:cstheme="minorHAnsi"/>
+        </w:rPr>
+        <w:t>there_are_marital_children and (parentage_affidavit_revoke or parentage_order_revoke or parentage_marital_revoke)</w:t>
+      </w:r>
       <w:r>
         <w:rPr>
           <w:rFonts w:asciiTheme="minorHAnsi" w:hAnsiTheme="minorHAnsi" w:cstheme="minorHAnsi"/>
           <w:szCs w:val="28"/>
         </w:rPr>
-        <w:t>”]</w:t>
+        <w:t>) or (</w:t>
+      </w:r>
+      <w:r>
+        <w:rPr>
+          <w:rFonts w:asciiTheme="minorHAnsi" w:hAnsiTheme="minorHAnsi" w:cstheme="minorHAnsi"/>
+        </w:rPr>
+        <w:t>there_are_marital_children and not MI_has_jurisdiction_all_kids</w:t>
       </w:r>
       <w:r>
         <w:rPr>
           <w:rFonts w:asciiTheme="minorHAnsi" w:hAnsiTheme="minorHAnsi" w:cstheme="minorHAnsi"/>
           <w:szCs w:val="28"/>
         </w:rPr>
-        <w:t xml:space="preserve"> </w:t>
+        <w:t>)</w:t>
       </w:r>
       <w:r>
         <w:rPr>
           <w:rFonts w:asciiTheme="minorHAnsi" w:hAnsiTheme="minorHAnsi" w:cstheme="minorHAnsi"/>
           <w:szCs w:val="28"/>
         </w:rPr>
-        <w:t>or (</w:t>
-      </w:r>
-      <w:proofErr w:type="spellStart"/>
+        <w:t xml:space="preserve"> or </w:t>
+      </w:r>
       <w:r>
         <w:rPr>
           <w:rFonts w:asciiTheme="minorHAnsi" w:hAnsiTheme="minorHAnsi" w:cstheme="minorHAnsi"/>
           <w:szCs w:val="28"/>
         </w:rPr>
-        <w:t>tool_ID</w:t>
-      </w:r>
-      <w:proofErr w:type="spellEnd"/>
+        <w:t>(</w:t>
+      </w:r>
       <w:r>
         <w:rPr>
           <w:rFonts w:asciiTheme="minorHAnsi" w:hAnsiTheme="minorHAnsi" w:cstheme="minorHAnsi"/>
           <w:szCs w:val="28"/>
         </w:rPr>
-        <w:t xml:space="preserve"> == “</w:t>
-      </w:r>
-      <w:proofErr w:type="spellStart"/>
+        <w:t xml:space="preserve">marriage.real_property.filter(owner=users[0]).filter(titled_together=True) | length + marriage.real_property.filter(owner=other_parties[0]).filter(titled_together=True) | length &gt; 0 </w:t>
+      </w:r>
       <w:r>
         <w:rPr>
           <w:rFonts w:asciiTheme="minorHAnsi" w:hAnsiTheme="minorHAnsi" w:cstheme="minorHAnsi"/>
           <w:szCs w:val="28"/>
         </w:rPr>
-        <w:t>JOD_only</w:t>
-      </w:r>
-      <w:proofErr w:type="spellEnd"/>
-      <w:r>
-        <w:rPr>
-          <w:rFonts w:asciiTheme="minorHAnsi" w:hAnsiTheme="minorHAnsi" w:cstheme="minorHAnsi"/>
-          <w:szCs w:val="28"/>
-        </w:rPr>
-        <w:t xml:space="preserve">” and </w:t>
-      </w:r>
-      <w:r>
-        <w:rPr>
-          <w:rFonts w:asciiTheme="minorHAnsi" w:hAnsiTheme="minorHAnsi" w:cstheme="minorHAnsi"/>
-          <w:szCs w:val="28"/>
-        </w:rPr>
-        <w:t>(</w:t>
-      </w:r>
-      <w:r>
-        <w:rPr>
-          <w:rFonts w:asciiTheme="minorHAnsi" w:hAnsiTheme="minorHAnsi" w:cstheme="minorHAnsi"/>
-          <w:szCs w:val="28"/>
-        </w:rPr>
-        <w:t>(</w:t>
-      </w:r>
-      <w:proofErr w:type="spellStart"/>
-      <w:r>
-        <w:rPr>
-          <w:rFonts w:asciiTheme="minorHAnsi" w:hAnsiTheme="minorHAnsi" w:cstheme="minorHAnsi"/>
-          <w:szCs w:val="28"/>
-        </w:rPr>
-        <w:t>marriage.have_pension_retirement</w:t>
-      </w:r>
-      <w:proofErr w:type="spellEnd"/>
-      <w:r>
-        <w:rPr>
-          <w:rFonts w:asciiTheme="minorHAnsi" w:hAnsiTheme="minorHAnsi" w:cstheme="minorHAnsi"/>
-          <w:szCs w:val="28"/>
-        </w:rPr>
-        <w:t xml:space="preserve"> </w:t>
-      </w:r>
-      <w:r>
-        <w:rPr>
-          <w:rFonts w:asciiTheme="minorHAnsi" w:hAnsiTheme="minorHAnsi" w:cstheme="minorHAnsi"/>
-          <w:szCs w:val="28"/>
-        </w:rPr>
-        <w:t xml:space="preserve">and </w:t>
-      </w:r>
-      <w:proofErr w:type="spellStart"/>
-      <w:r>
-        <w:rPr>
-          <w:rFonts w:asciiTheme="minorHAnsi" w:hAnsiTheme="minorHAnsi" w:cstheme="minorHAnsi"/>
-          <w:szCs w:val="28"/>
-        </w:rPr>
-        <w:t>marriage.pension_contributions_made</w:t>
-      </w:r>
-      <w:proofErr w:type="spellEnd"/>
-      <w:r>
-        <w:rPr>
-          <w:rFonts w:asciiTheme="minorHAnsi" w:hAnsiTheme="minorHAnsi" w:cstheme="minorHAnsi"/>
-          <w:szCs w:val="28"/>
-        </w:rPr>
-        <w:t xml:space="preserve"> </w:t>
-      </w:r>
-      <w:r>
-        <w:rPr>
-          <w:rFonts w:asciiTheme="minorHAnsi" w:hAnsiTheme="minorHAnsi" w:cstheme="minorHAnsi"/>
-          <w:szCs w:val="28"/>
-        </w:rPr>
-        <w:t xml:space="preserve">and not </w:t>
-      </w:r>
-      <w:proofErr w:type="spellStart"/>
-      <w:r>
-        <w:rPr>
-          <w:rFonts w:asciiTheme="minorHAnsi" w:hAnsiTheme="minorHAnsi" w:cstheme="minorHAnsi"/>
-          <w:szCs w:val="28"/>
-        </w:rPr>
-        <w:t>marriage.pension_retirement_accounts_keep_own</w:t>
-      </w:r>
-      <w:proofErr w:type="spellEnd"/>
-      <w:r>
-        <w:rPr>
-          <w:rFonts w:asciiTheme="minorHAnsi" w:hAnsiTheme="minorHAnsi" w:cstheme="minorHAnsi"/>
-          <w:szCs w:val="28"/>
-        </w:rPr>
-        <w:t>) or (</w:t>
-      </w:r>
-      <w:proofErr w:type="spellStart"/>
-      <w:r>
-        <w:rPr>
-          <w:rFonts w:asciiTheme="minorHAnsi" w:hAnsiTheme="minorHAnsi" w:cstheme="minorHAnsi"/>
-        </w:rPr>
-        <w:t>marriage.personal_property_need_items</w:t>
-      </w:r>
-      <w:proofErr w:type="spellEnd"/>
-      <w:r>
-        <w:rPr>
-          <w:rFonts w:asciiTheme="minorHAnsi" w:hAnsiTheme="minorHAnsi" w:cstheme="minorHAnsi"/>
-        </w:rPr>
-        <w:t xml:space="preserve"> and </w:t>
-      </w:r>
-      <w:proofErr w:type="spellStart"/>
-      <w:r>
-        <w:rPr>
-          <w:rFonts w:asciiTheme="minorHAnsi" w:hAnsiTheme="minorHAnsi" w:cstheme="minorHAnsi"/>
-        </w:rPr>
-        <w:t>marriage.accounts.filter</w:t>
-      </w:r>
-      <w:proofErr w:type="spellEnd"/>
-      <w:r>
-        <w:rPr>
-          <w:rFonts w:asciiTheme="minorHAnsi" w:hAnsiTheme="minorHAnsi" w:cstheme="minorHAnsi"/>
-        </w:rPr>
-        <w:t>(</w:t>
-      </w:r>
-      <w:proofErr w:type="spellStart"/>
-      <w:r>
-        <w:rPr>
-          <w:rFonts w:asciiTheme="minorHAnsi" w:hAnsiTheme="minorHAnsi" w:cstheme="minorHAnsi"/>
-        </w:rPr>
-        <w:t>trigger_investment_reminder</w:t>
-      </w:r>
-      <w:proofErr w:type="spellEnd"/>
-      <w:r>
-        <w:rPr>
-          <w:rFonts w:asciiTheme="minorHAnsi" w:hAnsiTheme="minorHAnsi" w:cstheme="minorHAnsi"/>
-        </w:rPr>
-        <w:t>=True) | length &gt; 0</w:t>
-      </w:r>
-      <w:r>
-        <w:rPr>
-          <w:rFonts w:asciiTheme="minorHAnsi" w:hAnsiTheme="minorHAnsi" w:cstheme="minorHAnsi"/>
-          <w:szCs w:val="28"/>
-        </w:rPr>
-        <w:t>) or (</w:t>
-      </w:r>
-      <w:proofErr w:type="spellStart"/>
-      <w:r>
-        <w:rPr>
-          <w:rFonts w:asciiTheme="minorHAnsi" w:hAnsiTheme="minorHAnsi" w:cstheme="minorHAnsi"/>
-        </w:rPr>
-        <w:t>there_are_marital_children</w:t>
-      </w:r>
-      <w:proofErr w:type="spellEnd"/>
-      <w:r>
-        <w:rPr>
-          <w:rFonts w:asciiTheme="minorHAnsi" w:hAnsiTheme="minorHAnsi" w:cstheme="minorHAnsi"/>
-        </w:rPr>
-        <w:t xml:space="preserve"> and (</w:t>
-      </w:r>
-      <w:proofErr w:type="spellStart"/>
-      <w:r>
-        <w:rPr>
-          <w:rFonts w:asciiTheme="minorHAnsi" w:hAnsiTheme="minorHAnsi" w:cstheme="minorHAnsi"/>
-        </w:rPr>
-        <w:t>parentage_affidavit_revoke</w:t>
-      </w:r>
-      <w:proofErr w:type="spellEnd"/>
-      <w:r>
-        <w:rPr>
-          <w:rFonts w:asciiTheme="minorHAnsi" w:hAnsiTheme="minorHAnsi" w:cstheme="minorHAnsi"/>
-        </w:rPr>
-        <w:t xml:space="preserve"> or </w:t>
-      </w:r>
-      <w:proofErr w:type="spellStart"/>
-      <w:r>
-        <w:rPr>
-          <w:rFonts w:asciiTheme="minorHAnsi" w:hAnsiTheme="minorHAnsi" w:cstheme="minorHAnsi"/>
-        </w:rPr>
-        <w:t>parentage_order_revoke</w:t>
-      </w:r>
-      <w:proofErr w:type="spellEnd"/>
-      <w:r>
-        <w:rPr>
-          <w:rFonts w:asciiTheme="minorHAnsi" w:hAnsiTheme="minorHAnsi" w:cstheme="minorHAnsi"/>
-        </w:rPr>
-        <w:t xml:space="preserve"> or </w:t>
-      </w:r>
-      <w:proofErr w:type="spellStart"/>
-      <w:r>
-        <w:rPr>
-          <w:rFonts w:asciiTheme="minorHAnsi" w:hAnsiTheme="minorHAnsi" w:cstheme="minorHAnsi"/>
-        </w:rPr>
-        <w:t>parentage_marital_revoke</w:t>
-      </w:r>
-      <w:proofErr w:type="spellEnd"/>
-      <w:r>
-        <w:rPr>
-          <w:rFonts w:asciiTheme="minorHAnsi" w:hAnsiTheme="minorHAnsi" w:cstheme="minorHAnsi"/>
-        </w:rPr>
-        <w:t>)</w:t>
-      </w:r>
-      <w:r>
-        <w:rPr>
-          <w:rFonts w:asciiTheme="minorHAnsi" w:hAnsiTheme="minorHAnsi" w:cstheme="minorHAnsi"/>
-          <w:szCs w:val="28"/>
-        </w:rPr>
-        <w:t>) or (</w:t>
-      </w:r>
-      <w:proofErr w:type="spellStart"/>
-      <w:r>
-        <w:rPr>
-          <w:rFonts w:asciiTheme="minorHAnsi" w:hAnsiTheme="minorHAnsi" w:cstheme="minorHAnsi"/>
-        </w:rPr>
-        <w:t>there_are_marital_children</w:t>
-      </w:r>
-      <w:proofErr w:type="spellEnd"/>
-      <w:r>
-        <w:rPr>
-          <w:rFonts w:asciiTheme="minorHAnsi" w:hAnsiTheme="minorHAnsi" w:cstheme="minorHAnsi"/>
-        </w:rPr>
-        <w:t xml:space="preserve"> and not </w:t>
-      </w:r>
-      <w:proofErr w:type="spellStart"/>
-      <w:r>
-        <w:rPr>
-          <w:rFonts w:asciiTheme="minorHAnsi" w:hAnsiTheme="minorHAnsi" w:cstheme="minorHAnsi"/>
-        </w:rPr>
-        <w:t>MI_has_jurisdiction_all_kids</w:t>
-      </w:r>
-      <w:proofErr w:type="spellEnd"/>
-      <w:r>
-        <w:rPr>
-          <w:rFonts w:asciiTheme="minorHAnsi" w:hAnsiTheme="minorHAnsi" w:cstheme="minorHAnsi"/>
-          <w:szCs w:val="28"/>
-        </w:rPr>
-        <w:t>)</w:t>
-      </w:r>
-      <w:r>
-        <w:rPr>
-          <w:rFonts w:asciiTheme="minorHAnsi" w:hAnsiTheme="minorHAnsi" w:cstheme="minorHAnsi"/>
-          <w:szCs w:val="28"/>
-        </w:rPr>
-        <w:t xml:space="preserve"> or </w:t>
-      </w:r>
-      <w:r>
-        <w:rPr>
-          <w:rFonts w:asciiTheme="minorHAnsi" w:hAnsiTheme="minorHAnsi" w:cstheme="minorHAnsi"/>
-          <w:szCs w:val="28"/>
-        </w:rPr>
-        <w:t>(</w:t>
-      </w:r>
-      <w:r>
-        <w:rPr>
-          <w:rFonts w:asciiTheme="minorHAnsi" w:hAnsiTheme="minorHAnsi" w:cstheme="minorHAnsi"/>
-          <w:szCs w:val="28"/>
-        </w:rPr>
-        <w:t xml:space="preserve">marriage.real_property.filter(owner=users[0]).filter(titled_together=True) | length + marriage.real_property.filter(owner=other_parties[0]).filter(titled_together=True) | length &gt; 0 or </w:t>
-      </w:r>
-      <w:r>
-        <w:rPr>
-          <w:rFonts w:asciiTheme="minorHAnsi" w:hAnsiTheme="minorHAnsi" w:cstheme="minorHAnsi"/>
-          <w:szCs w:val="28"/>
-        </w:rPr>
         <w:lastRenderedPageBreak/>
-        <w:t>marriage.real_property.filter(owner=users[0]).filter(titled_together=False).filter(title_award_to_named=False) | length + marriage.real_property.filter(owner=other_parties[0]).filter(titled_together=False).filter(title_award_to_named=False) | length &gt; 0</w:t>
+        <w:t>or marriage.real_property.filter(owner=users[0]).filter(titled_together=False).filter(title_award_to_named=False) | length + marriage.real_property.filter(owner=other_parties[0]).filter(titled_together=False).filter(title_award_to_named=False) | length &gt; 0</w:t>
       </w:r>
       <w:r>
         <w:rPr>
@@ -831,49 +503,7 @@
           <w:rFonts w:asciiTheme="minorHAnsi" w:hAnsiTheme="minorHAnsi" w:cstheme="minorHAnsi"/>
         </w:rPr>
         <w:lastRenderedPageBreak/>
-        <w:t xml:space="preserve">{{p </w:t>
-      </w:r>
-      <w:proofErr w:type="spellStart"/>
-      <w:r>
-        <w:rPr>
-          <w:rFonts w:asciiTheme="minorHAnsi" w:hAnsiTheme="minorHAnsi" w:cstheme="minorHAnsi"/>
-        </w:rPr>
-        <w:t>include_docx_</w:t>
-      </w:r>
-      <w:proofErr w:type="gramStart"/>
-      <w:r>
-        <w:rPr>
-          <w:rFonts w:asciiTheme="minorHAnsi" w:hAnsiTheme="minorHAnsi" w:cstheme="minorHAnsi"/>
-        </w:rPr>
-        <w:t>template</w:t>
-      </w:r>
-      <w:proofErr w:type="spellEnd"/>
-      <w:r>
-        <w:rPr>
-          <w:rFonts w:asciiTheme="minorHAnsi" w:hAnsiTheme="minorHAnsi" w:cstheme="minorHAnsi"/>
-        </w:rPr>
-        <w:t>(‘</w:t>
-      </w:r>
-      <w:proofErr w:type="gramEnd"/>
-      <w:r>
-        <w:rPr>
-          <w:rFonts w:asciiTheme="minorHAnsi" w:hAnsiTheme="minorHAnsi" w:cstheme="minorHAnsi"/>
-        </w:rPr>
-        <w:t>reminders_template.docx’</w:t>
-      </w:r>
-      <w:proofErr w:type="gramStart"/>
-      <w:r>
-        <w:rPr>
-          <w:rFonts w:asciiTheme="minorHAnsi" w:hAnsiTheme="minorHAnsi" w:cstheme="minorHAnsi"/>
-        </w:rPr>
-        <w:t>) }</w:t>
-      </w:r>
-      <w:proofErr w:type="gramEnd"/>
-      <w:r>
-        <w:rPr>
-          <w:rFonts w:asciiTheme="minorHAnsi" w:hAnsiTheme="minorHAnsi" w:cstheme="minorHAnsi"/>
-        </w:rPr>
-        <w:t>}</w:t>
+        <w:t>{{p include_docx_template(‘reminders_template.docx’) }}</w:t>
       </w:r>
     </w:p>
     <w:p>
@@ -887,16 +517,8 @@
         <w:rPr>
           <w:rFonts w:asciiTheme="minorHAnsi" w:hAnsiTheme="minorHAnsi" w:cstheme="minorHAnsi"/>
         </w:rPr>
-        <w:t xml:space="preserve">{%p </w:t>
-      </w:r>
-      <w:proofErr w:type="gramStart"/>
-      <w:r>
-        <w:rPr>
-          <w:rFonts w:asciiTheme="minorHAnsi" w:hAnsiTheme="minorHAnsi" w:cstheme="minorHAnsi"/>
-        </w:rPr>
-        <w:t>endif %}</w:t>
-      </w:r>
-      <w:proofErr w:type="gramEnd"/>
+        <w:t>{%p endif %}</w:t>
+      </w:r>
     </w:p>
     <w:p>
       <w:pPr>
@@ -909,69 +531,13 @@
         <w:rPr>
           <w:rFonts w:asciiTheme="minorHAnsi" w:hAnsiTheme="minorHAnsi" w:cstheme="minorHAnsi"/>
         </w:rPr>
-        <w:t xml:space="preserve">{%p if </w:t>
-      </w:r>
-      <w:proofErr w:type="spellStart"/>
-      <w:r>
-        <w:rPr>
-          <w:rFonts w:asciiTheme="minorHAnsi" w:hAnsiTheme="minorHAnsi" w:cstheme="minorHAnsi"/>
-        </w:rPr>
-        <w:t>tool_ID</w:t>
-      </w:r>
-      <w:proofErr w:type="spellEnd"/>
-      <w:r>
-        <w:rPr>
-          <w:rFonts w:asciiTheme="minorHAnsi" w:hAnsiTheme="minorHAnsi" w:cstheme="minorHAnsi"/>
-        </w:rPr>
-        <w:t xml:space="preserve"> == "</w:t>
-      </w:r>
-      <w:proofErr w:type="spellStart"/>
-      <w:r>
-        <w:rPr>
-          <w:rFonts w:asciiTheme="minorHAnsi" w:hAnsiTheme="minorHAnsi" w:cstheme="minorHAnsi"/>
-        </w:rPr>
-        <w:t>divorce_complaint</w:t>
-      </w:r>
-      <w:proofErr w:type="spellEnd"/>
-      <w:r>
-        <w:rPr>
-          <w:rFonts w:asciiTheme="minorHAnsi" w:hAnsiTheme="minorHAnsi" w:cstheme="minorHAnsi"/>
-        </w:rPr>
-        <w:t>"</w:t>
-      </w:r>
-      <w:r>
-        <w:rPr>
-          <w:rFonts w:asciiTheme="minorHAnsi" w:hAnsiTheme="minorHAnsi" w:cstheme="minorHAnsi"/>
-        </w:rPr>
-        <w:t xml:space="preserve"> or </w:t>
-      </w:r>
-      <w:proofErr w:type="spellStart"/>
-      <w:r>
-        <w:rPr>
-          <w:rFonts w:asciiTheme="minorHAnsi" w:hAnsiTheme="minorHAnsi" w:cstheme="minorHAnsi"/>
-        </w:rPr>
-        <w:t>tool_ID</w:t>
-      </w:r>
-      <w:proofErr w:type="spellEnd"/>
-      <w:r>
-        <w:rPr>
-          <w:rFonts w:asciiTheme="minorHAnsi" w:hAnsiTheme="minorHAnsi" w:cstheme="minorHAnsi"/>
-        </w:rPr>
-        <w:t xml:space="preserve"> == “</w:t>
-      </w:r>
-      <w:proofErr w:type="spellStart"/>
-      <w:r>
-        <w:rPr>
-          <w:rFonts w:asciiTheme="minorHAnsi" w:hAnsiTheme="minorHAnsi" w:cstheme="minorHAnsi"/>
-        </w:rPr>
-        <w:t>divorce_answer</w:t>
-      </w:r>
-      <w:proofErr w:type="spellEnd"/>
-      <w:r>
-        <w:rPr>
-          <w:rFonts w:asciiTheme="minorHAnsi" w:hAnsiTheme="minorHAnsi" w:cstheme="minorHAnsi"/>
-        </w:rPr>
-        <w:t>”</w:t>
+        <w:t>{%p if tool_ID == "divorce_complaint"</w:t>
+      </w:r>
+      <w:r>
+        <w:rPr>
+          <w:rFonts w:asciiTheme="minorHAnsi" w:hAnsiTheme="minorHAnsi" w:cstheme="minorHAnsi"/>
+        </w:rPr>
+        <w:t xml:space="preserve"> or tool_ID == “divorce_answer”</w:t>
       </w:r>
       <w:r>
         <w:rPr>
@@ -993,65 +559,32 @@
         <w:lastRenderedPageBreak/>
         <w:t xml:space="preserve">{% if </w:t>
       </w:r>
-      <w:proofErr w:type="spellStart"/>
-      <w:r>
-        <w:t>tool_ID</w:t>
-      </w:r>
-      <w:proofErr w:type="spellEnd"/>
-      <w:r>
-        <w:t xml:space="preserve"> == "</w:t>
-      </w:r>
-      <w:proofErr w:type="spellStart"/>
-      <w:r>
-        <w:t>divorce_complaint</w:t>
-      </w:r>
-      <w:proofErr w:type="spellEnd"/>
+      <w:r>
+        <w:t>tool_ID == "divorce_complaint</w:t>
+      </w:r>
       <w:r>
         <w:t xml:space="preserve">" </w:t>
       </w:r>
       <w:r>
         <w:t xml:space="preserve">and </w:t>
       </w:r>
-      <w:proofErr w:type="spellStart"/>
-      <w:r>
-        <w:t>there_are_marital_</w:t>
-      </w:r>
-      <w:proofErr w:type="gramStart"/>
-      <w:r>
-        <w:t>children</w:t>
-      </w:r>
-      <w:proofErr w:type="spellEnd"/>
-      <w:r>
-        <w:t xml:space="preserve"> </w:t>
+      <w:r>
+        <w:t xml:space="preserve">there_are_marital_children </w:t>
       </w:r>
       <w:r>
         <w:t>%}</w:t>
       </w:r>
-      <w:proofErr w:type="gramEnd"/>
     </w:p>
     <w:p>
       <w:pPr>
         <w:pStyle w:val="Normalforinsertedinstructions"/>
       </w:pPr>
       <w:r>
-        <w:t xml:space="preserve">{{p </w:t>
-      </w:r>
-      <w:proofErr w:type="spellStart"/>
-      <w:r>
-        <w:t>include_docx_</w:t>
-      </w:r>
-      <w:proofErr w:type="gramStart"/>
-      <w:r>
-        <w:t>template</w:t>
-      </w:r>
-      <w:proofErr w:type="spellEnd"/>
-      <w:r>
-        <w:t>(</w:t>
+        <w:t>{{p include_docx_template(</w:t>
       </w:r>
       <w:r>
         <w:t>‘</w:t>
       </w:r>
-      <w:proofErr w:type="gramEnd"/>
       <w:r>
         <w:t>instructions_divorce_with_children</w:t>
       </w:r>
@@ -1061,13 +594,8 @@
       <w:r>
         <w:t>’</w:t>
       </w:r>
-      <w:proofErr w:type="gramStart"/>
-      <w:r>
-        <w:t>) }</w:t>
-      </w:r>
-      <w:proofErr w:type="gramEnd"/>
-      <w:r>
-        <w:t>}</w:t>
+      <w:r>
+        <w:t>) }}</w:t>
       </w:r>
     </w:p>
     <w:p>
@@ -1075,67 +603,31 @@
         <w:pStyle w:val="Normalforinsertedinstructions"/>
       </w:pPr>
       <w:r>
-        <w:t xml:space="preserve">{% </w:t>
-      </w:r>
-      <w:proofErr w:type="spellStart"/>
-      <w:r>
-        <w:t>elif</w:t>
-      </w:r>
-      <w:proofErr w:type="spellEnd"/>
-      <w:r>
-        <w:t xml:space="preserve"> </w:t>
-      </w:r>
-      <w:proofErr w:type="spellStart"/>
-      <w:r>
-        <w:t>tool_ID</w:t>
-      </w:r>
-      <w:proofErr w:type="spellEnd"/>
-      <w:r>
-        <w:t xml:space="preserve"> == "</w:t>
-      </w:r>
-      <w:proofErr w:type="spellStart"/>
-      <w:r>
-        <w:t>divorce_complaint</w:t>
-      </w:r>
-      <w:proofErr w:type="spellEnd"/>
+        <w:t>{% elif tool_ID == "divorce_complaint</w:t>
+      </w:r>
       <w:r>
         <w:t xml:space="preserve">" </w:t>
       </w:r>
       <w:r>
         <w:t xml:space="preserve">and not </w:t>
       </w:r>
-      <w:proofErr w:type="spellStart"/>
-      <w:r>
-        <w:t>there_are_marital_</w:t>
-      </w:r>
-      <w:proofErr w:type="gramStart"/>
-      <w:r>
-        <w:t>children</w:t>
-      </w:r>
-      <w:proofErr w:type="spellEnd"/>
-      <w:r>
-        <w:t xml:space="preserve"> </w:t>
+      <w:r>
+        <w:t xml:space="preserve">there_are_marital_children </w:t>
       </w:r>
       <w:r>
         <w:t>%}</w:t>
       </w:r>
-      <w:proofErr w:type="gramEnd"/>
     </w:p>
     <w:p>
       <w:pPr>
         <w:pStyle w:val="Normalforinsertedinstructions"/>
       </w:pPr>
       <w:r>
-        <w:t>{{p include_docx_</w:t>
-      </w:r>
-      <w:proofErr w:type="gramStart"/>
-      <w:r>
-        <w:t>template(</w:t>
+        <w:t>{{p include_docx_template(</w:t>
       </w:r>
       <w:r>
         <w:t>‘</w:t>
       </w:r>
-      <w:proofErr w:type="gramEnd"/>
       <w:r>
         <w:t>instructions_divorce_with</w:t>
       </w:r>
@@ -1151,13 +643,8 @@
       <w:r>
         <w:t>’</w:t>
       </w:r>
-      <w:proofErr w:type="gramStart"/>
-      <w:r>
-        <w:t>) }</w:t>
-      </w:r>
-      <w:proofErr w:type="gramEnd"/>
-      <w:r>
-        <w:t>}</w:t>
+      <w:r>
+        <w:t>) }}</w:t>
       </w:r>
     </w:p>
     <w:p>
@@ -1165,63 +652,24 @@
         <w:pStyle w:val="Normalforinsertedinstructions"/>
       </w:pPr>
       <w:r>
-        <w:t xml:space="preserve">{% </w:t>
-      </w:r>
-      <w:proofErr w:type="spellStart"/>
-      <w:r>
-        <w:t>elif</w:t>
-      </w:r>
-      <w:proofErr w:type="spellEnd"/>
-      <w:r>
-        <w:t xml:space="preserve"> </w:t>
-      </w:r>
-      <w:proofErr w:type="spellStart"/>
-      <w:r>
-        <w:t>tool_ID</w:t>
-      </w:r>
-      <w:proofErr w:type="spellEnd"/>
-      <w:r>
-        <w:t xml:space="preserve"> == "</w:t>
-      </w:r>
-      <w:proofErr w:type="spellStart"/>
-      <w:r>
-        <w:t>divorce_answer</w:t>
-      </w:r>
-      <w:proofErr w:type="spellEnd"/>
-      <w:proofErr w:type="gramStart"/>
+        <w:t>{% elif tool_ID == "divorce_answer</w:t>
+      </w:r>
       <w:r>
         <w:t xml:space="preserve">" </w:t>
       </w:r>
       <w:r>
         <w:t>%}</w:t>
       </w:r>
-      <w:proofErr w:type="gramEnd"/>
     </w:p>
     <w:p>
       <w:pPr>
         <w:pStyle w:val="Normalforinsertedinstructions"/>
       </w:pPr>
       <w:r>
-        <w:t xml:space="preserve">{{p </w:t>
-      </w:r>
-      <w:proofErr w:type="spellStart"/>
-      <w:r>
-        <w:t>include_docx_</w:t>
-      </w:r>
-      <w:proofErr w:type="gramStart"/>
-      <w:r>
-        <w:t>template</w:t>
-      </w:r>
-      <w:proofErr w:type="spellEnd"/>
-      <w:r>
-        <w:t>(</w:t>
-      </w:r>
-      <w:r>
-        <w:t>‘</w:t>
-      </w:r>
-      <w:proofErr w:type="gramEnd"/>
-      <w:r>
-        <w:t>instructions_divorce_answer</w:t>
+        <w:t>{{p include_docx_template(</w:t>
+      </w:r>
+      <w:r>
+        <w:t>‘instructions_divorce_answer</w:t>
       </w:r>
       <w:r>
         <w:t>.docx</w:t>
@@ -1229,13 +677,8 @@
       <w:r>
         <w:t>’</w:t>
       </w:r>
-      <w:proofErr w:type="gramStart"/>
-      <w:r>
-        <w:t>) }</w:t>
-      </w:r>
-      <w:proofErr w:type="gramEnd"/>
-      <w:r>
-        <w:t>}</w:t>
+      <w:r>
+        <w:t>) }}</w:t>
       </w:r>
     </w:p>
     <w:p>
@@ -1251,13 +694,8 @@
         <w:pStyle w:val="Normalforinsertedinstructions"/>
       </w:pPr>
       <w:r>
-        <w:t xml:space="preserve">{%p </w:t>
-      </w:r>
-      <w:proofErr w:type="gramStart"/>
-      <w:r>
-        <w:t>endif %}</w:t>
-      </w:r>
-      <w:proofErr w:type="gramEnd"/>
+        <w:t>{%p endif %}</w:t>
+      </w:r>
     </w:p>
     <w:p>
       <w:pPr>
@@ -1266,56 +704,39 @@
       <w:r>
         <w:t xml:space="preserve">{%p if </w:t>
       </w:r>
-      <w:proofErr w:type="spellStart"/>
-      <w:r>
-        <w:t>tool_ID</w:t>
-      </w:r>
-      <w:proofErr w:type="spellEnd"/>
+      <w:r>
+        <w:t xml:space="preserve">tool_ID </w:t>
+      </w:r>
+      <w:r>
+        <w:t>in</w:t>
+      </w:r>
       <w:r>
         <w:t xml:space="preserve"> </w:t>
       </w:r>
       <w:r>
-        <w:t>in</w:t>
-      </w:r>
-      <w:r>
-        <w:t xml:space="preserve"> </w:t>
-      </w:r>
-      <w:r>
         <w:t>[</w:t>
       </w:r>
       <w:r>
+        <w:t>"divorce_complaint</w:t>
+      </w:r>
+      <w:r>
         <w:t>"</w:t>
       </w:r>
-      <w:proofErr w:type="spellStart"/>
-      <w:r>
-        <w:t>divorce_complaint</w:t>
-      </w:r>
-      <w:proofErr w:type="spellEnd"/>
+      <w:r>
+        <w:t xml:space="preserve">, </w:t>
+      </w:r>
+      <w:r>
+        <w:t>"JOD_only</w:t>
+      </w:r>
       <w:r>
         <w:t>"</w:t>
       </w:r>
       <w:r>
-        <w:t xml:space="preserve">, </w:t>
-      </w:r>
-      <w:r>
-        <w:t>"</w:t>
-      </w:r>
-      <w:proofErr w:type="spellStart"/>
-      <w:r>
-        <w:t>JOD_only</w:t>
-      </w:r>
-      <w:proofErr w:type="spellEnd"/>
-      <w:r>
-        <w:t>"</w:t>
-      </w:r>
-      <w:proofErr w:type="gramStart"/>
-      <w:r>
         <w:t xml:space="preserve">] </w:t>
       </w:r>
       <w:r>
         <w:t>%}</w:t>
       </w:r>
-      <w:proofErr w:type="gramEnd"/>
     </w:p>
     <w:p>
       <w:r>
@@ -1328,37 +749,19 @@
       </w:pPr>
       <w:r>
         <w:lastRenderedPageBreak/>
-        <w:t xml:space="preserve">{{p </w:t>
-      </w:r>
-      <w:proofErr w:type="spellStart"/>
-      <w:r>
-        <w:t>include_docx_</w:t>
-      </w:r>
-      <w:proofErr w:type="gramStart"/>
-      <w:r>
-        <w:t>template</w:t>
-      </w:r>
-      <w:proofErr w:type="spellEnd"/>
-      <w:r>
-        <w:t>(</w:t>
+        <w:t>{{p include_docx_template(</w:t>
       </w:r>
       <w:r>
         <w:t>‘</w:t>
       </w:r>
-      <w:proofErr w:type="gramEnd"/>
       <w:r>
         <w:t>testimony_script.docx</w:t>
       </w:r>
       <w:r>
         <w:t>’</w:t>
       </w:r>
-      <w:proofErr w:type="gramStart"/>
-      <w:r>
-        <w:t>) }</w:t>
-      </w:r>
-      <w:proofErr w:type="gramEnd"/>
-      <w:r>
-        <w:t>}</w:t>
+      <w:r>
+        <w:t>) }}</w:t>
       </w:r>
     </w:p>
     <w:p>
@@ -1366,13 +769,8 @@
         <w:pStyle w:val="Normalforinsertedinstructions"/>
       </w:pPr>
       <w:r>
-        <w:t xml:space="preserve">{%p </w:t>
-      </w:r>
-      <w:proofErr w:type="gramStart"/>
-      <w:r>
-        <w:t>endif %}</w:t>
-      </w:r>
-      <w:proofErr w:type="gramEnd"/>
+        <w:t>{%p endif %}</w:t>
+      </w:r>
     </w:p>
     <w:sectPr>
       <w:type w:val="continuous"/>
@@ -4102,28 +3500,28 @@
 </file>
 
 <file path=customXml/item1.xml><?xml version="1.0" encoding="utf-8"?>
-<b:Sources xmlns:b="http://schemas.openxmlformats.org/officeDocument/2006/bibliography" xmlns="http://schemas.openxmlformats.org/officeDocument/2006/bibliography" SelectedStyle="\APASixthEditionOfficeOnline.xsl" StyleName="APA" Version="6"/>
-</file>
-
-<file path=customXml/item2.xml><?xml version="1.0" encoding="utf-8"?>
 <go:gDocsCustomXmlDataStorage xmlns:go="http://customooxmlschemas.google.com/" xmlns:r="http://schemas.openxmlformats.org/officeDocument/2006/relationships" uri="GoogleDocsCustomDataVersion2">
   <go:docsCustomData xmlns:go="http://customooxmlschemas.google.com/" roundtripDataSignature="AMtx7mjac1FaFv6WV3g0GhcUIQ9kG0o+yg==">CgMxLjAyDmgubjh0aHd2ZHFzMTk0MghoLmdqZGd4czIOaC56N2hubnB1aWk1NDkyDWguc3hkdG9pMzhvYmkyDmguNWY0ZXAwcWVlOXRlMg5oLmVqdDhyOXF0bXp6djIOaC4yOWpnN3o3Y2I3bGIyDmguanM4cTNwM3I0eDZjMg5oLnYzbTFuaXhkbzBwejIOaC5wZzd4dGp6Y2t3dWkyDmgueTE0MHhvdmdnYml0Mg5oLjRocjAxMWhrOXVyNjIOaC5xMTI4N2VvNmMyd24yDmguODY5YjBrbWEwNmtsMg5oLm1hczdybXljNW82ejgAciExV3BDbUx3RGV0a2poVzFWLUZiZXdyanhaTmV2Wm8tWm0=</go:docsCustomData>
 </go:gDocsCustomXmlDataStorage>
 </file>
 
-<file path=customXml/itemProps1.xml><?xml version="1.0" encoding="utf-8"?>
-<ds:datastoreItem xmlns:ds="http://schemas.openxmlformats.org/officeDocument/2006/customXml" ds:itemID="{D17ADB1C-BB67-458D-A072-D9E3A76A5AA9}">
-  <ds:schemaRefs>
-    <ds:schemaRef ds:uri="http://schemas.openxmlformats.org/officeDocument/2006/bibliography"/>
-  </ds:schemaRefs>
-</ds:datastoreItem>
+<file path=customXml/item2.xml><?xml version="1.0" encoding="utf-8"?>
+<b:Sources xmlns:b="http://schemas.openxmlformats.org/officeDocument/2006/bibliography" xmlns="http://schemas.openxmlformats.org/officeDocument/2006/bibliography" SelectedStyle="\APASixthEditionOfficeOnline.xsl" StyleName="APA" Version="6"/>
 </file>
 
-<file path=customXml/itemProps2.xml><?xml version="1.0" encoding="utf-8"?>
+<file path=customXml/itemProps1.xml><?xml version="1.0" encoding="utf-8"?>
 <ds:datastoreItem xmlns:ds="http://schemas.openxmlformats.org/officeDocument/2006/customXml" ds:itemID="{11111111-1234-1234-1234-123412341234}">
   <ds:schemaRefs>
     <ds:schemaRef ds:uri="http://customooxmlschemas.google.com/"/>
     <ds:schemaRef ds:uri="http://schemas.openxmlformats.org/officeDocument/2006/relationships"/>
   </ds:schemaRefs>
 </ds:datastoreItem>
+</file>
+
+<file path=customXml/itemProps2.xml><?xml version="1.0" encoding="utf-8"?>
+<ds:datastoreItem xmlns:ds="http://schemas.openxmlformats.org/officeDocument/2006/customXml" ds:itemID="{D17ADB1C-BB67-458D-A072-D9E3A76A5AA9}">
+  <ds:schemaRefs>
+    <ds:schemaRef ds:uri="http://schemas.openxmlformats.org/officeDocument/2006/bibliography"/>
+  </ds:schemaRefs>
+</ds:datastoreItem>
 </file>
</xml_diff>

<commit_message>
fix "default" bug; adjust document bundle
</commit_message>
<xml_diff>
--- a/docassemble/MLHDivorceAndCustody/data/templates/instructions.docx
+++ b/docassemble/MLHDivorceAndCustody/data/templates/instructions.docx
@@ -7,13 +7,45 @@
         <w:pStyle w:val="Normalforinsertedinstructions"/>
       </w:pPr>
       <w:r>
-        <w:t>{{p include_docx_template('docassemble.mlhframework:data/templates/cover_sheet_2.0.docx') }}</w:t>
+        <w:t>{{p include_docx_template('</w:t>
+      </w:r>
+      <w:proofErr w:type="gramStart"/>
+      <w:r>
+        <w:t>docassemble.mlhframework</w:t>
+      </w:r>
+      <w:proofErr w:type="gramEnd"/>
+      <w:r>
+        <w:t>:data/templates/cover_sheet_2.0.docx'</w:t>
+      </w:r>
+      <w:proofErr w:type="gramStart"/>
+      <w:r>
+        <w:t>) }</w:t>
+      </w:r>
+      <w:proofErr w:type="gramEnd"/>
+      <w:r>
+        <w:t>}</w:t>
       </w:r>
     </w:p>
     <w:p/>
     <w:p>
       <w:r>
-        <w:t>{%p if tool_ID == “divorce_complaint” %}</w:t>
+        <w:t xml:space="preserve">{%p if </w:t>
+      </w:r>
+      <w:proofErr w:type="spellStart"/>
+      <w:r>
+        <w:t>tool_ID</w:t>
+      </w:r>
+      <w:proofErr w:type="spellEnd"/>
+      <w:r>
+        <w:t xml:space="preserve"> == “</w:t>
+      </w:r>
+      <w:proofErr w:type="spellStart"/>
+      <w:r>
+        <w:t>divorce_complaint</w:t>
+      </w:r>
+      <w:proofErr w:type="spellEnd"/>
+      <w:r>
+        <w:t>” %}</w:t>
       </w:r>
     </w:p>
     <w:p>
@@ -84,7 +116,31 @@
     </w:p>
     <w:p>
       <w:r>
-        <w:t>{%p elif tool_ID == “JOD_only” %}</w:t>
+        <w:t xml:space="preserve">{%p </w:t>
+      </w:r>
+      <w:proofErr w:type="spellStart"/>
+      <w:r>
+        <w:t>elif</w:t>
+      </w:r>
+      <w:proofErr w:type="spellEnd"/>
+      <w:r>
+        <w:t xml:space="preserve"> </w:t>
+      </w:r>
+      <w:proofErr w:type="spellStart"/>
+      <w:r>
+        <w:t>tool_ID</w:t>
+      </w:r>
+      <w:proofErr w:type="spellEnd"/>
+      <w:r>
+        <w:t xml:space="preserve"> == “</w:t>
+      </w:r>
+      <w:proofErr w:type="spellStart"/>
+      <w:r>
+        <w:t>JOD_only</w:t>
+      </w:r>
+      <w:proofErr w:type="spellEnd"/>
+      <w:r>
+        <w:t>” %}</w:t>
       </w:r>
     </w:p>
     <w:p>
@@ -152,7 +208,31 @@
     </w:p>
     <w:p>
       <w:r>
-        <w:t>{%p elif tool_ID == “divorce_answer” %}</w:t>
+        <w:t xml:space="preserve">{%p </w:t>
+      </w:r>
+      <w:proofErr w:type="spellStart"/>
+      <w:r>
+        <w:t>elif</w:t>
+      </w:r>
+      <w:proofErr w:type="spellEnd"/>
+      <w:r>
+        <w:t xml:space="preserve"> </w:t>
+      </w:r>
+      <w:proofErr w:type="spellStart"/>
+      <w:r>
+        <w:t>tool_ID</w:t>
+      </w:r>
+      <w:proofErr w:type="spellEnd"/>
+      <w:r>
+        <w:t xml:space="preserve"> == “</w:t>
+      </w:r>
+      <w:proofErr w:type="spellStart"/>
+      <w:r>
+        <w:t>divorce_answer</w:t>
+      </w:r>
+      <w:proofErr w:type="spellEnd"/>
+      <w:r>
+        <w:t>” %}</w:t>
       </w:r>
     </w:p>
     <w:p>
@@ -225,7 +305,31 @@
     </w:p>
     <w:p>
       <w:r>
-        <w:t>{%p endif %}</w:t>
+        <w:t xml:space="preserve">{%p </w:t>
+      </w:r>
+      <w:proofErr w:type="spellStart"/>
+      <w:r>
+        <w:t>elif</w:t>
+      </w:r>
+      <w:proofErr w:type="spellEnd"/>
+      <w:r>
+        <w:t xml:space="preserve"> </w:t>
+      </w:r>
+      <w:proofErr w:type="spellStart"/>
+      <w:r>
+        <w:t>tool_ID</w:t>
+      </w:r>
+      <w:proofErr w:type="spellEnd"/>
+      <w:r>
+        <w:t xml:space="preserve"> == “</w:t>
+      </w:r>
+      <w:proofErr w:type="spellStart"/>
+      <w:r>
+        <w:t>custody_complaint</w:t>
+      </w:r>
+      <w:proofErr w:type="spellEnd"/>
+      <w:r>
+        <w:t>” %}</w:t>
       </w:r>
     </w:p>
     <w:p>
@@ -236,20 +340,97 @@
     <w:p>
       <w:pPr>
         <w:jc w:val="center"/>
-      </w:pPr>
+        <w:rPr>
+          <w:noProof/>
+        </w:rPr>
+      </w:pPr>
+      <w:r>
+        <w:rPr>
+          <w:noProof/>
+        </w:rPr>
+        <w:drawing>
+          <wp:inline distT="0" distB="0" distL="0" distR="0" wp14:anchorId="24493B4F" wp14:editId="68540EE5">
+            <wp:extent cx="1133475" cy="1133475"/>
+            <wp:effectExtent l="0" t="0" r="9525" b="9525"/>
+            <wp:docPr id="1265558323" name="Picture 2" descr="Survey QR Code"/>
+            <wp:cNvGraphicFramePr>
+              <a:graphicFrameLocks xmlns:a="http://schemas.openxmlformats.org/drawingml/2006/main" noChangeAspect="1"/>
+            </wp:cNvGraphicFramePr>
+            <a:graphic xmlns:a="http://schemas.openxmlformats.org/drawingml/2006/main">
+              <a:graphicData uri="http://schemas.openxmlformats.org/drawingml/2006/picture">
+                <pic:pic xmlns:pic="http://schemas.openxmlformats.org/drawingml/2006/picture">
+                  <pic:nvPicPr>
+                    <pic:cNvPr id="1265558323" name="Picture 2" descr="Survey QR Code"/>
+                    <pic:cNvPicPr>
+                      <a:picLocks noChangeAspect="1" noChangeArrowheads="1"/>
+                    </pic:cNvPicPr>
+                  </pic:nvPicPr>
+                  <pic:blipFill>
+                    <a:blip r:embed="rId10">
+                      <a:extLst>
+                        <a:ext uri="{28A0092B-C50C-407E-A947-70E740481C1C}">
+                          <a14:useLocalDpi xmlns:a14="http://schemas.microsoft.com/office/drawing/2010/main" val="0"/>
+                        </a:ext>
+                      </a:extLst>
+                    </a:blip>
+                    <a:srcRect/>
+                    <a:stretch>
+                      <a:fillRect/>
+                    </a:stretch>
+                  </pic:blipFill>
+                  <pic:spPr bwMode="auto">
+                    <a:xfrm>
+                      <a:off x="0" y="0"/>
+                      <a:ext cx="1133475" cy="1133475"/>
+                    </a:xfrm>
+                    <a:prstGeom prst="rect">
+                      <a:avLst/>
+                    </a:prstGeom>
+                    <a:noFill/>
+                    <a:ln>
+                      <a:noFill/>
+                    </a:ln>
+                  </pic:spPr>
+                </pic:pic>
+              </a:graphicData>
+            </a:graphic>
+          </wp:inline>
+        </w:drawing>
+      </w:r>
     </w:p>
     <w:p>
-      <w:pPr>
-        <w:jc w:val="center"/>
-      </w:pPr>
+      <w:r>
+        <w:t xml:space="preserve">{%p </w:t>
+      </w:r>
+      <w:proofErr w:type="gramStart"/>
+      <w:r>
+        <w:t>endif %}</w:t>
+      </w:r>
+      <w:proofErr w:type="gramEnd"/>
     </w:p>
     <w:p>
       <w:pPr>
-        <w:rPr>
-          <w:rFonts w:asciiTheme="minorHAnsi" w:hAnsiTheme="minorHAnsi" w:cstheme="minorHAnsi"/>
-          <w:szCs w:val="28"/>
-        </w:rPr>
-      </w:pPr>
+        <w:jc w:val="center"/>
+      </w:pPr>
+    </w:p>
+    <w:p>
+      <w:pPr>
+        <w:jc w:val="center"/>
+      </w:pPr>
+    </w:p>
+    <w:p>
+      <w:pPr>
+        <w:jc w:val="center"/>
+      </w:pPr>
+    </w:p>
+    <w:p>
+      <w:pPr>
+        <w:rPr>
+          <w:rFonts w:asciiTheme="minorHAnsi" w:hAnsiTheme="minorHAnsi" w:cstheme="minorHAnsi"/>
+          <w:szCs w:val="28"/>
+        </w:rPr>
+      </w:pPr>
+      <w:proofErr w:type="gramStart"/>
       <w:r>
         <w:rPr>
           <w:rFonts w:cs="Times New Roman"/>
@@ -271,14 +452,40 @@
           <w:noProof/>
           <w:szCs w:val="28"/>
         </w:rPr>
-        <w:t xml:space="preserve">cover_sheet_thanks </w:t>
-      </w:r>
-      <w:r>
-        <w:rPr>
-          <w:rFonts w:asciiTheme="minorHAnsi" w:hAnsiTheme="minorHAnsi" w:cstheme="minorHAnsi"/>
-          <w:szCs w:val="28"/>
-        </w:rPr>
-        <w:t>}}</w:t>
+        <w:t>cover</w:t>
+      </w:r>
+      <w:proofErr w:type="gramEnd"/>
+      <w:r>
+        <w:rPr>
+          <w:rFonts w:asciiTheme="minorHAnsi" w:hAnsiTheme="minorHAnsi" w:cstheme="minorHAnsi"/>
+          <w:noProof/>
+          <w:szCs w:val="28"/>
+        </w:rPr>
+        <w:t>_sheet_</w:t>
+      </w:r>
+      <w:proofErr w:type="gramStart"/>
+      <w:r>
+        <w:rPr>
+          <w:rFonts w:asciiTheme="minorHAnsi" w:hAnsiTheme="minorHAnsi" w:cstheme="minorHAnsi"/>
+          <w:noProof/>
+          <w:szCs w:val="28"/>
+        </w:rPr>
+        <w:t xml:space="preserve">thanks </w:t>
+      </w:r>
+      <w:r>
+        <w:rPr>
+          <w:rFonts w:asciiTheme="minorHAnsi" w:hAnsiTheme="minorHAnsi" w:cstheme="minorHAnsi"/>
+          <w:szCs w:val="28"/>
+        </w:rPr>
+        <w:t>}</w:t>
+      </w:r>
+      <w:proofErr w:type="gramEnd"/>
+      <w:r>
+        <w:rPr>
+          <w:rFonts w:asciiTheme="minorHAnsi" w:hAnsiTheme="minorHAnsi" w:cstheme="minorHAnsi"/>
+          <w:szCs w:val="28"/>
+        </w:rPr>
+        <w:t>}</w:t>
       </w:r>
     </w:p>
     <w:p>
@@ -293,7 +500,23 @@
           <w:rFonts w:asciiTheme="minorHAnsi" w:hAnsiTheme="minorHAnsi" w:cstheme="minorHAnsi"/>
           <w:szCs w:val="28"/>
         </w:rPr>
-        <w:t xml:space="preserve">{%p if tool_ID </w:t>
+        <w:t xml:space="preserve">{%p if </w:t>
+      </w:r>
+      <w:proofErr w:type="spellStart"/>
+      <w:r>
+        <w:rPr>
+          <w:rFonts w:asciiTheme="minorHAnsi" w:hAnsiTheme="minorHAnsi" w:cstheme="minorHAnsi"/>
+          <w:szCs w:val="28"/>
+        </w:rPr>
+        <w:t>tool_ID</w:t>
+      </w:r>
+      <w:proofErr w:type="spellEnd"/>
+      <w:r>
+        <w:rPr>
+          <w:rFonts w:asciiTheme="minorHAnsi" w:hAnsiTheme="minorHAnsi" w:cstheme="minorHAnsi"/>
+          <w:szCs w:val="28"/>
+        </w:rPr>
+        <w:t xml:space="preserve"> </w:t>
       </w:r>
       <w:r>
         <w:rPr>
@@ -307,21 +530,85 @@
           <w:rFonts w:asciiTheme="minorHAnsi" w:hAnsiTheme="minorHAnsi" w:cstheme="minorHAnsi"/>
           <w:szCs w:val="28"/>
         </w:rPr>
-        <w:t>“divorce_complaint”</w:t>
-      </w:r>
-      <w:r>
-        <w:rPr>
-          <w:rFonts w:asciiTheme="minorHAnsi" w:hAnsiTheme="minorHAnsi" w:cstheme="minorHAnsi"/>
-          <w:szCs w:val="28"/>
-        </w:rPr>
-        <w:t>, “divorce_answer”</w:t>
-      </w:r>
-      <w:r>
-        <w:rPr>
-          <w:rFonts w:asciiTheme="minorHAnsi" w:hAnsiTheme="minorHAnsi" w:cstheme="minorHAnsi"/>
-          <w:szCs w:val="28"/>
-        </w:rPr>
-        <w:t>, “custody_complaint”, “custody_answer”</w:t>
+        <w:t>“</w:t>
+      </w:r>
+      <w:proofErr w:type="spellStart"/>
+      <w:r>
+        <w:rPr>
+          <w:rFonts w:asciiTheme="minorHAnsi" w:hAnsiTheme="minorHAnsi" w:cstheme="minorHAnsi"/>
+          <w:szCs w:val="28"/>
+        </w:rPr>
+        <w:t>divorce_complaint</w:t>
+      </w:r>
+      <w:proofErr w:type="spellEnd"/>
+      <w:r>
+        <w:rPr>
+          <w:rFonts w:asciiTheme="minorHAnsi" w:hAnsiTheme="minorHAnsi" w:cstheme="minorHAnsi"/>
+          <w:szCs w:val="28"/>
+        </w:rPr>
+        <w:t>”</w:t>
+      </w:r>
+      <w:r>
+        <w:rPr>
+          <w:rFonts w:asciiTheme="minorHAnsi" w:hAnsiTheme="minorHAnsi" w:cstheme="minorHAnsi"/>
+          <w:szCs w:val="28"/>
+        </w:rPr>
+        <w:t>, “</w:t>
+      </w:r>
+      <w:proofErr w:type="spellStart"/>
+      <w:r>
+        <w:rPr>
+          <w:rFonts w:asciiTheme="minorHAnsi" w:hAnsiTheme="minorHAnsi" w:cstheme="minorHAnsi"/>
+          <w:szCs w:val="28"/>
+        </w:rPr>
+        <w:t>divorce_answer</w:t>
+      </w:r>
+      <w:proofErr w:type="spellEnd"/>
+      <w:r>
+        <w:rPr>
+          <w:rFonts w:asciiTheme="minorHAnsi" w:hAnsiTheme="minorHAnsi" w:cstheme="minorHAnsi"/>
+          <w:szCs w:val="28"/>
+        </w:rPr>
+        <w:t>”</w:t>
+      </w:r>
+      <w:r>
+        <w:rPr>
+          <w:rFonts w:asciiTheme="minorHAnsi" w:hAnsiTheme="minorHAnsi" w:cstheme="minorHAnsi"/>
+          <w:szCs w:val="28"/>
+        </w:rPr>
+        <w:t>, “</w:t>
+      </w:r>
+      <w:proofErr w:type="spellStart"/>
+      <w:r>
+        <w:rPr>
+          <w:rFonts w:asciiTheme="minorHAnsi" w:hAnsiTheme="minorHAnsi" w:cstheme="minorHAnsi"/>
+          <w:szCs w:val="28"/>
+        </w:rPr>
+        <w:t>custody_complaint</w:t>
+      </w:r>
+      <w:proofErr w:type="spellEnd"/>
+      <w:r>
+        <w:rPr>
+          <w:rFonts w:asciiTheme="minorHAnsi" w:hAnsiTheme="minorHAnsi" w:cstheme="minorHAnsi"/>
+          <w:szCs w:val="28"/>
+        </w:rPr>
+        <w:t>”, “</w:t>
+      </w:r>
+      <w:proofErr w:type="spellStart"/>
+      <w:r>
+        <w:rPr>
+          <w:rFonts w:asciiTheme="minorHAnsi" w:hAnsiTheme="minorHAnsi" w:cstheme="minorHAnsi"/>
+          <w:szCs w:val="28"/>
+        </w:rPr>
+        <w:t>custody_answer</w:t>
+      </w:r>
+      <w:proofErr w:type="spellEnd"/>
+      <w:r>
+        <w:rPr>
+          <w:rFonts w:asciiTheme="minorHAnsi" w:hAnsiTheme="minorHAnsi" w:cstheme="minorHAnsi"/>
+          <w:szCs w:val="28"/>
+        </w:rPr>
+        <w:t>”</w:t>
       </w:r>
       <w:r>
         <w:rPr>
@@ -342,7 +629,39 @@
           <w:rFonts w:asciiTheme="minorHAnsi" w:hAnsiTheme="minorHAnsi" w:cstheme="minorHAnsi"/>
           <w:szCs w:val="28"/>
         </w:rPr>
-        <w:t xml:space="preserve">or (tool_ID == “JOD_only” and </w:t>
+        <w:t>or (</w:t>
+      </w:r>
+      <w:proofErr w:type="spellStart"/>
+      <w:r>
+        <w:rPr>
+          <w:rFonts w:asciiTheme="minorHAnsi" w:hAnsiTheme="minorHAnsi" w:cstheme="minorHAnsi"/>
+          <w:szCs w:val="28"/>
+        </w:rPr>
+        <w:t>tool_ID</w:t>
+      </w:r>
+      <w:proofErr w:type="spellEnd"/>
+      <w:r>
+        <w:rPr>
+          <w:rFonts w:asciiTheme="minorHAnsi" w:hAnsiTheme="minorHAnsi" w:cstheme="minorHAnsi"/>
+          <w:szCs w:val="28"/>
+        </w:rPr>
+        <w:t xml:space="preserve"> == “</w:t>
+      </w:r>
+      <w:proofErr w:type="spellStart"/>
+      <w:r>
+        <w:rPr>
+          <w:rFonts w:asciiTheme="minorHAnsi" w:hAnsiTheme="minorHAnsi" w:cstheme="minorHAnsi"/>
+          <w:szCs w:val="28"/>
+        </w:rPr>
+        <w:t>JOD_only</w:t>
+      </w:r>
+      <w:proofErr w:type="spellEnd"/>
+      <w:r>
+        <w:rPr>
+          <w:rFonts w:asciiTheme="minorHAnsi" w:hAnsiTheme="minorHAnsi" w:cstheme="minorHAnsi"/>
+          <w:szCs w:val="28"/>
+        </w:rPr>
+        <w:t xml:space="preserve">” and </w:t>
       </w:r>
       <w:r>
         <w:rPr>
@@ -356,28 +675,64 @@
           <w:rFonts w:asciiTheme="minorHAnsi" w:hAnsiTheme="minorHAnsi" w:cstheme="minorHAnsi"/>
           <w:szCs w:val="28"/>
         </w:rPr>
-        <w:t xml:space="preserve">(marriage.have_pension_retirement </w:t>
-      </w:r>
-      <w:r>
-        <w:rPr>
-          <w:rFonts w:asciiTheme="minorHAnsi" w:hAnsiTheme="minorHAnsi" w:cstheme="minorHAnsi"/>
-          <w:szCs w:val="28"/>
-        </w:rPr>
-        <w:t xml:space="preserve">and marriage.pension_contributions_made </w:t>
-      </w:r>
-      <w:r>
-        <w:rPr>
-          <w:rFonts w:asciiTheme="minorHAnsi" w:hAnsiTheme="minorHAnsi" w:cstheme="minorHAnsi"/>
-          <w:szCs w:val="28"/>
-        </w:rPr>
-        <w:t>and not marriage.pension_retirement_accounts_keep_own) or (</w:t>
-      </w:r>
-      <w:r>
-        <w:rPr>
-          <w:rFonts w:asciiTheme="minorHAnsi" w:hAnsiTheme="minorHAnsi" w:cstheme="minorHAnsi"/>
-        </w:rPr>
-        <w:t>marriage.personal_property_need_items and marriage.accounts.filter(trigger_investment_reminder=True) | length &gt; 0</w:t>
-      </w:r>
+        <w:t>(</w:t>
+      </w:r>
+      <w:proofErr w:type="spellStart"/>
+      <w:r>
+        <w:rPr>
+          <w:rFonts w:asciiTheme="minorHAnsi" w:hAnsiTheme="minorHAnsi" w:cstheme="minorHAnsi"/>
+          <w:szCs w:val="28"/>
+        </w:rPr>
+        <w:t>marriage.have_pension_retirement</w:t>
+      </w:r>
+      <w:proofErr w:type="spellEnd"/>
+      <w:r>
+        <w:rPr>
+          <w:rFonts w:asciiTheme="minorHAnsi" w:hAnsiTheme="minorHAnsi" w:cstheme="minorHAnsi"/>
+          <w:szCs w:val="28"/>
+        </w:rPr>
+        <w:t xml:space="preserve"> </w:t>
+      </w:r>
+      <w:r>
+        <w:rPr>
+          <w:rFonts w:asciiTheme="minorHAnsi" w:hAnsiTheme="minorHAnsi" w:cstheme="minorHAnsi"/>
+          <w:szCs w:val="28"/>
+        </w:rPr>
+        <w:t xml:space="preserve">and </w:t>
+      </w:r>
+      <w:proofErr w:type="spellStart"/>
+      <w:r>
+        <w:rPr>
+          <w:rFonts w:asciiTheme="minorHAnsi" w:hAnsiTheme="minorHAnsi" w:cstheme="minorHAnsi"/>
+          <w:szCs w:val="28"/>
+        </w:rPr>
+        <w:t>marriage.pension_contributions_made</w:t>
+      </w:r>
+      <w:proofErr w:type="spellEnd"/>
+      <w:r>
+        <w:rPr>
+          <w:rFonts w:asciiTheme="minorHAnsi" w:hAnsiTheme="minorHAnsi" w:cstheme="minorHAnsi"/>
+          <w:szCs w:val="28"/>
+        </w:rPr>
+        <w:t xml:space="preserve"> </w:t>
+      </w:r>
+      <w:r>
+        <w:rPr>
+          <w:rFonts w:asciiTheme="minorHAnsi" w:hAnsiTheme="minorHAnsi" w:cstheme="minorHAnsi"/>
+          <w:szCs w:val="28"/>
+        </w:rPr>
+        <w:t xml:space="preserve">and not </w:t>
+      </w:r>
+      <w:proofErr w:type="spellStart"/>
+      <w:r>
+        <w:rPr>
+          <w:rFonts w:asciiTheme="minorHAnsi" w:hAnsiTheme="minorHAnsi" w:cstheme="minorHAnsi"/>
+          <w:szCs w:val="28"/>
+        </w:rPr>
+        <w:lastRenderedPageBreak/>
+        <w:t>marriage.pension_retirement_accounts_keep_own</w:t>
+      </w:r>
+      <w:proofErr w:type="spellEnd"/>
       <w:r>
         <w:rPr>
           <w:rFonts w:asciiTheme="minorHAnsi" w:hAnsiTheme="minorHAnsi" w:cstheme="minorHAnsi"/>
@@ -385,11 +740,47 @@
         </w:rPr>
         <w:t>) or (</w:t>
       </w:r>
-      <w:r>
-        <w:rPr>
-          <w:rFonts w:asciiTheme="minorHAnsi" w:hAnsiTheme="minorHAnsi" w:cstheme="minorHAnsi"/>
-        </w:rPr>
-        <w:t>there_are_marital_children and (parentage_affidavit_revoke or parentage_order_revoke or parentage_marital_revoke)</w:t>
+      <w:proofErr w:type="spellStart"/>
+      <w:r>
+        <w:rPr>
+          <w:rFonts w:asciiTheme="minorHAnsi" w:hAnsiTheme="minorHAnsi" w:cstheme="minorHAnsi"/>
+        </w:rPr>
+        <w:t>marriage.personal_property_need_items</w:t>
+      </w:r>
+      <w:proofErr w:type="spellEnd"/>
+      <w:r>
+        <w:rPr>
+          <w:rFonts w:asciiTheme="minorHAnsi" w:hAnsiTheme="minorHAnsi" w:cstheme="minorHAnsi"/>
+        </w:rPr>
+        <w:t xml:space="preserve"> and </w:t>
+      </w:r>
+      <w:proofErr w:type="spellStart"/>
+      <w:r>
+        <w:rPr>
+          <w:rFonts w:asciiTheme="minorHAnsi" w:hAnsiTheme="minorHAnsi" w:cstheme="minorHAnsi"/>
+        </w:rPr>
+        <w:t>marriage.accounts.filter</w:t>
+      </w:r>
+      <w:proofErr w:type="spellEnd"/>
+      <w:r>
+        <w:rPr>
+          <w:rFonts w:asciiTheme="minorHAnsi" w:hAnsiTheme="minorHAnsi" w:cstheme="minorHAnsi"/>
+        </w:rPr>
+        <w:t>(</w:t>
+      </w:r>
+      <w:proofErr w:type="spellStart"/>
+      <w:r>
+        <w:rPr>
+          <w:rFonts w:asciiTheme="minorHAnsi" w:hAnsiTheme="minorHAnsi" w:cstheme="minorHAnsi"/>
+        </w:rPr>
+        <w:t>trigger_investment_reminder</w:t>
+      </w:r>
+      <w:proofErr w:type="spellEnd"/>
+      <w:r>
+        <w:rPr>
+          <w:rFonts w:asciiTheme="minorHAnsi" w:hAnsiTheme="minorHAnsi" w:cstheme="minorHAnsi"/>
+        </w:rPr>
+        <w:t>=True) | length &gt; 0</w:t>
       </w:r>
       <w:r>
         <w:rPr>
@@ -398,16 +789,59 @@
         </w:rPr>
         <w:t>) or (</w:t>
       </w:r>
-      <w:r>
-        <w:rPr>
-          <w:rFonts w:asciiTheme="minorHAnsi" w:hAnsiTheme="minorHAnsi" w:cstheme="minorHAnsi"/>
-        </w:rPr>
-        <w:t>there_are_marital_children and not MI_has_jurisdiction_all_kids</w:t>
-      </w:r>
-      <w:r>
-        <w:rPr>
-          <w:rFonts w:asciiTheme="minorHAnsi" w:hAnsiTheme="minorHAnsi" w:cstheme="minorHAnsi"/>
-          <w:szCs w:val="28"/>
+      <w:proofErr w:type="spellStart"/>
+      <w:r>
+        <w:rPr>
+          <w:rFonts w:asciiTheme="minorHAnsi" w:hAnsiTheme="minorHAnsi" w:cstheme="minorHAnsi"/>
+        </w:rPr>
+        <w:t>there_are_marital_children</w:t>
+      </w:r>
+      <w:proofErr w:type="spellEnd"/>
+      <w:r>
+        <w:rPr>
+          <w:rFonts w:asciiTheme="minorHAnsi" w:hAnsiTheme="minorHAnsi" w:cstheme="minorHAnsi"/>
+        </w:rPr>
+        <w:t xml:space="preserve"> and (</w:t>
+      </w:r>
+      <w:proofErr w:type="spellStart"/>
+      <w:r>
+        <w:rPr>
+          <w:rFonts w:asciiTheme="minorHAnsi" w:hAnsiTheme="minorHAnsi" w:cstheme="minorHAnsi"/>
+        </w:rPr>
+        <w:t>parentage_affidavit_revoke</w:t>
+      </w:r>
+      <w:proofErr w:type="spellEnd"/>
+      <w:r>
+        <w:rPr>
+          <w:rFonts w:asciiTheme="minorHAnsi" w:hAnsiTheme="minorHAnsi" w:cstheme="minorHAnsi"/>
+        </w:rPr>
+        <w:t xml:space="preserve"> or </w:t>
+      </w:r>
+      <w:proofErr w:type="spellStart"/>
+      <w:r>
+        <w:rPr>
+          <w:rFonts w:asciiTheme="minorHAnsi" w:hAnsiTheme="minorHAnsi" w:cstheme="minorHAnsi"/>
+        </w:rPr>
+        <w:t>parentage_order_revoke</w:t>
+      </w:r>
+      <w:proofErr w:type="spellEnd"/>
+      <w:r>
+        <w:rPr>
+          <w:rFonts w:asciiTheme="minorHAnsi" w:hAnsiTheme="minorHAnsi" w:cstheme="minorHAnsi"/>
+        </w:rPr>
+        <w:t xml:space="preserve"> or </w:t>
+      </w:r>
+      <w:proofErr w:type="spellStart"/>
+      <w:r>
+        <w:rPr>
+          <w:rFonts w:asciiTheme="minorHAnsi" w:hAnsiTheme="minorHAnsi" w:cstheme="minorHAnsi"/>
+        </w:rPr>
+        <w:t>parentage_marital_revoke</w:t>
+      </w:r>
+      <w:proofErr w:type="spellEnd"/>
+      <w:r>
+        <w:rPr>
+          <w:rFonts w:asciiTheme="minorHAnsi" w:hAnsiTheme="minorHAnsi" w:cstheme="minorHAnsi"/>
         </w:rPr>
         <w:t>)</w:t>
       </w:r>
@@ -416,6 +850,42 @@
           <w:rFonts w:asciiTheme="minorHAnsi" w:hAnsiTheme="minorHAnsi" w:cstheme="minorHAnsi"/>
           <w:szCs w:val="28"/>
         </w:rPr>
+        <w:t>) or (</w:t>
+      </w:r>
+      <w:proofErr w:type="spellStart"/>
+      <w:r>
+        <w:rPr>
+          <w:rFonts w:asciiTheme="minorHAnsi" w:hAnsiTheme="minorHAnsi" w:cstheme="minorHAnsi"/>
+        </w:rPr>
+        <w:t>there_are_marital_children</w:t>
+      </w:r>
+      <w:proofErr w:type="spellEnd"/>
+      <w:r>
+        <w:rPr>
+          <w:rFonts w:asciiTheme="minorHAnsi" w:hAnsiTheme="minorHAnsi" w:cstheme="minorHAnsi"/>
+        </w:rPr>
+        <w:t xml:space="preserve"> and not </w:t>
+      </w:r>
+      <w:proofErr w:type="spellStart"/>
+      <w:r>
+        <w:rPr>
+          <w:rFonts w:asciiTheme="minorHAnsi" w:hAnsiTheme="minorHAnsi" w:cstheme="minorHAnsi"/>
+        </w:rPr>
+        <w:t>MI_has_jurisdiction_all_kids</w:t>
+      </w:r>
+      <w:proofErr w:type="spellEnd"/>
+      <w:r>
+        <w:rPr>
+          <w:rFonts w:asciiTheme="minorHAnsi" w:hAnsiTheme="minorHAnsi" w:cstheme="minorHAnsi"/>
+          <w:szCs w:val="28"/>
+        </w:rPr>
+        <w:t>)</w:t>
+      </w:r>
+      <w:r>
+        <w:rPr>
+          <w:rFonts w:asciiTheme="minorHAnsi" w:hAnsiTheme="minorHAnsi" w:cstheme="minorHAnsi"/>
+          <w:szCs w:val="28"/>
+        </w:rPr>
         <w:t xml:space="preserve"> or </w:t>
       </w:r>
       <w:r>
@@ -430,15 +900,7 @@
           <w:rFonts w:asciiTheme="minorHAnsi" w:hAnsiTheme="minorHAnsi" w:cstheme="minorHAnsi"/>
           <w:szCs w:val="28"/>
         </w:rPr>
-        <w:t xml:space="preserve">marriage.real_property.filter(owner=users[0]).filter(titled_together=True) | length + marriage.real_property.filter(owner=other_parties[0]).filter(titled_together=True) | length &gt; 0 </w:t>
-      </w:r>
-      <w:r>
-        <w:rPr>
-          <w:rFonts w:asciiTheme="minorHAnsi" w:hAnsiTheme="minorHAnsi" w:cstheme="minorHAnsi"/>
-          <w:szCs w:val="28"/>
-        </w:rPr>
-        <w:lastRenderedPageBreak/>
-        <w:t>or marriage.real_property.filter(owner=users[0]).filter(titled_together=False).filter(title_award_to_named=False) | length + marriage.real_property.filter(owner=other_parties[0]).filter(titled_together=False).filter(title_award_to_named=False) | length &gt; 0</w:t>
+        <w:t>marriage.real_property.filter(owner=users[0]).filter(titled_together=True) | length + marriage.real_property.filter(owner=other_parties[0]).filter(titled_together=True) | length &gt; 0 or marriage.real_property.filter(owner=users[0]).filter(titled_together=False).filter(title_award_to_named=False) | length + marriage.real_property.filter(owner=other_parties[0]).filter(titled_together=False).filter(title_award_to_named=False) | length &gt; 0</w:t>
       </w:r>
       <w:r>
         <w:rPr>
@@ -503,7 +965,49 @@
           <w:rFonts w:asciiTheme="minorHAnsi" w:hAnsiTheme="minorHAnsi" w:cstheme="minorHAnsi"/>
         </w:rPr>
         <w:lastRenderedPageBreak/>
-        <w:t>{{p include_docx_template(‘reminders_template.docx’) }}</w:t>
+        <w:t xml:space="preserve">{{p </w:t>
+      </w:r>
+      <w:proofErr w:type="spellStart"/>
+      <w:r>
+        <w:rPr>
+          <w:rFonts w:asciiTheme="minorHAnsi" w:hAnsiTheme="minorHAnsi" w:cstheme="minorHAnsi"/>
+        </w:rPr>
+        <w:t>include_docx_</w:t>
+      </w:r>
+      <w:proofErr w:type="gramStart"/>
+      <w:r>
+        <w:rPr>
+          <w:rFonts w:asciiTheme="minorHAnsi" w:hAnsiTheme="minorHAnsi" w:cstheme="minorHAnsi"/>
+        </w:rPr>
+        <w:t>template</w:t>
+      </w:r>
+      <w:proofErr w:type="spellEnd"/>
+      <w:r>
+        <w:rPr>
+          <w:rFonts w:asciiTheme="minorHAnsi" w:hAnsiTheme="minorHAnsi" w:cstheme="minorHAnsi"/>
+        </w:rPr>
+        <w:t>(‘</w:t>
+      </w:r>
+      <w:proofErr w:type="gramEnd"/>
+      <w:r>
+        <w:rPr>
+          <w:rFonts w:asciiTheme="minorHAnsi" w:hAnsiTheme="minorHAnsi" w:cstheme="minorHAnsi"/>
+        </w:rPr>
+        <w:t>reminders_template.docx’</w:t>
+      </w:r>
+      <w:proofErr w:type="gramStart"/>
+      <w:r>
+        <w:rPr>
+          <w:rFonts w:asciiTheme="minorHAnsi" w:hAnsiTheme="minorHAnsi" w:cstheme="minorHAnsi"/>
+        </w:rPr>
+        <w:t>) }</w:t>
+      </w:r>
+      <w:proofErr w:type="gramEnd"/>
+      <w:r>
+        <w:rPr>
+          <w:rFonts w:asciiTheme="minorHAnsi" w:hAnsiTheme="minorHAnsi" w:cstheme="minorHAnsi"/>
+        </w:rPr>
+        <w:t>}</w:t>
       </w:r>
     </w:p>
     <w:p>
@@ -517,8 +1021,16 @@
         <w:rPr>
           <w:rFonts w:asciiTheme="minorHAnsi" w:hAnsiTheme="minorHAnsi" w:cstheme="minorHAnsi"/>
         </w:rPr>
-        <w:t>{%p endif %}</w:t>
-      </w:r>
+        <w:t xml:space="preserve">{%p </w:t>
+      </w:r>
+      <w:proofErr w:type="gramStart"/>
+      <w:r>
+        <w:rPr>
+          <w:rFonts w:asciiTheme="minorHAnsi" w:hAnsiTheme="minorHAnsi" w:cstheme="minorHAnsi"/>
+        </w:rPr>
+        <w:t>endif %}</w:t>
+      </w:r>
+      <w:proofErr w:type="gramEnd"/>
     </w:p>
     <w:p>
       <w:pPr>
@@ -531,13 +1043,69 @@
         <w:rPr>
           <w:rFonts w:asciiTheme="minorHAnsi" w:hAnsiTheme="minorHAnsi" w:cstheme="minorHAnsi"/>
         </w:rPr>
-        <w:t>{%p if tool_ID == "divorce_complaint"</w:t>
-      </w:r>
-      <w:r>
-        <w:rPr>
-          <w:rFonts w:asciiTheme="minorHAnsi" w:hAnsiTheme="minorHAnsi" w:cstheme="minorHAnsi"/>
-        </w:rPr>
-        <w:t xml:space="preserve"> or tool_ID == “divorce_answer”</w:t>
+        <w:t xml:space="preserve">{%p if </w:t>
+      </w:r>
+      <w:proofErr w:type="spellStart"/>
+      <w:r>
+        <w:rPr>
+          <w:rFonts w:asciiTheme="minorHAnsi" w:hAnsiTheme="minorHAnsi" w:cstheme="minorHAnsi"/>
+        </w:rPr>
+        <w:t>tool_ID</w:t>
+      </w:r>
+      <w:proofErr w:type="spellEnd"/>
+      <w:r>
+        <w:rPr>
+          <w:rFonts w:asciiTheme="minorHAnsi" w:hAnsiTheme="minorHAnsi" w:cstheme="minorHAnsi"/>
+        </w:rPr>
+        <w:t xml:space="preserve"> == "</w:t>
+      </w:r>
+      <w:proofErr w:type="spellStart"/>
+      <w:r>
+        <w:rPr>
+          <w:rFonts w:asciiTheme="minorHAnsi" w:hAnsiTheme="minorHAnsi" w:cstheme="minorHAnsi"/>
+        </w:rPr>
+        <w:t>divorce_complaint</w:t>
+      </w:r>
+      <w:proofErr w:type="spellEnd"/>
+      <w:r>
+        <w:rPr>
+          <w:rFonts w:asciiTheme="minorHAnsi" w:hAnsiTheme="minorHAnsi" w:cstheme="minorHAnsi"/>
+        </w:rPr>
+        <w:t>"</w:t>
+      </w:r>
+      <w:r>
+        <w:rPr>
+          <w:rFonts w:asciiTheme="minorHAnsi" w:hAnsiTheme="minorHAnsi" w:cstheme="minorHAnsi"/>
+        </w:rPr>
+        <w:t xml:space="preserve"> or </w:t>
+      </w:r>
+      <w:proofErr w:type="spellStart"/>
+      <w:r>
+        <w:rPr>
+          <w:rFonts w:asciiTheme="minorHAnsi" w:hAnsiTheme="minorHAnsi" w:cstheme="minorHAnsi"/>
+        </w:rPr>
+        <w:t>tool_ID</w:t>
+      </w:r>
+      <w:proofErr w:type="spellEnd"/>
+      <w:r>
+        <w:rPr>
+          <w:rFonts w:asciiTheme="minorHAnsi" w:hAnsiTheme="minorHAnsi" w:cstheme="minorHAnsi"/>
+        </w:rPr>
+        <w:t xml:space="preserve"> == “</w:t>
+      </w:r>
+      <w:proofErr w:type="spellStart"/>
+      <w:r>
+        <w:rPr>
+          <w:rFonts w:asciiTheme="minorHAnsi" w:hAnsiTheme="minorHAnsi" w:cstheme="minorHAnsi"/>
+        </w:rPr>
+        <w:t>divorce_answer</w:t>
+      </w:r>
+      <w:proofErr w:type="spellEnd"/>
+      <w:r>
+        <w:rPr>
+          <w:rFonts w:asciiTheme="minorHAnsi" w:hAnsiTheme="minorHAnsi" w:cstheme="minorHAnsi"/>
+        </w:rPr>
+        <w:t>”</w:t>
       </w:r>
       <w:r>
         <w:rPr>
@@ -559,32 +1127,65 @@
         <w:lastRenderedPageBreak/>
         <w:t xml:space="preserve">{% if </w:t>
       </w:r>
-      <w:r>
-        <w:t>tool_ID == "divorce_complaint</w:t>
-      </w:r>
+      <w:proofErr w:type="spellStart"/>
+      <w:r>
+        <w:t>tool_ID</w:t>
+      </w:r>
+      <w:proofErr w:type="spellEnd"/>
+      <w:r>
+        <w:t xml:space="preserve"> == "</w:t>
+      </w:r>
+      <w:proofErr w:type="spellStart"/>
+      <w:r>
+        <w:t>divorce_complaint</w:t>
+      </w:r>
+      <w:proofErr w:type="spellEnd"/>
       <w:r>
         <w:t xml:space="preserve">" </w:t>
       </w:r>
       <w:r>
         <w:t xml:space="preserve">and </w:t>
       </w:r>
-      <w:r>
-        <w:t xml:space="preserve">there_are_marital_children </w:t>
+      <w:proofErr w:type="spellStart"/>
+      <w:r>
+        <w:t>there_are_marital_</w:t>
+      </w:r>
+      <w:proofErr w:type="gramStart"/>
+      <w:r>
+        <w:t>children</w:t>
+      </w:r>
+      <w:proofErr w:type="spellEnd"/>
+      <w:r>
+        <w:t xml:space="preserve"> </w:t>
       </w:r>
       <w:r>
         <w:t>%}</w:t>
       </w:r>
+      <w:proofErr w:type="gramEnd"/>
     </w:p>
     <w:p>
       <w:pPr>
         <w:pStyle w:val="Normalforinsertedinstructions"/>
       </w:pPr>
       <w:r>
-        <w:t>{{p include_docx_template(</w:t>
+        <w:t xml:space="preserve">{{p </w:t>
+      </w:r>
+      <w:proofErr w:type="spellStart"/>
+      <w:r>
+        <w:t>include_docx_</w:t>
+      </w:r>
+      <w:proofErr w:type="gramStart"/>
+      <w:r>
+        <w:t>template</w:t>
+      </w:r>
+      <w:proofErr w:type="spellEnd"/>
+      <w:r>
+        <w:t>(</w:t>
       </w:r>
       <w:r>
         <w:t>‘</w:t>
       </w:r>
+      <w:proofErr w:type="gramEnd"/>
       <w:r>
         <w:t>instructions_divorce_with_children</w:t>
       </w:r>
@@ -594,8 +1195,13 @@
       <w:r>
         <w:t>’</w:t>
       </w:r>
-      <w:r>
-        <w:t>) }}</w:t>
+      <w:proofErr w:type="gramStart"/>
+      <w:r>
+        <w:t>) }</w:t>
+      </w:r>
+      <w:proofErr w:type="gramEnd"/>
+      <w:r>
+        <w:t>}</w:t>
       </w:r>
     </w:p>
     <w:p>
@@ -603,31 +1209,67 @@
         <w:pStyle w:val="Normalforinsertedinstructions"/>
       </w:pPr>
       <w:r>
-        <w:t>{% elif tool_ID == "divorce_complaint</w:t>
-      </w:r>
+        <w:t xml:space="preserve">{% </w:t>
+      </w:r>
+      <w:proofErr w:type="spellStart"/>
+      <w:r>
+        <w:t>elif</w:t>
+      </w:r>
+      <w:proofErr w:type="spellEnd"/>
+      <w:r>
+        <w:t xml:space="preserve"> </w:t>
+      </w:r>
+      <w:proofErr w:type="spellStart"/>
+      <w:r>
+        <w:t>tool_ID</w:t>
+      </w:r>
+      <w:proofErr w:type="spellEnd"/>
+      <w:r>
+        <w:t xml:space="preserve"> == "</w:t>
+      </w:r>
+      <w:proofErr w:type="spellStart"/>
+      <w:r>
+        <w:t>divorce_complaint</w:t>
+      </w:r>
+      <w:proofErr w:type="spellEnd"/>
       <w:r>
         <w:t xml:space="preserve">" </w:t>
       </w:r>
       <w:r>
         <w:t xml:space="preserve">and not </w:t>
       </w:r>
-      <w:r>
-        <w:t xml:space="preserve">there_are_marital_children </w:t>
+      <w:proofErr w:type="spellStart"/>
+      <w:r>
+        <w:t>there_are_marital_</w:t>
+      </w:r>
+      <w:proofErr w:type="gramStart"/>
+      <w:r>
+        <w:t>children</w:t>
+      </w:r>
+      <w:proofErr w:type="spellEnd"/>
+      <w:r>
+        <w:t xml:space="preserve"> </w:t>
       </w:r>
       <w:r>
         <w:t>%}</w:t>
       </w:r>
+      <w:proofErr w:type="gramEnd"/>
     </w:p>
     <w:p>
       <w:pPr>
         <w:pStyle w:val="Normalforinsertedinstructions"/>
       </w:pPr>
       <w:r>
-        <w:t>{{p include_docx_template(</w:t>
+        <w:t>{{p include_docx_</w:t>
+      </w:r>
+      <w:proofErr w:type="gramStart"/>
+      <w:r>
+        <w:t>template(</w:t>
       </w:r>
       <w:r>
         <w:t>‘</w:t>
       </w:r>
+      <w:proofErr w:type="gramEnd"/>
       <w:r>
         <w:t>instructions_divorce_with</w:t>
       </w:r>
@@ -643,8 +1285,13 @@
       <w:r>
         <w:t>’</w:t>
       </w:r>
-      <w:r>
-        <w:t>) }}</w:t>
+      <w:proofErr w:type="gramStart"/>
+      <w:r>
+        <w:t>) }</w:t>
+      </w:r>
+      <w:proofErr w:type="gramEnd"/>
+      <w:r>
+        <w:t>}</w:t>
       </w:r>
     </w:p>
     <w:p>
@@ -652,24 +1299,63 @@
         <w:pStyle w:val="Normalforinsertedinstructions"/>
       </w:pPr>
       <w:r>
-        <w:t>{% elif tool_ID == "divorce_answer</w:t>
-      </w:r>
+        <w:t xml:space="preserve">{% </w:t>
+      </w:r>
+      <w:proofErr w:type="spellStart"/>
+      <w:r>
+        <w:t>elif</w:t>
+      </w:r>
+      <w:proofErr w:type="spellEnd"/>
+      <w:r>
+        <w:t xml:space="preserve"> </w:t>
+      </w:r>
+      <w:proofErr w:type="spellStart"/>
+      <w:r>
+        <w:t>tool_ID</w:t>
+      </w:r>
+      <w:proofErr w:type="spellEnd"/>
+      <w:r>
+        <w:t xml:space="preserve"> == "</w:t>
+      </w:r>
+      <w:proofErr w:type="spellStart"/>
+      <w:r>
+        <w:t>divorce_answer</w:t>
+      </w:r>
+      <w:proofErr w:type="spellEnd"/>
+      <w:proofErr w:type="gramStart"/>
       <w:r>
         <w:t xml:space="preserve">" </w:t>
       </w:r>
       <w:r>
         <w:t>%}</w:t>
       </w:r>
+      <w:proofErr w:type="gramEnd"/>
     </w:p>
     <w:p>
       <w:pPr>
         <w:pStyle w:val="Normalforinsertedinstructions"/>
       </w:pPr>
       <w:r>
-        <w:t>{{p include_docx_template(</w:t>
-      </w:r>
-      <w:r>
-        <w:t>‘instructions_divorce_answer</w:t>
+        <w:t xml:space="preserve">{{p </w:t>
+      </w:r>
+      <w:proofErr w:type="spellStart"/>
+      <w:r>
+        <w:t>include_docx_</w:t>
+      </w:r>
+      <w:proofErr w:type="gramStart"/>
+      <w:r>
+        <w:t>template</w:t>
+      </w:r>
+      <w:proofErr w:type="spellEnd"/>
+      <w:r>
+        <w:t>(</w:t>
+      </w:r>
+      <w:r>
+        <w:t>‘</w:t>
+      </w:r>
+      <w:proofErr w:type="gramEnd"/>
+      <w:r>
+        <w:t>instructions_divorce_answer</w:t>
       </w:r>
       <w:r>
         <w:t>.docx</w:t>
@@ -677,8 +1363,13 @@
       <w:r>
         <w:t>’</w:t>
       </w:r>
-      <w:r>
-        <w:t>) }}</w:t>
+      <w:proofErr w:type="gramStart"/>
+      <w:r>
+        <w:t>) }</w:t>
+      </w:r>
+      <w:proofErr w:type="gramEnd"/>
+      <w:r>
+        <w:t>}</w:t>
       </w:r>
     </w:p>
     <w:p>
@@ -694,8 +1385,13 @@
         <w:pStyle w:val="Normalforinsertedinstructions"/>
       </w:pPr>
       <w:r>
-        <w:t>{%p endif %}</w:t>
-      </w:r>
+        <w:t xml:space="preserve">{%p </w:t>
+      </w:r>
+      <w:proofErr w:type="gramStart"/>
+      <w:r>
+        <w:t>endif %}</w:t>
+      </w:r>
+      <w:proofErr w:type="gramEnd"/>
     </w:p>
     <w:p>
       <w:pPr>
@@ -704,8 +1400,13 @@
       <w:r>
         <w:t xml:space="preserve">{%p if </w:t>
       </w:r>
-      <w:r>
-        <w:t xml:space="preserve">tool_ID </w:t>
+      <w:proofErr w:type="spellStart"/>
+      <w:r>
+        <w:t>tool_ID</w:t>
+      </w:r>
+      <w:proofErr w:type="spellEnd"/>
+      <w:r>
+        <w:t xml:space="preserve"> </w:t>
       </w:r>
       <w:r>
         <w:t>in</w:t>
@@ -717,26 +1418,38 @@
         <w:t>[</w:t>
       </w:r>
       <w:r>
-        <w:t>"divorce_complaint</w:t>
-      </w:r>
-      <w:r>
         <w:t>"</w:t>
       </w:r>
+      <w:proofErr w:type="spellStart"/>
+      <w:r>
+        <w:t>divorce_complaint</w:t>
+      </w:r>
+      <w:proofErr w:type="spellEnd"/>
+      <w:r>
+        <w:t>"</w:t>
+      </w:r>
       <w:r>
         <w:t xml:space="preserve">, </w:t>
       </w:r>
       <w:r>
-        <w:t>"JOD_only</w:t>
-      </w:r>
-      <w:r>
         <w:t>"</w:t>
       </w:r>
+      <w:proofErr w:type="spellStart"/>
+      <w:r>
+        <w:t>JOD_only</w:t>
+      </w:r>
+      <w:proofErr w:type="spellEnd"/>
+      <w:r>
+        <w:t>"</w:t>
+      </w:r>
+      <w:proofErr w:type="gramStart"/>
       <w:r>
         <w:t xml:space="preserve">] </w:t>
       </w:r>
       <w:r>
         <w:t>%}</w:t>
       </w:r>
+      <w:proofErr w:type="gramEnd"/>
     </w:p>
     <w:p>
       <w:r>
@@ -749,19 +1462,37 @@
       </w:pPr>
       <w:r>
         <w:lastRenderedPageBreak/>
-        <w:t>{{p include_docx_template(</w:t>
+        <w:t xml:space="preserve">{{p </w:t>
+      </w:r>
+      <w:proofErr w:type="spellStart"/>
+      <w:r>
+        <w:t>include_docx_</w:t>
+      </w:r>
+      <w:proofErr w:type="gramStart"/>
+      <w:r>
+        <w:t>template</w:t>
+      </w:r>
+      <w:proofErr w:type="spellEnd"/>
+      <w:r>
+        <w:t>(</w:t>
       </w:r>
       <w:r>
         <w:t>‘</w:t>
       </w:r>
+      <w:proofErr w:type="gramEnd"/>
       <w:r>
         <w:t>testimony_script.docx</w:t>
       </w:r>
       <w:r>
         <w:t>’</w:t>
       </w:r>
-      <w:r>
-        <w:t>) }}</w:t>
+      <w:proofErr w:type="gramStart"/>
+      <w:r>
+        <w:t>) }</w:t>
+      </w:r>
+      <w:proofErr w:type="gramEnd"/>
+      <w:r>
+        <w:t>}</w:t>
       </w:r>
     </w:p>
     <w:p>
@@ -769,8 +1500,13 @@
         <w:pStyle w:val="Normalforinsertedinstructions"/>
       </w:pPr>
       <w:r>
-        <w:t>{%p endif %}</w:t>
-      </w:r>
+        <w:t xml:space="preserve">{%p </w:t>
+      </w:r>
+      <w:proofErr w:type="gramStart"/>
+      <w:r>
+        <w:t>endif %}</w:t>
+      </w:r>
+      <w:proofErr w:type="gramEnd"/>
     </w:p>
     <w:sectPr>
       <w:type w:val="continuous"/>
@@ -2968,7 +3704,6 @@
   <w:style w:type="character" w:default="1" w:styleId="DefaultParagraphFont">
     <w:name w:val="Default Paragraph Font"/>
     <w:uiPriority w:val="1"/>
-    <w:semiHidden/>
     <w:unhideWhenUsed/>
   </w:style>
   <w:style w:type="table" w:default="1" w:styleId="TableNormal">
@@ -3500,28 +4235,28 @@
 </file>
 
 <file path=customXml/item1.xml><?xml version="1.0" encoding="utf-8"?>
+<b:Sources xmlns:b="http://schemas.openxmlformats.org/officeDocument/2006/bibliography" xmlns="http://schemas.openxmlformats.org/officeDocument/2006/bibliography" SelectedStyle="\APASixthEditionOfficeOnline.xsl" StyleName="APA" Version="6"/>
+</file>
+
+<file path=customXml/item2.xml><?xml version="1.0" encoding="utf-8"?>
 <go:gDocsCustomXmlDataStorage xmlns:go="http://customooxmlschemas.google.com/" xmlns:r="http://schemas.openxmlformats.org/officeDocument/2006/relationships" uri="GoogleDocsCustomDataVersion2">
   <go:docsCustomData xmlns:go="http://customooxmlschemas.google.com/" roundtripDataSignature="AMtx7mjac1FaFv6WV3g0GhcUIQ9kG0o+yg==">CgMxLjAyDmgubjh0aHd2ZHFzMTk0MghoLmdqZGd4czIOaC56N2hubnB1aWk1NDkyDWguc3hkdG9pMzhvYmkyDmguNWY0ZXAwcWVlOXRlMg5oLmVqdDhyOXF0bXp6djIOaC4yOWpnN3o3Y2I3bGIyDmguanM4cTNwM3I0eDZjMg5oLnYzbTFuaXhkbzBwejIOaC5wZzd4dGp6Y2t3dWkyDmgueTE0MHhvdmdnYml0Mg5oLjRocjAxMWhrOXVyNjIOaC5xMTI4N2VvNmMyd24yDmguODY5YjBrbWEwNmtsMg5oLm1hczdybXljNW82ejgAciExV3BDbUx3RGV0a2poVzFWLUZiZXdyanhaTmV2Wm8tWm0=</go:docsCustomData>
 </go:gDocsCustomXmlDataStorage>
 </file>
 
-<file path=customXml/item2.xml><?xml version="1.0" encoding="utf-8"?>
-<b:Sources xmlns:b="http://schemas.openxmlformats.org/officeDocument/2006/bibliography" xmlns="http://schemas.openxmlformats.org/officeDocument/2006/bibliography" SelectedStyle="\APASixthEditionOfficeOnline.xsl" StyleName="APA" Version="6"/>
+<file path=customXml/itemProps1.xml><?xml version="1.0" encoding="utf-8"?>
+<ds:datastoreItem xmlns:ds="http://schemas.openxmlformats.org/officeDocument/2006/customXml" ds:itemID="{D17ADB1C-BB67-458D-A072-D9E3A76A5AA9}">
+  <ds:schemaRefs>
+    <ds:schemaRef ds:uri="http://schemas.openxmlformats.org/officeDocument/2006/bibliography"/>
+  </ds:schemaRefs>
+</ds:datastoreItem>
 </file>
 
-<file path=customXml/itemProps1.xml><?xml version="1.0" encoding="utf-8"?>
+<file path=customXml/itemProps2.xml><?xml version="1.0" encoding="utf-8"?>
 <ds:datastoreItem xmlns:ds="http://schemas.openxmlformats.org/officeDocument/2006/customXml" ds:itemID="{11111111-1234-1234-1234-123412341234}">
   <ds:schemaRefs>
     <ds:schemaRef ds:uri="http://customooxmlschemas.google.com/"/>
     <ds:schemaRef ds:uri="http://schemas.openxmlformats.org/officeDocument/2006/relationships"/>
   </ds:schemaRefs>
 </ds:datastoreItem>
-</file>
-
-<file path=customXml/itemProps2.xml><?xml version="1.0" encoding="utf-8"?>
-<ds:datastoreItem xmlns:ds="http://schemas.openxmlformats.org/officeDocument/2006/customXml" ds:itemID="{D17ADB1C-BB67-458D-A072-D9E3A76A5AA9}">
-  <ds:schemaRefs>
-    <ds:schemaRef ds:uri="http://schemas.openxmlformats.org/officeDocument/2006/bibliography"/>
-  </ds:schemaRefs>
-</ds:datastoreItem>
 </file>
</xml_diff>